<commit_message>
14.09.26            List changes: Phonebook
</commit_message>
<xml_diff>
--- a/AQA/Теория/📝 aqa подготовка.docx
+++ b/AQA/Теория/📝 aqa подготовка.docx
@@ -33966,8 +33966,377 @@
           <w:szCs w:val="18"/>
         </w:rPr>
       </w:pPr>
-    </w:p>
-    <w:p/>
+      <w:r>
+        <w:rPr>
+          <w:rFonts w:ascii="Times New Roman" w:hAnsi="Times New Roman" w:cs="Times New Roman"/>
+          <w:color w:val="595959" w:themeColor="text1" w:themeTint="A6"/>
+          <w:sz w:val="18"/>
+          <w:szCs w:val="18"/>
+        </w:rPr>
+        <w:t>Ответы на вопросы:</w:t>
+      </w:r>
+    </w:p>
+    <w:p>
+      <w:pPr>
+        <w:pStyle w:val="a4"/>
+        <w:numPr>
+          <w:ilvl w:val="1"/>
+          <w:numId w:val="74"/>
+        </w:numPr>
+        <w:rPr>
+          <w:rFonts w:ascii="Times New Roman" w:hAnsi="Times New Roman" w:cs="Times New Roman"/>
+          <w:color w:val="595959" w:themeColor="text1" w:themeTint="A6"/>
+          <w:sz w:val="18"/>
+          <w:szCs w:val="18"/>
+        </w:rPr>
+      </w:pPr>
+      <w:r>
+        <w:rPr>
+          <w:rFonts w:ascii="Times New Roman" w:hAnsi="Times New Roman" w:cs="Times New Roman"/>
+          <w:color w:val="595959" w:themeColor="text1" w:themeTint="A6"/>
+          <w:sz w:val="18"/>
+          <w:szCs w:val="18"/>
+        </w:rPr>
+        <w:t xml:space="preserve">Мы храним номера телефонов как </w:t>
+      </w:r>
+      <w:r>
+        <w:rPr>
+          <w:rFonts w:ascii="Times New Roman" w:hAnsi="Times New Roman" w:cs="Times New Roman"/>
+          <w:b/>
+          <w:bCs/>
+          <w:color w:val="595959" w:themeColor="text1" w:themeTint="A6"/>
+          <w:sz w:val="18"/>
+          <w:szCs w:val="18"/>
+        </w:rPr>
+        <w:t>строки (str)</w:t>
+      </w:r>
+      <w:r>
+        <w:rPr>
+          <w:rFonts w:ascii="Times New Roman" w:hAnsi="Times New Roman" w:cs="Times New Roman"/>
+          <w:color w:val="595959" w:themeColor="text1" w:themeTint="A6"/>
+          <w:sz w:val="18"/>
+          <w:szCs w:val="18"/>
+        </w:rPr>
+        <w:t xml:space="preserve">, а не как </w:t>
+      </w:r>
+      <w:r>
+        <w:rPr>
+          <w:rFonts w:ascii="Times New Roman" w:hAnsi="Times New Roman" w:cs="Times New Roman"/>
+          <w:b/>
+          <w:bCs/>
+          <w:color w:val="595959" w:themeColor="text1" w:themeTint="A6"/>
+          <w:sz w:val="18"/>
+          <w:szCs w:val="18"/>
+        </w:rPr>
+        <w:t>числа (int)</w:t>
+      </w:r>
+      <w:r>
+        <w:rPr>
+          <w:rFonts w:ascii="Times New Roman" w:hAnsi="Times New Roman" w:cs="Times New Roman"/>
+          <w:color w:val="595959" w:themeColor="text1" w:themeTint="A6"/>
+          <w:sz w:val="18"/>
+          <w:szCs w:val="18"/>
+        </w:rPr>
+        <w:t>, по нескольким причинам:</w:t>
+      </w:r>
+    </w:p>
+    <w:p>
+      <w:pPr>
+        <w:numPr>
+          <w:ilvl w:val="0"/>
+          <w:numId w:val="77"/>
+        </w:numPr>
+        <w:rPr>
+          <w:rFonts w:ascii="Times New Roman" w:hAnsi="Times New Roman" w:cs="Times New Roman"/>
+          <w:color w:val="595959" w:themeColor="text1" w:themeTint="A6"/>
+          <w:sz w:val="18"/>
+          <w:szCs w:val="18"/>
+        </w:rPr>
+      </w:pPr>
+      <w:r>
+        <w:rPr>
+          <w:rFonts w:ascii="Times New Roman" w:hAnsi="Times New Roman" w:cs="Times New Roman"/>
+          <w:b/>
+          <w:bCs/>
+          <w:color w:val="595959" w:themeColor="text1" w:themeTint="A6"/>
+          <w:sz w:val="18"/>
+          <w:szCs w:val="18"/>
+        </w:rPr>
+        <w:t>Потеря ведущих нулей:</w:t>
+      </w:r>
+      <w:r>
+        <w:rPr>
+          <w:rFonts w:ascii="Times New Roman" w:hAnsi="Times New Roman" w:cs="Times New Roman"/>
+          <w:color w:val="595959" w:themeColor="text1" w:themeTint="A6"/>
+          <w:sz w:val="18"/>
+          <w:szCs w:val="18"/>
+        </w:rPr>
+        <w:t>. Если сохранить номер 0671234567 как int, компьютер превратит его в 671234567. В результате код страны или города просто сотрется.</w:t>
+      </w:r>
+    </w:p>
+    <w:p>
+      <w:pPr>
+        <w:numPr>
+          <w:ilvl w:val="0"/>
+          <w:numId w:val="77"/>
+        </w:numPr>
+        <w:rPr>
+          <w:rFonts w:ascii="Times New Roman" w:hAnsi="Times New Roman" w:cs="Times New Roman"/>
+          <w:color w:val="595959" w:themeColor="text1" w:themeTint="A6"/>
+          <w:sz w:val="18"/>
+          <w:szCs w:val="18"/>
+        </w:rPr>
+      </w:pPr>
+      <w:r>
+        <w:rPr>
+          <w:rFonts w:ascii="Times New Roman" w:hAnsi="Times New Roman" w:cs="Times New Roman"/>
+          <w:b/>
+          <w:bCs/>
+          <w:color w:val="595959" w:themeColor="text1" w:themeTint="A6"/>
+          <w:sz w:val="18"/>
+          <w:szCs w:val="18"/>
+        </w:rPr>
+        <w:t>Специальные символы:</w:t>
+      </w:r>
+      <w:r>
+        <w:rPr>
+          <w:rFonts w:ascii="Times New Roman" w:hAnsi="Times New Roman" w:cs="Times New Roman"/>
+          <w:color w:val="595959" w:themeColor="text1" w:themeTint="A6"/>
+          <w:sz w:val="18"/>
+          <w:szCs w:val="18"/>
+        </w:rPr>
+        <w:t xml:space="preserve"> Тип int поддерживает только цифры, поэтому сохранить номер в международном формате вроде +7 (999) 123-45-67 как число физически невозможно.</w:t>
+      </w:r>
+    </w:p>
+    <w:p>
+      <w:pPr>
+        <w:numPr>
+          <w:ilvl w:val="0"/>
+          <w:numId w:val="77"/>
+        </w:numPr>
+        <w:rPr>
+          <w:rFonts w:ascii="Times New Roman" w:hAnsi="Times New Roman" w:cs="Times New Roman"/>
+          <w:color w:val="595959" w:themeColor="text1" w:themeTint="A6"/>
+          <w:sz w:val="18"/>
+          <w:szCs w:val="18"/>
+        </w:rPr>
+      </w:pPr>
+      <w:r>
+        <w:rPr>
+          <w:rFonts w:ascii="Times New Roman" w:hAnsi="Times New Roman" w:cs="Times New Roman"/>
+          <w:b/>
+          <w:bCs/>
+          <w:color w:val="595959" w:themeColor="text1" w:themeTint="A6"/>
+          <w:sz w:val="18"/>
+          <w:szCs w:val="18"/>
+        </w:rPr>
+        <w:t>Отсутствие математического смысла:</w:t>
+      </w:r>
+      <w:r>
+        <w:rPr>
+          <w:rFonts w:ascii="Times New Roman" w:hAnsi="Times New Roman" w:cs="Times New Roman"/>
+          <w:color w:val="595959" w:themeColor="text1" w:themeTint="A6"/>
+          <w:sz w:val="18"/>
+          <w:szCs w:val="18"/>
+        </w:rPr>
+        <w:t xml:space="preserve"> С номерами телефонов никогда не проводят арифметические операции. Их не нужно складывать, вычитать, умножать или делить. Они служат текстовыми идентификаторами, как почтовые индексы или номера паспортов.</w:t>
+      </w:r>
+    </w:p>
+    <w:p>
+      <w:pPr>
+        <w:pStyle w:val="a4"/>
+        <w:spacing w:after="0" w:line="240" w:lineRule="auto"/>
+        <w:ind w:left="1440"/>
+        <w:rPr>
+          <w:rFonts w:ascii="Times New Roman" w:eastAsia="Times New Roman" w:hAnsi="Times New Roman" w:cs="Times New Roman"/>
+          <w:color w:val="7F7F7F" w:themeColor="text1" w:themeTint="80"/>
+          <w:sz w:val="18"/>
+          <w:szCs w:val="18"/>
+          <w:lang w:eastAsia="ru-RU"/>
+        </w:rPr>
+      </w:pPr>
+    </w:p>
+    <w:p>
+      <w:pPr>
+        <w:pStyle w:val="a4"/>
+        <w:numPr>
+          <w:ilvl w:val="1"/>
+          <w:numId w:val="74"/>
+        </w:numPr>
+        <w:spacing w:after="0" w:line="240" w:lineRule="auto"/>
+        <w:rPr>
+          <w:rFonts w:ascii="Times New Roman" w:eastAsia="Times New Roman" w:hAnsi="Times New Roman" w:cs="Times New Roman"/>
+          <w:color w:val="7F7F7F" w:themeColor="text1" w:themeTint="80"/>
+          <w:sz w:val="18"/>
+          <w:szCs w:val="18"/>
+          <w:lang w:eastAsia="ru-RU"/>
+        </w:rPr>
+      </w:pPr>
+      <w:r>
+        <w:rPr>
+          <w:rFonts w:ascii="Times New Roman" w:eastAsia="Times New Roman" w:hAnsi="Times New Roman" w:cs="Times New Roman"/>
+          <w:color w:val="7F7F7F" w:themeColor="text1" w:themeTint="80"/>
+          <w:sz w:val="18"/>
+          <w:szCs w:val="18"/>
+          <w:lang w:eastAsia="ru-RU"/>
+        </w:rPr>
+        <w:t>П</w:t>
+      </w:r>
+      <w:r>
+        <w:rPr>
+          <w:rFonts w:ascii="Times New Roman" w:eastAsia="Times New Roman" w:hAnsi="Times New Roman" w:cs="Times New Roman"/>
+          <w:color w:val="7F7F7F" w:themeColor="text1" w:themeTint="80"/>
+          <w:sz w:val="18"/>
+          <w:szCs w:val="18"/>
+          <w:lang w:eastAsia="ru-RU"/>
+        </w:rPr>
+        <w:t xml:space="preserve">рограмма завершится с ошибкой </w:t>
+      </w:r>
+      <w:r>
+        <w:rPr>
+          <w:rFonts w:ascii="Times New Roman" w:eastAsia="Times New Roman" w:hAnsi="Times New Roman" w:cs="Times New Roman"/>
+          <w:b/>
+          <w:bCs/>
+          <w:color w:val="7F7F7F" w:themeColor="text1" w:themeTint="80"/>
+          <w:sz w:val="18"/>
+          <w:szCs w:val="18"/>
+          <w:lang w:eastAsia="ru-RU"/>
+        </w:rPr>
+        <w:t>TypeError: unhashable type: 'list'</w:t>
+      </w:r>
+      <w:r>
+        <w:rPr>
+          <w:rFonts w:ascii="Times New Roman" w:eastAsia="Times New Roman" w:hAnsi="Times New Roman" w:cs="Times New Roman"/>
+          <w:color w:val="7F7F7F" w:themeColor="text1" w:themeTint="80"/>
+          <w:sz w:val="18"/>
+          <w:szCs w:val="18"/>
+          <w:lang w:eastAsia="ru-RU"/>
+        </w:rPr>
+        <w:t>.</w:t>
+      </w:r>
+    </w:p>
+    <w:p>
+      <w:pPr>
+        <w:pStyle w:val="a4"/>
+        <w:ind w:left="1440"/>
+        <w:rPr>
+          <w:rFonts w:ascii="Times New Roman" w:hAnsi="Times New Roman" w:cs="Times New Roman"/>
+          <w:color w:val="595959" w:themeColor="text1" w:themeTint="A6"/>
+          <w:sz w:val="18"/>
+          <w:szCs w:val="18"/>
+        </w:rPr>
+      </w:pPr>
+    </w:p>
+    <w:p>
+      <w:pPr>
+        <w:rPr>
+          <w:rFonts w:ascii="Times New Roman" w:hAnsi="Times New Roman" w:cs="Times New Roman"/>
+          <w:color w:val="595959" w:themeColor="text1" w:themeTint="A6"/>
+          <w:sz w:val="18"/>
+          <w:szCs w:val="18"/>
+        </w:rPr>
+      </w:pPr>
+      <w:r>
+        <w:rPr>
+          <w:rFonts w:ascii="Times New Roman" w:hAnsi="Times New Roman" w:cs="Times New Roman"/>
+          <w:color w:val="595959" w:themeColor="text1" w:themeTint="A6"/>
+          <w:sz w:val="18"/>
+          <w:szCs w:val="18"/>
+        </w:rPr>
+        <w:br/>
+        <w:t>почему это происходит:</w:t>
+      </w:r>
+    </w:p>
+    <w:p>
+      <w:pPr>
+        <w:numPr>
+          <w:ilvl w:val="0"/>
+          <w:numId w:val="79"/>
+        </w:numPr>
+        <w:rPr>
+          <w:rFonts w:ascii="Times New Roman" w:hAnsi="Times New Roman" w:cs="Times New Roman"/>
+          <w:color w:val="595959" w:themeColor="text1" w:themeTint="A6"/>
+          <w:sz w:val="18"/>
+          <w:szCs w:val="18"/>
+        </w:rPr>
+      </w:pPr>
+      <w:r>
+        <w:rPr>
+          <w:rFonts w:ascii="Times New Roman" w:hAnsi="Times New Roman" w:cs="Times New Roman"/>
+          <w:b/>
+          <w:bCs/>
+          <w:color w:val="595959" w:themeColor="text1" w:themeTint="A6"/>
+          <w:sz w:val="18"/>
+          <w:szCs w:val="18"/>
+        </w:rPr>
+        <w:t>к</w:t>
+      </w:r>
+      <w:r>
+        <w:rPr>
+          <w:rFonts w:ascii="Times New Roman" w:hAnsi="Times New Roman" w:cs="Times New Roman"/>
+          <w:b/>
+          <w:bCs/>
+          <w:color w:val="595959" w:themeColor="text1" w:themeTint="A6"/>
+          <w:sz w:val="18"/>
+          <w:szCs w:val="18"/>
+        </w:rPr>
+        <w:t>лючи словаря должны быть хэшируемыми</w:t>
+      </w:r>
+      <w:r>
+        <w:rPr>
+          <w:rFonts w:ascii="Times New Roman" w:hAnsi="Times New Roman" w:cs="Times New Roman"/>
+          <w:b/>
+          <w:bCs/>
+          <w:color w:val="595959" w:themeColor="text1" w:themeTint="A6"/>
+          <w:sz w:val="18"/>
+          <w:szCs w:val="18"/>
+        </w:rPr>
+        <w:t xml:space="preserve"> - </w:t>
+      </w:r>
+      <w:r>
+        <w:rPr>
+          <w:rFonts w:ascii="Times New Roman" w:hAnsi="Times New Roman" w:cs="Times New Roman"/>
+          <w:color w:val="595959" w:themeColor="text1" w:themeTint="A6"/>
+          <w:sz w:val="18"/>
+          <w:szCs w:val="18"/>
+        </w:rPr>
+        <w:t xml:space="preserve">  чтобы моментально находить значение в памяти, не перебирая весь словарь целиком.</w:t>
+      </w:r>
+    </w:p>
+    <w:p>
+      <w:pPr>
+        <w:numPr>
+          <w:ilvl w:val="0"/>
+          <w:numId w:val="79"/>
+        </w:numPr>
+        <w:rPr>
+          <w:rFonts w:ascii="Times New Roman" w:hAnsi="Times New Roman" w:cs="Times New Roman"/>
+          <w:color w:val="595959" w:themeColor="text1" w:themeTint="A6"/>
+          <w:sz w:val="18"/>
+          <w:szCs w:val="18"/>
+        </w:rPr>
+      </w:pPr>
+    </w:p>
+    <w:p>
+      <w:pPr>
+        <w:rPr>
+          <w:rFonts w:ascii="Times New Roman" w:hAnsi="Times New Roman" w:cs="Times New Roman"/>
+          <w:color w:val="595959" w:themeColor="text1" w:themeTint="A6"/>
+          <w:sz w:val="18"/>
+          <w:szCs w:val="18"/>
+        </w:rPr>
+      </w:pPr>
+    </w:p>
+    <w:p>
+      <w:pPr>
+        <w:rPr>
+          <w:rFonts w:ascii="Times New Roman" w:hAnsi="Times New Roman" w:cs="Times New Roman"/>
+          <w:color w:val="595959" w:themeColor="text1" w:themeTint="A6"/>
+          <w:sz w:val="18"/>
+          <w:szCs w:val="18"/>
+        </w:rPr>
+      </w:pPr>
+    </w:p>
     <w:sectPr>
       <w:headerReference w:type="default" r:id="rId74"/>
       <w:footerReference w:type="default" r:id="rId75"/>
@@ -37525,7 +37894,7 @@
   <w:abstractNum w:abstractNumId="25" w15:restartNumberingAfterBreak="0">
     <w:nsid w:val="23330F42"/>
     <w:multiLevelType w:val="multilevel"/>
-    <w:tmpl w:val="1B88ABA8"/>
+    <w:tmpl w:val="2D568EEC"/>
     <w:lvl w:ilvl="0">
       <w:start w:val="1"/>
       <w:numFmt w:val="bullet"/>
@@ -37542,20 +37911,16 @@
         <w:sz w:val="20"/>
       </w:rPr>
     </w:lvl>
-    <w:lvl w:ilvl="1" w:tentative="1">
-      <w:start w:val="1"/>
-      <w:numFmt w:val="bullet"/>
-      <w:lvlText w:val=""/>
-      <w:lvlJc w:val="left"/>
-      <w:pPr>
-        <w:tabs>
-          <w:tab w:val="num" w:pos="1440"/>
-        </w:tabs>
+    <w:lvl w:ilvl="1">
+      <w:start w:val="1"/>
+      <w:numFmt w:val="decimal"/>
+      <w:lvlText w:val="%2."/>
+      <w:lvlJc w:val="left"/>
+      <w:pPr>
         <w:ind w:left="1440" w:hanging="360"/>
       </w:pPr>
       <w:rPr>
-        <w:rFonts w:ascii="Symbol" w:hAnsi="Symbol" w:hint="default"/>
-        <w:sz w:val="20"/>
+        <w:rFonts w:hint="default"/>
       </w:rPr>
     </w:lvl>
     <w:lvl w:ilvl="2" w:tentative="1">
@@ -40838,6 +41203,155 @@
     </w:lvl>
   </w:abstractNum>
   <w:abstractNum w:abstractNumId="49" w15:restartNumberingAfterBreak="0">
+    <w:nsid w:val="4C33111E"/>
+    <w:multiLevelType w:val="multilevel"/>
+    <w:tmpl w:val="A1FE39D2"/>
+    <w:lvl w:ilvl="0">
+      <w:start w:val="1"/>
+      <w:numFmt w:val="bullet"/>
+      <w:lvlText w:val=""/>
+      <w:lvlJc w:val="left"/>
+      <w:pPr>
+        <w:tabs>
+          <w:tab w:val="num" w:pos="720"/>
+        </w:tabs>
+        <w:ind w:left="720" w:hanging="360"/>
+      </w:pPr>
+      <w:rPr>
+        <w:rFonts w:ascii="Symbol" w:hAnsi="Symbol" w:hint="default"/>
+        <w:sz w:val="20"/>
+      </w:rPr>
+    </w:lvl>
+    <w:lvl w:ilvl="1" w:tentative="1">
+      <w:start w:val="1"/>
+      <w:numFmt w:val="bullet"/>
+      <w:lvlText w:val="o"/>
+      <w:lvlJc w:val="left"/>
+      <w:pPr>
+        <w:tabs>
+          <w:tab w:val="num" w:pos="1440"/>
+        </w:tabs>
+        <w:ind w:left="1440" w:hanging="360"/>
+      </w:pPr>
+      <w:rPr>
+        <w:rFonts w:ascii="Courier New" w:hAnsi="Courier New" w:hint="default"/>
+        <w:sz w:val="20"/>
+      </w:rPr>
+    </w:lvl>
+    <w:lvl w:ilvl="2" w:tentative="1">
+      <w:start w:val="1"/>
+      <w:numFmt w:val="bullet"/>
+      <w:lvlText w:val=""/>
+      <w:lvlJc w:val="left"/>
+      <w:pPr>
+        <w:tabs>
+          <w:tab w:val="num" w:pos="2160"/>
+        </w:tabs>
+        <w:ind w:left="2160" w:hanging="360"/>
+      </w:pPr>
+      <w:rPr>
+        <w:rFonts w:ascii="Wingdings" w:hAnsi="Wingdings" w:hint="default"/>
+        <w:sz w:val="20"/>
+      </w:rPr>
+    </w:lvl>
+    <w:lvl w:ilvl="3" w:tentative="1">
+      <w:start w:val="1"/>
+      <w:numFmt w:val="bullet"/>
+      <w:lvlText w:val=""/>
+      <w:lvlJc w:val="left"/>
+      <w:pPr>
+        <w:tabs>
+          <w:tab w:val="num" w:pos="2880"/>
+        </w:tabs>
+        <w:ind w:left="2880" w:hanging="360"/>
+      </w:pPr>
+      <w:rPr>
+        <w:rFonts w:ascii="Wingdings" w:hAnsi="Wingdings" w:hint="default"/>
+        <w:sz w:val="20"/>
+      </w:rPr>
+    </w:lvl>
+    <w:lvl w:ilvl="4" w:tentative="1">
+      <w:start w:val="1"/>
+      <w:numFmt w:val="bullet"/>
+      <w:lvlText w:val=""/>
+      <w:lvlJc w:val="left"/>
+      <w:pPr>
+        <w:tabs>
+          <w:tab w:val="num" w:pos="3600"/>
+        </w:tabs>
+        <w:ind w:left="3600" w:hanging="360"/>
+      </w:pPr>
+      <w:rPr>
+        <w:rFonts w:ascii="Wingdings" w:hAnsi="Wingdings" w:hint="default"/>
+        <w:sz w:val="20"/>
+      </w:rPr>
+    </w:lvl>
+    <w:lvl w:ilvl="5" w:tentative="1">
+      <w:start w:val="1"/>
+      <w:numFmt w:val="bullet"/>
+      <w:lvlText w:val=""/>
+      <w:lvlJc w:val="left"/>
+      <w:pPr>
+        <w:tabs>
+          <w:tab w:val="num" w:pos="4320"/>
+        </w:tabs>
+        <w:ind w:left="4320" w:hanging="360"/>
+      </w:pPr>
+      <w:rPr>
+        <w:rFonts w:ascii="Wingdings" w:hAnsi="Wingdings" w:hint="default"/>
+        <w:sz w:val="20"/>
+      </w:rPr>
+    </w:lvl>
+    <w:lvl w:ilvl="6" w:tentative="1">
+      <w:start w:val="1"/>
+      <w:numFmt w:val="bullet"/>
+      <w:lvlText w:val=""/>
+      <w:lvlJc w:val="left"/>
+      <w:pPr>
+        <w:tabs>
+          <w:tab w:val="num" w:pos="5040"/>
+        </w:tabs>
+        <w:ind w:left="5040" w:hanging="360"/>
+      </w:pPr>
+      <w:rPr>
+        <w:rFonts w:ascii="Wingdings" w:hAnsi="Wingdings" w:hint="default"/>
+        <w:sz w:val="20"/>
+      </w:rPr>
+    </w:lvl>
+    <w:lvl w:ilvl="7" w:tentative="1">
+      <w:start w:val="1"/>
+      <w:numFmt w:val="bullet"/>
+      <w:lvlText w:val=""/>
+      <w:lvlJc w:val="left"/>
+      <w:pPr>
+        <w:tabs>
+          <w:tab w:val="num" w:pos="5760"/>
+        </w:tabs>
+        <w:ind w:left="5760" w:hanging="360"/>
+      </w:pPr>
+      <w:rPr>
+        <w:rFonts w:ascii="Wingdings" w:hAnsi="Wingdings" w:hint="default"/>
+        <w:sz w:val="20"/>
+      </w:rPr>
+    </w:lvl>
+    <w:lvl w:ilvl="8" w:tentative="1">
+      <w:start w:val="1"/>
+      <w:numFmt w:val="bullet"/>
+      <w:lvlText w:val=""/>
+      <w:lvlJc w:val="left"/>
+      <w:pPr>
+        <w:tabs>
+          <w:tab w:val="num" w:pos="6480"/>
+        </w:tabs>
+        <w:ind w:left="6480" w:hanging="360"/>
+      </w:pPr>
+      <w:rPr>
+        <w:rFonts w:ascii="Wingdings" w:hAnsi="Wingdings" w:hint="default"/>
+        <w:sz w:val="20"/>
+      </w:rPr>
+    </w:lvl>
+  </w:abstractNum>
+  <w:abstractNum w:abstractNumId="50" w15:restartNumberingAfterBreak="0">
     <w:nsid w:val="522B7E37"/>
     <w:multiLevelType w:val="multilevel"/>
     <w:tmpl w:val="D52C9F50"/>
@@ -40986,7 +41500,7 @@
       </w:rPr>
     </w:lvl>
   </w:abstractNum>
-  <w:abstractNum w:abstractNumId="50" w15:restartNumberingAfterBreak="0">
+  <w:abstractNum w:abstractNumId="51" w15:restartNumberingAfterBreak="0">
     <w:nsid w:val="5491163E"/>
     <w:multiLevelType w:val="multilevel"/>
     <w:tmpl w:val="1F008D98"/>
@@ -41099,7 +41613,7 @@
       </w:pPr>
     </w:lvl>
   </w:abstractNum>
-  <w:abstractNum w:abstractNumId="51" w15:restartNumberingAfterBreak="0">
+  <w:abstractNum w:abstractNumId="52" w15:restartNumberingAfterBreak="0">
     <w:nsid w:val="55C07B86"/>
     <w:multiLevelType w:val="multilevel"/>
     <w:tmpl w:val="21B0D25A"/>
@@ -41248,7 +41762,7 @@
       </w:rPr>
     </w:lvl>
   </w:abstractNum>
-  <w:abstractNum w:abstractNumId="52" w15:restartNumberingAfterBreak="0">
+  <w:abstractNum w:abstractNumId="53" w15:restartNumberingAfterBreak="0">
     <w:nsid w:val="55F426D8"/>
     <w:multiLevelType w:val="multilevel"/>
     <w:tmpl w:val="C54A629A"/>
@@ -41397,7 +41911,7 @@
       </w:rPr>
     </w:lvl>
   </w:abstractNum>
-  <w:abstractNum w:abstractNumId="53" w15:restartNumberingAfterBreak="0">
+  <w:abstractNum w:abstractNumId="54" w15:restartNumberingAfterBreak="0">
     <w:nsid w:val="563874AD"/>
     <w:multiLevelType w:val="hybridMultilevel"/>
     <w:tmpl w:val="1A9067B4"/>
@@ -41510,7 +42024,156 @@
       </w:rPr>
     </w:lvl>
   </w:abstractNum>
-  <w:abstractNum w:abstractNumId="54" w15:restartNumberingAfterBreak="0">
+  <w:abstractNum w:abstractNumId="55" w15:restartNumberingAfterBreak="0">
+    <w:nsid w:val="57AF0F76"/>
+    <w:multiLevelType w:val="multilevel"/>
+    <w:tmpl w:val="85580CC4"/>
+    <w:lvl w:ilvl="0">
+      <w:start w:val="1"/>
+      <w:numFmt w:val="bullet"/>
+      <w:lvlText w:val=""/>
+      <w:lvlJc w:val="left"/>
+      <w:pPr>
+        <w:tabs>
+          <w:tab w:val="num" w:pos="720"/>
+        </w:tabs>
+        <w:ind w:left="720" w:hanging="360"/>
+      </w:pPr>
+      <w:rPr>
+        <w:rFonts w:ascii="Symbol" w:hAnsi="Symbol" w:hint="default"/>
+        <w:sz w:val="20"/>
+      </w:rPr>
+    </w:lvl>
+    <w:lvl w:ilvl="1" w:tentative="1">
+      <w:start w:val="1"/>
+      <w:numFmt w:val="bullet"/>
+      <w:lvlText w:val="o"/>
+      <w:lvlJc w:val="left"/>
+      <w:pPr>
+        <w:tabs>
+          <w:tab w:val="num" w:pos="1440"/>
+        </w:tabs>
+        <w:ind w:left="1440" w:hanging="360"/>
+      </w:pPr>
+      <w:rPr>
+        <w:rFonts w:ascii="Courier New" w:hAnsi="Courier New" w:hint="default"/>
+        <w:sz w:val="20"/>
+      </w:rPr>
+    </w:lvl>
+    <w:lvl w:ilvl="2" w:tentative="1">
+      <w:start w:val="1"/>
+      <w:numFmt w:val="bullet"/>
+      <w:lvlText w:val=""/>
+      <w:lvlJc w:val="left"/>
+      <w:pPr>
+        <w:tabs>
+          <w:tab w:val="num" w:pos="2160"/>
+        </w:tabs>
+        <w:ind w:left="2160" w:hanging="360"/>
+      </w:pPr>
+      <w:rPr>
+        <w:rFonts w:ascii="Wingdings" w:hAnsi="Wingdings" w:hint="default"/>
+        <w:sz w:val="20"/>
+      </w:rPr>
+    </w:lvl>
+    <w:lvl w:ilvl="3" w:tentative="1">
+      <w:start w:val="1"/>
+      <w:numFmt w:val="bullet"/>
+      <w:lvlText w:val=""/>
+      <w:lvlJc w:val="left"/>
+      <w:pPr>
+        <w:tabs>
+          <w:tab w:val="num" w:pos="2880"/>
+        </w:tabs>
+        <w:ind w:left="2880" w:hanging="360"/>
+      </w:pPr>
+      <w:rPr>
+        <w:rFonts w:ascii="Wingdings" w:hAnsi="Wingdings" w:hint="default"/>
+        <w:sz w:val="20"/>
+      </w:rPr>
+    </w:lvl>
+    <w:lvl w:ilvl="4" w:tentative="1">
+      <w:start w:val="1"/>
+      <w:numFmt w:val="bullet"/>
+      <w:lvlText w:val=""/>
+      <w:lvlJc w:val="left"/>
+      <w:pPr>
+        <w:tabs>
+          <w:tab w:val="num" w:pos="3600"/>
+        </w:tabs>
+        <w:ind w:left="3600" w:hanging="360"/>
+      </w:pPr>
+      <w:rPr>
+        <w:rFonts w:ascii="Wingdings" w:hAnsi="Wingdings" w:hint="default"/>
+        <w:sz w:val="20"/>
+      </w:rPr>
+    </w:lvl>
+    <w:lvl w:ilvl="5" w:tentative="1">
+      <w:start w:val="1"/>
+      <w:numFmt w:val="bullet"/>
+      <w:lvlText w:val=""/>
+      <w:lvlJc w:val="left"/>
+      <w:pPr>
+        <w:tabs>
+          <w:tab w:val="num" w:pos="4320"/>
+        </w:tabs>
+        <w:ind w:left="4320" w:hanging="360"/>
+      </w:pPr>
+      <w:rPr>
+        <w:rFonts w:ascii="Wingdings" w:hAnsi="Wingdings" w:hint="default"/>
+        <w:sz w:val="20"/>
+      </w:rPr>
+    </w:lvl>
+    <w:lvl w:ilvl="6" w:tentative="1">
+      <w:start w:val="1"/>
+      <w:numFmt w:val="bullet"/>
+      <w:lvlText w:val=""/>
+      <w:lvlJc w:val="left"/>
+      <w:pPr>
+        <w:tabs>
+          <w:tab w:val="num" w:pos="5040"/>
+        </w:tabs>
+        <w:ind w:left="5040" w:hanging="360"/>
+      </w:pPr>
+      <w:rPr>
+        <w:rFonts w:ascii="Wingdings" w:hAnsi="Wingdings" w:hint="default"/>
+        <w:sz w:val="20"/>
+      </w:rPr>
+    </w:lvl>
+    <w:lvl w:ilvl="7" w:tentative="1">
+      <w:start w:val="1"/>
+      <w:numFmt w:val="bullet"/>
+      <w:lvlText w:val=""/>
+      <w:lvlJc w:val="left"/>
+      <w:pPr>
+        <w:tabs>
+          <w:tab w:val="num" w:pos="5760"/>
+        </w:tabs>
+        <w:ind w:left="5760" w:hanging="360"/>
+      </w:pPr>
+      <w:rPr>
+        <w:rFonts w:ascii="Wingdings" w:hAnsi="Wingdings" w:hint="default"/>
+        <w:sz w:val="20"/>
+      </w:rPr>
+    </w:lvl>
+    <w:lvl w:ilvl="8" w:tentative="1">
+      <w:start w:val="1"/>
+      <w:numFmt w:val="bullet"/>
+      <w:lvlText w:val=""/>
+      <w:lvlJc w:val="left"/>
+      <w:pPr>
+        <w:tabs>
+          <w:tab w:val="num" w:pos="6480"/>
+        </w:tabs>
+        <w:ind w:left="6480" w:hanging="360"/>
+      </w:pPr>
+      <w:rPr>
+        <w:rFonts w:ascii="Wingdings" w:hAnsi="Wingdings" w:hint="default"/>
+        <w:sz w:val="20"/>
+      </w:rPr>
+    </w:lvl>
+  </w:abstractNum>
+  <w:abstractNum w:abstractNumId="56" w15:restartNumberingAfterBreak="0">
     <w:nsid w:val="5B1F6F2E"/>
     <w:multiLevelType w:val="multilevel"/>
     <w:tmpl w:val="0906AA84"/>
@@ -41623,7 +42286,7 @@
       </w:pPr>
     </w:lvl>
   </w:abstractNum>
-  <w:abstractNum w:abstractNumId="55" w15:restartNumberingAfterBreak="0">
+  <w:abstractNum w:abstractNumId="57" w15:restartNumberingAfterBreak="0">
     <w:nsid w:val="5CBB445D"/>
     <w:multiLevelType w:val="multilevel"/>
     <w:tmpl w:val="D5B40914"/>
@@ -41772,7 +42435,7 @@
       </w:rPr>
     </w:lvl>
   </w:abstractNum>
-  <w:abstractNum w:abstractNumId="56" w15:restartNumberingAfterBreak="0">
+  <w:abstractNum w:abstractNumId="58" w15:restartNumberingAfterBreak="0">
     <w:nsid w:val="5EB21B9C"/>
     <w:multiLevelType w:val="multilevel"/>
     <w:tmpl w:val="DA1C1E8C"/>
@@ -41885,7 +42548,7 @@
       </w:pPr>
     </w:lvl>
   </w:abstractNum>
-  <w:abstractNum w:abstractNumId="57" w15:restartNumberingAfterBreak="0">
+  <w:abstractNum w:abstractNumId="59" w15:restartNumberingAfterBreak="0">
     <w:nsid w:val="60346E60"/>
     <w:multiLevelType w:val="multilevel"/>
     <w:tmpl w:val="615EE75A"/>
@@ -42034,7 +42697,7 @@
       </w:rPr>
     </w:lvl>
   </w:abstractNum>
-  <w:abstractNum w:abstractNumId="58" w15:restartNumberingAfterBreak="0">
+  <w:abstractNum w:abstractNumId="60" w15:restartNumberingAfterBreak="0">
     <w:nsid w:val="60526FE8"/>
     <w:multiLevelType w:val="multilevel"/>
     <w:tmpl w:val="B8482F36"/>
@@ -42147,7 +42810,7 @@
       </w:pPr>
     </w:lvl>
   </w:abstractNum>
-  <w:abstractNum w:abstractNumId="59" w15:restartNumberingAfterBreak="0">
+  <w:abstractNum w:abstractNumId="61" w15:restartNumberingAfterBreak="0">
     <w:nsid w:val="611C3BA3"/>
     <w:multiLevelType w:val="multilevel"/>
     <w:tmpl w:val="3362B75C"/>
@@ -42296,7 +42959,7 @@
       </w:rPr>
     </w:lvl>
   </w:abstractNum>
-  <w:abstractNum w:abstractNumId="60" w15:restartNumberingAfterBreak="0">
+  <w:abstractNum w:abstractNumId="62" w15:restartNumberingAfterBreak="0">
     <w:nsid w:val="61221F3B"/>
     <w:multiLevelType w:val="multilevel"/>
     <w:tmpl w:val="9372F35E"/>
@@ -42409,7 +43072,7 @@
       </w:pPr>
     </w:lvl>
   </w:abstractNum>
-  <w:abstractNum w:abstractNumId="61" w15:restartNumberingAfterBreak="0">
+  <w:abstractNum w:abstractNumId="63" w15:restartNumberingAfterBreak="0">
     <w:nsid w:val="61635166"/>
     <w:multiLevelType w:val="multilevel"/>
     <w:tmpl w:val="194A916E"/>
@@ -42522,7 +43185,7 @@
       </w:pPr>
     </w:lvl>
   </w:abstractNum>
-  <w:abstractNum w:abstractNumId="62" w15:restartNumberingAfterBreak="0">
+  <w:abstractNum w:abstractNumId="64" w15:restartNumberingAfterBreak="0">
     <w:nsid w:val="616C446A"/>
     <w:multiLevelType w:val="multilevel"/>
     <w:tmpl w:val="B4F6C7B6"/>
@@ -42635,7 +43298,7 @@
       </w:pPr>
     </w:lvl>
   </w:abstractNum>
-  <w:abstractNum w:abstractNumId="63" w15:restartNumberingAfterBreak="0">
+  <w:abstractNum w:abstractNumId="65" w15:restartNumberingAfterBreak="0">
     <w:nsid w:val="61C6356F"/>
     <w:multiLevelType w:val="multilevel"/>
     <w:tmpl w:val="2690EA9C"/>
@@ -42784,7 +43447,7 @@
       </w:rPr>
     </w:lvl>
   </w:abstractNum>
-  <w:abstractNum w:abstractNumId="64" w15:restartNumberingAfterBreak="0">
+  <w:abstractNum w:abstractNumId="66" w15:restartNumberingAfterBreak="0">
     <w:nsid w:val="62D95EB3"/>
     <w:multiLevelType w:val="hybridMultilevel"/>
     <w:tmpl w:val="8FC623BE"/>
@@ -42897,7 +43560,7 @@
       </w:rPr>
     </w:lvl>
   </w:abstractNum>
-  <w:abstractNum w:abstractNumId="65" w15:restartNumberingAfterBreak="0">
+  <w:abstractNum w:abstractNumId="67" w15:restartNumberingAfterBreak="0">
     <w:nsid w:val="68E86A8C"/>
     <w:multiLevelType w:val="hybridMultilevel"/>
     <w:tmpl w:val="76287898"/>
@@ -42983,7 +43646,156 @@
       </w:pPr>
     </w:lvl>
   </w:abstractNum>
-  <w:abstractNum w:abstractNumId="66" w15:restartNumberingAfterBreak="0">
+  <w:abstractNum w:abstractNumId="68" w15:restartNumberingAfterBreak="0">
+    <w:nsid w:val="692B5ABA"/>
+    <w:multiLevelType w:val="multilevel"/>
+    <w:tmpl w:val="B52CEBD4"/>
+    <w:lvl w:ilvl="0">
+      <w:start w:val="1"/>
+      <w:numFmt w:val="bullet"/>
+      <w:lvlText w:val=""/>
+      <w:lvlJc w:val="left"/>
+      <w:pPr>
+        <w:tabs>
+          <w:tab w:val="num" w:pos="720"/>
+        </w:tabs>
+        <w:ind w:left="720" w:hanging="360"/>
+      </w:pPr>
+      <w:rPr>
+        <w:rFonts w:ascii="Symbol" w:hAnsi="Symbol" w:hint="default"/>
+        <w:sz w:val="20"/>
+      </w:rPr>
+    </w:lvl>
+    <w:lvl w:ilvl="1" w:tentative="1">
+      <w:start w:val="1"/>
+      <w:numFmt w:val="bullet"/>
+      <w:lvlText w:val="o"/>
+      <w:lvlJc w:val="left"/>
+      <w:pPr>
+        <w:tabs>
+          <w:tab w:val="num" w:pos="1440"/>
+        </w:tabs>
+        <w:ind w:left="1440" w:hanging="360"/>
+      </w:pPr>
+      <w:rPr>
+        <w:rFonts w:ascii="Courier New" w:hAnsi="Courier New" w:hint="default"/>
+        <w:sz w:val="20"/>
+      </w:rPr>
+    </w:lvl>
+    <w:lvl w:ilvl="2" w:tentative="1">
+      <w:start w:val="1"/>
+      <w:numFmt w:val="bullet"/>
+      <w:lvlText w:val=""/>
+      <w:lvlJc w:val="left"/>
+      <w:pPr>
+        <w:tabs>
+          <w:tab w:val="num" w:pos="2160"/>
+        </w:tabs>
+        <w:ind w:left="2160" w:hanging="360"/>
+      </w:pPr>
+      <w:rPr>
+        <w:rFonts w:ascii="Wingdings" w:hAnsi="Wingdings" w:hint="default"/>
+        <w:sz w:val="20"/>
+      </w:rPr>
+    </w:lvl>
+    <w:lvl w:ilvl="3" w:tentative="1">
+      <w:start w:val="1"/>
+      <w:numFmt w:val="bullet"/>
+      <w:lvlText w:val=""/>
+      <w:lvlJc w:val="left"/>
+      <w:pPr>
+        <w:tabs>
+          <w:tab w:val="num" w:pos="2880"/>
+        </w:tabs>
+        <w:ind w:left="2880" w:hanging="360"/>
+      </w:pPr>
+      <w:rPr>
+        <w:rFonts w:ascii="Wingdings" w:hAnsi="Wingdings" w:hint="default"/>
+        <w:sz w:val="20"/>
+      </w:rPr>
+    </w:lvl>
+    <w:lvl w:ilvl="4" w:tentative="1">
+      <w:start w:val="1"/>
+      <w:numFmt w:val="bullet"/>
+      <w:lvlText w:val=""/>
+      <w:lvlJc w:val="left"/>
+      <w:pPr>
+        <w:tabs>
+          <w:tab w:val="num" w:pos="3600"/>
+        </w:tabs>
+        <w:ind w:left="3600" w:hanging="360"/>
+      </w:pPr>
+      <w:rPr>
+        <w:rFonts w:ascii="Wingdings" w:hAnsi="Wingdings" w:hint="default"/>
+        <w:sz w:val="20"/>
+      </w:rPr>
+    </w:lvl>
+    <w:lvl w:ilvl="5" w:tentative="1">
+      <w:start w:val="1"/>
+      <w:numFmt w:val="bullet"/>
+      <w:lvlText w:val=""/>
+      <w:lvlJc w:val="left"/>
+      <w:pPr>
+        <w:tabs>
+          <w:tab w:val="num" w:pos="4320"/>
+        </w:tabs>
+        <w:ind w:left="4320" w:hanging="360"/>
+      </w:pPr>
+      <w:rPr>
+        <w:rFonts w:ascii="Wingdings" w:hAnsi="Wingdings" w:hint="default"/>
+        <w:sz w:val="20"/>
+      </w:rPr>
+    </w:lvl>
+    <w:lvl w:ilvl="6" w:tentative="1">
+      <w:start w:val="1"/>
+      <w:numFmt w:val="bullet"/>
+      <w:lvlText w:val=""/>
+      <w:lvlJc w:val="left"/>
+      <w:pPr>
+        <w:tabs>
+          <w:tab w:val="num" w:pos="5040"/>
+        </w:tabs>
+        <w:ind w:left="5040" w:hanging="360"/>
+      </w:pPr>
+      <w:rPr>
+        <w:rFonts w:ascii="Wingdings" w:hAnsi="Wingdings" w:hint="default"/>
+        <w:sz w:val="20"/>
+      </w:rPr>
+    </w:lvl>
+    <w:lvl w:ilvl="7" w:tentative="1">
+      <w:start w:val="1"/>
+      <w:numFmt w:val="bullet"/>
+      <w:lvlText w:val=""/>
+      <w:lvlJc w:val="left"/>
+      <w:pPr>
+        <w:tabs>
+          <w:tab w:val="num" w:pos="5760"/>
+        </w:tabs>
+        <w:ind w:left="5760" w:hanging="360"/>
+      </w:pPr>
+      <w:rPr>
+        <w:rFonts w:ascii="Wingdings" w:hAnsi="Wingdings" w:hint="default"/>
+        <w:sz w:val="20"/>
+      </w:rPr>
+    </w:lvl>
+    <w:lvl w:ilvl="8" w:tentative="1">
+      <w:start w:val="1"/>
+      <w:numFmt w:val="bullet"/>
+      <w:lvlText w:val=""/>
+      <w:lvlJc w:val="left"/>
+      <w:pPr>
+        <w:tabs>
+          <w:tab w:val="num" w:pos="6480"/>
+        </w:tabs>
+        <w:ind w:left="6480" w:hanging="360"/>
+      </w:pPr>
+      <w:rPr>
+        <w:rFonts w:ascii="Wingdings" w:hAnsi="Wingdings" w:hint="default"/>
+        <w:sz w:val="20"/>
+      </w:rPr>
+    </w:lvl>
+  </w:abstractNum>
+  <w:abstractNum w:abstractNumId="69" w15:restartNumberingAfterBreak="0">
     <w:nsid w:val="6AC020B7"/>
     <w:multiLevelType w:val="multilevel"/>
     <w:tmpl w:val="6D9441F4"/>
@@ -43132,7 +43944,7 @@
       </w:rPr>
     </w:lvl>
   </w:abstractNum>
-  <w:abstractNum w:abstractNumId="67" w15:restartNumberingAfterBreak="0">
+  <w:abstractNum w:abstractNumId="70" w15:restartNumberingAfterBreak="0">
     <w:nsid w:val="71011011"/>
     <w:multiLevelType w:val="multilevel"/>
     <w:tmpl w:val="289A1548"/>
@@ -43281,7 +44093,7 @@
       </w:rPr>
     </w:lvl>
   </w:abstractNum>
-  <w:abstractNum w:abstractNumId="68" w15:restartNumberingAfterBreak="0">
+  <w:abstractNum w:abstractNumId="71" w15:restartNumberingAfterBreak="0">
     <w:nsid w:val="721C6561"/>
     <w:multiLevelType w:val="hybridMultilevel"/>
     <w:tmpl w:val="ECD677D4"/>
@@ -43394,7 +44206,7 @@
       </w:rPr>
     </w:lvl>
   </w:abstractNum>
-  <w:abstractNum w:abstractNumId="69" w15:restartNumberingAfterBreak="0">
+  <w:abstractNum w:abstractNumId="72" w15:restartNumberingAfterBreak="0">
     <w:nsid w:val="73F9785C"/>
     <w:multiLevelType w:val="multilevel"/>
     <w:tmpl w:val="67522E8C"/>
@@ -43543,7 +44355,7 @@
       </w:rPr>
     </w:lvl>
   </w:abstractNum>
-  <w:abstractNum w:abstractNumId="70" w15:restartNumberingAfterBreak="0">
+  <w:abstractNum w:abstractNumId="73" w15:restartNumberingAfterBreak="0">
     <w:nsid w:val="746A4C4A"/>
     <w:multiLevelType w:val="multilevel"/>
     <w:tmpl w:val="10E0C05E"/>
@@ -43692,7 +44504,7 @@
       </w:rPr>
     </w:lvl>
   </w:abstractNum>
-  <w:abstractNum w:abstractNumId="71" w15:restartNumberingAfterBreak="0">
+  <w:abstractNum w:abstractNumId="74" w15:restartNumberingAfterBreak="0">
     <w:nsid w:val="74D607F9"/>
     <w:multiLevelType w:val="multilevel"/>
     <w:tmpl w:val="F4CCFE30"/>
@@ -43805,7 +44617,7 @@
       </w:pPr>
     </w:lvl>
   </w:abstractNum>
-  <w:abstractNum w:abstractNumId="72" w15:restartNumberingAfterBreak="0">
+  <w:abstractNum w:abstractNumId="75" w15:restartNumberingAfterBreak="0">
     <w:nsid w:val="79306BAB"/>
     <w:multiLevelType w:val="multilevel"/>
     <w:tmpl w:val="778EECBA"/>
@@ -43918,7 +44730,7 @@
       </w:pPr>
     </w:lvl>
   </w:abstractNum>
-  <w:abstractNum w:abstractNumId="73" w15:restartNumberingAfterBreak="0">
+  <w:abstractNum w:abstractNumId="76" w15:restartNumberingAfterBreak="0">
     <w:nsid w:val="7A52735D"/>
     <w:multiLevelType w:val="multilevel"/>
     <w:tmpl w:val="FD2069AA"/>
@@ -44067,7 +44879,7 @@
       </w:rPr>
     </w:lvl>
   </w:abstractNum>
-  <w:abstractNum w:abstractNumId="74" w15:restartNumberingAfterBreak="0">
+  <w:abstractNum w:abstractNumId="77" w15:restartNumberingAfterBreak="0">
     <w:nsid w:val="7F1B7409"/>
     <w:multiLevelType w:val="multilevel"/>
     <w:tmpl w:val="812289E2"/>
@@ -44216,7 +45028,7 @@
       </w:rPr>
     </w:lvl>
   </w:abstractNum>
-  <w:abstractNum w:abstractNumId="75" w15:restartNumberingAfterBreak="0">
+  <w:abstractNum w:abstractNumId="78" w15:restartNumberingAfterBreak="0">
     <w:nsid w:val="7F604749"/>
     <w:multiLevelType w:val="multilevel"/>
     <w:tmpl w:val="F6C69AC2"/>
@@ -44372,19 +45184,19 @@
     <w:abstractNumId w:val="20"/>
   </w:num>
   <w:num w:numId="3" w16cid:durableId="462119961">
-    <w:abstractNumId w:val="53"/>
+    <w:abstractNumId w:val="54"/>
   </w:num>
   <w:num w:numId="4" w16cid:durableId="1954094783">
     <w:abstractNumId w:val="35"/>
   </w:num>
   <w:num w:numId="5" w16cid:durableId="882136229">
-    <w:abstractNumId w:val="70"/>
+    <w:abstractNumId w:val="73"/>
   </w:num>
   <w:num w:numId="6" w16cid:durableId="1025794466">
     <w:abstractNumId w:val="1"/>
   </w:num>
   <w:num w:numId="7" w16cid:durableId="651449495">
-    <w:abstractNumId w:val="65"/>
+    <w:abstractNumId w:val="67"/>
   </w:num>
   <w:num w:numId="8" w16cid:durableId="1139345737">
     <w:abstractNumId w:val="10"/>
@@ -44396,13 +45208,13 @@
     <w:abstractNumId w:val="29"/>
   </w:num>
   <w:num w:numId="11" w16cid:durableId="10494282">
-    <w:abstractNumId w:val="63"/>
+    <w:abstractNumId w:val="65"/>
   </w:num>
   <w:num w:numId="12" w16cid:durableId="1177386414">
-    <w:abstractNumId w:val="75"/>
+    <w:abstractNumId w:val="78"/>
   </w:num>
   <w:num w:numId="13" w16cid:durableId="1633973990">
-    <w:abstractNumId w:val="61"/>
+    <w:abstractNumId w:val="63"/>
   </w:num>
   <w:num w:numId="14" w16cid:durableId="223836851">
     <w:abstractNumId w:val="3"/>
@@ -44411,7 +45223,7 @@
     <w:abstractNumId w:val="43"/>
   </w:num>
   <w:num w:numId="16" w16cid:durableId="104740181">
-    <w:abstractNumId w:val="71"/>
+    <w:abstractNumId w:val="74"/>
   </w:num>
   <w:num w:numId="17" w16cid:durableId="1620184776">
     <w:abstractNumId w:val="33"/>
@@ -44435,16 +45247,16 @@
     <w:abstractNumId w:val="32"/>
   </w:num>
   <w:num w:numId="24" w16cid:durableId="1103771391">
-    <w:abstractNumId w:val="58"/>
+    <w:abstractNumId w:val="60"/>
   </w:num>
   <w:num w:numId="25" w16cid:durableId="31465451">
-    <w:abstractNumId w:val="73"/>
+    <w:abstractNumId w:val="76"/>
   </w:num>
   <w:num w:numId="26" w16cid:durableId="494348183">
     <w:abstractNumId w:val="31"/>
   </w:num>
   <w:num w:numId="27" w16cid:durableId="356124465">
-    <w:abstractNumId w:val="74"/>
+    <w:abstractNumId w:val="77"/>
   </w:num>
   <w:num w:numId="28" w16cid:durableId="438139090">
     <w:abstractNumId w:val="18"/>
@@ -44462,13 +45274,13 @@
     <w:abstractNumId w:val="46"/>
   </w:num>
   <w:num w:numId="33" w16cid:durableId="708385342">
-    <w:abstractNumId w:val="72"/>
+    <w:abstractNumId w:val="75"/>
   </w:num>
   <w:num w:numId="34" w16cid:durableId="470095744">
-    <w:abstractNumId w:val="54"/>
+    <w:abstractNumId w:val="56"/>
   </w:num>
   <w:num w:numId="35" w16cid:durableId="2053915843">
-    <w:abstractNumId w:val="60"/>
+    <w:abstractNumId w:val="62"/>
   </w:num>
   <w:num w:numId="36" w16cid:durableId="2125225438">
     <w:abstractNumId w:val="47"/>
@@ -44489,22 +45301,22 @@
     <w:abstractNumId w:val="23"/>
   </w:num>
   <w:num w:numId="42" w16cid:durableId="1743141462">
-    <w:abstractNumId w:val="59"/>
+    <w:abstractNumId w:val="61"/>
   </w:num>
   <w:num w:numId="43" w16cid:durableId="1445491838">
-    <w:abstractNumId w:val="66"/>
+    <w:abstractNumId w:val="69"/>
   </w:num>
   <w:num w:numId="44" w16cid:durableId="1236431717">
     <w:abstractNumId w:val="30"/>
   </w:num>
   <w:num w:numId="45" w16cid:durableId="912274187">
-    <w:abstractNumId w:val="50"/>
+    <w:abstractNumId w:val="51"/>
   </w:num>
   <w:num w:numId="46" w16cid:durableId="1278945118">
     <w:abstractNumId w:val="37"/>
   </w:num>
   <w:num w:numId="47" w16cid:durableId="2007316713">
-    <w:abstractNumId w:val="67"/>
+    <w:abstractNumId w:val="70"/>
   </w:num>
   <w:num w:numId="48" w16cid:durableId="1414624504">
     <w:abstractNumId w:val="24"/>
@@ -44513,7 +45325,7 @@
     <w:abstractNumId w:val="19"/>
   </w:num>
   <w:num w:numId="50" w16cid:durableId="427190722">
-    <w:abstractNumId w:val="56"/>
+    <w:abstractNumId w:val="58"/>
   </w:num>
   <w:num w:numId="51" w16cid:durableId="581568260">
     <w:abstractNumId w:val="16"/>
@@ -44525,13 +45337,13 @@
     <w:abstractNumId w:val="21"/>
   </w:num>
   <w:num w:numId="54" w16cid:durableId="259334031">
-    <w:abstractNumId w:val="69"/>
+    <w:abstractNumId w:val="72"/>
   </w:num>
   <w:num w:numId="55" w16cid:durableId="951471421">
-    <w:abstractNumId w:val="51"/>
+    <w:abstractNumId w:val="52"/>
   </w:num>
   <w:num w:numId="56" w16cid:durableId="569003322">
-    <w:abstractNumId w:val="49"/>
+    <w:abstractNumId w:val="50"/>
   </w:num>
   <w:num w:numId="57" w16cid:durableId="1206675072">
     <w:abstractNumId w:val="12"/>
@@ -44543,7 +45355,7 @@
     <w:abstractNumId w:val="7"/>
   </w:num>
   <w:num w:numId="60" w16cid:durableId="215556297">
-    <w:abstractNumId w:val="57"/>
+    <w:abstractNumId w:val="59"/>
   </w:num>
   <w:num w:numId="61" w16cid:durableId="985084932">
     <w:abstractNumId w:val="38"/>
@@ -44561,13 +45373,13 @@
     <w:abstractNumId w:val="9"/>
   </w:num>
   <w:num w:numId="66" w16cid:durableId="1595941427">
-    <w:abstractNumId w:val="55"/>
+    <w:abstractNumId w:val="57"/>
   </w:num>
   <w:num w:numId="67" w16cid:durableId="1644001138">
     <w:abstractNumId w:val="14"/>
   </w:num>
   <w:num w:numId="68" w16cid:durableId="545222999">
-    <w:abstractNumId w:val="68"/>
+    <w:abstractNumId w:val="71"/>
   </w:num>
   <w:num w:numId="69" w16cid:durableId="25834519">
     <w:abstractNumId w:val="4"/>
@@ -44579,7 +45391,7 @@
     <w:abstractNumId w:val="34"/>
   </w:num>
   <w:num w:numId="72" w16cid:durableId="613681810">
-    <w:abstractNumId w:val="52"/>
+    <w:abstractNumId w:val="53"/>
   </w:num>
   <w:num w:numId="73" w16cid:durableId="260844048">
     <w:abstractNumId w:val="26"/>
@@ -44588,10 +45400,19 @@
     <w:abstractNumId w:val="25"/>
   </w:num>
   <w:num w:numId="75" w16cid:durableId="26149008">
-    <w:abstractNumId w:val="62"/>
+    <w:abstractNumId w:val="64"/>
   </w:num>
   <w:num w:numId="76" w16cid:durableId="519777124">
-    <w:abstractNumId w:val="64"/>
+    <w:abstractNumId w:val="66"/>
+  </w:num>
+  <w:num w:numId="77" w16cid:durableId="548537405">
+    <w:abstractNumId w:val="55"/>
+  </w:num>
+  <w:num w:numId="78" w16cid:durableId="1276716416">
+    <w:abstractNumId w:val="49"/>
+  </w:num>
+  <w:num w:numId="79" w16cid:durableId="1875456340">
+    <w:abstractNumId w:val="68"/>
   </w:num>
   <w:numIdMacAtCleanup w:val="74"/>
 </w:numbering>
@@ -45106,7 +45927,6 @@
   <w:style w:type="character" w:default="1" w:styleId="a0">
     <w:name w:val="Default Paragraph Font"/>
     <w:uiPriority w:val="1"/>
-    <w:semiHidden/>
     <w:unhideWhenUsed/>
   </w:style>
   <w:style w:type="table" w:default="1" w:styleId="a1">
@@ -45493,6 +46313,19 @@
       <w:szCs w:val="20"/>
     </w:rPr>
   </w:style>
+  <w:style w:type="character" w:styleId="HTML1">
+    <w:name w:val="HTML Code"/>
+    <w:basedOn w:val="a0"/>
+    <w:uiPriority w:val="99"/>
+    <w:semiHidden/>
+    <w:unhideWhenUsed/>
+    <w:rsid w:val="00FC6D1C"/>
+    <w:rPr>
+      <w:rFonts w:ascii="Courier New" w:eastAsia="Times New Roman" w:hAnsi="Courier New" w:cs="Courier New"/>
+      <w:sz w:val="20"/>
+      <w:szCs w:val="20"/>
+    </w:rPr>
+  </w:style>
 </w:styles>
 </file>
 

</xml_diff>

<commit_message>
15.09.26            List changes: Character counting
</commit_message>
<xml_diff>
--- a/AQA/Теория/📝 aqa подготовка.docx
+++ b/AQA/Теория/📝 aqa подготовка.docx
@@ -755,16 +755,87 @@
           <w:bCs/>
           <w:color w:val="595959" w:themeColor="text1" w:themeTint="A6"/>
           <w:u w:val="single"/>
-        </w:rPr>
-      </w:pPr>
-      <w:r>
+          <w:lang w:val="en-US"/>
+        </w:rPr>
+      </w:pPr>
+    </w:p>
+    <w:p>
+      <w:pPr>
+        <w:spacing w:after="0"/>
+        <w:jc w:val="center"/>
         <w:rPr>
           <w:rFonts w:ascii="Times New Roman" w:hAnsi="Times New Roman" w:cs="Times New Roman"/>
           <w:b/>
           <w:bCs/>
           <w:color w:val="595959" w:themeColor="text1" w:themeTint="A6"/>
           <w:u w:val="single"/>
-        </w:rPr>
+          <w:lang w:val="en-US"/>
+        </w:rPr>
+      </w:pPr>
+    </w:p>
+    <w:p>
+      <w:pPr>
+        <w:spacing w:after="0"/>
+        <w:jc w:val="center"/>
+        <w:rPr>
+          <w:rFonts w:ascii="Times New Roman" w:hAnsi="Times New Roman" w:cs="Times New Roman"/>
+          <w:b/>
+          <w:bCs/>
+          <w:color w:val="595959" w:themeColor="text1" w:themeTint="A6"/>
+          <w:u w:val="single"/>
+          <w:lang w:val="en-US"/>
+        </w:rPr>
+      </w:pPr>
+    </w:p>
+    <w:p>
+      <w:pPr>
+        <w:spacing w:after="0"/>
+        <w:jc w:val="center"/>
+        <w:rPr>
+          <w:rFonts w:ascii="Times New Roman" w:hAnsi="Times New Roman" w:cs="Times New Roman"/>
+          <w:b/>
+          <w:bCs/>
+          <w:color w:val="595959" w:themeColor="text1" w:themeTint="A6"/>
+          <w:u w:val="single"/>
+          <w:lang w:val="en-US"/>
+        </w:rPr>
+      </w:pPr>
+    </w:p>
+    <w:p>
+      <w:pPr>
+        <w:spacing w:after="0"/>
+        <w:jc w:val="center"/>
+        <w:rPr>
+          <w:rFonts w:ascii="Times New Roman" w:hAnsi="Times New Roman" w:cs="Times New Roman"/>
+          <w:b/>
+          <w:bCs/>
+          <w:color w:val="595959" w:themeColor="text1" w:themeTint="A6"/>
+          <w:u w:val="single"/>
+          <w:lang w:val="en-US"/>
+        </w:rPr>
+      </w:pPr>
+    </w:p>
+    <w:p>
+      <w:pPr>
+        <w:spacing w:after="0"/>
+        <w:jc w:val="center"/>
+        <w:rPr>
+          <w:rFonts w:ascii="Times New Roman" w:hAnsi="Times New Roman" w:cs="Times New Roman"/>
+          <w:b/>
+          <w:bCs/>
+          <w:color w:val="595959" w:themeColor="text1" w:themeTint="A6"/>
+          <w:u w:val="single"/>
+        </w:rPr>
+      </w:pPr>
+      <w:r>
+        <w:rPr>
+          <w:rFonts w:ascii="Times New Roman" w:hAnsi="Times New Roman" w:cs="Times New Roman"/>
+          <w:b/>
+          <w:bCs/>
+          <w:color w:val="595959" w:themeColor="text1" w:themeTint="A6"/>
+          <w:u w:val="single"/>
+        </w:rPr>
+        <w:lastRenderedPageBreak/>
         <w:t>СОДЕРЖАНИЕ</w:t>
       </w:r>
     </w:p>
@@ -803,7 +874,6 @@
           <w:sz w:val="22"/>
           <w:szCs w:val="22"/>
         </w:rPr>
-        <w:lastRenderedPageBreak/>
         <w:t>📝</w:t>
       </w:r>
       <w:r>
@@ -1250,7 +1320,27 @@
             <w:sz w:val="20"/>
             <w:szCs w:val="20"/>
           </w:rPr>
-          <w:t>Структуры данных</w:t>
+          <w:t>Структуры д</w:t>
+        </w:r>
+        <w:r>
+          <w:rPr>
+            <w:rStyle w:val="a3"/>
+            <w:rFonts w:ascii="Times New Roman" w:hAnsi="Times New Roman" w:cs="Times New Roman"/>
+            <w:color w:val="595959" w:themeColor="text1" w:themeTint="A6"/>
+            <w:sz w:val="20"/>
+            <w:szCs w:val="20"/>
+          </w:rPr>
+          <w:t>а</w:t>
+        </w:r>
+        <w:r>
+          <w:rPr>
+            <w:rStyle w:val="a3"/>
+            <w:rFonts w:ascii="Times New Roman" w:hAnsi="Times New Roman" w:cs="Times New Roman"/>
+            <w:color w:val="595959" w:themeColor="text1" w:themeTint="A6"/>
+            <w:sz w:val="20"/>
+            <w:szCs w:val="20"/>
+          </w:rPr>
+          <w:t>нных</w:t>
         </w:r>
       </w:hyperlink>
     </w:p>
@@ -1570,7 +1660,27 @@
             <w:sz w:val="20"/>
             <w:szCs w:val="20"/>
           </w:rPr>
-          <w:t xml:space="preserve"> Словари (dict)</w:t>
+          <w:t xml:space="preserve"> Словари (</w:t>
+        </w:r>
+        <w:r>
+          <w:rPr>
+            <w:rStyle w:val="a3"/>
+            <w:rFonts w:ascii="Times New Roman" w:hAnsi="Times New Roman" w:cs="Times New Roman"/>
+            <w:color w:val="595959" w:themeColor="text1" w:themeTint="A6"/>
+            <w:sz w:val="20"/>
+            <w:szCs w:val="20"/>
+          </w:rPr>
+          <w:t>d</w:t>
+        </w:r>
+        <w:r>
+          <w:rPr>
+            <w:rStyle w:val="a3"/>
+            <w:rFonts w:ascii="Times New Roman" w:hAnsi="Times New Roman" w:cs="Times New Roman"/>
+            <w:color w:val="595959" w:themeColor="text1" w:themeTint="A6"/>
+            <w:sz w:val="20"/>
+            <w:szCs w:val="20"/>
+          </w:rPr>
+          <w:t>ict)</w:t>
         </w:r>
       </w:hyperlink>
     </w:p>
@@ -1903,6 +2013,67 @@
           <w:b/>
           <w:bCs/>
           <w:color w:val="595959" w:themeColor="text1" w:themeTint="A6"/>
+          <w:lang w:val="en-US"/>
+        </w:rPr>
+      </w:pPr>
+      <w:r>
+        <w:rPr>
+          <w:rFonts w:ascii="Times New Roman" w:hAnsi="Times New Roman" w:cs="Times New Roman"/>
+          <w:b/>
+          <w:bCs/>
+          <w:color w:val="595959" w:themeColor="text1" w:themeTint="A6"/>
+        </w:rPr>
+        <w:t xml:space="preserve"> </w:t>
+      </w:r>
+    </w:p>
+    <w:p>
+      <w:pPr>
+        <w:spacing w:after="0"/>
+        <w:jc w:val="center"/>
+        <w:rPr>
+          <w:rFonts w:ascii="Times New Roman" w:hAnsi="Times New Roman" w:cs="Times New Roman"/>
+          <w:b/>
+          <w:bCs/>
+          <w:color w:val="595959" w:themeColor="text1" w:themeTint="A6"/>
+          <w:lang w:val="en-US"/>
+        </w:rPr>
+      </w:pPr>
+    </w:p>
+    <w:p>
+      <w:pPr>
+        <w:spacing w:after="0"/>
+        <w:jc w:val="center"/>
+        <w:rPr>
+          <w:rFonts w:ascii="Times New Roman" w:hAnsi="Times New Roman" w:cs="Times New Roman"/>
+          <w:b/>
+          <w:bCs/>
+          <w:color w:val="595959" w:themeColor="text1" w:themeTint="A6"/>
+          <w:lang w:val="en-US"/>
+        </w:rPr>
+      </w:pPr>
+    </w:p>
+    <w:p>
+      <w:pPr>
+        <w:spacing w:after="0"/>
+        <w:jc w:val="center"/>
+        <w:rPr>
+          <w:rFonts w:ascii="Times New Roman" w:hAnsi="Times New Roman" w:cs="Times New Roman"/>
+          <w:b/>
+          <w:bCs/>
+          <w:color w:val="595959" w:themeColor="text1" w:themeTint="A6"/>
+          <w:lang w:val="en-US"/>
+        </w:rPr>
+      </w:pPr>
+    </w:p>
+    <w:p>
+      <w:pPr>
+        <w:spacing w:after="0"/>
+        <w:jc w:val="center"/>
+        <w:rPr>
+          <w:rFonts w:ascii="Times New Roman" w:hAnsi="Times New Roman" w:cs="Times New Roman"/>
+          <w:b/>
+          <w:bCs/>
+          <w:color w:val="595959" w:themeColor="text1" w:themeTint="A6"/>
           <w14:shadow w14:blurRad="114300" w14:dist="0" w14:dir="0" w14:sx="0" w14:sy="0" w14:kx="0" w14:ky="0" w14:algn="none">
             <w14:srgbClr w14:val="000000"/>
           </w14:shadow>
@@ -1915,15 +2086,7 @@
           <w:bCs/>
           <w:color w:val="595959" w:themeColor="text1" w:themeTint="A6"/>
         </w:rPr>
-        <w:t xml:space="preserve"> </w:t>
-      </w:r>
-      <w:r>
-        <w:rPr>
-          <w:rFonts w:ascii="Times New Roman" w:hAnsi="Times New Roman" w:cs="Times New Roman"/>
-          <w:b/>
-          <w:bCs/>
-          <w:color w:val="595959" w:themeColor="text1" w:themeTint="A6"/>
-        </w:rPr>
+        <w:lastRenderedPageBreak/>
         <w:t>ТЕМА</w:t>
       </w:r>
       <w:r>
@@ -1959,7 +2122,6 @@
           <w:sz w:val="20"/>
           <w:szCs w:val="20"/>
         </w:rPr>
-        <w:lastRenderedPageBreak/>
         <w:t>Общие компоненты ПК и их взаимодействи</w:t>
       </w:r>
       <w:r>
@@ -3017,18 +3179,24 @@
       <w:pPr>
         <w:jc w:val="center"/>
         <w:rPr>
+          <w:rFonts w:ascii="Century Schoolbook" w:hAnsi="Century Schoolbook"/>
           <w:b/>
           <w:bCs/>
           <w:i/>
           <w:iCs/>
           <w:color w:val="595959" w:themeColor="text1" w:themeTint="A6"/>
-        </w:rPr>
-      </w:pPr>
-      <w:r>
-        <w:rPr>
-          <w:b/>
-          <w:bCs/>
-          <w:color w:val="595959" w:themeColor="text1" w:themeTint="A6"/>
+          <w:sz w:val="18"/>
+          <w:szCs w:val="18"/>
+        </w:rPr>
+      </w:pPr>
+      <w:r>
+        <w:rPr>
+          <w:rFonts w:ascii="Century Schoolbook" w:hAnsi="Century Schoolbook"/>
+          <w:b/>
+          <w:bCs/>
+          <w:color w:val="595959" w:themeColor="text1" w:themeTint="A6"/>
+          <w:sz w:val="18"/>
+          <w:szCs w:val="18"/>
         </w:rPr>
         <w:t>Как компоненты ПК взаимодействуют</w:t>
       </w:r>
@@ -3036,14 +3204,14 @@
     <w:p>
       <w:pPr>
         <w:rPr>
-          <w:rFonts w:ascii="Times New Roman" w:hAnsi="Times New Roman" w:cs="Times New Roman"/>
-          <w:sz w:val="18"/>
-          <w:szCs w:val="18"/>
-        </w:rPr>
-      </w:pPr>
-      <w:r>
-        <w:rPr>
-          <w:rFonts w:ascii="Times New Roman" w:hAnsi="Times New Roman" w:cs="Times New Roman"/>
+          <w:rFonts w:ascii="Century Schoolbook" w:hAnsi="Century Schoolbook" w:cs="Times New Roman"/>
+          <w:sz w:val="18"/>
+          <w:szCs w:val="18"/>
+        </w:rPr>
+      </w:pPr>
+      <w:r>
+        <w:rPr>
+          <w:rFonts w:ascii="Century Schoolbook" w:hAnsi="Century Schoolbook" w:cs="Times New Roman"/>
           <w:sz w:val="18"/>
           <w:szCs w:val="18"/>
         </w:rPr>
@@ -3051,7 +3219,7 @@
       </w:r>
       <w:r>
         <w:rPr>
-          <w:rFonts w:ascii="Times New Roman" w:hAnsi="Times New Roman" w:cs="Times New Roman"/>
+          <w:rFonts w:ascii="Century Schoolbook" w:hAnsi="Century Schoolbook" w:cs="Times New Roman"/>
           <w:sz w:val="18"/>
           <w:szCs w:val="18"/>
         </w:rPr>
@@ -3059,7 +3227,7 @@
       </w:r>
       <w:r>
         <w:rPr>
-          <w:rFonts w:ascii="Times New Roman" w:hAnsi="Times New Roman" w:cs="Times New Roman"/>
+          <w:rFonts w:ascii="Century Schoolbook" w:hAnsi="Century Schoolbook" w:cs="Times New Roman"/>
           <w:sz w:val="18"/>
           <w:szCs w:val="18"/>
         </w:rPr>
@@ -3074,14 +3242,14 @@
           <w:numId w:val="4"/>
         </w:numPr>
         <w:rPr>
-          <w:rFonts w:ascii="Times New Roman" w:hAnsi="Times New Roman" w:cs="Times New Roman"/>
-          <w:sz w:val="18"/>
-          <w:szCs w:val="18"/>
-        </w:rPr>
-      </w:pPr>
-      <w:r>
-        <w:rPr>
-          <w:rFonts w:ascii="Times New Roman" w:hAnsi="Times New Roman" w:cs="Times New Roman"/>
+          <w:rFonts w:ascii="Century Schoolbook" w:hAnsi="Century Schoolbook" w:cs="Times New Roman"/>
+          <w:sz w:val="18"/>
+          <w:szCs w:val="18"/>
+        </w:rPr>
+      </w:pPr>
+      <w:r>
+        <w:rPr>
+          <w:rFonts w:ascii="Century Schoolbook" w:hAnsi="Century Schoolbook" w:cs="Times New Roman"/>
           <w:sz w:val="18"/>
           <w:szCs w:val="18"/>
         </w:rPr>
@@ -3089,7 +3257,7 @@
       </w:r>
       <w:r>
         <w:rPr>
-          <w:rFonts w:ascii="Times New Roman" w:hAnsi="Times New Roman" w:cs="Times New Roman"/>
+          <w:rFonts w:ascii="Century Schoolbook" w:hAnsi="Century Schoolbook" w:cs="Times New Roman"/>
           <w:b/>
           <w:bCs/>
           <w:sz w:val="18"/>
@@ -3099,7 +3267,7 @@
       </w:r>
       <w:r>
         <w:rPr>
-          <w:rFonts w:ascii="Times New Roman" w:hAnsi="Times New Roman" w:cs="Times New Roman"/>
+          <w:rFonts w:ascii="Century Schoolbook" w:hAnsi="Century Schoolbook" w:cs="Times New Roman"/>
           <w:sz w:val="18"/>
           <w:szCs w:val="18"/>
         </w:rPr>
@@ -3107,7 +3275,7 @@
       </w:r>
       <w:r>
         <w:rPr>
-          <w:rFonts w:ascii="Times New Roman" w:hAnsi="Times New Roman" w:cs="Times New Roman"/>
+          <w:rFonts w:ascii="Century Schoolbook" w:hAnsi="Century Schoolbook" w:cs="Times New Roman"/>
           <w:sz w:val="18"/>
           <w:szCs w:val="18"/>
         </w:rPr>
@@ -3123,14 +3291,14 @@
         </w:numPr>
         <w:spacing w:after="0"/>
         <w:rPr>
-          <w:rFonts w:ascii="Times New Roman" w:hAnsi="Times New Roman" w:cs="Times New Roman"/>
-          <w:sz w:val="18"/>
-          <w:szCs w:val="18"/>
-        </w:rPr>
-      </w:pPr>
-      <w:r>
-        <w:rPr>
-          <w:rFonts w:ascii="Times New Roman" w:hAnsi="Times New Roman" w:cs="Times New Roman"/>
+          <w:rFonts w:ascii="Century Schoolbook" w:hAnsi="Century Schoolbook" w:cs="Times New Roman"/>
+          <w:sz w:val="18"/>
+          <w:szCs w:val="18"/>
+        </w:rPr>
+      </w:pPr>
+      <w:r>
+        <w:rPr>
+          <w:rFonts w:ascii="Century Schoolbook" w:hAnsi="Century Schoolbook" w:cs="Times New Roman"/>
           <w:sz w:val="18"/>
           <w:szCs w:val="18"/>
         </w:rPr>
@@ -3138,7 +3306,7 @@
       </w:r>
       <w:r>
         <w:rPr>
-          <w:rFonts w:ascii="Times New Roman" w:hAnsi="Times New Roman" w:cs="Times New Roman"/>
+          <w:rFonts w:ascii="Century Schoolbook" w:hAnsi="Century Schoolbook" w:cs="Times New Roman"/>
           <w:sz w:val="18"/>
           <w:szCs w:val="18"/>
           <w:lang w:val="en-US"/>
@@ -3147,7 +3315,7 @@
       </w:r>
       <w:r>
         <w:rPr>
-          <w:rFonts w:ascii="Times New Roman" w:hAnsi="Times New Roman" w:cs="Times New Roman"/>
+          <w:rFonts w:ascii="Century Schoolbook" w:hAnsi="Century Schoolbook" w:cs="Times New Roman"/>
           <w:sz w:val="18"/>
           <w:szCs w:val="18"/>
         </w:rPr>
@@ -3155,7 +3323,7 @@
       </w:r>
       <w:r>
         <w:rPr>
-          <w:rFonts w:ascii="Times New Roman" w:hAnsi="Times New Roman" w:cs="Times New Roman"/>
+          <w:rFonts w:ascii="Century Schoolbook" w:hAnsi="Century Schoolbook" w:cs="Times New Roman"/>
           <w:sz w:val="18"/>
           <w:szCs w:val="18"/>
         </w:rPr>
@@ -3163,7 +3331,7 @@
       </w:r>
       <w:r>
         <w:rPr>
-          <w:rFonts w:ascii="Times New Roman" w:hAnsi="Times New Roman" w:cs="Times New Roman"/>
+          <w:rFonts w:ascii="Century Schoolbook" w:hAnsi="Century Schoolbook" w:cs="Times New Roman"/>
           <w:sz w:val="18"/>
           <w:szCs w:val="18"/>
           <w:lang w:val="en-US"/>
@@ -3172,7 +3340,7 @@
       </w:r>
       <w:r>
         <w:rPr>
-          <w:rFonts w:ascii="Times New Roman" w:hAnsi="Times New Roman" w:cs="Times New Roman"/>
+          <w:rFonts w:ascii="Century Schoolbook" w:hAnsi="Century Schoolbook" w:cs="Times New Roman"/>
           <w:sz w:val="18"/>
           <w:szCs w:val="18"/>
         </w:rPr>
@@ -3180,7 +3348,7 @@
       </w:r>
       <w:r>
         <w:rPr>
-          <w:rFonts w:ascii="Times New Roman" w:hAnsi="Times New Roman" w:cs="Times New Roman"/>
+          <w:rFonts w:ascii="Century Schoolbook" w:hAnsi="Century Schoolbook" w:cs="Times New Roman"/>
           <w:b/>
           <w:bCs/>
           <w:sz w:val="18"/>
@@ -3197,14 +3365,14 @@
           <w:numId w:val="4"/>
         </w:numPr>
         <w:rPr>
-          <w:rFonts w:ascii="Times New Roman" w:hAnsi="Times New Roman" w:cs="Times New Roman"/>
-          <w:sz w:val="18"/>
-          <w:szCs w:val="18"/>
-        </w:rPr>
-      </w:pPr>
-      <w:r>
-        <w:rPr>
-          <w:rFonts w:ascii="Times New Roman" w:hAnsi="Times New Roman" w:cs="Times New Roman"/>
+          <w:rFonts w:ascii="Century Schoolbook" w:hAnsi="Century Schoolbook" w:cs="Times New Roman"/>
+          <w:sz w:val="18"/>
+          <w:szCs w:val="18"/>
+        </w:rPr>
+      </w:pPr>
+      <w:r>
+        <w:rPr>
+          <w:rFonts w:ascii="Century Schoolbook" w:hAnsi="Century Schoolbook" w:cs="Times New Roman"/>
           <w:sz w:val="18"/>
           <w:szCs w:val="18"/>
         </w:rPr>
@@ -3212,7 +3380,7 @@
       </w:r>
       <w:r>
         <w:rPr>
-          <w:rFonts w:ascii="Times New Roman" w:hAnsi="Times New Roman" w:cs="Times New Roman"/>
+          <w:rFonts w:ascii="Century Schoolbook" w:hAnsi="Century Schoolbook" w:cs="Times New Roman"/>
           <w:sz w:val="18"/>
           <w:szCs w:val="18"/>
         </w:rPr>
@@ -3220,7 +3388,7 @@
       </w:r>
       <w:r>
         <w:rPr>
-          <w:rFonts w:ascii="Times New Roman" w:hAnsi="Times New Roman" w:cs="Times New Roman"/>
+          <w:rFonts w:ascii="Century Schoolbook" w:hAnsi="Century Schoolbook" w:cs="Times New Roman"/>
           <w:sz w:val="18"/>
           <w:szCs w:val="18"/>
         </w:rPr>
@@ -3228,7 +3396,7 @@
       </w:r>
       <w:r>
         <w:rPr>
-          <w:rFonts w:ascii="Times New Roman" w:hAnsi="Times New Roman" w:cs="Times New Roman"/>
+          <w:rFonts w:ascii="Century Schoolbook" w:hAnsi="Century Schoolbook" w:cs="Times New Roman"/>
           <w:sz w:val="18"/>
           <w:szCs w:val="18"/>
         </w:rPr>
@@ -3236,7 +3404,7 @@
       </w:r>
       <w:r>
         <w:rPr>
-          <w:rFonts w:ascii="Times New Roman" w:hAnsi="Times New Roman" w:cs="Times New Roman"/>
+          <w:rFonts w:ascii="Century Schoolbook" w:hAnsi="Century Schoolbook" w:cs="Times New Roman"/>
           <w:b/>
           <w:bCs/>
           <w:sz w:val="18"/>
@@ -3246,7 +3414,7 @@
       </w:r>
       <w:r>
         <w:rPr>
-          <w:rFonts w:ascii="Times New Roman" w:hAnsi="Times New Roman" w:cs="Times New Roman"/>
+          <w:rFonts w:ascii="Century Schoolbook" w:hAnsi="Century Schoolbook" w:cs="Times New Roman"/>
           <w:sz w:val="18"/>
           <w:szCs w:val="18"/>
         </w:rPr>
@@ -3254,7 +3422,7 @@
       </w:r>
       <w:r>
         <w:rPr>
-          <w:rFonts w:ascii="Times New Roman" w:hAnsi="Times New Roman" w:cs="Times New Roman"/>
+          <w:rFonts w:ascii="Century Schoolbook" w:hAnsi="Century Schoolbook" w:cs="Times New Roman"/>
           <w:sz w:val="18"/>
           <w:szCs w:val="18"/>
         </w:rPr>
@@ -3262,7 +3430,7 @@
       </w:r>
       <w:r>
         <w:rPr>
-          <w:rFonts w:ascii="Times New Roman" w:hAnsi="Times New Roman" w:cs="Times New Roman"/>
+          <w:rFonts w:ascii="Century Schoolbook" w:hAnsi="Century Schoolbook" w:cs="Times New Roman"/>
           <w:sz w:val="18"/>
           <w:szCs w:val="18"/>
         </w:rPr>
@@ -3270,33 +3438,15 @@
       </w:r>
       <w:r>
         <w:rPr>
-          <w:rFonts w:ascii="Times New Roman" w:hAnsi="Times New Roman" w:cs="Times New Roman"/>
-          <w:sz w:val="18"/>
-          <w:szCs w:val="18"/>
-        </w:rPr>
-        <w:t>. Продолжая тему примера с телефоном</w:t>
-      </w:r>
-      <w:proofErr w:type="gramStart"/>
-      <w:r>
-        <w:rPr>
-          <w:rFonts w:ascii="Times New Roman" w:hAnsi="Times New Roman" w:cs="Times New Roman"/>
-          <w:sz w:val="18"/>
-          <w:szCs w:val="18"/>
-        </w:rPr>
-        <w:t>:</w:t>
-      </w:r>
-      <w:proofErr w:type="gramEnd"/>
-      <w:r>
-        <w:rPr>
-          <w:rFonts w:ascii="Times New Roman" w:hAnsi="Times New Roman" w:cs="Times New Roman"/>
-          <w:sz w:val="18"/>
-          <w:szCs w:val="18"/>
-        </w:rPr>
-        <w:t xml:space="preserve"> проверил уведомления (пока смотрел</w:t>
-      </w:r>
-      <w:r>
-        <w:rPr>
-          <w:rFonts w:ascii="Times New Roman" w:hAnsi="Times New Roman" w:cs="Times New Roman"/>
+          <w:rFonts w:ascii="Century Schoolbook" w:hAnsi="Century Schoolbook" w:cs="Times New Roman"/>
+          <w:sz w:val="18"/>
+          <w:szCs w:val="18"/>
+        </w:rPr>
+        <w:t>. Продолжая тему примера с телефоном: проверил уведомления (пока смотрел</w:t>
+      </w:r>
+      <w:r>
+        <w:rPr>
+          <w:rFonts w:ascii="Century Schoolbook" w:hAnsi="Century Schoolbook" w:cs="Times New Roman"/>
           <w:sz w:val="18"/>
           <w:szCs w:val="18"/>
         </w:rPr>
@@ -3304,7 +3454,7 @@
       </w:r>
       <w:r>
         <w:rPr>
-          <w:rFonts w:ascii="Times New Roman" w:hAnsi="Times New Roman" w:cs="Times New Roman"/>
+          <w:rFonts w:ascii="Century Schoolbook" w:hAnsi="Century Schoolbook" w:cs="Times New Roman"/>
           <w:sz w:val="18"/>
           <w:szCs w:val="18"/>
         </w:rPr>
@@ -3312,7 +3462,7 @@
       </w:r>
       <w:r>
         <w:rPr>
-          <w:rFonts w:ascii="Times New Roman" w:hAnsi="Times New Roman" w:cs="Times New Roman"/>
+          <w:rFonts w:ascii="Century Schoolbook" w:hAnsi="Century Schoolbook" w:cs="Times New Roman"/>
           <w:b/>
           <w:bCs/>
           <w:sz w:val="18"/>
@@ -3322,7 +3472,7 @@
       </w:r>
       <w:r>
         <w:rPr>
-          <w:rFonts w:ascii="Times New Roman" w:hAnsi="Times New Roman" w:cs="Times New Roman"/>
+          <w:rFonts w:ascii="Century Schoolbook" w:hAnsi="Century Schoolbook" w:cs="Times New Roman"/>
           <w:sz w:val="18"/>
           <w:szCs w:val="18"/>
         </w:rPr>
@@ -3330,7 +3480,7 @@
       </w:r>
       <w:r>
         <w:rPr>
-          <w:rFonts w:ascii="Times New Roman" w:hAnsi="Times New Roman" w:cs="Times New Roman"/>
+          <w:rFonts w:ascii="Century Schoolbook" w:hAnsi="Century Schoolbook" w:cs="Times New Roman"/>
           <w:sz w:val="18"/>
           <w:szCs w:val="18"/>
         </w:rPr>
@@ -3338,7 +3488,7 @@
       </w:r>
       <w:r>
         <w:rPr>
-          <w:rFonts w:ascii="Times New Roman" w:hAnsi="Times New Roman" w:cs="Times New Roman"/>
+          <w:rFonts w:ascii="Century Schoolbook" w:hAnsi="Century Schoolbook" w:cs="Times New Roman"/>
           <w:sz w:val="18"/>
           <w:szCs w:val="18"/>
         </w:rPr>
@@ -3346,7 +3496,7 @@
       </w:r>
       <w:r>
         <w:rPr>
-          <w:rFonts w:ascii="Times New Roman" w:hAnsi="Times New Roman" w:cs="Times New Roman"/>
+          <w:rFonts w:ascii="Century Schoolbook" w:hAnsi="Century Schoolbook" w:cs="Times New Roman"/>
           <w:sz w:val="18"/>
           <w:szCs w:val="18"/>
         </w:rPr>
@@ -3354,7 +3504,7 @@
       </w:r>
       <w:r>
         <w:rPr>
-          <w:rFonts w:ascii="Times New Roman" w:hAnsi="Times New Roman" w:cs="Times New Roman"/>
+          <w:rFonts w:ascii="Century Schoolbook" w:hAnsi="Century Schoolbook" w:cs="Times New Roman"/>
           <w:sz w:val="18"/>
           <w:szCs w:val="18"/>
           <w:lang w:val="en-US"/>
@@ -3363,7 +3513,7 @@
       </w:r>
       <w:r>
         <w:rPr>
-          <w:rFonts w:ascii="Times New Roman" w:hAnsi="Times New Roman" w:cs="Times New Roman"/>
+          <w:rFonts w:ascii="Century Schoolbook" w:hAnsi="Century Schoolbook" w:cs="Times New Roman"/>
           <w:sz w:val="18"/>
           <w:szCs w:val="18"/>
         </w:rPr>
@@ -3371,7 +3521,7 @@
       </w:r>
       <w:r>
         <w:rPr>
-          <w:rFonts w:ascii="Times New Roman" w:hAnsi="Times New Roman" w:cs="Times New Roman"/>
+          <w:rFonts w:ascii="Century Schoolbook" w:hAnsi="Century Schoolbook" w:cs="Times New Roman"/>
           <w:sz w:val="18"/>
           <w:szCs w:val="18"/>
         </w:rPr>
@@ -3386,14 +3536,14 @@
           <w:numId w:val="4"/>
         </w:numPr>
         <w:rPr>
-          <w:rFonts w:ascii="Times New Roman" w:hAnsi="Times New Roman" w:cs="Times New Roman"/>
-          <w:sz w:val="18"/>
-          <w:szCs w:val="18"/>
-        </w:rPr>
-      </w:pPr>
-      <w:r>
-        <w:rPr>
-          <w:rFonts w:ascii="Times New Roman" w:hAnsi="Times New Roman" w:cs="Times New Roman"/>
+          <w:rFonts w:ascii="Century Schoolbook" w:hAnsi="Century Schoolbook" w:cs="Times New Roman"/>
+          <w:sz w:val="18"/>
+          <w:szCs w:val="18"/>
+        </w:rPr>
+      </w:pPr>
+      <w:r>
+        <w:rPr>
+          <w:rFonts w:ascii="Century Schoolbook" w:hAnsi="Century Schoolbook" w:cs="Times New Roman"/>
           <w:b/>
           <w:bCs/>
           <w:sz w:val="18"/>
@@ -3403,7 +3553,7 @@
       </w:r>
       <w:r>
         <w:rPr>
-          <w:rFonts w:ascii="Times New Roman" w:hAnsi="Times New Roman" w:cs="Times New Roman"/>
+          <w:rFonts w:ascii="Century Schoolbook" w:hAnsi="Century Schoolbook" w:cs="Times New Roman"/>
           <w:sz w:val="18"/>
           <w:szCs w:val="18"/>
         </w:rPr>
@@ -3411,7 +3561,7 @@
       </w:r>
       <w:r>
         <w:rPr>
-          <w:rFonts w:ascii="Times New Roman" w:hAnsi="Times New Roman" w:cs="Times New Roman"/>
+          <w:rFonts w:ascii="Century Schoolbook" w:hAnsi="Century Schoolbook" w:cs="Times New Roman"/>
           <w:b/>
           <w:bCs/>
           <w:sz w:val="18"/>
@@ -3421,7 +3571,7 @@
       </w:r>
       <w:r>
         <w:rPr>
-          <w:rFonts w:ascii="Times New Roman" w:hAnsi="Times New Roman" w:cs="Times New Roman"/>
+          <w:rFonts w:ascii="Century Schoolbook" w:hAnsi="Century Schoolbook" w:cs="Times New Roman"/>
           <w:sz w:val="18"/>
           <w:szCs w:val="18"/>
         </w:rPr>
@@ -3429,7 +3579,7 @@
       </w:r>
       <w:r>
         <w:rPr>
-          <w:rFonts w:ascii="Times New Roman" w:hAnsi="Times New Roman" w:cs="Times New Roman"/>
+          <w:rFonts w:ascii="Century Schoolbook" w:hAnsi="Century Schoolbook" w:cs="Times New Roman"/>
           <w:sz w:val="18"/>
           <w:szCs w:val="18"/>
         </w:rPr>
@@ -3437,7 +3587,7 @@
       </w:r>
       <w:r>
         <w:rPr>
-          <w:rFonts w:ascii="Times New Roman" w:hAnsi="Times New Roman" w:cs="Times New Roman"/>
+          <w:rFonts w:ascii="Century Schoolbook" w:hAnsi="Century Schoolbook" w:cs="Times New Roman"/>
           <w:sz w:val="18"/>
           <w:szCs w:val="18"/>
         </w:rPr>
@@ -3445,7 +3595,7 @@
       </w:r>
       <w:r>
         <w:rPr>
-          <w:rFonts w:ascii="Times New Roman" w:hAnsi="Times New Roman" w:cs="Times New Roman"/>
+          <w:rFonts w:ascii="Century Schoolbook" w:hAnsi="Century Schoolbook" w:cs="Times New Roman"/>
           <w:sz w:val="18"/>
           <w:szCs w:val="18"/>
         </w:rPr>
@@ -3453,7 +3603,7 @@
       </w:r>
       <w:r>
         <w:rPr>
-          <w:rFonts w:ascii="Times New Roman" w:hAnsi="Times New Roman" w:cs="Times New Roman"/>
+          <w:rFonts w:ascii="Century Schoolbook" w:hAnsi="Century Schoolbook" w:cs="Times New Roman"/>
           <w:sz w:val="18"/>
           <w:szCs w:val="18"/>
         </w:rPr>
@@ -3461,7 +3611,7 @@
       </w:r>
       <w:r>
         <w:rPr>
-          <w:rFonts w:ascii="Times New Roman" w:hAnsi="Times New Roman" w:cs="Times New Roman"/>
+          <w:rFonts w:ascii="Century Schoolbook" w:hAnsi="Century Schoolbook" w:cs="Times New Roman"/>
           <w:b/>
           <w:bCs/>
           <w:sz w:val="18"/>
@@ -3478,14 +3628,14 @@
           <w:numId w:val="4"/>
         </w:numPr>
         <w:rPr>
-          <w:rFonts w:ascii="Times New Roman" w:hAnsi="Times New Roman" w:cs="Times New Roman"/>
-          <w:sz w:val="18"/>
-          <w:szCs w:val="18"/>
-        </w:rPr>
-      </w:pPr>
-      <w:r>
-        <w:rPr>
-          <w:rFonts w:ascii="Times New Roman" w:hAnsi="Times New Roman" w:cs="Times New Roman"/>
+          <w:rFonts w:ascii="Century Schoolbook" w:hAnsi="Century Schoolbook" w:cs="Times New Roman"/>
+          <w:sz w:val="18"/>
+          <w:szCs w:val="18"/>
+        </w:rPr>
+      </w:pPr>
+      <w:r>
+        <w:rPr>
+          <w:rFonts w:ascii="Century Schoolbook" w:hAnsi="Century Schoolbook" w:cs="Times New Roman"/>
           <w:sz w:val="18"/>
           <w:szCs w:val="18"/>
         </w:rPr>
@@ -3493,7 +3643,7 @@
       </w:r>
       <w:r>
         <w:rPr>
-          <w:rFonts w:ascii="Times New Roman" w:hAnsi="Times New Roman" w:cs="Times New Roman"/>
+          <w:rFonts w:ascii="Century Schoolbook" w:hAnsi="Century Schoolbook" w:cs="Times New Roman"/>
           <w:b/>
           <w:bCs/>
           <w:sz w:val="18"/>
@@ -3504,7 +3654,7 @@
       </w:r>
       <w:r>
         <w:rPr>
-          <w:rFonts w:ascii="Times New Roman" w:hAnsi="Times New Roman" w:cs="Times New Roman"/>
+          <w:rFonts w:ascii="Century Schoolbook" w:hAnsi="Century Schoolbook" w:cs="Times New Roman"/>
           <w:b/>
           <w:bCs/>
           <w:sz w:val="18"/>
@@ -3514,7 +3664,7 @@
       </w:r>
       <w:r>
         <w:rPr>
-          <w:rFonts w:ascii="Times New Roman" w:hAnsi="Times New Roman" w:cs="Times New Roman"/>
+          <w:rFonts w:ascii="Century Schoolbook" w:hAnsi="Century Schoolbook" w:cs="Times New Roman"/>
           <w:b/>
           <w:bCs/>
           <w:sz w:val="18"/>
@@ -3525,7 +3675,7 @@
       </w:r>
       <w:r>
         <w:rPr>
-          <w:rFonts w:ascii="Times New Roman" w:hAnsi="Times New Roman" w:cs="Times New Roman"/>
+          <w:rFonts w:ascii="Century Schoolbook" w:hAnsi="Century Schoolbook" w:cs="Times New Roman"/>
           <w:b/>
           <w:bCs/>
           <w:sz w:val="18"/>
@@ -3535,7 +3685,7 @@
       </w:r>
       <w:r>
         <w:rPr>
-          <w:rFonts w:ascii="Times New Roman" w:hAnsi="Times New Roman" w:cs="Times New Roman"/>
+          <w:rFonts w:ascii="Century Schoolbook" w:hAnsi="Century Schoolbook" w:cs="Times New Roman"/>
           <w:sz w:val="18"/>
           <w:szCs w:val="18"/>
         </w:rPr>
@@ -3543,7 +3693,7 @@
       </w:r>
       <w:r>
         <w:rPr>
-          <w:rFonts w:ascii="Times New Roman" w:hAnsi="Times New Roman" w:cs="Times New Roman"/>
+          <w:rFonts w:ascii="Century Schoolbook" w:hAnsi="Century Schoolbook" w:cs="Times New Roman"/>
           <w:sz w:val="18"/>
           <w:szCs w:val="18"/>
           <w:lang w:val="en-US"/>
@@ -3552,7 +3702,7 @@
       </w:r>
       <w:r>
         <w:rPr>
-          <w:rFonts w:ascii="Times New Roman" w:hAnsi="Times New Roman" w:cs="Times New Roman"/>
+          <w:rFonts w:ascii="Century Schoolbook" w:hAnsi="Century Schoolbook" w:cs="Times New Roman"/>
           <w:sz w:val="18"/>
           <w:szCs w:val="18"/>
         </w:rPr>
@@ -3560,7 +3710,7 @@
       </w:r>
       <w:r>
         <w:rPr>
-          <w:rFonts w:ascii="Times New Roman" w:hAnsi="Times New Roman" w:cs="Times New Roman"/>
+          <w:rFonts w:ascii="Century Schoolbook" w:hAnsi="Century Schoolbook" w:cs="Times New Roman"/>
           <w:sz w:val="18"/>
           <w:szCs w:val="18"/>
           <w:lang w:val="en-US"/>
@@ -3569,7 +3719,7 @@
       </w:r>
       <w:r>
         <w:rPr>
-          <w:rFonts w:ascii="Times New Roman" w:hAnsi="Times New Roman" w:cs="Times New Roman"/>
+          <w:rFonts w:ascii="Century Schoolbook" w:hAnsi="Century Schoolbook" w:cs="Times New Roman"/>
           <w:sz w:val="18"/>
           <w:szCs w:val="18"/>
         </w:rPr>
@@ -3577,7 +3727,7 @@
       </w:r>
       <w:r>
         <w:rPr>
-          <w:rFonts w:ascii="Times New Roman" w:hAnsi="Times New Roman" w:cs="Times New Roman"/>
+          <w:rFonts w:ascii="Century Schoolbook" w:hAnsi="Century Schoolbook" w:cs="Times New Roman"/>
           <w:sz w:val="18"/>
           <w:szCs w:val="18"/>
           <w:lang w:val="en-US"/>
@@ -3586,7 +3736,7 @@
       </w:r>
       <w:r>
         <w:rPr>
-          <w:rFonts w:ascii="Times New Roman" w:hAnsi="Times New Roman" w:cs="Times New Roman"/>
+          <w:rFonts w:ascii="Century Schoolbook" w:hAnsi="Century Schoolbook" w:cs="Times New Roman"/>
           <w:sz w:val="18"/>
           <w:szCs w:val="18"/>
         </w:rPr>
@@ -3594,7 +3744,7 @@
       </w:r>
       <w:r>
         <w:rPr>
-          <w:rFonts w:ascii="Times New Roman" w:hAnsi="Times New Roman" w:cs="Times New Roman"/>
+          <w:rFonts w:ascii="Century Schoolbook" w:hAnsi="Century Schoolbook" w:cs="Times New Roman"/>
           <w:sz w:val="18"/>
           <w:szCs w:val="18"/>
           <w:lang w:val="en-US"/>
@@ -3603,7 +3753,7 @@
       </w:r>
       <w:r>
         <w:rPr>
-          <w:rFonts w:ascii="Times New Roman" w:hAnsi="Times New Roman" w:cs="Times New Roman"/>
+          <w:rFonts w:ascii="Century Schoolbook" w:hAnsi="Century Schoolbook" w:cs="Times New Roman"/>
           <w:sz w:val="18"/>
           <w:szCs w:val="18"/>
         </w:rPr>
@@ -3611,7 +3761,7 @@
       </w:r>
       <w:r>
         <w:rPr>
-          <w:rFonts w:ascii="Times New Roman" w:hAnsi="Times New Roman" w:cs="Times New Roman"/>
+          <w:rFonts w:ascii="Century Schoolbook" w:hAnsi="Century Schoolbook" w:cs="Times New Roman"/>
           <w:sz w:val="18"/>
           <w:szCs w:val="18"/>
           <w:lang w:val="en-US"/>
@@ -3620,7 +3770,7 @@
       </w:r>
       <w:r>
         <w:rPr>
-          <w:rFonts w:ascii="Times New Roman" w:hAnsi="Times New Roman" w:cs="Times New Roman"/>
+          <w:rFonts w:ascii="Century Schoolbook" w:hAnsi="Century Schoolbook" w:cs="Times New Roman"/>
           <w:sz w:val="18"/>
           <w:szCs w:val="18"/>
         </w:rPr>
@@ -3628,7 +3778,7 @@
       </w:r>
       <w:r>
         <w:rPr>
-          <w:rFonts w:ascii="Times New Roman" w:hAnsi="Times New Roman" w:cs="Times New Roman"/>
+          <w:rFonts w:ascii="Century Schoolbook" w:hAnsi="Century Schoolbook" w:cs="Times New Roman"/>
           <w:sz w:val="18"/>
           <w:szCs w:val="18"/>
           <w:lang w:val="en-US"/>
@@ -3637,7 +3787,7 @@
       </w:r>
       <w:r>
         <w:rPr>
-          <w:rFonts w:ascii="Times New Roman" w:hAnsi="Times New Roman" w:cs="Times New Roman"/>
+          <w:rFonts w:ascii="Century Schoolbook" w:hAnsi="Century Schoolbook" w:cs="Times New Roman"/>
           <w:sz w:val="18"/>
           <w:szCs w:val="18"/>
         </w:rPr>
@@ -3745,6 +3895,7 @@
         <w:rPr>
           <w:noProof/>
         </w:rPr>
+        <w:lastRenderedPageBreak/>
         <w:drawing>
           <wp:inline distT="0" distB="0" distL="0" distR="0" wp14:anchorId="3269CD44" wp14:editId="40BD973B">
             <wp:extent cx="3329338" cy="1816100"/>
@@ -3845,7 +3996,6 @@
           <w:szCs w:val="20"/>
           <w:lang w:val="en-US"/>
         </w:rPr>
-        <w:lastRenderedPageBreak/>
         <w:drawing>
           <wp:inline distT="0" distB="0" distL="0" distR="0" wp14:anchorId="3AF423CB" wp14:editId="357F9EE5">
             <wp:extent cx="3758469" cy="2079110"/>
@@ -4460,6 +4610,7 @@
         <w:rPr>
           <w:noProof/>
         </w:rPr>
+        <w:lastRenderedPageBreak/>
         <w:drawing>
           <wp:inline distT="0" distB="0" distL="0" distR="0" wp14:anchorId="062AB185" wp14:editId="2EE8DCBC">
             <wp:extent cx="2622375" cy="1639019"/>
@@ -4850,7 +5001,6 @@
           <w:sz w:val="18"/>
           <w:szCs w:val="18"/>
         </w:rPr>
-        <w:lastRenderedPageBreak/>
         <w:t>Задачи:</w:t>
       </w:r>
       <w:r>
@@ -5933,6 +6083,20 @@
           <w:rFonts w:ascii="Times New Roman" w:hAnsi="Times New Roman" w:cs="Times New Roman"/>
           <w:b/>
           <w:bCs/>
+          <w:color w:val="7F7F7F" w:themeColor="text1" w:themeTint="80"/>
+          <w:sz w:val="20"/>
+          <w:szCs w:val="20"/>
+          <w:lang w:val="en-US"/>
+        </w:rPr>
+      </w:pPr>
+    </w:p>
+    <w:p>
+      <w:pPr>
+        <w:jc w:val="center"/>
+        <w:rPr>
+          <w:rFonts w:ascii="Times New Roman" w:hAnsi="Times New Roman" w:cs="Times New Roman"/>
+          <w:b/>
+          <w:bCs/>
           <w:i/>
           <w:iCs/>
           <w:color w:val="7F7F7F" w:themeColor="text1" w:themeTint="80"/>
@@ -5949,6 +6113,7 @@
           <w:sz w:val="20"/>
           <w:szCs w:val="20"/>
         </w:rPr>
+        <w:lastRenderedPageBreak/>
         <w:t>Что происходит при включении (Boot-up процесс)</w:t>
       </w:r>
     </w:p>
@@ -6817,7 +6982,6 @@
           <w:sz w:val="18"/>
           <w:szCs w:val="18"/>
         </w:rPr>
-        <w:lastRenderedPageBreak/>
         <w:t>Это «мозги» процессора. За них отвечает Арифметико-Логическое Устройство (ALU).</w:t>
       </w:r>
     </w:p>
@@ -7509,6 +7673,7 @@
           <w:sz w:val="18"/>
           <w:szCs w:val="18"/>
         </w:rPr>
+        <w:lastRenderedPageBreak/>
         <w:t>Что происходит:</w:t>
       </w:r>
       <w:r>
@@ -7875,7 +8040,6 @@
           <w:sz w:val="18"/>
           <w:szCs w:val="18"/>
         </w:rPr>
-        <w:lastRenderedPageBreak/>
         <w:t>Зачем это нужно:</w:t>
       </w:r>
       <w:r>
@@ -8709,6 +8873,7 @@
           <w:sz w:val="18"/>
           <w:szCs w:val="18"/>
         </w:rPr>
+        <w:lastRenderedPageBreak/>
         <w:t xml:space="preserve">│ Разрядность </w:t>
       </w:r>
       <w:r>
@@ -9597,7 +9762,6 @@
           <w:sz w:val="18"/>
           <w:szCs w:val="18"/>
         </w:rPr>
-        <w:lastRenderedPageBreak/>
         <w:t>регистр хранит число от 0 до 4 294 967</w:t>
       </w:r>
       <w:r>
@@ -10195,6 +10359,7 @@
           <w:sz w:val="18"/>
           <w:szCs w:val="18"/>
         </w:rPr>
+        <w:lastRenderedPageBreak/>
         <w:t>Прерывание (Interrupt):</w:t>
       </w:r>
       <w:r>
@@ -10561,7 +10726,6 @@
           <w:sz w:val="18"/>
           <w:szCs w:val="18"/>
         </w:rPr>
-        <w:lastRenderedPageBreak/>
         <w:t>Программные:</w:t>
       </w:r>
       <w:r>
@@ -11277,6 +11441,7 @@
           <w:szCs w:val="18"/>
           <w:lang w:eastAsia="ru-RU"/>
         </w:rPr>
+        <w:lastRenderedPageBreak/>
         <w:t>2. Адресные сигналы (Address Bus) — "ГДЕ ДЕЛАТЬ?"</w:t>
       </w:r>
     </w:p>
@@ -11687,7 +11852,6 @@
           <w:sz w:val="20"/>
           <w:szCs w:val="20"/>
         </w:rPr>
-        <w:lastRenderedPageBreak/>
         <w:t>Многопоточность</w:t>
       </w:r>
     </w:p>
@@ -12131,6 +12295,7 @@
           <w:sz w:val="18"/>
           <w:szCs w:val="18"/>
         </w:rPr>
+        <w:lastRenderedPageBreak/>
         <w:t xml:space="preserve">1. Сокеты: </w:t>
       </w:r>
       <w:r>
@@ -12552,7 +12717,6 @@
           <w:sz w:val="18"/>
           <w:szCs w:val="18"/>
         </w:rPr>
-        <w:lastRenderedPageBreak/>
         <w:t>Потоки: 2031</w:t>
       </w:r>
       <w:r>
@@ -13279,6 +13443,7 @@
           <w:sz w:val="18"/>
           <w:szCs w:val="18"/>
         </w:rPr>
+        <w:lastRenderedPageBreak/>
         <w:t>На одном ядре</w:t>
       </w:r>
       <w:r>
@@ -13752,7 +13917,6 @@
           <w:sz w:val="18"/>
           <w:szCs w:val="18"/>
         </w:rPr>
-        <w:lastRenderedPageBreak/>
         <w:t>Ядро №1</w:t>
       </w:r>
       <w:r>
@@ -14316,21 +14480,102 @@
           <w:b/>
           <w:bCs/>
           <w:color w:val="595959" w:themeColor="text1" w:themeTint="A6"/>
+          <w:lang w:val="en-US"/>
           <w14:shadow w14:blurRad="114300" w14:dist="0" w14:dir="0" w14:sx="0" w14:sy="0" w14:kx="0" w14:ky="0" w14:algn="none">
             <w14:srgbClr w14:val="000000"/>
           </w14:shadow>
         </w:rPr>
       </w:pPr>
-      <w:r>
-        <w:rPr>
-          <w:rFonts w:ascii="Times New Roman" w:hAnsi="Times New Roman" w:cs="Times New Roman"/>
-          <w:b/>
-          <w:bCs/>
-          <w:color w:val="595959" w:themeColor="text1" w:themeTint="A6"/>
+    </w:p>
+    <w:p>
+      <w:pPr>
+        <w:spacing w:after="0"/>
+        <w:jc w:val="center"/>
+        <w:rPr>
+          <w:rFonts w:ascii="Times New Roman" w:hAnsi="Times New Roman" w:cs="Times New Roman"/>
+          <w:b/>
+          <w:bCs/>
+          <w:color w:val="595959" w:themeColor="text1" w:themeTint="A6"/>
+          <w:lang w:val="en-US"/>
           <w14:shadow w14:blurRad="114300" w14:dist="0" w14:dir="0" w14:sx="0" w14:sy="0" w14:kx="0" w14:ky="0" w14:algn="none">
             <w14:srgbClr w14:val="000000"/>
           </w14:shadow>
         </w:rPr>
+      </w:pPr>
+    </w:p>
+    <w:p>
+      <w:pPr>
+        <w:spacing w:after="0"/>
+        <w:jc w:val="center"/>
+        <w:rPr>
+          <w:rFonts w:ascii="Times New Roman" w:hAnsi="Times New Roman" w:cs="Times New Roman"/>
+          <w:b/>
+          <w:bCs/>
+          <w:color w:val="595959" w:themeColor="text1" w:themeTint="A6"/>
+          <w:lang w:val="en-US"/>
+          <w14:shadow w14:blurRad="114300" w14:dist="0" w14:dir="0" w14:sx="0" w14:sy="0" w14:kx="0" w14:ky="0" w14:algn="none">
+            <w14:srgbClr w14:val="000000"/>
+          </w14:shadow>
+        </w:rPr>
+      </w:pPr>
+    </w:p>
+    <w:p>
+      <w:pPr>
+        <w:spacing w:after="0"/>
+        <w:jc w:val="center"/>
+        <w:rPr>
+          <w:rFonts w:ascii="Times New Roman" w:hAnsi="Times New Roman" w:cs="Times New Roman"/>
+          <w:b/>
+          <w:bCs/>
+          <w:color w:val="595959" w:themeColor="text1" w:themeTint="A6"/>
+          <w:lang w:val="en-US"/>
+          <w14:shadow w14:blurRad="114300" w14:dist="0" w14:dir="0" w14:sx="0" w14:sy="0" w14:kx="0" w14:ky="0" w14:algn="none">
+            <w14:srgbClr w14:val="000000"/>
+          </w14:shadow>
+        </w:rPr>
+      </w:pPr>
+    </w:p>
+    <w:p>
+      <w:pPr>
+        <w:spacing w:after="0"/>
+        <w:jc w:val="center"/>
+        <w:rPr>
+          <w:rFonts w:ascii="Times New Roman" w:hAnsi="Times New Roman" w:cs="Times New Roman"/>
+          <w:b/>
+          <w:bCs/>
+          <w:color w:val="595959" w:themeColor="text1" w:themeTint="A6"/>
+          <w:lang w:val="en-US"/>
+          <w14:shadow w14:blurRad="114300" w14:dist="0" w14:dir="0" w14:sx="0" w14:sy="0" w14:kx="0" w14:ky="0" w14:algn="none">
+            <w14:srgbClr w14:val="000000"/>
+          </w14:shadow>
+        </w:rPr>
+      </w:pPr>
+    </w:p>
+    <w:p>
+      <w:pPr>
+        <w:spacing w:after="0"/>
+        <w:jc w:val="center"/>
+        <w:rPr>
+          <w:rFonts w:ascii="Times New Roman" w:hAnsi="Times New Roman" w:cs="Times New Roman"/>
+          <w:b/>
+          <w:bCs/>
+          <w:color w:val="595959" w:themeColor="text1" w:themeTint="A6"/>
+          <w14:shadow w14:blurRad="114300" w14:dist="0" w14:dir="0" w14:sx="0" w14:sy="0" w14:kx="0" w14:ky="0" w14:algn="none">
+            <w14:srgbClr w14:val="000000"/>
+          </w14:shadow>
+        </w:rPr>
+      </w:pPr>
+      <w:r>
+        <w:rPr>
+          <w:rFonts w:ascii="Times New Roman" w:hAnsi="Times New Roman" w:cs="Times New Roman"/>
+          <w:b/>
+          <w:bCs/>
+          <w:color w:val="595959" w:themeColor="text1" w:themeTint="A6"/>
+          <w14:shadow w14:blurRad="114300" w14:dist="0" w14:dir="0" w14:sx="0" w14:sy="0" w14:kx="0" w14:ky="0" w14:algn="none">
+            <w14:srgbClr w14:val="000000"/>
+          </w14:shadow>
+        </w:rPr>
+        <w:lastRenderedPageBreak/>
         <w:t>ТЕМА 3</w:t>
       </w:r>
     </w:p>
@@ -14758,7 +15003,6 @@
           <w:sz w:val="18"/>
           <w:szCs w:val="18"/>
         </w:rPr>
-        <w:lastRenderedPageBreak/>
         <w:t>Диск (SSD/HDD)</w:t>
       </w:r>
       <w:r>
@@ -15354,6 +15598,7 @@
           <w:szCs w:val="24"/>
           <w:lang w:eastAsia="ru-RU"/>
         </w:rPr>
+        <w:lastRenderedPageBreak/>
         <w:drawing>
           <wp:inline distT="0" distB="0" distL="0" distR="0" wp14:anchorId="16DAA3D9" wp14:editId="5F9F5452">
             <wp:extent cx="4234008" cy="2066540"/>
@@ -15842,7 +16087,6 @@
           <w:sz w:val="18"/>
           <w:szCs w:val="18"/>
         </w:rPr>
-        <w:lastRenderedPageBreak/>
         <w:t xml:space="preserve">Процессор берет этот адрес и идет в </w:t>
       </w:r>
       <w:r>
@@ -16202,6 +16446,7 @@
           <w:sz w:val="18"/>
           <w:szCs w:val="18"/>
         </w:rPr>
+        <w:lastRenderedPageBreak/>
         <w:t>Квартира = Регистры.</w:t>
       </w:r>
       <w:r>
@@ -17077,7 +17322,6 @@
           <w:sz w:val="18"/>
           <w:szCs w:val="18"/>
         </w:rPr>
-        <w:lastRenderedPageBreak/>
         <w:t>GC просто проходит по всей Куче «метлой».</w:t>
       </w:r>
     </w:p>
@@ -17348,6 +17592,7 @@
         <w:rPr>
           <w:noProof/>
         </w:rPr>
+        <w:lastRenderedPageBreak/>
         <w:drawing>
           <wp:inline distT="0" distB="0" distL="0" distR="0" wp14:anchorId="1E37639F" wp14:editId="6DCDC034">
             <wp:extent cx="3160972" cy="1289930"/>
@@ -18154,7 +18399,6 @@
         <w:rPr>
           <w:noProof/>
         </w:rPr>
-        <w:lastRenderedPageBreak/>
         <w:drawing>
           <wp:inline distT="0" distB="0" distL="0" distR="0" wp14:anchorId="353769B2" wp14:editId="3C14EA27">
             <wp:extent cx="3535190" cy="921304"/>
@@ -18342,6 +18586,7 @@
           <w:sz w:val="18"/>
           <w:szCs w:val="18"/>
         </w:rPr>
+        <w:lastRenderedPageBreak/>
         <w:t>Поток №1</w:t>
       </w:r>
       <w:r>
@@ -19773,7 +20018,6 @@
           <w:sz w:val="18"/>
           <w:szCs w:val="18"/>
         </w:rPr>
-        <w:lastRenderedPageBreak/>
         <w:t>Суть:</w:t>
       </w:r>
       <w:r>
@@ -20151,6 +20395,7 @@
           <w:sz w:val="18"/>
           <w:szCs w:val="18"/>
         </w:rPr>
+        <w:lastRenderedPageBreak/>
         <w:t>Результат:</w:t>
       </w:r>
       <w:r>
@@ -21117,7 +21362,6 @@
           <w:sz w:val="18"/>
           <w:szCs w:val="18"/>
         </w:rPr>
-        <w:lastRenderedPageBreak/>
         <w:t xml:space="preserve">Ты обязан сразу сказать: int x = 5; если потом попытаешься засунуть туда строку, программа </w:t>
       </w:r>
       <w:r>
@@ -21475,6 +21719,7 @@
           <w:sz w:val="18"/>
           <w:szCs w:val="18"/>
         </w:rPr>
+        <w:lastRenderedPageBreak/>
         <w:t>Тип </w:t>
       </w:r>
       <w:r>
@@ -22519,7 +22764,6 @@
                 <w:sz w:val="18"/>
                 <w:szCs w:val="18"/>
               </w:rPr>
-              <w:lastRenderedPageBreak/>
               <w:t>Можно только создать новый объект и перепривязать на него переменную.</w:t>
             </w:r>
           </w:p>
@@ -22624,7 +22868,6 @@
                 <w:szCs w:val="18"/>
                 <w:lang w:val="en-US"/>
               </w:rPr>
-              <w:lastRenderedPageBreak/>
               <w:t>list</w:t>
             </w:r>
           </w:p>
@@ -22753,7 +22996,6 @@
               <w:rPr>
                 <w:noProof/>
               </w:rPr>
-              <w:lastRenderedPageBreak/>
               <w:drawing>
                 <wp:inline distT="0" distB="0" distL="0" distR="0" wp14:anchorId="7E9D4411" wp14:editId="40589540">
                   <wp:extent cx="1408025" cy="542925"/>
@@ -23088,6 +23330,7 @@
           <w:sz w:val="18"/>
           <w:szCs w:val="18"/>
         </w:rPr>
+        <w:lastRenderedPageBreak/>
         <w:t>Ты </w:t>
       </w:r>
       <w:r>
@@ -23790,7 +24033,6 @@
                 <w:sz w:val="18"/>
                 <w:szCs w:val="18"/>
               </w:rPr>
-              <w:lastRenderedPageBreak/>
               <w:t>A</w:t>
             </w:r>
           </w:p>
@@ -24465,6 +24707,7 @@
                 <w:sz w:val="18"/>
                 <w:szCs w:val="18"/>
               </w:rPr>
+              <w:lastRenderedPageBreak/>
               <w:t>True</w:t>
             </w:r>
           </w:p>
@@ -25851,7 +26094,6 @@
           <w:sz w:val="18"/>
           <w:szCs w:val="18"/>
         </w:rPr>
-        <w:lastRenderedPageBreak/>
         <w:t>Циклы</w:t>
       </w:r>
     </w:p>
@@ -25973,6 +26215,7 @@
         <w:rPr>
           <w:noProof/>
         </w:rPr>
+        <w:lastRenderedPageBreak/>
         <w:drawing>
           <wp:inline distT="0" distB="0" distL="0" distR="0" wp14:anchorId="092FF200" wp14:editId="76669D3C">
             <wp:extent cx="3565739" cy="1878594"/>
@@ -26479,7 +26722,6 @@
           <w:sz w:val="18"/>
           <w:szCs w:val="18"/>
         </w:rPr>
-        <w:lastRenderedPageBreak/>
         <w:t>В Python можно делать цикл for ... in ... только по "итерируемым" объектам — то есть тем, которые можно перебрать</w:t>
       </w:r>
       <w:r>
@@ -26665,6 +26907,16 @@
           <w:szCs w:val="18"/>
         </w:rPr>
         <w:br/>
+      </w:r>
+      <w:r>
+        <w:rPr>
+          <w:rFonts w:ascii="Times New Roman" w:hAnsi="Times New Roman" w:cs="Times New Roman"/>
+          <w:color w:val="000000" w:themeColor="text1"/>
+          <w:spacing w:val="-1"/>
+          <w:sz w:val="18"/>
+          <w:szCs w:val="18"/>
+        </w:rPr>
+        <w:lastRenderedPageBreak/>
         <w:t xml:space="preserve">    </w:t>
       </w:r>
       <w:r>
@@ -33326,6 +33578,31 @@
         </w:rPr>
         <w:t>:</w:t>
       </w:r>
+      <w:hyperlink r:id="rId74" w:history="1">
+        <w:r>
+          <w:rPr>
+            <w:rStyle w:val="a3"/>
+            <w:rFonts w:ascii="Times New Roman" w:hAnsi="Times New Roman" w:cs="Times New Roman"/>
+            <w:b/>
+            <w:bCs/>
+            <w:sz w:val="18"/>
+            <w:szCs w:val="18"/>
+            <w:lang w:val="en-US"/>
+          </w:rPr>
+          <w:t xml:space="preserve"> </w:t>
+        </w:r>
+        <w:r>
+          <w:rPr>
+            <w:rStyle w:val="a3"/>
+            <w:rFonts w:ascii="Times New Roman" w:hAnsi="Times New Roman" w:cs="Times New Roman"/>
+            <w:b/>
+            <w:bCs/>
+            <w:sz w:val="18"/>
+            <w:szCs w:val="18"/>
+          </w:rPr>
+          <w:t>ссылка</w:t>
+        </w:r>
+      </w:hyperlink>
     </w:p>
     <w:p>
       <w:pPr>
@@ -33355,7 +33632,6 @@
           <w:color w:val="595959" w:themeColor="text1" w:themeTint="A6"/>
           <w:sz w:val="18"/>
           <w:szCs w:val="18"/>
-          <w:lang w:val="en-US"/>
         </w:rPr>
       </w:pPr>
     </w:p>
@@ -33969,8 +34245,8 @@
       </w:pPr>
     </w:p>
     <w:sectPr>
-      <w:headerReference w:type="default" r:id="rId74"/>
-      <w:footerReference w:type="default" r:id="rId75"/>
+      <w:headerReference w:type="default" r:id="rId75"/>
+      <w:footerReference w:type="default" r:id="rId76"/>
       <w:pgSz w:w="12240" w:h="20160" w:code="5"/>
       <w:pgMar w:top="1134" w:right="850" w:bottom="1134" w:left="1701" w:header="283" w:footer="397" w:gutter="0"/>
       <w:pgNumType w:start="1"/>
@@ -45710,6 +45986,7 @@
   <w:style w:type="character" w:default="1" w:styleId="a0">
     <w:name w:val="Default Paragraph Font"/>
     <w:uiPriority w:val="1"/>
+    <w:semiHidden/>
     <w:unhideWhenUsed/>
   </w:style>
   <w:style w:type="table" w:default="1" w:styleId="a1">

</xml_diff>

<commit_message>
15.09.26            List changes: Tuples
</commit_message>
<xml_diff>
--- a/AQA/Теория/📝 aqa подготовка.docx
+++ b/AQA/Теория/📝 aqa подготовка.docx
@@ -1320,27 +1320,7 @@
             <w:sz w:val="20"/>
             <w:szCs w:val="20"/>
           </w:rPr>
-          <w:t>Структуры д</w:t>
-        </w:r>
-        <w:r>
-          <w:rPr>
-            <w:rStyle w:val="a3"/>
-            <w:rFonts w:ascii="Times New Roman" w:hAnsi="Times New Roman" w:cs="Times New Roman"/>
-            <w:color w:val="595959" w:themeColor="text1" w:themeTint="A6"/>
-            <w:sz w:val="20"/>
-            <w:szCs w:val="20"/>
-          </w:rPr>
-          <w:t>а</w:t>
-        </w:r>
-        <w:r>
-          <w:rPr>
-            <w:rStyle w:val="a3"/>
-            <w:rFonts w:ascii="Times New Roman" w:hAnsi="Times New Roman" w:cs="Times New Roman"/>
-            <w:color w:val="595959" w:themeColor="text1" w:themeTint="A6"/>
-            <w:sz w:val="20"/>
-            <w:szCs w:val="20"/>
-          </w:rPr>
-          <w:t>нных</w:t>
+          <w:t>Структуры данных</w:t>
         </w:r>
       </w:hyperlink>
     </w:p>
@@ -1660,27 +1640,7 @@
             <w:sz w:val="20"/>
             <w:szCs w:val="20"/>
           </w:rPr>
-          <w:t xml:space="preserve"> Словари (</w:t>
-        </w:r>
-        <w:r>
-          <w:rPr>
-            <w:rStyle w:val="a3"/>
-            <w:rFonts w:ascii="Times New Roman" w:hAnsi="Times New Roman" w:cs="Times New Roman"/>
-            <w:color w:val="595959" w:themeColor="text1" w:themeTint="A6"/>
-            <w:sz w:val="20"/>
-            <w:szCs w:val="20"/>
-          </w:rPr>
-          <w:t>d</w:t>
-        </w:r>
-        <w:r>
-          <w:rPr>
-            <w:rStyle w:val="a3"/>
-            <w:rFonts w:ascii="Times New Roman" w:hAnsi="Times New Roman" w:cs="Times New Roman"/>
-            <w:color w:val="595959" w:themeColor="text1" w:themeTint="A6"/>
-            <w:sz w:val="20"/>
-            <w:szCs w:val="20"/>
-          </w:rPr>
-          <w:t>ict)</w:t>
+          <w:t xml:space="preserve"> Словари (dict)</w:t>
         </w:r>
       </w:hyperlink>
     </w:p>
@@ -2013,7 +1973,6 @@
           <w:b/>
           <w:bCs/>
           <w:color w:val="595959" w:themeColor="text1" w:themeTint="A6"/>
-          <w:lang w:val="en-US"/>
         </w:rPr>
       </w:pPr>
       <w:r>
@@ -2035,7 +1994,6 @@
           <w:b/>
           <w:bCs/>
           <w:color w:val="595959" w:themeColor="text1" w:themeTint="A6"/>
-          <w:lang w:val="en-US"/>
         </w:rPr>
       </w:pPr>
     </w:p>
@@ -2048,7 +2006,6 @@
           <w:b/>
           <w:bCs/>
           <w:color w:val="595959" w:themeColor="text1" w:themeTint="A6"/>
-          <w:lang w:val="en-US"/>
         </w:rPr>
       </w:pPr>
     </w:p>
@@ -2061,7 +2018,6 @@
           <w:b/>
           <w:bCs/>
           <w:color w:val="595959" w:themeColor="text1" w:themeTint="A6"/>
-          <w:lang w:val="en-US"/>
         </w:rPr>
       </w:pPr>
     </w:p>
@@ -3442,7 +3398,25 @@
           <w:sz w:val="18"/>
           <w:szCs w:val="18"/>
         </w:rPr>
-        <w:t>. Продолжая тему примера с телефоном: проверил уведомления (пока смотрел</w:t>
+        <w:t>. Продолжая тему примера с телефоном</w:t>
+      </w:r>
+      <w:proofErr w:type="gramStart"/>
+      <w:r>
+        <w:rPr>
+          <w:rFonts w:ascii="Century Schoolbook" w:hAnsi="Century Schoolbook" w:cs="Times New Roman"/>
+          <w:sz w:val="18"/>
+          <w:szCs w:val="18"/>
+        </w:rPr>
+        <w:t>:</w:t>
+      </w:r>
+      <w:proofErr w:type="gramEnd"/>
+      <w:r>
+        <w:rPr>
+          <w:rFonts w:ascii="Century Schoolbook" w:hAnsi="Century Schoolbook" w:cs="Times New Roman"/>
+          <w:sz w:val="18"/>
+          <w:szCs w:val="18"/>
+        </w:rPr>
+        <w:t xml:space="preserve"> проверил уведомления (пока смотрел</w:t>
       </w:r>
       <w:r>
         <w:rPr>
@@ -14480,7 +14454,6 @@
           <w:b/>
           <w:bCs/>
           <w:color w:val="595959" w:themeColor="text1" w:themeTint="A6"/>
-          <w:lang w:val="en-US"/>
           <w14:shadow w14:blurRad="114300" w14:dist="0" w14:dir="0" w14:sx="0" w14:sy="0" w14:kx="0" w14:ky="0" w14:algn="none">
             <w14:srgbClr w14:val="000000"/>
           </w14:shadow>
@@ -14496,7 +14469,6 @@
           <w:b/>
           <w:bCs/>
           <w:color w:val="595959" w:themeColor="text1" w:themeTint="A6"/>
-          <w:lang w:val="en-US"/>
           <w14:shadow w14:blurRad="114300" w14:dist="0" w14:dir="0" w14:sx="0" w14:sy="0" w14:kx="0" w14:ky="0" w14:algn="none">
             <w14:srgbClr w14:val="000000"/>
           </w14:shadow>
@@ -14512,7 +14484,6 @@
           <w:b/>
           <w:bCs/>
           <w:color w:val="595959" w:themeColor="text1" w:themeTint="A6"/>
-          <w:lang w:val="en-US"/>
           <w14:shadow w14:blurRad="114300" w14:dist="0" w14:dir="0" w14:sx="0" w14:sy="0" w14:kx="0" w14:ky="0" w14:algn="none">
             <w14:srgbClr w14:val="000000"/>
           </w14:shadow>
@@ -14528,7 +14499,6 @@
           <w:b/>
           <w:bCs/>
           <w:color w:val="595959" w:themeColor="text1" w:themeTint="A6"/>
-          <w:lang w:val="en-US"/>
           <w14:shadow w14:blurRad="114300" w14:dist="0" w14:dir="0" w14:sx="0" w14:sy="0" w14:kx="0" w14:ky="0" w14:algn="none">
             <w14:srgbClr w14:val="000000"/>
           </w14:shadow>
@@ -14544,7 +14514,6 @@
           <w:b/>
           <w:bCs/>
           <w:color w:val="595959" w:themeColor="text1" w:themeTint="A6"/>
-          <w:lang w:val="en-US"/>
           <w14:shadow w14:blurRad="114300" w14:dist="0" w14:dir="0" w14:sx="0" w14:sy="0" w14:kx="0" w14:ky="0" w14:algn="none">
             <w14:srgbClr w14:val="000000"/>
           </w14:shadow>
@@ -33587,7 +33556,6 @@
             <w:bCs/>
             <w:sz w:val="18"/>
             <w:szCs w:val="18"/>
-            <w:lang w:val="en-US"/>
           </w:rPr>
           <w:t xml:space="preserve"> </w:t>
         </w:r>
@@ -33619,6 +33587,524 @@
       <w:pPr>
         <w:rPr>
           <w:rFonts w:ascii="Times New Roman" w:hAnsi="Times New Roman" w:cs="Times New Roman"/>
+          <w:b/>
+          <w:bCs/>
+          <w:color w:val="595959" w:themeColor="text1" w:themeTint="A6"/>
+          <w:sz w:val="18"/>
+          <w:szCs w:val="18"/>
+        </w:rPr>
+      </w:pPr>
+      <w:r>
+        <w:rPr>
+          <w:rFonts w:ascii="Times New Roman" w:hAnsi="Times New Roman" w:cs="Times New Roman"/>
+          <w:b/>
+          <w:bCs/>
+          <w:color w:val="595959" w:themeColor="text1" w:themeTint="A6"/>
+          <w:sz w:val="18"/>
+          <w:szCs w:val="18"/>
+        </w:rPr>
+        <w:t>Вопросы на закрепление</w:t>
+      </w:r>
+    </w:p>
+    <w:p>
+      <w:pPr>
+        <w:numPr>
+          <w:ilvl w:val="0"/>
+          <w:numId w:val="81"/>
+        </w:numPr>
+        <w:rPr>
+          <w:rFonts w:ascii="Times New Roman" w:hAnsi="Times New Roman" w:cs="Times New Roman"/>
+          <w:color w:val="595959" w:themeColor="text1" w:themeTint="A6"/>
+          <w:sz w:val="18"/>
+          <w:szCs w:val="18"/>
+        </w:rPr>
+      </w:pPr>
+      <w:r>
+        <w:rPr>
+          <w:rFonts w:ascii="Times New Roman" w:hAnsi="Times New Roman" w:cs="Times New Roman"/>
+          <w:color w:val="595959" w:themeColor="text1" w:themeTint="A6"/>
+          <w:sz w:val="18"/>
+          <w:szCs w:val="18"/>
+        </w:rPr>
+        <w:t>Почему мы используем .strip() после input()? Что будет, если его не использовать?</w:t>
+      </w:r>
+    </w:p>
+    <w:p>
+      <w:pPr>
+        <w:rPr>
+          <w:rFonts w:ascii="Times New Roman" w:hAnsi="Times New Roman" w:cs="Times New Roman"/>
+          <w:color w:val="595959" w:themeColor="text1" w:themeTint="A6"/>
+          <w:sz w:val="18"/>
+          <w:szCs w:val="18"/>
+        </w:rPr>
+      </w:pPr>
+      <w:r>
+        <w:rPr>
+          <w:rFonts w:ascii="Times New Roman" w:hAnsi="Times New Roman" w:cs="Times New Roman"/>
+          <w:color w:val="595959" w:themeColor="text1" w:themeTint="A6"/>
+          <w:sz w:val="18"/>
+          <w:szCs w:val="18"/>
+        </w:rPr>
+        <w:t>Для того чтобы убрать пробелы в начале и в конце строки, таким образом мы гарантируем валидацию данных если на вход программа получит одни пробелы</w:t>
+      </w:r>
+    </w:p>
+    <w:p>
+      <w:pPr>
+        <w:numPr>
+          <w:ilvl w:val="0"/>
+          <w:numId w:val="81"/>
+        </w:numPr>
+        <w:rPr>
+          <w:rFonts w:ascii="Times New Roman" w:hAnsi="Times New Roman" w:cs="Times New Roman"/>
+          <w:color w:val="595959" w:themeColor="text1" w:themeTint="A6"/>
+          <w:sz w:val="18"/>
+          <w:szCs w:val="18"/>
+        </w:rPr>
+      </w:pPr>
+      <w:r>
+        <w:rPr>
+          <w:rFonts w:ascii="Times New Roman" w:hAnsi="Times New Roman" w:cs="Times New Roman"/>
+          <w:color w:val="595959" w:themeColor="text1" w:themeTint="A6"/>
+          <w:sz w:val="18"/>
+          <w:szCs w:val="18"/>
+        </w:rPr>
+        <w:t>В чём преимущество использования char_count.get(char, 0) + 1 по сравнению с твоим предыдущим вариантом (if char in char_count)?</w:t>
+      </w:r>
+    </w:p>
+    <w:p>
+      <w:pPr>
+        <w:rPr>
+          <w:rFonts w:ascii="Times New Roman" w:hAnsi="Times New Roman" w:cs="Times New Roman"/>
+          <w:color w:val="595959" w:themeColor="text1" w:themeTint="A6"/>
+          <w:sz w:val="18"/>
+          <w:szCs w:val="18"/>
+        </w:rPr>
+      </w:pPr>
+      <w:r>
+        <w:rPr>
+          <w:rFonts w:ascii="Times New Roman" w:hAnsi="Times New Roman" w:cs="Times New Roman"/>
+          <w:color w:val="595959" w:themeColor="text1" w:themeTint="A6"/>
+          <w:sz w:val="18"/>
+          <w:szCs w:val="18"/>
+        </w:rPr>
+        <w:t>В том что метод</w:t>
+      </w:r>
+      <w:r>
+        <w:rPr>
+          <w:rFonts w:ascii="Times New Roman" w:hAnsi="Times New Roman" w:cs="Times New Roman"/>
+          <w:color w:val="595959" w:themeColor="text1" w:themeTint="A6"/>
+          <w:sz w:val="18"/>
+          <w:szCs w:val="18"/>
+        </w:rPr>
+        <w:t xml:space="preserve"> словаря</w:t>
+      </w:r>
+      <w:r>
+        <w:rPr>
+          <w:rFonts w:ascii="Times New Roman" w:hAnsi="Times New Roman" w:cs="Times New Roman"/>
+          <w:color w:val="595959" w:themeColor="text1" w:themeTint="A6"/>
+          <w:sz w:val="18"/>
+          <w:szCs w:val="18"/>
+        </w:rPr>
+        <w:t xml:space="preserve"> .</w:t>
+      </w:r>
+      <w:r>
+        <w:rPr>
+          <w:rFonts w:ascii="Times New Roman" w:hAnsi="Times New Roman" w:cs="Times New Roman"/>
+          <w:color w:val="595959" w:themeColor="text1" w:themeTint="A6"/>
+          <w:sz w:val="18"/>
+          <w:szCs w:val="18"/>
+          <w:lang w:val="en-US"/>
+        </w:rPr>
+        <w:t>get</w:t>
+      </w:r>
+      <w:r>
+        <w:rPr>
+          <w:rFonts w:ascii="Times New Roman" w:hAnsi="Times New Roman" w:cs="Times New Roman"/>
+          <w:color w:val="595959" w:themeColor="text1" w:themeTint="A6"/>
+          <w:sz w:val="18"/>
+          <w:szCs w:val="18"/>
+        </w:rPr>
+        <w:t>()</w:t>
+      </w:r>
+      <w:r>
+        <w:rPr>
+          <w:rFonts w:ascii="Times New Roman" w:hAnsi="Times New Roman" w:cs="Times New Roman"/>
+          <w:color w:val="595959" w:themeColor="text1" w:themeTint="A6"/>
+          <w:sz w:val="18"/>
+          <w:szCs w:val="18"/>
+        </w:rPr>
+        <w:t xml:space="preserve"> </w:t>
+      </w:r>
+      <w:r>
+        <w:rPr>
+          <w:rFonts w:ascii="Times New Roman" w:hAnsi="Times New Roman" w:cs="Times New Roman"/>
+          <w:color w:val="595959" w:themeColor="text1" w:themeTint="A6"/>
+          <w:sz w:val="18"/>
+          <w:szCs w:val="18"/>
+        </w:rPr>
+        <w:t xml:space="preserve">это более </w:t>
+      </w:r>
+      <w:r>
+        <w:rPr>
+          <w:rFonts w:ascii="Times New Roman" w:hAnsi="Times New Roman" w:cs="Times New Roman"/>
+          <w:color w:val="595959" w:themeColor="text1" w:themeTint="A6"/>
+          <w:sz w:val="18"/>
+          <w:szCs w:val="18"/>
+        </w:rPr>
+        <w:t>м</w:t>
+      </w:r>
+      <w:r>
+        <w:rPr>
+          <w:rFonts w:ascii="Times New Roman" w:hAnsi="Times New Roman" w:cs="Times New Roman"/>
+          <w:color w:val="595959" w:themeColor="text1" w:themeTint="A6"/>
+          <w:sz w:val="18"/>
+          <w:szCs w:val="18"/>
+        </w:rPr>
+        <w:t>ягкий и безопасный способ</w:t>
+      </w:r>
+      <w:r>
+        <w:rPr>
+          <w:rFonts w:ascii="Times New Roman" w:hAnsi="Times New Roman" w:cs="Times New Roman"/>
+          <w:color w:val="595959" w:themeColor="text1" w:themeTint="A6"/>
+          <w:sz w:val="18"/>
+          <w:szCs w:val="18"/>
+        </w:rPr>
+        <w:t xml:space="preserve"> в</w:t>
+      </w:r>
+      <w:r>
+        <w:rPr>
+          <w:rFonts w:ascii="Times New Roman" w:hAnsi="Times New Roman" w:cs="Times New Roman"/>
+          <w:color w:val="595959" w:themeColor="text1" w:themeTint="A6"/>
+          <w:sz w:val="18"/>
+          <w:szCs w:val="18"/>
+        </w:rPr>
+        <w:t>ернуть</w:t>
+      </w:r>
+      <w:r>
+        <w:rPr>
+          <w:rFonts w:ascii="Times New Roman" w:hAnsi="Times New Roman" w:cs="Times New Roman"/>
+          <w:color w:val="595959" w:themeColor="text1" w:themeTint="A6"/>
+          <w:sz w:val="18"/>
+          <w:szCs w:val="18"/>
+        </w:rPr>
+        <w:t xml:space="preserve"> ключ словаря</w:t>
+      </w:r>
+      <w:r>
+        <w:rPr>
+          <w:rFonts w:ascii="Times New Roman" w:hAnsi="Times New Roman" w:cs="Times New Roman"/>
+          <w:color w:val="595959" w:themeColor="text1" w:themeTint="A6"/>
+          <w:sz w:val="18"/>
+          <w:szCs w:val="18"/>
+        </w:rPr>
+        <w:t>. Предположим,</w:t>
+      </w:r>
+      <w:r>
+        <w:rPr>
+          <w:rFonts w:ascii="Times New Roman" w:hAnsi="Times New Roman" w:cs="Times New Roman"/>
+          <w:color w:val="595959" w:themeColor="text1" w:themeTint="A6"/>
+          <w:sz w:val="18"/>
+          <w:szCs w:val="18"/>
+        </w:rPr>
+        <w:t xml:space="preserve"> если ключа не существует, </w:t>
+      </w:r>
+      <w:r>
+        <w:rPr>
+          <w:rFonts w:ascii="Times New Roman" w:hAnsi="Times New Roman" w:cs="Times New Roman"/>
+          <w:color w:val="595959" w:themeColor="text1" w:themeTint="A6"/>
+          <w:sz w:val="18"/>
+          <w:szCs w:val="18"/>
+        </w:rPr>
+        <w:t>.</w:t>
+      </w:r>
+      <w:r>
+        <w:rPr>
+          <w:rFonts w:ascii="Times New Roman" w:hAnsi="Times New Roman" w:cs="Times New Roman"/>
+          <w:color w:val="595959" w:themeColor="text1" w:themeTint="A6"/>
+          <w:sz w:val="18"/>
+          <w:szCs w:val="18"/>
+          <w:lang w:val="en-US"/>
+        </w:rPr>
+        <w:t>get</w:t>
+      </w:r>
+      <w:r>
+        <w:rPr>
+          <w:rFonts w:ascii="Times New Roman" w:hAnsi="Times New Roman" w:cs="Times New Roman"/>
+          <w:color w:val="595959" w:themeColor="text1" w:themeTint="A6"/>
+          <w:sz w:val="18"/>
+          <w:szCs w:val="18"/>
+        </w:rPr>
+        <w:t xml:space="preserve"> </w:t>
+      </w:r>
+      <w:r>
+        <w:rPr>
+          <w:rFonts w:ascii="Times New Roman" w:hAnsi="Times New Roman" w:cs="Times New Roman"/>
+          <w:color w:val="595959" w:themeColor="text1" w:themeTint="A6"/>
+          <w:sz w:val="18"/>
+          <w:szCs w:val="18"/>
+        </w:rPr>
+        <w:t>вернёт</w:t>
+      </w:r>
+      <w:r>
+        <w:rPr>
+          <w:rFonts w:ascii="Times New Roman" w:hAnsi="Times New Roman" w:cs="Times New Roman"/>
+          <w:color w:val="595959" w:themeColor="text1" w:themeTint="A6"/>
+          <w:sz w:val="18"/>
+          <w:szCs w:val="18"/>
+        </w:rPr>
+        <w:t xml:space="preserve"> None (вместо того чтобы выбрасывать исключение), или</w:t>
+      </w:r>
+      <w:r>
+        <w:rPr>
+          <w:rFonts w:ascii="Times New Roman" w:hAnsi="Times New Roman" w:cs="Times New Roman"/>
+          <w:color w:val="595959" w:themeColor="text1" w:themeTint="A6"/>
+          <w:sz w:val="18"/>
+          <w:szCs w:val="18"/>
+        </w:rPr>
+        <w:t xml:space="preserve"> как пишут в форумах, </w:t>
+      </w:r>
+      <w:r>
+        <w:rPr>
+          <w:rFonts w:ascii="Times New Roman" w:hAnsi="Times New Roman" w:cs="Times New Roman"/>
+          <w:color w:val="595959" w:themeColor="text1" w:themeTint="A6"/>
+          <w:sz w:val="18"/>
+          <w:szCs w:val="18"/>
+        </w:rPr>
+        <w:t xml:space="preserve"> мож</w:t>
+      </w:r>
+      <w:r>
+        <w:rPr>
+          <w:rFonts w:ascii="Times New Roman" w:hAnsi="Times New Roman" w:cs="Times New Roman"/>
+          <w:color w:val="595959" w:themeColor="text1" w:themeTint="A6"/>
+          <w:sz w:val="18"/>
+          <w:szCs w:val="18"/>
+        </w:rPr>
+        <w:t>но</w:t>
+      </w:r>
+      <w:r>
+        <w:rPr>
+          <w:rFonts w:ascii="Times New Roman" w:hAnsi="Times New Roman" w:cs="Times New Roman"/>
+          <w:color w:val="595959" w:themeColor="text1" w:themeTint="A6"/>
+          <w:sz w:val="18"/>
+          <w:szCs w:val="18"/>
+        </w:rPr>
+        <w:t xml:space="preserve"> указать, какое значение вернуть в этом случае, с помощью необязательного второго аргумента</w:t>
+      </w:r>
+      <w:r>
+        <w:rPr>
+          <w:rFonts w:ascii="Times New Roman" w:hAnsi="Times New Roman" w:cs="Times New Roman"/>
+          <w:color w:val="595959" w:themeColor="text1" w:themeTint="A6"/>
+          <w:sz w:val="18"/>
+          <w:szCs w:val="18"/>
+        </w:rPr>
+        <w:t>, но я хуй знает как это сделать</w:t>
+      </w:r>
+      <w:r>
+        <w:rPr>
+          <w:rFonts w:ascii="Times New Roman" w:hAnsi="Times New Roman" w:cs="Times New Roman"/>
+          <w:color w:val="595959" w:themeColor="text1" w:themeTint="A6"/>
+          <w:sz w:val="18"/>
+          <w:szCs w:val="18"/>
+        </w:rPr>
+        <w:t>.</w:t>
+      </w:r>
+    </w:p>
+    <w:p>
+      <w:pPr>
+        <w:numPr>
+          <w:ilvl w:val="0"/>
+          <w:numId w:val="81"/>
+        </w:numPr>
+        <w:rPr>
+          <w:rFonts w:ascii="Times New Roman" w:hAnsi="Times New Roman" w:cs="Times New Roman"/>
+          <w:color w:val="595959" w:themeColor="text1" w:themeTint="A6"/>
+          <w:sz w:val="18"/>
+          <w:szCs w:val="18"/>
+        </w:rPr>
+      </w:pPr>
+      <w:r>
+        <w:rPr>
+          <w:rFonts w:ascii="Times New Roman" w:hAnsi="Times New Roman" w:cs="Times New Roman"/>
+          <w:color w:val="595959" w:themeColor="text1" w:themeTint="A6"/>
+          <w:sz w:val="18"/>
+          <w:szCs w:val="18"/>
+        </w:rPr>
+        <w:t>Зачем нужен break в конце программы? Что будет, если его убрать?</w:t>
+      </w:r>
+    </w:p>
+    <w:p>
+      <w:pPr>
+        <w:rPr>
+          <w:rFonts w:ascii="Times New Roman" w:hAnsi="Times New Roman" w:cs="Times New Roman"/>
+          <w:color w:val="595959" w:themeColor="text1" w:themeTint="A6"/>
+          <w:sz w:val="18"/>
+          <w:szCs w:val="18"/>
+          <w:lang w:val="en-US"/>
+        </w:rPr>
+      </w:pPr>
+      <w:r>
+        <w:rPr>
+          <w:rFonts w:ascii="Times New Roman" w:hAnsi="Times New Roman" w:cs="Times New Roman"/>
+          <w:color w:val="595959" w:themeColor="text1" w:themeTint="A6"/>
+          <w:sz w:val="18"/>
+          <w:szCs w:val="18"/>
+        </w:rPr>
+        <w:t xml:space="preserve">Для остановки бесконечного цикла, если его убрать цикл продолжится даже если пользователь введёт корректные данные, этот я чекнул уже в самой проге </w:t>
+      </w:r>
+      <w:r>
+        <w:rPr>
+          <mc:AlternateContent>
+            <mc:Choice Requires="w16se">
+              <w:rFonts w:ascii="Times New Roman" w:hAnsi="Times New Roman" w:cs="Times New Roman"/>
+            </mc:Choice>
+            <mc:Fallback>
+              <w:rFonts w:ascii="Segoe UI Emoji" w:eastAsia="Segoe UI Emoji" w:hAnsi="Segoe UI Emoji" w:cs="Segoe UI Emoji"/>
+            </mc:Fallback>
+          </mc:AlternateContent>
+          <w:color w:val="595959" w:themeColor="text1" w:themeTint="A6"/>
+          <w:sz w:val="18"/>
+          <w:szCs w:val="18"/>
+          <w:lang w:val="en-US"/>
+        </w:rPr>
+        <mc:AlternateContent>
+          <mc:Choice Requires="w16se">
+            <w16se:symEx w16se:font="Segoe UI Emoji" w16se:char="1F604"/>
+          </mc:Choice>
+          <mc:Fallback>
+            <w:t>😄</w:t>
+          </mc:Fallback>
+        </mc:AlternateContent>
+      </w:r>
+      <w:r>
+        <w:rPr>
+          <mc:AlternateContent>
+            <mc:Choice Requires="w16se">
+              <w:rFonts w:ascii="Times New Roman" w:hAnsi="Times New Roman" w:cs="Times New Roman"/>
+            </mc:Choice>
+            <mc:Fallback>
+              <w:rFonts w:ascii="Segoe UI Emoji" w:eastAsia="Segoe UI Emoji" w:hAnsi="Segoe UI Emoji" w:cs="Segoe UI Emoji"/>
+            </mc:Fallback>
+          </mc:AlternateContent>
+          <w:color w:val="595959" w:themeColor="text1" w:themeTint="A6"/>
+          <w:sz w:val="18"/>
+          <w:szCs w:val="18"/>
+          <w:lang w:val="en-US"/>
+        </w:rPr>
+        <mc:AlternateContent>
+          <mc:Choice Requires="w16se">
+            <w16se:symEx w16se:font="Segoe UI Emoji" w16se:char="1F60E"/>
+          </mc:Choice>
+          <mc:Fallback>
+            <w:t>😎</w:t>
+          </mc:Fallback>
+        </mc:AlternateContent>
+      </w:r>
+      <w:r>
+        <w:rPr>
+          <mc:AlternateContent>
+            <mc:Choice Requires="w16se">
+              <w:rFonts w:ascii="Times New Roman" w:hAnsi="Times New Roman" w:cs="Times New Roman"/>
+            </mc:Choice>
+            <mc:Fallback>
+              <w:rFonts w:ascii="Segoe UI Emoji" w:eastAsia="Segoe UI Emoji" w:hAnsi="Segoe UI Emoji" w:cs="Segoe UI Emoji"/>
+            </mc:Fallback>
+          </mc:AlternateContent>
+          <w:color w:val="595959" w:themeColor="text1" w:themeTint="A6"/>
+          <w:sz w:val="18"/>
+          <w:szCs w:val="18"/>
+          <w:lang w:val="en-US"/>
+        </w:rPr>
+        <mc:AlternateContent>
+          <mc:Choice Requires="w16se">
+            <w16se:symEx w16se:font="Segoe UI Emoji" w16se:char="1F47B"/>
+          </mc:Choice>
+          <mc:Fallback>
+            <w:t>👻</w:t>
+          </mc:Fallback>
+        </mc:AlternateContent>
+      </w:r>
+    </w:p>
+    <w:p>
+      <w:pPr>
+        <w:numPr>
+          <w:ilvl w:val="0"/>
+          <w:numId w:val="81"/>
+        </w:numPr>
+        <w:rPr>
+          <w:rFonts w:ascii="Times New Roman" w:hAnsi="Times New Roman" w:cs="Times New Roman"/>
+          <w:color w:val="595959" w:themeColor="text1" w:themeTint="A6"/>
+          <w:sz w:val="18"/>
+          <w:szCs w:val="18"/>
+        </w:rPr>
+      </w:pPr>
+      <w:r>
+        <w:rPr>
+          <w:rFonts w:ascii="Times New Roman" w:hAnsi="Times New Roman" w:cs="Times New Roman"/>
+          <w:color w:val="595959" w:themeColor="text1" w:themeTint="A6"/>
+          <w:sz w:val="18"/>
+          <w:szCs w:val="18"/>
+        </w:rPr>
+        <w:t>Что делает строка if not user_input:? Можно ли написать это по-другому?</w:t>
+      </w:r>
+    </w:p>
+    <w:p>
+      <w:pPr>
+        <w:rPr>
+          <w:rFonts w:ascii="Times New Roman" w:hAnsi="Times New Roman" w:cs="Times New Roman"/>
+          <w:color w:val="595959" w:themeColor="text1" w:themeTint="A6"/>
+          <w:sz w:val="18"/>
+          <w:szCs w:val="18"/>
+        </w:rPr>
+      </w:pPr>
+      <w:r>
+        <w:rPr>
+          <w:rFonts w:ascii="Times New Roman" w:hAnsi="Times New Roman" w:cs="Times New Roman"/>
+          <w:color w:val="595959" w:themeColor="text1" w:themeTint="A6"/>
+          <w:sz w:val="18"/>
+          <w:szCs w:val="18"/>
+        </w:rPr>
+        <w:t xml:space="preserve">Проверяет ввел ли пользователь какой-либо символ, можно написать ещё вот так: </w:t>
+      </w:r>
+      <w:r>
+        <w:rPr>
+          <w:rFonts w:ascii="Times New Roman" w:hAnsi="Times New Roman" w:cs="Times New Roman"/>
+          <w:color w:val="595959" w:themeColor="text1" w:themeTint="A6"/>
+          <w:sz w:val="18"/>
+          <w:szCs w:val="18"/>
+        </w:rPr>
+        <w:t>if user_input == "":</w:t>
+      </w:r>
+      <w:r>
+        <w:rPr>
+          <w:rFonts w:ascii="Times New Roman" w:hAnsi="Times New Roman" w:cs="Times New Roman"/>
+          <w:color w:val="595959" w:themeColor="text1" w:themeTint="A6"/>
+          <w:sz w:val="18"/>
+          <w:szCs w:val="18"/>
+        </w:rPr>
+        <w:t xml:space="preserve"> это идентично </w:t>
+      </w:r>
+      <w:r>
+        <w:rPr>
+          <w:rFonts w:ascii="Times New Roman" w:hAnsi="Times New Roman" w:cs="Times New Roman"/>
+          <w:color w:val="595959" w:themeColor="text1" w:themeTint="A6"/>
+          <w:sz w:val="18"/>
+          <w:szCs w:val="18"/>
+        </w:rPr>
+        <w:t>тому,</w:t>
+      </w:r>
+      <w:r>
+        <w:rPr>
+          <w:rFonts w:ascii="Times New Roman" w:hAnsi="Times New Roman" w:cs="Times New Roman"/>
+          <w:color w:val="595959" w:themeColor="text1" w:themeTint="A6"/>
+          <w:sz w:val="18"/>
+          <w:szCs w:val="18"/>
+        </w:rPr>
+        <w:t xml:space="preserve"> что и сейчас в текущей реализации</w:t>
+      </w:r>
+    </w:p>
+    <w:p>
+      <w:pPr>
+        <w:rPr>
+          <w:rFonts w:ascii="Times New Roman" w:hAnsi="Times New Roman" w:cs="Times New Roman"/>
           <w:color w:val="595959" w:themeColor="text1" w:themeTint="A6"/>
           <w:sz w:val="18"/>
           <w:szCs w:val="18"/>
@@ -33645,6 +34131,7 @@
           <w:color w:val="767171" w:themeColor="background2" w:themeShade="80"/>
           <w:sz w:val="24"/>
           <w:szCs w:val="24"/>
+          <w:lang w:val="en-US"/>
         </w:rPr>
       </w:pPr>
       <w:bookmarkStart w:id="16" w:name="_5_-_Кортежи"/>
@@ -33714,6 +34201,101 @@
         <w:spacing w:after="0"/>
         <w:jc w:val="center"/>
         <w:rPr>
+          <w:rFonts w:ascii="Century Schoolbook" w:hAnsi="Century Schoolbook" w:cs="Times New Roman"/>
+          <w:b/>
+          <w:bCs/>
+          <w:color w:val="767171" w:themeColor="background2" w:themeShade="80"/>
+          <w:sz w:val="18"/>
+          <w:szCs w:val="18"/>
+        </w:rPr>
+      </w:pPr>
+      <w:r>
+        <w:rPr>
+          <w:rFonts w:ascii="Century Schoolbook" w:hAnsi="Century Schoolbook" w:cs="Times New Roman"/>
+          <w:b/>
+          <w:bCs/>
+          <w:color w:val="7F7F7F" w:themeColor="text1" w:themeTint="80"/>
+          <w:sz w:val="18"/>
+          <w:szCs w:val="18"/>
+        </w:rPr>
+        <w:t>Теория</w:t>
+      </w:r>
+      <w:r>
+        <w:rPr>
+          <w:rFonts w:ascii="Century Schoolbook" w:hAnsi="Century Schoolbook" w:cs="Times New Roman"/>
+          <w:b/>
+          <w:bCs/>
+          <w:color w:val="767171" w:themeColor="background2" w:themeShade="80"/>
+          <w:sz w:val="18"/>
+          <w:szCs w:val="18"/>
+        </w:rPr>
+        <w:t>:</w:t>
+      </w:r>
+    </w:p>
+    <w:p>
+      <w:pPr>
+        <w:jc w:val="center"/>
+        <w:rPr>
+          <w:rFonts w:ascii="Century Schoolbook" w:hAnsi="Century Schoolbook" w:cs="Times New Roman"/>
+          <w:b/>
+          <w:bCs/>
+          <w:color w:val="767171" w:themeColor="background2" w:themeShade="80"/>
+          <w:sz w:val="18"/>
+          <w:szCs w:val="18"/>
+        </w:rPr>
+      </w:pPr>
+      <w:r>
+        <w:rPr>
+          <w:rFonts w:ascii="Century Schoolbook" w:hAnsi="Century Schoolbook" w:cs="Times New Roman"/>
+          <w:b/>
+          <w:bCs/>
+          <w:color w:val="767171" w:themeColor="background2" w:themeShade="80"/>
+          <w:sz w:val="18"/>
+          <w:szCs w:val="18"/>
+        </w:rPr>
+        <w:t xml:space="preserve">Кортежи: </w:t>
+      </w:r>
+      <w:hyperlink r:id="rId75" w:history="1">
+        <w:r>
+          <w:rPr>
+            <w:rStyle w:val="a3"/>
+            <w:rFonts w:ascii="Century Schoolbook" w:hAnsi="Century Schoolbook" w:cs="Times New Roman"/>
+            <w:b/>
+            <w:bCs/>
+            <w:sz w:val="18"/>
+            <w:szCs w:val="18"/>
+          </w:rPr>
+          <w:t>ссыл</w:t>
+        </w:r>
+        <w:r>
+          <w:rPr>
+            <w:rStyle w:val="a3"/>
+            <w:rFonts w:ascii="Century Schoolbook" w:hAnsi="Century Schoolbook" w:cs="Times New Roman"/>
+            <w:b/>
+            <w:bCs/>
+            <w:sz w:val="18"/>
+            <w:szCs w:val="18"/>
+          </w:rPr>
+          <w:t>к</w:t>
+        </w:r>
+        <w:r>
+          <w:rPr>
+            <w:rStyle w:val="a3"/>
+            <w:rFonts w:ascii="Century Schoolbook" w:hAnsi="Century Schoolbook" w:cs="Times New Roman"/>
+            <w:b/>
+            <w:bCs/>
+            <w:sz w:val="18"/>
+            <w:szCs w:val="18"/>
+          </w:rPr>
+          <w:t>а</w:t>
+        </w:r>
+      </w:hyperlink>
+    </w:p>
+    <w:p>
+      <w:pPr>
+        <w:spacing w:after="0"/>
+        <w:jc w:val="center"/>
+        <w:rPr>
           <w:rFonts w:ascii="Times New Roman" w:hAnsi="Times New Roman" w:cs="Times New Roman"/>
           <w:color w:val="595959" w:themeColor="text1" w:themeTint="A6"/>
           <w:sz w:val="18"/>
@@ -33844,13 +34426,37 @@
     </w:p>
     <w:p>
       <w:pPr>
-        <w:rPr>
-          <w:rFonts w:ascii="Times New Roman" w:hAnsi="Times New Roman" w:cs="Times New Roman"/>
-          <w:color w:val="595959" w:themeColor="text1" w:themeTint="A6"/>
-          <w:sz w:val="18"/>
-          <w:szCs w:val="18"/>
-        </w:rPr>
-      </w:pPr>
+        <w:spacing w:after="0"/>
+        <w:jc w:val="center"/>
+        <w:rPr>
+          <w:rFonts w:ascii="Times New Roman" w:hAnsi="Times New Roman" w:cs="Times New Roman"/>
+          <w:color w:val="595959" w:themeColor="text1" w:themeTint="A6"/>
+          <w:sz w:val="18"/>
+          <w:szCs w:val="18"/>
+        </w:rPr>
+      </w:pPr>
+      <w:r>
+        <w:rPr>
+          <w:rFonts w:ascii="Times New Roman" w:hAnsi="Times New Roman" w:cs="Times New Roman"/>
+          <w:b/>
+          <w:bCs/>
+          <w:color w:val="C00000"/>
+          <w:sz w:val="18"/>
+          <w:szCs w:val="18"/>
+        </w:rPr>
+        <w:t>Задача:</w:t>
+      </w:r>
+      <w:r>
+        <w:rPr>
+          <w:rFonts w:ascii="Times New Roman" w:hAnsi="Times New Roman" w:cs="Times New Roman"/>
+          <w:b/>
+          <w:bCs/>
+          <w:color w:val="C00000"/>
+          <w:sz w:val="18"/>
+          <w:szCs w:val="18"/>
+        </w:rPr>
+        <w:t xml:space="preserve"> </w:t>
+      </w:r>
       <w:r>
         <w:rPr>
           <w:rFonts w:ascii="Times New Roman" w:hAnsi="Times New Roman" w:cs="Times New Roman"/>
@@ -33869,7 +34475,63 @@
           <w:sz w:val="18"/>
           <w:szCs w:val="18"/>
         </w:rPr>
-        <w:t>: Даны два списка: [1, 2, 3, 4] и [3, 4, 5, 6]. Найдите их пересечение, объединение и разность.</w:t>
+        <w:t>:</w:t>
+      </w:r>
+    </w:p>
+    <w:p>
+      <w:pPr>
+        <w:jc w:val="center"/>
+        <w:rPr>
+          <w:rFonts w:ascii="Times New Roman" w:hAnsi="Times New Roman" w:cs="Times New Roman"/>
+          <w:color w:val="595959" w:themeColor="text1" w:themeTint="A6"/>
+          <w:sz w:val="18"/>
+          <w:szCs w:val="18"/>
+        </w:rPr>
+      </w:pPr>
+      <w:r>
+        <w:rPr>
+          <w:rFonts w:ascii="Times New Roman" w:hAnsi="Times New Roman" w:cs="Times New Roman"/>
+          <w:color w:val="595959" w:themeColor="text1" w:themeTint="A6"/>
+          <w:sz w:val="18"/>
+          <w:szCs w:val="18"/>
+        </w:rPr>
+        <w:t>Даны два списка: [1, 2, 3, 4] и [3, 4, 5, 6]. Найдите их пересечение, объединение и разность.</w:t>
+      </w:r>
+    </w:p>
+    <w:p>
+      <w:pPr>
+        <w:pBdr>
+          <w:bottom w:val="single" w:sz="12" w:space="1" w:color="auto"/>
+        </w:pBdr>
+        <w:rPr>
+          <w:rFonts w:ascii="Times New Roman" w:hAnsi="Times New Roman" w:cs="Times New Roman"/>
+          <w:color w:val="595959" w:themeColor="text1" w:themeTint="A6"/>
+          <w:sz w:val="18"/>
+          <w:szCs w:val="18"/>
+          <w:lang w:val="en-US"/>
+        </w:rPr>
+      </w:pPr>
+      <w:r>
+        <w:rPr>
+          <w:rFonts w:ascii="Times New Roman" w:hAnsi="Times New Roman" w:cs="Times New Roman"/>
+          <w:b/>
+          <w:bCs/>
+          <w:color w:val="595959" w:themeColor="text1" w:themeTint="A6"/>
+          <w:sz w:val="18"/>
+          <w:szCs w:val="18"/>
+        </w:rPr>
+        <w:t>РЕШЕНИЕ</w:t>
+      </w:r>
+      <w:r>
+        <w:rPr>
+          <w:rFonts w:ascii="Times New Roman" w:hAnsi="Times New Roman" w:cs="Times New Roman"/>
+          <w:b/>
+          <w:bCs/>
+          <w:color w:val="595959" w:themeColor="text1" w:themeTint="A6"/>
+          <w:sz w:val="18"/>
+          <w:szCs w:val="18"/>
+        </w:rPr>
+        <w:t>:</w:t>
       </w:r>
     </w:p>
     <w:p>
@@ -34019,6 +34681,7 @@
           <w:sz w:val="18"/>
           <w:szCs w:val="18"/>
         </w:rPr>
+        <w:lastRenderedPageBreak/>
         <w:t>Напишите функцию, которая принимает объект и выводит его тип, используя type().</w:t>
       </w:r>
     </w:p>
@@ -34245,8 +34908,8 @@
       </w:pPr>
     </w:p>
     <w:sectPr>
-      <w:headerReference w:type="default" r:id="rId75"/>
-      <w:footerReference w:type="default" r:id="rId76"/>
+      <w:headerReference w:type="default" r:id="rId76"/>
+      <w:footerReference w:type="default" r:id="rId77"/>
       <w:pgSz w:w="12240" w:h="20160" w:code="5"/>
       <w:pgMar w:top="1134" w:right="850" w:bottom="1134" w:left="1701" w:header="283" w:footer="397" w:gutter="0"/>
       <w:pgNumType w:start="1"/>
@@ -44936,6 +45599,119 @@
     </w:lvl>
   </w:abstractNum>
   <w:abstractNum w:abstractNumId="78" w15:restartNumberingAfterBreak="0">
+    <w:nsid w:val="7B2F1B4B"/>
+    <w:multiLevelType w:val="multilevel"/>
+    <w:tmpl w:val="6FCA332C"/>
+    <w:lvl w:ilvl="0">
+      <w:start w:val="1"/>
+      <w:numFmt w:val="decimal"/>
+      <w:lvlText w:val="%1."/>
+      <w:lvlJc w:val="left"/>
+      <w:pPr>
+        <w:tabs>
+          <w:tab w:val="num" w:pos="720"/>
+        </w:tabs>
+        <w:ind w:left="720" w:hanging="360"/>
+      </w:pPr>
+    </w:lvl>
+    <w:lvl w:ilvl="1" w:tentative="1">
+      <w:start w:val="1"/>
+      <w:numFmt w:val="decimal"/>
+      <w:lvlText w:val="%2."/>
+      <w:lvlJc w:val="left"/>
+      <w:pPr>
+        <w:tabs>
+          <w:tab w:val="num" w:pos="1440"/>
+        </w:tabs>
+        <w:ind w:left="1440" w:hanging="360"/>
+      </w:pPr>
+    </w:lvl>
+    <w:lvl w:ilvl="2" w:tentative="1">
+      <w:start w:val="1"/>
+      <w:numFmt w:val="decimal"/>
+      <w:lvlText w:val="%3."/>
+      <w:lvlJc w:val="left"/>
+      <w:pPr>
+        <w:tabs>
+          <w:tab w:val="num" w:pos="2160"/>
+        </w:tabs>
+        <w:ind w:left="2160" w:hanging="360"/>
+      </w:pPr>
+    </w:lvl>
+    <w:lvl w:ilvl="3" w:tentative="1">
+      <w:start w:val="1"/>
+      <w:numFmt w:val="decimal"/>
+      <w:lvlText w:val="%4."/>
+      <w:lvlJc w:val="left"/>
+      <w:pPr>
+        <w:tabs>
+          <w:tab w:val="num" w:pos="2880"/>
+        </w:tabs>
+        <w:ind w:left="2880" w:hanging="360"/>
+      </w:pPr>
+    </w:lvl>
+    <w:lvl w:ilvl="4" w:tentative="1">
+      <w:start w:val="1"/>
+      <w:numFmt w:val="decimal"/>
+      <w:lvlText w:val="%5."/>
+      <w:lvlJc w:val="left"/>
+      <w:pPr>
+        <w:tabs>
+          <w:tab w:val="num" w:pos="3600"/>
+        </w:tabs>
+        <w:ind w:left="3600" w:hanging="360"/>
+      </w:pPr>
+    </w:lvl>
+    <w:lvl w:ilvl="5" w:tentative="1">
+      <w:start w:val="1"/>
+      <w:numFmt w:val="decimal"/>
+      <w:lvlText w:val="%6."/>
+      <w:lvlJc w:val="left"/>
+      <w:pPr>
+        <w:tabs>
+          <w:tab w:val="num" w:pos="4320"/>
+        </w:tabs>
+        <w:ind w:left="4320" w:hanging="360"/>
+      </w:pPr>
+    </w:lvl>
+    <w:lvl w:ilvl="6" w:tentative="1">
+      <w:start w:val="1"/>
+      <w:numFmt w:val="decimal"/>
+      <w:lvlText w:val="%7."/>
+      <w:lvlJc w:val="left"/>
+      <w:pPr>
+        <w:tabs>
+          <w:tab w:val="num" w:pos="5040"/>
+        </w:tabs>
+        <w:ind w:left="5040" w:hanging="360"/>
+      </w:pPr>
+    </w:lvl>
+    <w:lvl w:ilvl="7" w:tentative="1">
+      <w:start w:val="1"/>
+      <w:numFmt w:val="decimal"/>
+      <w:lvlText w:val="%8."/>
+      <w:lvlJc w:val="left"/>
+      <w:pPr>
+        <w:tabs>
+          <w:tab w:val="num" w:pos="5760"/>
+        </w:tabs>
+        <w:ind w:left="5760" w:hanging="360"/>
+      </w:pPr>
+    </w:lvl>
+    <w:lvl w:ilvl="8" w:tentative="1">
+      <w:start w:val="1"/>
+      <w:numFmt w:val="decimal"/>
+      <w:lvlText w:val="%9."/>
+      <w:lvlJc w:val="left"/>
+      <w:pPr>
+        <w:tabs>
+          <w:tab w:val="num" w:pos="6480"/>
+        </w:tabs>
+        <w:ind w:left="6480" w:hanging="360"/>
+      </w:pPr>
+    </w:lvl>
+  </w:abstractNum>
+  <w:abstractNum w:abstractNumId="79" w15:restartNumberingAfterBreak="0">
     <w:nsid w:val="7F1B7409"/>
     <w:multiLevelType w:val="multilevel"/>
     <w:tmpl w:val="812289E2"/>
@@ -45084,7 +45860,7 @@
       </w:rPr>
     </w:lvl>
   </w:abstractNum>
-  <w:abstractNum w:abstractNumId="79" w15:restartNumberingAfterBreak="0">
+  <w:abstractNum w:abstractNumId="80" w15:restartNumberingAfterBreak="0">
     <w:nsid w:val="7F604749"/>
     <w:multiLevelType w:val="multilevel"/>
     <w:tmpl w:val="F6C69AC2"/>
@@ -45267,7 +46043,7 @@
     <w:abstractNumId w:val="66"/>
   </w:num>
   <w:num w:numId="12" w16cid:durableId="1177386414">
-    <w:abstractNumId w:val="79"/>
+    <w:abstractNumId w:val="80"/>
   </w:num>
   <w:num w:numId="13" w16cid:durableId="1633973990">
     <w:abstractNumId w:val="64"/>
@@ -45312,7 +46088,7 @@
     <w:abstractNumId w:val="31"/>
   </w:num>
   <w:num w:numId="27" w16cid:durableId="356124465">
-    <w:abstractNumId w:val="78"/>
+    <w:abstractNumId w:val="79"/>
   </w:num>
   <w:num w:numId="28" w16cid:durableId="438139090">
     <w:abstractNumId w:val="18"/>
@@ -45472,6 +46248,9 @@
   </w:num>
   <w:num w:numId="80" w16cid:durableId="1813134467">
     <w:abstractNumId w:val="40"/>
+  </w:num>
+  <w:num w:numId="81" w16cid:durableId="1095856623">
+    <w:abstractNumId w:val="78"/>
   </w:num>
   <w:numIdMacAtCleanup w:val="74"/>
 </w:numbering>
@@ -45986,7 +46765,6 @@
   <w:style w:type="character" w:default="1" w:styleId="a0">
     <w:name w:val="Default Paragraph Font"/>
     <w:uiPriority w:val="1"/>
-    <w:semiHidden/>
     <w:unhideWhenUsed/>
   </w:style>
   <w:style w:type="table" w:default="1" w:styleId="a1">

</xml_diff>

<commit_message>
16.09.26            List changes: tuples aqa
</commit_message>
<xml_diff>
--- a/AQA/Теория/📝 aqa подготовка.docx
+++ b/AQA/Теория/📝 aqa подготовка.docx
@@ -33751,25 +33751,7 @@
           <w:sz w:val="18"/>
           <w:szCs w:val="18"/>
         </w:rPr>
-        <w:t>м</w:t>
-      </w:r>
-      <w:r>
-        <w:rPr>
-          <w:rFonts w:ascii="Times New Roman" w:hAnsi="Times New Roman" w:cs="Times New Roman"/>
-          <w:color w:val="595959" w:themeColor="text1" w:themeTint="A6"/>
-          <w:sz w:val="18"/>
-          <w:szCs w:val="18"/>
-        </w:rPr>
-        <w:t>ягкий и безопасный способ</w:t>
-      </w:r>
-      <w:r>
-        <w:rPr>
-          <w:rFonts w:ascii="Times New Roman" w:hAnsi="Times New Roman" w:cs="Times New Roman"/>
-          <w:color w:val="595959" w:themeColor="text1" w:themeTint="A6"/>
-          <w:sz w:val="18"/>
-          <w:szCs w:val="18"/>
-        </w:rPr>
-        <w:t xml:space="preserve"> в</w:t>
+        <w:t>мягкий и безопасный способ в</w:t>
       </w:r>
       <w:r>
         <w:rPr>
@@ -33938,7 +33920,6 @@
           <w:color w:val="595959" w:themeColor="text1" w:themeTint="A6"/>
           <w:sz w:val="18"/>
           <w:szCs w:val="18"/>
-          <w:lang w:val="en-US"/>
         </w:rPr>
       </w:pPr>
       <w:r>
@@ -34131,7 +34112,6 @@
           <w:color w:val="767171" w:themeColor="background2" w:themeShade="80"/>
           <w:sz w:val="24"/>
           <w:szCs w:val="24"/>
-          <w:lang w:val="en-US"/>
         </w:rPr>
       </w:pPr>
       <w:bookmarkStart w:id="16" w:name="_5_-_Кортежи"/>
@@ -34265,35 +34245,1254 @@
             <w:sz w:val="18"/>
             <w:szCs w:val="18"/>
           </w:rPr>
-          <w:t>ссыл</w:t>
+          <w:t>ссылка</w:t>
         </w:r>
+      </w:hyperlink>
+    </w:p>
+    <w:p>
+      <w:pPr>
+        <w:spacing w:after="0"/>
+        <w:jc w:val="center"/>
+        <w:rPr>
+          <w:rFonts w:ascii="Times New Roman" w:hAnsi="Times New Roman" w:cs="Times New Roman"/>
+          <w:color w:val="595959" w:themeColor="text1" w:themeTint="A6"/>
+          <w:sz w:val="18"/>
+          <w:szCs w:val="18"/>
+        </w:rPr>
+      </w:pPr>
+      <w:r>
+        <w:rPr>
+          <w:rFonts w:ascii="Times New Roman" w:hAnsi="Times New Roman" w:cs="Times New Roman"/>
+          <w:b/>
+          <w:bCs/>
+          <w:color w:val="C00000"/>
+          <w:sz w:val="18"/>
+          <w:szCs w:val="18"/>
+        </w:rPr>
+        <w:t>Задача:</w:t>
+      </w:r>
+      <w:r>
+        <w:rPr>
+          <w:rFonts w:ascii="Times New Roman" w:hAnsi="Times New Roman" w:cs="Times New Roman"/>
+          <w:b/>
+          <w:bCs/>
+          <w:color w:val="C00000"/>
+          <w:sz w:val="18"/>
+          <w:szCs w:val="18"/>
+        </w:rPr>
+        <w:t xml:space="preserve"> </w:t>
+      </w:r>
+      <w:r>
+        <w:rPr>
+          <w:rFonts w:ascii="Times New Roman" w:hAnsi="Times New Roman" w:cs="Times New Roman"/>
+          <w:b/>
+          <w:bCs/>
+          <w:color w:val="595959" w:themeColor="text1" w:themeTint="A6"/>
+          <w:sz w:val="18"/>
+          <w:szCs w:val="18"/>
+        </w:rPr>
+        <w:t>Кортежи</w:t>
+      </w:r>
+      <w:r>
+        <w:rPr>
+          <w:rFonts w:ascii="Times New Roman" w:hAnsi="Times New Roman" w:cs="Times New Roman"/>
+          <w:color w:val="595959" w:themeColor="text1" w:themeTint="A6"/>
+          <w:sz w:val="18"/>
+          <w:szCs w:val="18"/>
+        </w:rPr>
+        <w:t>:</w:t>
+      </w:r>
+    </w:p>
+    <w:p>
+      <w:pPr>
+        <w:pBdr>
+          <w:bottom w:val="single" w:sz="12" w:space="1" w:color="auto"/>
+        </w:pBdr>
+        <w:spacing w:after="0"/>
+        <w:jc w:val="center"/>
+        <w:rPr>
+          <w:rFonts w:ascii="Times New Roman" w:hAnsi="Times New Roman" w:cs="Times New Roman"/>
+          <w:color w:val="595959" w:themeColor="text1" w:themeTint="A6"/>
+          <w:sz w:val="18"/>
+          <w:szCs w:val="18"/>
+        </w:rPr>
+      </w:pPr>
+      <w:r>
+        <w:rPr>
+          <w:rFonts w:ascii="Times New Roman" w:hAnsi="Times New Roman" w:cs="Times New Roman"/>
+          <w:color w:val="595959" w:themeColor="text1" w:themeTint="A6"/>
+          <w:sz w:val="18"/>
+          <w:szCs w:val="18"/>
+        </w:rPr>
+        <w:t>Создайте кортеж из 3 элементов. Попробуйте изменить один элемент (ожидайте ошибку). Преобразуйте кортеж в список, измените элемент и преобразуйте обратно в кортеж.</w:t>
+      </w:r>
+    </w:p>
+    <w:p>
+      <w:pPr>
+        <w:pBdr>
+          <w:bottom w:val="single" w:sz="12" w:space="1" w:color="auto"/>
+        </w:pBdr>
+        <w:rPr>
+          <w:rFonts w:ascii="Times New Roman" w:hAnsi="Times New Roman" w:cs="Times New Roman"/>
+          <w:color w:val="595959" w:themeColor="text1" w:themeTint="A6"/>
+          <w:sz w:val="18"/>
+          <w:szCs w:val="18"/>
+        </w:rPr>
+      </w:pPr>
+      <w:r>
+        <w:rPr>
+          <w:rFonts w:ascii="Times New Roman" w:hAnsi="Times New Roman" w:cs="Times New Roman"/>
+          <w:b/>
+          <w:bCs/>
+          <w:color w:val="595959" w:themeColor="text1" w:themeTint="A6"/>
+          <w:sz w:val="18"/>
+          <w:szCs w:val="18"/>
+        </w:rPr>
+        <w:t>РЕШЕНИЕ</w:t>
+      </w:r>
+      <w:r>
+        <w:rPr>
+          <w:rFonts w:ascii="Times New Roman" w:hAnsi="Times New Roman" w:cs="Times New Roman"/>
+          <w:b/>
+          <w:bCs/>
+          <w:color w:val="595959" w:themeColor="text1" w:themeTint="A6"/>
+          <w:sz w:val="18"/>
+          <w:szCs w:val="18"/>
+        </w:rPr>
+        <w:t>:</w:t>
+      </w:r>
+      <w:r>
+        <w:rPr>
+          <w:rFonts w:ascii="Times New Roman" w:hAnsi="Times New Roman" w:cs="Times New Roman"/>
+          <w:b/>
+          <w:bCs/>
+          <w:color w:val="595959" w:themeColor="text1" w:themeTint="A6"/>
+          <w:sz w:val="18"/>
+          <w:szCs w:val="18"/>
+        </w:rPr>
+        <w:t xml:space="preserve"> </w:t>
+      </w:r>
+      <w:hyperlink r:id="rId76" w:history="1">
         <w:r>
           <w:rPr>
             <w:rStyle w:val="a3"/>
-            <w:rFonts w:ascii="Century Schoolbook" w:hAnsi="Century Schoolbook" w:cs="Times New Roman"/>
+            <w:rFonts w:ascii="Times New Roman" w:hAnsi="Times New Roman" w:cs="Times New Roman"/>
             <w:b/>
             <w:bCs/>
             <w:sz w:val="18"/>
             <w:szCs w:val="18"/>
           </w:rPr>
-          <w:t>к</w:t>
-        </w:r>
-        <w:r>
-          <w:rPr>
-            <w:rStyle w:val="a3"/>
-            <w:rFonts w:ascii="Century Schoolbook" w:hAnsi="Century Schoolbook" w:cs="Times New Roman"/>
-            <w:b/>
-            <w:bCs/>
-            <w:sz w:val="18"/>
-            <w:szCs w:val="18"/>
-          </w:rPr>
-          <w:t>а</w:t>
+          <w:t>ссылка</w:t>
         </w:r>
       </w:hyperlink>
     </w:p>
     <w:p>
       <w:pPr>
         <w:spacing w:after="0"/>
+        <w:rPr>
+          <w:rFonts w:ascii="Times New Roman" w:hAnsi="Times New Roman" w:cs="Times New Roman"/>
+          <w:color w:val="595959" w:themeColor="text1" w:themeTint="A6"/>
+          <w:sz w:val="18"/>
+          <w:szCs w:val="18"/>
+        </w:rPr>
+      </w:pPr>
+    </w:p>
+    <w:p>
+      <w:pPr>
+        <w:spacing w:after="0"/>
+        <w:rPr>
+          <w:rFonts w:ascii="Times New Roman" w:hAnsi="Times New Roman" w:cs="Times New Roman"/>
+          <w:b/>
+          <w:bCs/>
+          <w:color w:val="595959" w:themeColor="text1" w:themeTint="A6"/>
+          <w:sz w:val="18"/>
+          <w:szCs w:val="18"/>
+        </w:rPr>
+      </w:pPr>
+      <w:r>
+        <w:rPr>
+          <w:rFonts w:ascii="Times New Roman" w:hAnsi="Times New Roman" w:cs="Times New Roman"/>
+          <w:b/>
+          <w:bCs/>
+          <w:color w:val="595959" w:themeColor="text1" w:themeTint="A6"/>
+          <w:sz w:val="18"/>
+          <w:szCs w:val="18"/>
+        </w:rPr>
+        <w:t>Вопросы на закрепление</w:t>
+      </w:r>
+    </w:p>
+    <w:p>
+      <w:pPr>
+        <w:numPr>
+          <w:ilvl w:val="0"/>
+          <w:numId w:val="82"/>
+        </w:numPr>
+        <w:spacing w:after="0"/>
+        <w:rPr>
+          <w:rFonts w:ascii="Times New Roman" w:hAnsi="Times New Roman" w:cs="Times New Roman"/>
+          <w:color w:val="595959" w:themeColor="text1" w:themeTint="A6"/>
+          <w:sz w:val="18"/>
+          <w:szCs w:val="18"/>
+        </w:rPr>
+      </w:pPr>
+      <w:r>
+        <w:rPr>
+          <w:rFonts w:ascii="Times New Roman" w:hAnsi="Times New Roman" w:cs="Times New Roman"/>
+          <w:color w:val="595959" w:themeColor="text1" w:themeTint="A6"/>
+          <w:sz w:val="18"/>
+          <w:szCs w:val="18"/>
+        </w:rPr>
+        <w:t>Почему в блоке try_modify_tuple() возникает именно TypeError, а не какая-то другая ошибка?</w:t>
+      </w:r>
+    </w:p>
+    <w:p>
+      <w:pPr>
+        <w:spacing w:after="0"/>
+        <w:rPr>
+          <w:rFonts w:ascii="Times New Roman" w:hAnsi="Times New Roman" w:cs="Times New Roman"/>
+          <w:color w:val="595959" w:themeColor="text1" w:themeTint="A6"/>
+          <w:sz w:val="18"/>
+          <w:szCs w:val="18"/>
+        </w:rPr>
+      </w:pPr>
+    </w:p>
+    <w:p>
+      <w:pPr>
+        <w:spacing w:after="0"/>
+        <w:rPr>
+          <w:rFonts w:ascii="Times New Roman" w:hAnsi="Times New Roman" w:cs="Times New Roman"/>
+          <w:color w:val="595959" w:themeColor="text1" w:themeTint="A6"/>
+          <w:sz w:val="18"/>
+          <w:szCs w:val="18"/>
+          <w:lang w:val="en-US"/>
+        </w:rPr>
+      </w:pPr>
+      <w:r>
+        <w:rPr>
+          <w:rFonts w:ascii="Times New Roman" w:hAnsi="Times New Roman" w:cs="Times New Roman"/>
+          <w:color w:val="595959" w:themeColor="text1" w:themeTint="A6"/>
+          <w:sz w:val="18"/>
+          <w:szCs w:val="18"/>
+        </w:rPr>
+        <w:t>Потому что возникает конфликт типов данных. Мы пытаемся применить свойство одного объекта языка (списки) к другому объекту (кортежи), который не поддерживает данное свойство, речь про изменяемость. Мы</w:t>
+      </w:r>
+      <w:r>
+        <w:rPr>
+          <w:rFonts w:ascii="Times New Roman" w:hAnsi="Times New Roman" w:cs="Times New Roman"/>
+          <w:color w:val="595959" w:themeColor="text1" w:themeTint="A6"/>
+          <w:sz w:val="18"/>
+          <w:szCs w:val="18"/>
+          <w:lang w:val="en-US"/>
+        </w:rPr>
+        <w:t xml:space="preserve"> </w:t>
+      </w:r>
+      <w:r>
+        <w:rPr>
+          <w:rFonts w:ascii="Times New Roman" w:hAnsi="Times New Roman" w:cs="Times New Roman"/>
+          <w:color w:val="595959" w:themeColor="text1" w:themeTint="A6"/>
+          <w:sz w:val="18"/>
+          <w:szCs w:val="18"/>
+        </w:rPr>
+        <w:t>пытаемся</w:t>
+      </w:r>
+      <w:r>
+        <w:rPr>
+          <w:rFonts w:ascii="Times New Roman" w:hAnsi="Times New Roman" w:cs="Times New Roman"/>
+          <w:color w:val="595959" w:themeColor="text1" w:themeTint="A6"/>
+          <w:sz w:val="18"/>
+          <w:szCs w:val="18"/>
+          <w:lang w:val="en-US"/>
+        </w:rPr>
+        <w:t xml:space="preserve"> </w:t>
+      </w:r>
+      <w:r>
+        <w:rPr>
+          <w:rFonts w:ascii="Times New Roman" w:hAnsi="Times New Roman" w:cs="Times New Roman"/>
+          <w:color w:val="595959" w:themeColor="text1" w:themeTint="A6"/>
+          <w:sz w:val="18"/>
+          <w:szCs w:val="18"/>
+        </w:rPr>
+        <w:t>изменить</w:t>
+      </w:r>
+      <w:r>
+        <w:rPr>
+          <w:rFonts w:ascii="Times New Roman" w:hAnsi="Times New Roman" w:cs="Times New Roman"/>
+          <w:color w:val="595959" w:themeColor="text1" w:themeTint="A6"/>
+          <w:sz w:val="18"/>
+          <w:szCs w:val="18"/>
+          <w:lang w:val="en-US"/>
+        </w:rPr>
+        <w:t xml:space="preserve"> </w:t>
+      </w:r>
+      <w:r>
+        <w:rPr>
+          <w:rFonts w:ascii="Times New Roman" w:hAnsi="Times New Roman" w:cs="Times New Roman"/>
+          <w:color w:val="595959" w:themeColor="text1" w:themeTint="A6"/>
+          <w:sz w:val="18"/>
+          <w:szCs w:val="18"/>
+        </w:rPr>
+        <w:t>кортеж</w:t>
+      </w:r>
+      <w:r>
+        <w:rPr>
+          <w:rFonts w:ascii="Times New Roman" w:hAnsi="Times New Roman" w:cs="Times New Roman"/>
+          <w:color w:val="595959" w:themeColor="text1" w:themeTint="A6"/>
+          <w:sz w:val="18"/>
+          <w:szCs w:val="18"/>
+          <w:lang w:val="en-US"/>
+        </w:rPr>
+        <w:t xml:space="preserve"> </w:t>
+      </w:r>
+      <w:r>
+        <w:rPr>
+          <w:rFonts w:ascii="Times New Roman" w:hAnsi="Times New Roman" w:cs="Times New Roman"/>
+          <w:color w:val="595959" w:themeColor="text1" w:themeTint="A6"/>
+          <w:sz w:val="18"/>
+          <w:szCs w:val="18"/>
+          <w:lang w:val="en-US"/>
+        </w:rPr>
+        <w:sym w:font="Wingdings" w:char="F0E0"/>
+      </w:r>
+      <w:r>
+        <w:rPr>
+          <w:rFonts w:ascii="Times New Roman" w:hAnsi="Times New Roman" w:cs="Times New Roman"/>
+          <w:color w:val="595959" w:themeColor="text1" w:themeTint="A6"/>
+          <w:sz w:val="18"/>
+          <w:szCs w:val="18"/>
+          <w:lang w:val="en-US"/>
+        </w:rPr>
+        <w:t xml:space="preserve"> </w:t>
+      </w:r>
+      <w:r>
+        <w:rPr>
+          <w:rFonts w:ascii="Times New Roman" w:hAnsi="Times New Roman" w:cs="Times New Roman"/>
+          <w:color w:val="595959" w:themeColor="text1" w:themeTint="A6"/>
+          <w:sz w:val="18"/>
+          <w:szCs w:val="18"/>
+        </w:rPr>
+        <w:t>получаем</w:t>
+      </w:r>
+      <w:r>
+        <w:rPr>
+          <w:rFonts w:ascii="Times New Roman" w:hAnsi="Times New Roman" w:cs="Times New Roman"/>
+          <w:color w:val="595959" w:themeColor="text1" w:themeTint="A6"/>
+          <w:sz w:val="18"/>
+          <w:szCs w:val="18"/>
+          <w:lang w:val="en-US"/>
+        </w:rPr>
+        <w:t xml:space="preserve"> «</w:t>
+      </w:r>
+      <w:r>
+        <w:rPr>
+          <w:rFonts w:ascii="Times New Roman" w:hAnsi="Times New Roman" w:cs="Times New Roman"/>
+          <w:color w:val="595959" w:themeColor="text1" w:themeTint="A6"/>
+          <w:sz w:val="18"/>
+          <w:szCs w:val="18"/>
+          <w:lang w:val="en-US"/>
+        </w:rPr>
+        <w:t>tuple' object does not support item assignment</w:t>
+      </w:r>
+      <w:r>
+        <w:rPr>
+          <w:rFonts w:ascii="Times New Roman" w:hAnsi="Times New Roman" w:cs="Times New Roman"/>
+          <w:color w:val="595959" w:themeColor="text1" w:themeTint="A6"/>
+          <w:sz w:val="18"/>
+          <w:szCs w:val="18"/>
+          <w:lang w:val="en-US"/>
+        </w:rPr>
+        <w:t>»</w:t>
+      </w:r>
+    </w:p>
+    <w:p>
+      <w:pPr>
+        <w:spacing w:after="0"/>
+        <w:rPr>
+          <w:rFonts w:ascii="Times New Roman" w:hAnsi="Times New Roman" w:cs="Times New Roman"/>
+          <w:color w:val="595959" w:themeColor="text1" w:themeTint="A6"/>
+          <w:sz w:val="18"/>
+          <w:szCs w:val="18"/>
+          <w:lang w:val="en-US"/>
+        </w:rPr>
+      </w:pPr>
+    </w:p>
+    <w:p>
+      <w:pPr>
+        <w:numPr>
+          <w:ilvl w:val="0"/>
+          <w:numId w:val="82"/>
+        </w:numPr>
+        <w:spacing w:after="0"/>
+        <w:rPr>
+          <w:rFonts w:ascii="Times New Roman" w:hAnsi="Times New Roman" w:cs="Times New Roman"/>
+          <w:color w:val="595959" w:themeColor="text1" w:themeTint="A6"/>
+          <w:sz w:val="18"/>
+          <w:szCs w:val="18"/>
+        </w:rPr>
+      </w:pPr>
+      <w:r>
+        <w:rPr>
+          <w:rFonts w:ascii="Times New Roman" w:hAnsi="Times New Roman" w:cs="Times New Roman"/>
+          <w:color w:val="595959" w:themeColor="text1" w:themeTint="A6"/>
+          <w:sz w:val="18"/>
+          <w:szCs w:val="18"/>
+        </w:rPr>
+        <w:t>В</w:t>
+      </w:r>
+      <w:r>
+        <w:rPr>
+          <w:rFonts w:ascii="Times New Roman" w:hAnsi="Times New Roman" w:cs="Times New Roman"/>
+          <w:color w:val="595959" w:themeColor="text1" w:themeTint="A6"/>
+          <w:sz w:val="18"/>
+          <w:szCs w:val="18"/>
+          <w:lang w:val="en-US"/>
+        </w:rPr>
+        <w:t xml:space="preserve"> </w:t>
+      </w:r>
+      <w:r>
+        <w:rPr>
+          <w:rFonts w:ascii="Times New Roman" w:hAnsi="Times New Roman" w:cs="Times New Roman"/>
+          <w:color w:val="595959" w:themeColor="text1" w:themeTint="A6"/>
+          <w:sz w:val="18"/>
+          <w:szCs w:val="18"/>
+        </w:rPr>
+        <w:t>функции</w:t>
+      </w:r>
+      <w:r>
+        <w:rPr>
+          <w:rFonts w:ascii="Times New Roman" w:hAnsi="Times New Roman" w:cs="Times New Roman"/>
+          <w:color w:val="595959" w:themeColor="text1" w:themeTint="A6"/>
+          <w:sz w:val="18"/>
+          <w:szCs w:val="18"/>
+          <w:lang w:val="en-US"/>
+        </w:rPr>
+        <w:t xml:space="preserve"> show_results(original, modified: object = None) — </w:t>
+      </w:r>
+      <w:r>
+        <w:rPr>
+          <w:rFonts w:ascii="Times New Roman" w:hAnsi="Times New Roman" w:cs="Times New Roman"/>
+          <w:color w:val="595959" w:themeColor="text1" w:themeTint="A6"/>
+          <w:sz w:val="18"/>
+          <w:szCs w:val="18"/>
+        </w:rPr>
+        <w:t>что</w:t>
+      </w:r>
+      <w:r>
+        <w:rPr>
+          <w:rFonts w:ascii="Times New Roman" w:hAnsi="Times New Roman" w:cs="Times New Roman"/>
+          <w:color w:val="595959" w:themeColor="text1" w:themeTint="A6"/>
+          <w:sz w:val="18"/>
+          <w:szCs w:val="18"/>
+          <w:lang w:val="en-US"/>
+        </w:rPr>
+        <w:t xml:space="preserve"> </w:t>
+      </w:r>
+      <w:r>
+        <w:rPr>
+          <w:rFonts w:ascii="Times New Roman" w:hAnsi="Times New Roman" w:cs="Times New Roman"/>
+          <w:color w:val="595959" w:themeColor="text1" w:themeTint="A6"/>
+          <w:sz w:val="18"/>
+          <w:szCs w:val="18"/>
+        </w:rPr>
+        <w:t>означает</w:t>
+      </w:r>
+      <w:r>
+        <w:rPr>
+          <w:rFonts w:ascii="Times New Roman" w:hAnsi="Times New Roman" w:cs="Times New Roman"/>
+          <w:color w:val="595959" w:themeColor="text1" w:themeTint="A6"/>
+          <w:sz w:val="18"/>
+          <w:szCs w:val="18"/>
+          <w:lang w:val="en-US"/>
+        </w:rPr>
+        <w:t> = None </w:t>
+      </w:r>
+      <w:r>
+        <w:rPr>
+          <w:rFonts w:ascii="Times New Roman" w:hAnsi="Times New Roman" w:cs="Times New Roman"/>
+          <w:color w:val="595959" w:themeColor="text1" w:themeTint="A6"/>
+          <w:sz w:val="18"/>
+          <w:szCs w:val="18"/>
+        </w:rPr>
+        <w:t>для</w:t>
+      </w:r>
+      <w:r>
+        <w:rPr>
+          <w:rFonts w:ascii="Times New Roman" w:hAnsi="Times New Roman" w:cs="Times New Roman"/>
+          <w:color w:val="595959" w:themeColor="text1" w:themeTint="A6"/>
+          <w:sz w:val="18"/>
+          <w:szCs w:val="18"/>
+          <w:lang w:val="en-US"/>
+        </w:rPr>
+        <w:t xml:space="preserve"> </w:t>
+      </w:r>
+      <w:r>
+        <w:rPr>
+          <w:rFonts w:ascii="Times New Roman" w:hAnsi="Times New Roman" w:cs="Times New Roman"/>
+          <w:color w:val="595959" w:themeColor="text1" w:themeTint="A6"/>
+          <w:sz w:val="18"/>
+          <w:szCs w:val="18"/>
+        </w:rPr>
+        <w:t>параметра</w:t>
+      </w:r>
+      <w:r>
+        <w:rPr>
+          <w:rFonts w:ascii="Times New Roman" w:hAnsi="Times New Roman" w:cs="Times New Roman"/>
+          <w:color w:val="595959" w:themeColor="text1" w:themeTint="A6"/>
+          <w:sz w:val="18"/>
+          <w:szCs w:val="18"/>
+          <w:lang w:val="en-US"/>
+        </w:rPr>
+        <w:t xml:space="preserve"> modified? </w:t>
+      </w:r>
+      <w:r>
+        <w:rPr>
+          <w:rFonts w:ascii="Times New Roman" w:hAnsi="Times New Roman" w:cs="Times New Roman"/>
+          <w:color w:val="595959" w:themeColor="text1" w:themeTint="A6"/>
+          <w:sz w:val="18"/>
+          <w:szCs w:val="18"/>
+        </w:rPr>
+        <w:t>Что произойдёт, если вызвать show_results(original) без второго аргумента?</w:t>
+      </w:r>
+    </w:p>
+    <w:p>
+      <w:pPr>
+        <w:spacing w:after="0"/>
+        <w:rPr>
+          <w:rFonts w:ascii="Times New Roman" w:hAnsi="Times New Roman" w:cs="Times New Roman"/>
+          <w:color w:val="595959" w:themeColor="text1" w:themeTint="A6"/>
+          <w:sz w:val="18"/>
+          <w:szCs w:val="18"/>
+        </w:rPr>
+      </w:pPr>
+    </w:p>
+    <w:p>
+      <w:pPr>
+        <w:spacing w:after="0"/>
+        <w:rPr>
+          <w:rFonts w:ascii="Times New Roman" w:hAnsi="Times New Roman" w:cs="Times New Roman"/>
+          <w:color w:val="595959" w:themeColor="text1" w:themeTint="A6"/>
+          <w:sz w:val="18"/>
+          <w:szCs w:val="18"/>
+        </w:rPr>
+      </w:pPr>
+      <w:r>
+        <w:rPr>
+          <w:rFonts w:ascii="Times New Roman" w:hAnsi="Times New Roman" w:cs="Times New Roman"/>
+          <w:color w:val="595959" w:themeColor="text1" w:themeTint="A6"/>
+          <w:sz w:val="18"/>
+          <w:szCs w:val="18"/>
+        </w:rPr>
+        <w:lastRenderedPageBreak/>
+        <w:t> </w:t>
+      </w:r>
+      <w:r>
+        <w:rPr>
+          <w:rFonts w:ascii="Times New Roman" w:hAnsi="Times New Roman" w:cs="Times New Roman"/>
+          <w:color w:val="595959" w:themeColor="text1" w:themeTint="A6"/>
+          <w:sz w:val="18"/>
+          <w:szCs w:val="18"/>
+          <w:lang w:val="en-US"/>
+        </w:rPr>
+        <w:t>None</w:t>
+      </w:r>
+      <w:r>
+        <w:rPr>
+          <w:rFonts w:ascii="Times New Roman" w:hAnsi="Times New Roman" w:cs="Times New Roman"/>
+          <w:color w:val="595959" w:themeColor="text1" w:themeTint="A6"/>
+          <w:sz w:val="18"/>
+          <w:szCs w:val="18"/>
+        </w:rPr>
+        <w:t xml:space="preserve"> </w:t>
+      </w:r>
+      <w:r>
+        <w:rPr>
+          <w:rFonts w:ascii="Times New Roman" w:hAnsi="Times New Roman" w:cs="Times New Roman"/>
+          <w:color w:val="595959" w:themeColor="text1" w:themeTint="A6"/>
+          <w:sz w:val="18"/>
+          <w:szCs w:val="18"/>
+        </w:rPr>
+        <w:t xml:space="preserve">делает </w:t>
+      </w:r>
+      <w:r>
+        <w:rPr>
+          <w:rFonts w:ascii="Times New Roman" w:hAnsi="Times New Roman" w:cs="Times New Roman"/>
+          <w:color w:val="595959" w:themeColor="text1" w:themeTint="A6"/>
+          <w:sz w:val="18"/>
+          <w:szCs w:val="18"/>
+        </w:rPr>
+        <w:t>второй параметр </w:t>
+      </w:r>
+      <w:r>
+        <w:rPr>
+          <w:rFonts w:ascii="Times New Roman" w:hAnsi="Times New Roman" w:cs="Times New Roman"/>
+          <w:b/>
+          <w:bCs/>
+          <w:color w:val="595959" w:themeColor="text1" w:themeTint="A6"/>
+          <w:sz w:val="18"/>
+          <w:szCs w:val="18"/>
+        </w:rPr>
+        <w:t>необязательным</w:t>
+      </w:r>
+      <w:r>
+        <w:rPr>
+          <w:rFonts w:ascii="Times New Roman" w:hAnsi="Times New Roman" w:cs="Times New Roman"/>
+          <w:b/>
+          <w:bCs/>
+          <w:color w:val="595959" w:themeColor="text1" w:themeTint="A6"/>
+          <w:sz w:val="18"/>
+          <w:szCs w:val="18"/>
+        </w:rPr>
+        <w:t xml:space="preserve">, </w:t>
+      </w:r>
+      <w:r>
+        <w:rPr>
+          <w:rFonts w:ascii="Times New Roman" w:hAnsi="Times New Roman" w:cs="Times New Roman"/>
+          <w:color w:val="595959" w:themeColor="text1" w:themeTint="A6"/>
+          <w:sz w:val="18"/>
+          <w:szCs w:val="18"/>
+        </w:rPr>
+        <w:t xml:space="preserve">использование </w:t>
+      </w:r>
+      <w:r>
+        <w:rPr>
+          <w:rFonts w:ascii="Times New Roman" w:hAnsi="Times New Roman" w:cs="Times New Roman"/>
+          <w:color w:val="595959" w:themeColor="text1" w:themeTint="A6"/>
+          <w:sz w:val="18"/>
+          <w:szCs w:val="18"/>
+          <w:lang w:val="en-US"/>
+        </w:rPr>
+        <w:t>None</w:t>
+      </w:r>
+      <w:r>
+        <w:rPr>
+          <w:rFonts w:ascii="Times New Roman" w:hAnsi="Times New Roman" w:cs="Times New Roman"/>
+          <w:color w:val="595959" w:themeColor="text1" w:themeTint="A6"/>
+          <w:sz w:val="18"/>
+          <w:szCs w:val="18"/>
+        </w:rPr>
+        <w:t xml:space="preserve"> </w:t>
+      </w:r>
+      <w:r>
+        <w:rPr>
+          <w:rFonts w:ascii="Times New Roman" w:hAnsi="Times New Roman" w:cs="Times New Roman"/>
+          <w:color w:val="595959" w:themeColor="text1" w:themeTint="A6"/>
+          <w:sz w:val="18"/>
+          <w:szCs w:val="18"/>
+        </w:rPr>
+        <w:t xml:space="preserve">в данном случае позволяет нам не указывать параметр </w:t>
+      </w:r>
+      <w:r>
+        <w:rPr>
+          <w:rFonts w:ascii="Times New Roman" w:hAnsi="Times New Roman" w:cs="Times New Roman"/>
+          <w:color w:val="595959" w:themeColor="text1" w:themeTint="A6"/>
+          <w:sz w:val="18"/>
+          <w:szCs w:val="18"/>
+          <w:lang w:val="en-US"/>
+        </w:rPr>
+        <w:t>modified</w:t>
+      </w:r>
+      <w:r>
+        <w:rPr>
+          <w:rFonts w:ascii="Times New Roman" w:hAnsi="Times New Roman" w:cs="Times New Roman"/>
+          <w:color w:val="595959" w:themeColor="text1" w:themeTint="A6"/>
+          <w:sz w:val="18"/>
+          <w:szCs w:val="18"/>
+        </w:rPr>
+        <w:t xml:space="preserve"> при вызове функции </w:t>
+      </w:r>
+      <w:r>
+        <w:rPr>
+          <w:rFonts w:ascii="Times New Roman" w:hAnsi="Times New Roman" w:cs="Times New Roman"/>
+          <w:color w:val="595959" w:themeColor="text1" w:themeTint="A6"/>
+          <w:sz w:val="18"/>
+          <w:szCs w:val="18"/>
+          <w:lang w:val="en-US"/>
+        </w:rPr>
+        <w:t>show</w:t>
+      </w:r>
+      <w:r>
+        <w:rPr>
+          <w:rFonts w:ascii="Times New Roman" w:hAnsi="Times New Roman" w:cs="Times New Roman"/>
+          <w:color w:val="595959" w:themeColor="text1" w:themeTint="A6"/>
+          <w:sz w:val="18"/>
+          <w:szCs w:val="18"/>
+        </w:rPr>
+        <w:t>_</w:t>
+      </w:r>
+      <w:r>
+        <w:rPr>
+          <w:rFonts w:ascii="Times New Roman" w:hAnsi="Times New Roman" w:cs="Times New Roman"/>
+          <w:color w:val="595959" w:themeColor="text1" w:themeTint="A6"/>
+          <w:sz w:val="18"/>
+          <w:szCs w:val="18"/>
+          <w:lang w:val="en-US"/>
+        </w:rPr>
+        <w:t>results</w:t>
+      </w:r>
+      <w:r>
+        <w:rPr>
+          <w:rFonts w:ascii="Times New Roman" w:hAnsi="Times New Roman" w:cs="Times New Roman"/>
+          <w:color w:val="595959" w:themeColor="text1" w:themeTint="A6"/>
+          <w:sz w:val="18"/>
+          <w:szCs w:val="18"/>
+        </w:rPr>
+        <w:t xml:space="preserve">. Если мы не пропишем </w:t>
+      </w:r>
+      <w:r>
+        <w:rPr>
+          <w:rFonts w:ascii="Times New Roman" w:hAnsi="Times New Roman" w:cs="Times New Roman"/>
+          <w:color w:val="595959" w:themeColor="text1" w:themeTint="A6"/>
+          <w:sz w:val="18"/>
+          <w:szCs w:val="18"/>
+          <w:lang w:val="en-US"/>
+        </w:rPr>
+        <w:t>None</w:t>
+      </w:r>
+      <w:r>
+        <w:rPr>
+          <w:rFonts w:ascii="Times New Roman" w:hAnsi="Times New Roman" w:cs="Times New Roman"/>
+          <w:color w:val="595959" w:themeColor="text1" w:themeTint="A6"/>
+          <w:sz w:val="18"/>
+          <w:szCs w:val="18"/>
+        </w:rPr>
+        <w:t xml:space="preserve"> для </w:t>
+      </w:r>
+      <w:r>
+        <w:rPr>
+          <w:rFonts w:ascii="Times New Roman" w:hAnsi="Times New Roman" w:cs="Times New Roman"/>
+          <w:color w:val="595959" w:themeColor="text1" w:themeTint="A6"/>
+          <w:sz w:val="18"/>
+          <w:szCs w:val="18"/>
+          <w:lang w:val="en-US"/>
+        </w:rPr>
+        <w:t>modified</w:t>
+      </w:r>
+      <w:r>
+        <w:rPr>
+          <w:rFonts w:ascii="Times New Roman" w:hAnsi="Times New Roman" w:cs="Times New Roman"/>
+          <w:color w:val="595959" w:themeColor="text1" w:themeTint="A6"/>
+          <w:sz w:val="18"/>
+          <w:szCs w:val="18"/>
+        </w:rPr>
+        <w:t xml:space="preserve">, и вызовем функцию </w:t>
+      </w:r>
+      <w:r>
+        <w:rPr>
+          <w:rFonts w:ascii="Times New Roman" w:hAnsi="Times New Roman" w:cs="Times New Roman"/>
+          <w:color w:val="595959" w:themeColor="text1" w:themeTint="A6"/>
+          <w:sz w:val="18"/>
+          <w:szCs w:val="18"/>
+          <w:lang w:val="en-US"/>
+        </w:rPr>
+        <w:t>show</w:t>
+      </w:r>
+      <w:r>
+        <w:rPr>
+          <w:rFonts w:ascii="Times New Roman" w:hAnsi="Times New Roman" w:cs="Times New Roman"/>
+          <w:color w:val="595959" w:themeColor="text1" w:themeTint="A6"/>
+          <w:sz w:val="18"/>
+          <w:szCs w:val="18"/>
+        </w:rPr>
+        <w:t>_</w:t>
+      </w:r>
+      <w:r>
+        <w:rPr>
+          <w:rFonts w:ascii="Times New Roman" w:hAnsi="Times New Roman" w:cs="Times New Roman"/>
+          <w:color w:val="595959" w:themeColor="text1" w:themeTint="A6"/>
+          <w:sz w:val="18"/>
+          <w:szCs w:val="18"/>
+          <w:lang w:val="en-US"/>
+        </w:rPr>
+        <w:t>results</w:t>
+      </w:r>
+      <w:r>
+        <w:rPr>
+          <w:rFonts w:ascii="Times New Roman" w:hAnsi="Times New Roman" w:cs="Times New Roman"/>
+          <w:color w:val="595959" w:themeColor="text1" w:themeTint="A6"/>
+          <w:sz w:val="18"/>
+          <w:szCs w:val="18"/>
+        </w:rPr>
+        <w:t xml:space="preserve"> </w:t>
+      </w:r>
+      <w:r>
+        <w:rPr>
+          <w:rFonts w:ascii="Times New Roman" w:hAnsi="Times New Roman" w:cs="Times New Roman"/>
+          <w:color w:val="595959" w:themeColor="text1" w:themeTint="A6"/>
+          <w:sz w:val="18"/>
+          <w:szCs w:val="18"/>
+        </w:rPr>
+        <w:t>без него, программа упадёт с ошибкой: «</w:t>
+      </w:r>
+      <w:r>
+        <w:rPr>
+          <w:rFonts w:ascii="Times New Roman" w:hAnsi="Times New Roman" w:cs="Times New Roman"/>
+          <w:color w:val="595959" w:themeColor="text1" w:themeTint="A6"/>
+          <w:sz w:val="18"/>
+          <w:szCs w:val="18"/>
+        </w:rPr>
+        <w:t>TypeError: show_results() missing 1 required positional argument: 'modified'</w:t>
+      </w:r>
+      <w:r>
+        <w:rPr>
+          <w:rFonts w:ascii="Times New Roman" w:hAnsi="Times New Roman" w:cs="Times New Roman"/>
+          <w:color w:val="595959" w:themeColor="text1" w:themeTint="A6"/>
+          <w:sz w:val="18"/>
+          <w:szCs w:val="18"/>
+        </w:rPr>
+        <w:t>»</w:t>
+      </w:r>
+      <w:r>
+        <w:rPr>
+          <w:rFonts w:ascii="Times New Roman" w:hAnsi="Times New Roman" w:cs="Times New Roman"/>
+          <w:color w:val="595959" w:themeColor="text1" w:themeTint="A6"/>
+          <w:sz w:val="18"/>
+          <w:szCs w:val="18"/>
+        </w:rPr>
+        <w:t xml:space="preserve">. </w:t>
+      </w:r>
+      <w:proofErr w:type="gramStart"/>
+      <w:r>
+        <w:rPr>
+          <w:rFonts w:ascii="Times New Roman" w:hAnsi="Times New Roman" w:cs="Times New Roman"/>
+          <w:color w:val="595959" w:themeColor="text1" w:themeTint="A6"/>
+          <w:sz w:val="18"/>
+          <w:szCs w:val="18"/>
+        </w:rPr>
+        <w:t>Кстати</w:t>
+      </w:r>
+      <w:proofErr w:type="gramEnd"/>
+      <w:r>
+        <w:rPr>
+          <w:rFonts w:ascii="Times New Roman" w:hAnsi="Times New Roman" w:cs="Times New Roman"/>
+          <w:color w:val="595959" w:themeColor="text1" w:themeTint="A6"/>
+          <w:sz w:val="18"/>
+          <w:szCs w:val="18"/>
+        </w:rPr>
+        <w:t xml:space="preserve"> эта ошибка будет </w:t>
+      </w:r>
+      <w:r>
+        <w:rPr>
+          <w:rFonts w:ascii="Times New Roman" w:hAnsi="Times New Roman" w:cs="Times New Roman"/>
+          <w:color w:val="595959" w:themeColor="text1" w:themeTint="A6"/>
+          <w:sz w:val="18"/>
+          <w:szCs w:val="18"/>
+        </w:rPr>
+        <w:t>и, в случае если</w:t>
+      </w:r>
+      <w:r>
+        <w:rPr>
+          <w:rFonts w:ascii="Times New Roman" w:hAnsi="Times New Roman" w:cs="Times New Roman"/>
+          <w:color w:val="595959" w:themeColor="text1" w:themeTint="A6"/>
+          <w:sz w:val="18"/>
+          <w:szCs w:val="18"/>
+        </w:rPr>
+        <w:t xml:space="preserve"> мы </w:t>
+      </w:r>
+      <w:r>
+        <w:rPr>
+          <w:rFonts w:ascii="Times New Roman" w:hAnsi="Times New Roman" w:cs="Times New Roman"/>
+          <w:color w:val="595959" w:themeColor="text1" w:themeTint="A6"/>
+          <w:sz w:val="18"/>
+          <w:szCs w:val="18"/>
+        </w:rPr>
+        <w:t xml:space="preserve">укажем параметр </w:t>
+      </w:r>
+      <w:r>
+        <w:rPr>
+          <w:rFonts w:ascii="Times New Roman" w:hAnsi="Times New Roman" w:cs="Times New Roman"/>
+          <w:color w:val="595959" w:themeColor="text1" w:themeTint="A6"/>
+          <w:sz w:val="18"/>
+          <w:szCs w:val="18"/>
+          <w:lang w:val="en-US"/>
+        </w:rPr>
+        <w:t>modified</w:t>
+      </w:r>
+      <w:r>
+        <w:rPr>
+          <w:rFonts w:ascii="Times New Roman" w:hAnsi="Times New Roman" w:cs="Times New Roman"/>
+          <w:color w:val="595959" w:themeColor="text1" w:themeTint="A6"/>
+          <w:sz w:val="18"/>
+          <w:szCs w:val="18"/>
+        </w:rPr>
+        <w:t xml:space="preserve"> при вызове, но не укажем </w:t>
+      </w:r>
+      <w:r>
+        <w:rPr>
+          <w:rFonts w:ascii="Times New Roman" w:hAnsi="Times New Roman" w:cs="Times New Roman"/>
+          <w:color w:val="595959" w:themeColor="text1" w:themeTint="A6"/>
+          <w:sz w:val="18"/>
+          <w:szCs w:val="18"/>
+          <w:lang w:val="en-US"/>
+        </w:rPr>
+        <w:t>None,</w:t>
+      </w:r>
+      <w:r>
+        <w:rPr>
+          <w:rFonts w:ascii="Times New Roman" w:hAnsi="Times New Roman" w:cs="Times New Roman"/>
+          <w:color w:val="595959" w:themeColor="text1" w:themeTint="A6"/>
+          <w:sz w:val="18"/>
+          <w:szCs w:val="18"/>
+        </w:rPr>
+        <w:t xml:space="preserve"> </w:t>
+      </w:r>
+      <w:r>
+        <w:rPr>
+          <w:rFonts w:ascii="Times New Roman" w:hAnsi="Times New Roman" w:cs="Times New Roman"/>
+          <w:color w:val="595959" w:themeColor="text1" w:themeTint="A6"/>
+          <w:sz w:val="18"/>
+          <w:szCs w:val="18"/>
+        </w:rPr>
+        <w:t xml:space="preserve">когда объявляем функцию и передаём в нее аргументы, почему так…параметр же передан?  </w:t>
+      </w:r>
+      <w:r>
+        <w:rPr>
+          <w:rFonts w:ascii="Times New Roman" w:hAnsi="Times New Roman" w:cs="Times New Roman"/>
+          <w:color w:val="595959" w:themeColor="text1" w:themeTint="A6"/>
+          <w:sz w:val="18"/>
+          <w:szCs w:val="18"/>
+        </w:rPr>
+        <w:t xml:space="preserve"> </w:t>
+      </w:r>
+    </w:p>
+    <w:p>
+      <w:pPr>
+        <w:spacing w:after="0"/>
+        <w:rPr>
+          <w:rFonts w:ascii="Times New Roman" w:hAnsi="Times New Roman" w:cs="Times New Roman"/>
+          <w:color w:val="595959" w:themeColor="text1" w:themeTint="A6"/>
+          <w:sz w:val="18"/>
+          <w:szCs w:val="18"/>
+        </w:rPr>
+      </w:pPr>
+    </w:p>
+    <w:p>
+      <w:pPr>
+        <w:spacing w:after="0"/>
+        <w:rPr>
+          <w:rFonts w:ascii="Times New Roman" w:hAnsi="Times New Roman" w:cs="Times New Roman"/>
+          <w:color w:val="595959" w:themeColor="text1" w:themeTint="A6"/>
+          <w:sz w:val="18"/>
+          <w:szCs w:val="18"/>
+        </w:rPr>
+      </w:pPr>
+      <w:r>
+        <w:rPr>
+          <w:rFonts w:ascii="Times New Roman" w:hAnsi="Times New Roman" w:cs="Times New Roman"/>
+          <w:color w:val="595959" w:themeColor="text1" w:themeTint="A6"/>
+          <w:sz w:val="18"/>
+          <w:szCs w:val="18"/>
+        </w:rPr>
+        <w:drawing>
+          <wp:inline distT="0" distB="0" distL="0" distR="0" wp14:anchorId="368C4736" wp14:editId="660290F7">
+            <wp:extent cx="4005207" cy="1968500"/>
+            <wp:effectExtent l="0" t="0" r="0" b="0"/>
+            <wp:docPr id="1222931901" name="Рисунок 1"/>
+            <wp:cNvGraphicFramePr>
+              <a:graphicFrameLocks xmlns:a="http://schemas.openxmlformats.org/drawingml/2006/main" noChangeAspect="1"/>
+            </wp:cNvGraphicFramePr>
+            <a:graphic xmlns:a="http://schemas.openxmlformats.org/drawingml/2006/main">
+              <a:graphicData uri="http://schemas.openxmlformats.org/drawingml/2006/picture">
+                <pic:pic xmlns:pic="http://schemas.openxmlformats.org/drawingml/2006/picture">
+                  <pic:nvPicPr>
+                    <pic:cNvPr id="1222931901" name=""/>
+                    <pic:cNvPicPr/>
+                  </pic:nvPicPr>
+                  <pic:blipFill>
+                    <a:blip r:embed="rId77"/>
+                    <a:stretch>
+                      <a:fillRect/>
+                    </a:stretch>
+                  </pic:blipFill>
+                  <pic:spPr>
+                    <a:xfrm>
+                      <a:off x="0" y="0"/>
+                      <a:ext cx="4012009" cy="1971843"/>
+                    </a:xfrm>
+                    <a:prstGeom prst="rect">
+                      <a:avLst/>
+                    </a:prstGeom>
+                  </pic:spPr>
+                </pic:pic>
+              </a:graphicData>
+            </a:graphic>
+          </wp:inline>
+        </w:drawing>
+      </w:r>
+    </w:p>
+    <w:p>
+      <w:pPr>
+        <w:spacing w:after="0"/>
+        <w:rPr>
+          <w:rFonts w:ascii="Times New Roman" w:hAnsi="Times New Roman" w:cs="Times New Roman"/>
+          <w:color w:val="595959" w:themeColor="text1" w:themeTint="A6"/>
+          <w:sz w:val="18"/>
+          <w:szCs w:val="18"/>
+        </w:rPr>
+      </w:pPr>
+    </w:p>
+    <w:p>
+      <w:pPr>
+        <w:spacing w:after="0"/>
+        <w:rPr>
+          <w:rFonts w:ascii="Times New Roman" w:hAnsi="Times New Roman" w:cs="Times New Roman"/>
+          <w:color w:val="595959" w:themeColor="text1" w:themeTint="A6"/>
+          <w:sz w:val="18"/>
+          <w:szCs w:val="18"/>
+        </w:rPr>
+      </w:pPr>
+      <w:r>
+        <w:rPr>
+          <w:rFonts w:ascii="Times New Roman" w:hAnsi="Times New Roman" w:cs="Times New Roman"/>
+          <w:color w:val="595959" w:themeColor="text1" w:themeTint="A6"/>
+          <w:sz w:val="18"/>
+          <w:szCs w:val="18"/>
+        </w:rPr>
+        <w:br/>
+      </w:r>
+    </w:p>
+    <w:p>
+      <w:pPr>
+        <w:numPr>
+          <w:ilvl w:val="0"/>
+          <w:numId w:val="83"/>
+        </w:numPr>
+        <w:spacing w:after="0"/>
+        <w:rPr>
+          <w:rFonts w:ascii="Century Schoolbook" w:hAnsi="Century Schoolbook" w:cs="Times New Roman"/>
+          <w:sz w:val="18"/>
+          <w:szCs w:val="18"/>
+        </w:rPr>
+      </w:pPr>
+      <w:r>
+        <w:rPr>
+          <w:rFonts w:ascii="Century Schoolbook" w:hAnsi="Century Schoolbook" w:cs="Times New Roman"/>
+          <w:b/>
+          <w:bCs/>
+          <w:sz w:val="18"/>
+          <w:szCs w:val="18"/>
+        </w:rPr>
+        <w:t>Строка 43</w:t>
+      </w:r>
+      <w:r>
+        <w:rPr>
+          <w:rFonts w:ascii="Century Schoolbook" w:hAnsi="Century Schoolbook" w:cs="Times New Roman"/>
+          <w:sz w:val="18"/>
+          <w:szCs w:val="18"/>
+        </w:rPr>
+        <w:t>: show_results(original) — здесь мы вызываем функцию </w:t>
+      </w:r>
+      <w:r>
+        <w:rPr>
+          <w:rFonts w:ascii="Century Schoolbook" w:hAnsi="Century Schoolbook" w:cs="Times New Roman"/>
+          <w:b/>
+          <w:bCs/>
+          <w:sz w:val="18"/>
+          <w:szCs w:val="18"/>
+        </w:rPr>
+        <w:t>до того</w:t>
+      </w:r>
+      <w:r>
+        <w:rPr>
+          <w:rFonts w:ascii="Century Schoolbook" w:hAnsi="Century Schoolbook" w:cs="Times New Roman"/>
+          <w:sz w:val="18"/>
+          <w:szCs w:val="18"/>
+        </w:rPr>
+        <w:t>, как переменная modified вообще существует в программе. Мы физически </w:t>
+      </w:r>
+      <w:r>
+        <w:rPr>
+          <w:rFonts w:ascii="Century Schoolbook" w:hAnsi="Century Schoolbook" w:cs="Times New Roman"/>
+          <w:b/>
+          <w:bCs/>
+          <w:sz w:val="18"/>
+          <w:szCs w:val="18"/>
+        </w:rPr>
+        <w:t>не можем</w:t>
+      </w:r>
+      <w:r>
+        <w:rPr>
+          <w:rFonts w:ascii="Century Schoolbook" w:hAnsi="Century Schoolbook" w:cs="Times New Roman"/>
+          <w:sz w:val="18"/>
+          <w:szCs w:val="18"/>
+        </w:rPr>
+        <w:t> её передать, потому что её ещё нет.</w:t>
+      </w:r>
+    </w:p>
+    <w:p>
+      <w:pPr>
+        <w:numPr>
+          <w:ilvl w:val="0"/>
+          <w:numId w:val="83"/>
+        </w:numPr>
+        <w:spacing w:after="0"/>
+        <w:rPr>
+          <w:rFonts w:ascii="Century Schoolbook" w:hAnsi="Century Schoolbook" w:cs="Times New Roman"/>
+          <w:sz w:val="18"/>
+          <w:szCs w:val="18"/>
+        </w:rPr>
+      </w:pPr>
+      <w:r>
+        <w:rPr>
+          <w:rFonts w:ascii="Century Schoolbook" w:hAnsi="Century Schoolbook" w:cs="Times New Roman"/>
+          <w:b/>
+          <w:bCs/>
+          <w:sz w:val="18"/>
+          <w:szCs w:val="18"/>
+        </w:rPr>
+        <w:t>Строка 48</w:t>
+      </w:r>
+      <w:r>
+        <w:rPr>
+          <w:rFonts w:ascii="Century Schoolbook" w:hAnsi="Century Schoolbook" w:cs="Times New Roman"/>
+          <w:sz w:val="18"/>
+          <w:szCs w:val="18"/>
+        </w:rPr>
+        <w:t>: show_results(original, modified) — а здесь modified уже создана (строка 47), поэтому мы можем передать оба аргумента.</w:t>
+      </w:r>
+    </w:p>
+    <w:p>
+      <w:pPr>
+        <w:spacing w:after="0"/>
+        <w:rPr>
+          <w:rFonts w:ascii="Century Schoolbook" w:hAnsi="Century Schoolbook" w:cs="Times New Roman"/>
+          <w:sz w:val="18"/>
+          <w:szCs w:val="18"/>
+        </w:rPr>
+      </w:pPr>
+      <w:r>
+        <w:rPr>
+          <w:rFonts w:ascii="Century Schoolbook" w:hAnsi="Century Schoolbook" w:cs="Times New Roman"/>
+          <w:sz w:val="18"/>
+          <w:szCs w:val="18"/>
+        </w:rPr>
+        <w:t xml:space="preserve">Именно поэтому = None в объявлении функции — это то, что </w:t>
+      </w:r>
+      <w:r>
+        <w:rPr>
+          <w:rFonts w:ascii="Century Schoolbook" w:hAnsi="Century Schoolbook" w:cs="Times New Roman"/>
+          <w:b/>
+          <w:bCs/>
+          <w:sz w:val="18"/>
+          <w:szCs w:val="18"/>
+        </w:rPr>
+        <w:t>спасает</w:t>
+      </w:r>
+      <w:r>
+        <w:rPr>
+          <w:rFonts w:ascii="Century Schoolbook" w:hAnsi="Century Schoolbook" w:cs="Times New Roman"/>
+          <w:sz w:val="18"/>
+          <w:szCs w:val="18"/>
+        </w:rPr>
+        <w:t xml:space="preserve"> первый вызов (строка 43) от ошибки. Без этого default-значения программа бы упала именно на 43 строке.</w:t>
+      </w:r>
+    </w:p>
+    <w:p>
+      <w:pPr>
+        <w:spacing w:after="0"/>
+        <w:rPr>
+          <w:rFonts w:ascii="Times New Roman" w:hAnsi="Times New Roman" w:cs="Times New Roman"/>
+          <w:color w:val="595959" w:themeColor="text1" w:themeTint="A6"/>
+          <w:sz w:val="18"/>
+          <w:szCs w:val="18"/>
+        </w:rPr>
+      </w:pPr>
+    </w:p>
+    <w:p>
+      <w:pPr>
+        <w:numPr>
+          <w:ilvl w:val="0"/>
+          <w:numId w:val="82"/>
+        </w:numPr>
+        <w:spacing w:after="0"/>
+        <w:rPr>
+          <w:rFonts w:ascii="Times New Roman" w:hAnsi="Times New Roman" w:cs="Times New Roman"/>
+          <w:color w:val="595959" w:themeColor="text1" w:themeTint="A6"/>
+          <w:sz w:val="18"/>
+          <w:szCs w:val="18"/>
+        </w:rPr>
+      </w:pPr>
+      <w:r>
+        <w:rPr>
+          <w:rFonts w:ascii="Times New Roman" w:hAnsi="Times New Roman" w:cs="Times New Roman"/>
+          <w:color w:val="595959" w:themeColor="text1" w:themeTint="A6"/>
+          <w:sz w:val="18"/>
+          <w:szCs w:val="18"/>
+        </w:rPr>
+        <w:t>Почему мы вообще не можем просто взять и изменить кортеж, а вынуждены идти через список?</w:t>
+      </w:r>
+    </w:p>
+    <w:p>
+      <w:pPr>
+        <w:spacing w:after="0"/>
+        <w:rPr>
+          <w:rFonts w:ascii="Times New Roman" w:hAnsi="Times New Roman" w:cs="Times New Roman"/>
+          <w:color w:val="595959" w:themeColor="text1" w:themeTint="A6"/>
+          <w:sz w:val="18"/>
+          <w:szCs w:val="18"/>
+        </w:rPr>
+      </w:pPr>
+    </w:p>
+    <w:p>
+      <w:pPr>
+        <w:spacing w:after="0"/>
+        <w:rPr>
+          <w:rFonts w:ascii="Times New Roman" w:hAnsi="Times New Roman" w:cs="Times New Roman"/>
+          <w:color w:val="595959" w:themeColor="text1" w:themeTint="A6"/>
+          <w:sz w:val="18"/>
+          <w:szCs w:val="18"/>
+        </w:rPr>
+      </w:pPr>
+      <w:r>
+        <w:rPr>
+          <w:rFonts w:ascii="Times New Roman" w:hAnsi="Times New Roman" w:cs="Times New Roman"/>
+          <w:color w:val="595959" w:themeColor="text1" w:themeTint="A6"/>
+          <w:sz w:val="18"/>
+          <w:szCs w:val="18"/>
+        </w:rPr>
+        <w:t xml:space="preserve">Потому что список мутабельный объект языка </w:t>
+      </w:r>
+      <w:r>
+        <w:rPr>
+          <w:rFonts w:ascii="Times New Roman" w:hAnsi="Times New Roman" w:cs="Times New Roman"/>
+          <w:color w:val="595959" w:themeColor="text1" w:themeTint="A6"/>
+          <w:sz w:val="18"/>
+          <w:szCs w:val="18"/>
+          <w:lang w:val="en-US"/>
+        </w:rPr>
+        <w:t>Python</w:t>
+      </w:r>
+      <w:r>
+        <w:rPr>
+          <w:rFonts w:ascii="Times New Roman" w:hAnsi="Times New Roman" w:cs="Times New Roman"/>
+          <w:color w:val="595959" w:themeColor="text1" w:themeTint="A6"/>
+          <w:sz w:val="18"/>
+          <w:szCs w:val="18"/>
+        </w:rPr>
+        <w:t>, а кортеж нет, поэтому нас и просят даже можно сказать подсказывают в задаче, как нам изменить кортеж</w:t>
+      </w:r>
+    </w:p>
+    <w:p>
+      <w:pPr>
+        <w:spacing w:after="0"/>
+        <w:rPr>
+          <w:rFonts w:ascii="Times New Roman" w:hAnsi="Times New Roman" w:cs="Times New Roman"/>
+          <w:color w:val="595959" w:themeColor="text1" w:themeTint="A6"/>
+          <w:sz w:val="18"/>
+          <w:szCs w:val="18"/>
+        </w:rPr>
+      </w:pPr>
+      <w:r>
+        <w:rPr>
+          <w:rFonts w:ascii="Times New Roman" w:hAnsi="Times New Roman" w:cs="Times New Roman"/>
+          <w:color w:val="595959" w:themeColor="text1" w:themeTint="A6"/>
+          <w:sz w:val="18"/>
+          <w:szCs w:val="18"/>
+        </w:rPr>
+        <w:br/>
+      </w:r>
+    </w:p>
+    <w:p>
+      <w:pPr>
+        <w:spacing w:after="0"/>
         <w:jc w:val="center"/>
         <w:rPr>
           <w:rFonts w:ascii="Times New Roman" w:hAnsi="Times New Roman" w:cs="Times New Roman"/>
@@ -34333,7 +35532,7 @@
           <w:sz w:val="18"/>
           <w:szCs w:val="18"/>
         </w:rPr>
-        <w:t>Кортежи</w:t>
+        <w:t>Множества</w:t>
       </w:r>
       <w:r>
         <w:rPr>
@@ -34343,6 +35542,26 @@
           <w:szCs w:val="18"/>
         </w:rPr>
         <w:t>:</w:t>
+      </w:r>
+    </w:p>
+    <w:p>
+      <w:pPr>
+        <w:jc w:val="center"/>
+        <w:rPr>
+          <w:rFonts w:ascii="Times New Roman" w:hAnsi="Times New Roman" w:cs="Times New Roman"/>
+          <w:color w:val="595959" w:themeColor="text1" w:themeTint="A6"/>
+          <w:sz w:val="18"/>
+          <w:szCs w:val="18"/>
+        </w:rPr>
+      </w:pPr>
+      <w:r>
+        <w:rPr>
+          <w:rFonts w:ascii="Times New Roman" w:hAnsi="Times New Roman" w:cs="Times New Roman"/>
+          <w:color w:val="595959" w:themeColor="text1" w:themeTint="A6"/>
+          <w:sz w:val="18"/>
+          <w:szCs w:val="18"/>
+        </w:rPr>
+        <w:t>Даны два списка: [1, 2, 3, 4] и [3, 4, 5, 6]. Найдите их пересечение, объединение и разность.</w:t>
       </w:r>
     </w:p>
     <w:p>
@@ -34350,165 +35569,11 @@
         <w:pBdr>
           <w:bottom w:val="single" w:sz="12" w:space="1" w:color="auto"/>
         </w:pBdr>
-        <w:spacing w:after="0"/>
-        <w:jc w:val="center"/>
-        <w:rPr>
-          <w:rFonts w:ascii="Times New Roman" w:hAnsi="Times New Roman" w:cs="Times New Roman"/>
-          <w:color w:val="595959" w:themeColor="text1" w:themeTint="A6"/>
-          <w:sz w:val="18"/>
-          <w:szCs w:val="18"/>
-        </w:rPr>
-      </w:pPr>
-      <w:r>
-        <w:rPr>
-          <w:rFonts w:ascii="Times New Roman" w:hAnsi="Times New Roman" w:cs="Times New Roman"/>
-          <w:color w:val="595959" w:themeColor="text1" w:themeTint="A6"/>
-          <w:sz w:val="18"/>
-          <w:szCs w:val="18"/>
-        </w:rPr>
-        <w:t>Создайте кортеж из 3 элементов. Попробуйте изменить один элемент (ожидайте ошибку). Преобразуйте кортеж в список, измените элемент и преобразуйте обратно в кортеж.</w:t>
-      </w:r>
-    </w:p>
-    <w:p>
-      <w:pPr>
-        <w:pBdr>
-          <w:bottom w:val="single" w:sz="12" w:space="1" w:color="auto"/>
-        </w:pBdr>
-        <w:rPr>
-          <w:rFonts w:ascii="Times New Roman" w:hAnsi="Times New Roman" w:cs="Times New Roman"/>
-          <w:color w:val="595959" w:themeColor="text1" w:themeTint="A6"/>
-          <w:sz w:val="18"/>
-          <w:szCs w:val="18"/>
-        </w:rPr>
-      </w:pPr>
-      <w:r>
-        <w:rPr>
-          <w:rFonts w:ascii="Times New Roman" w:hAnsi="Times New Roman" w:cs="Times New Roman"/>
-          <w:b/>
-          <w:bCs/>
-          <w:color w:val="595959" w:themeColor="text1" w:themeTint="A6"/>
-          <w:sz w:val="18"/>
-          <w:szCs w:val="18"/>
-        </w:rPr>
-        <w:t>РЕШЕНИЕ</w:t>
-      </w:r>
-      <w:r>
-        <w:rPr>
-          <w:rFonts w:ascii="Times New Roman" w:hAnsi="Times New Roman" w:cs="Times New Roman"/>
-          <w:b/>
-          <w:bCs/>
-          <w:color w:val="595959" w:themeColor="text1" w:themeTint="A6"/>
-          <w:sz w:val="18"/>
-          <w:szCs w:val="18"/>
-        </w:rPr>
-        <w:t>:</w:t>
-      </w:r>
-    </w:p>
-    <w:p>
-      <w:pPr>
-        <w:spacing w:after="0"/>
-        <w:rPr>
-          <w:rFonts w:ascii="Times New Roman" w:hAnsi="Times New Roman" w:cs="Times New Roman"/>
-          <w:color w:val="595959" w:themeColor="text1" w:themeTint="A6"/>
-          <w:sz w:val="18"/>
-          <w:szCs w:val="18"/>
-        </w:rPr>
-      </w:pPr>
-      <w:r>
-        <w:rPr>
-          <w:rFonts w:ascii="Times New Roman" w:hAnsi="Times New Roman" w:cs="Times New Roman"/>
-          <w:color w:val="595959" w:themeColor="text1" w:themeTint="A6"/>
-          <w:sz w:val="18"/>
-          <w:szCs w:val="18"/>
-        </w:rPr>
-        <w:br/>
-      </w:r>
-    </w:p>
-    <w:p>
-      <w:pPr>
-        <w:spacing w:after="0"/>
-        <w:jc w:val="center"/>
-        <w:rPr>
-          <w:rFonts w:ascii="Times New Roman" w:hAnsi="Times New Roman" w:cs="Times New Roman"/>
-          <w:color w:val="595959" w:themeColor="text1" w:themeTint="A6"/>
-          <w:sz w:val="18"/>
-          <w:szCs w:val="18"/>
-        </w:rPr>
-      </w:pPr>
-      <w:r>
-        <w:rPr>
-          <w:rFonts w:ascii="Times New Roman" w:hAnsi="Times New Roman" w:cs="Times New Roman"/>
-          <w:b/>
-          <w:bCs/>
-          <w:color w:val="C00000"/>
-          <w:sz w:val="18"/>
-          <w:szCs w:val="18"/>
-        </w:rPr>
-        <w:t>Задача:</w:t>
-      </w:r>
-      <w:r>
-        <w:rPr>
-          <w:rFonts w:ascii="Times New Roman" w:hAnsi="Times New Roman" w:cs="Times New Roman"/>
-          <w:b/>
-          <w:bCs/>
-          <w:color w:val="C00000"/>
-          <w:sz w:val="18"/>
-          <w:szCs w:val="18"/>
-        </w:rPr>
-        <w:t xml:space="preserve"> </w:t>
-      </w:r>
-      <w:r>
-        <w:rPr>
-          <w:rFonts w:ascii="Times New Roman" w:hAnsi="Times New Roman" w:cs="Times New Roman"/>
-          <w:b/>
-          <w:bCs/>
-          <w:color w:val="595959" w:themeColor="text1" w:themeTint="A6"/>
-          <w:sz w:val="18"/>
-          <w:szCs w:val="18"/>
-        </w:rPr>
-        <w:t>Множества</w:t>
-      </w:r>
-      <w:r>
-        <w:rPr>
-          <w:rFonts w:ascii="Times New Roman" w:hAnsi="Times New Roman" w:cs="Times New Roman"/>
-          <w:color w:val="595959" w:themeColor="text1" w:themeTint="A6"/>
-          <w:sz w:val="18"/>
-          <w:szCs w:val="18"/>
-        </w:rPr>
-        <w:t>:</w:t>
-      </w:r>
-    </w:p>
-    <w:p>
-      <w:pPr>
-        <w:jc w:val="center"/>
-        <w:rPr>
-          <w:rFonts w:ascii="Times New Roman" w:hAnsi="Times New Roman" w:cs="Times New Roman"/>
-          <w:color w:val="595959" w:themeColor="text1" w:themeTint="A6"/>
-          <w:sz w:val="18"/>
-          <w:szCs w:val="18"/>
-        </w:rPr>
-      </w:pPr>
-      <w:r>
-        <w:rPr>
-          <w:rFonts w:ascii="Times New Roman" w:hAnsi="Times New Roman" w:cs="Times New Roman"/>
-          <w:color w:val="595959" w:themeColor="text1" w:themeTint="A6"/>
-          <w:sz w:val="18"/>
-          <w:szCs w:val="18"/>
-        </w:rPr>
-        <w:t>Даны два списка: [1, 2, 3, 4] и [3, 4, 5, 6]. Найдите их пересечение, объединение и разность.</w:t>
-      </w:r>
-    </w:p>
-    <w:p>
-      <w:pPr>
-        <w:pBdr>
-          <w:bottom w:val="single" w:sz="12" w:space="1" w:color="auto"/>
-        </w:pBdr>
-        <w:rPr>
-          <w:rFonts w:ascii="Times New Roman" w:hAnsi="Times New Roman" w:cs="Times New Roman"/>
-          <w:color w:val="595959" w:themeColor="text1" w:themeTint="A6"/>
-          <w:sz w:val="18"/>
-          <w:szCs w:val="18"/>
-          <w:lang w:val="en-US"/>
+        <w:rPr>
+          <w:rFonts w:ascii="Times New Roman" w:hAnsi="Times New Roman" w:cs="Times New Roman"/>
+          <w:color w:val="595959" w:themeColor="text1" w:themeTint="A6"/>
+          <w:sz w:val="18"/>
+          <w:szCs w:val="18"/>
         </w:rPr>
       </w:pPr>
       <w:r>
@@ -34681,7 +35746,6 @@
           <w:sz w:val="18"/>
           <w:szCs w:val="18"/>
         </w:rPr>
-        <w:lastRenderedPageBreak/>
         <w:t>Напишите функцию, которая принимает объект и выводит его тип, используя type().</w:t>
       </w:r>
     </w:p>
@@ -34908,8 +35972,8 @@
       </w:pPr>
     </w:p>
     <w:sectPr>
-      <w:headerReference w:type="default" r:id="rId76"/>
-      <w:footerReference w:type="default" r:id="rId77"/>
+      <w:headerReference w:type="default" r:id="rId78"/>
+      <w:footerReference w:type="default" r:id="rId79"/>
       <w:pgSz w:w="12240" w:h="20160" w:code="5"/>
       <w:pgMar w:top="1134" w:right="850" w:bottom="1134" w:left="1701" w:header="283" w:footer="397" w:gutter="0"/>
       <w:pgNumType w:start="1"/>
@@ -38462,6 +39526,155 @@
     </w:lvl>
   </w:abstractNum>
   <w:abstractNum w:abstractNumId="25" w15:restartNumberingAfterBreak="0">
+    <w:nsid w:val="22F714AE"/>
+    <w:multiLevelType w:val="multilevel"/>
+    <w:tmpl w:val="06401B9E"/>
+    <w:lvl w:ilvl="0">
+      <w:start w:val="1"/>
+      <w:numFmt w:val="bullet"/>
+      <w:lvlText w:val=""/>
+      <w:lvlJc w:val="left"/>
+      <w:pPr>
+        <w:tabs>
+          <w:tab w:val="num" w:pos="720"/>
+        </w:tabs>
+        <w:ind w:left="720" w:hanging="360"/>
+      </w:pPr>
+      <w:rPr>
+        <w:rFonts w:ascii="Symbol" w:hAnsi="Symbol" w:hint="default"/>
+        <w:sz w:val="20"/>
+      </w:rPr>
+    </w:lvl>
+    <w:lvl w:ilvl="1" w:tentative="1">
+      <w:start w:val="1"/>
+      <w:numFmt w:val="bullet"/>
+      <w:lvlText w:val="o"/>
+      <w:lvlJc w:val="left"/>
+      <w:pPr>
+        <w:tabs>
+          <w:tab w:val="num" w:pos="1440"/>
+        </w:tabs>
+        <w:ind w:left="1440" w:hanging="360"/>
+      </w:pPr>
+      <w:rPr>
+        <w:rFonts w:ascii="Courier New" w:hAnsi="Courier New" w:hint="default"/>
+        <w:sz w:val="20"/>
+      </w:rPr>
+    </w:lvl>
+    <w:lvl w:ilvl="2" w:tentative="1">
+      <w:start w:val="1"/>
+      <w:numFmt w:val="bullet"/>
+      <w:lvlText w:val=""/>
+      <w:lvlJc w:val="left"/>
+      <w:pPr>
+        <w:tabs>
+          <w:tab w:val="num" w:pos="2160"/>
+        </w:tabs>
+        <w:ind w:left="2160" w:hanging="360"/>
+      </w:pPr>
+      <w:rPr>
+        <w:rFonts w:ascii="Wingdings" w:hAnsi="Wingdings" w:hint="default"/>
+        <w:sz w:val="20"/>
+      </w:rPr>
+    </w:lvl>
+    <w:lvl w:ilvl="3" w:tentative="1">
+      <w:start w:val="1"/>
+      <w:numFmt w:val="bullet"/>
+      <w:lvlText w:val=""/>
+      <w:lvlJc w:val="left"/>
+      <w:pPr>
+        <w:tabs>
+          <w:tab w:val="num" w:pos="2880"/>
+        </w:tabs>
+        <w:ind w:left="2880" w:hanging="360"/>
+      </w:pPr>
+      <w:rPr>
+        <w:rFonts w:ascii="Wingdings" w:hAnsi="Wingdings" w:hint="default"/>
+        <w:sz w:val="20"/>
+      </w:rPr>
+    </w:lvl>
+    <w:lvl w:ilvl="4" w:tentative="1">
+      <w:start w:val="1"/>
+      <w:numFmt w:val="bullet"/>
+      <w:lvlText w:val=""/>
+      <w:lvlJc w:val="left"/>
+      <w:pPr>
+        <w:tabs>
+          <w:tab w:val="num" w:pos="3600"/>
+        </w:tabs>
+        <w:ind w:left="3600" w:hanging="360"/>
+      </w:pPr>
+      <w:rPr>
+        <w:rFonts w:ascii="Wingdings" w:hAnsi="Wingdings" w:hint="default"/>
+        <w:sz w:val="20"/>
+      </w:rPr>
+    </w:lvl>
+    <w:lvl w:ilvl="5" w:tentative="1">
+      <w:start w:val="1"/>
+      <w:numFmt w:val="bullet"/>
+      <w:lvlText w:val=""/>
+      <w:lvlJc w:val="left"/>
+      <w:pPr>
+        <w:tabs>
+          <w:tab w:val="num" w:pos="4320"/>
+        </w:tabs>
+        <w:ind w:left="4320" w:hanging="360"/>
+      </w:pPr>
+      <w:rPr>
+        <w:rFonts w:ascii="Wingdings" w:hAnsi="Wingdings" w:hint="default"/>
+        <w:sz w:val="20"/>
+      </w:rPr>
+    </w:lvl>
+    <w:lvl w:ilvl="6" w:tentative="1">
+      <w:start w:val="1"/>
+      <w:numFmt w:val="bullet"/>
+      <w:lvlText w:val=""/>
+      <w:lvlJc w:val="left"/>
+      <w:pPr>
+        <w:tabs>
+          <w:tab w:val="num" w:pos="5040"/>
+        </w:tabs>
+        <w:ind w:left="5040" w:hanging="360"/>
+      </w:pPr>
+      <w:rPr>
+        <w:rFonts w:ascii="Wingdings" w:hAnsi="Wingdings" w:hint="default"/>
+        <w:sz w:val="20"/>
+      </w:rPr>
+    </w:lvl>
+    <w:lvl w:ilvl="7" w:tentative="1">
+      <w:start w:val="1"/>
+      <w:numFmt w:val="bullet"/>
+      <w:lvlText w:val=""/>
+      <w:lvlJc w:val="left"/>
+      <w:pPr>
+        <w:tabs>
+          <w:tab w:val="num" w:pos="5760"/>
+        </w:tabs>
+        <w:ind w:left="5760" w:hanging="360"/>
+      </w:pPr>
+      <w:rPr>
+        <w:rFonts w:ascii="Wingdings" w:hAnsi="Wingdings" w:hint="default"/>
+        <w:sz w:val="20"/>
+      </w:rPr>
+    </w:lvl>
+    <w:lvl w:ilvl="8" w:tentative="1">
+      <w:start w:val="1"/>
+      <w:numFmt w:val="bullet"/>
+      <w:lvlText w:val=""/>
+      <w:lvlJc w:val="left"/>
+      <w:pPr>
+        <w:tabs>
+          <w:tab w:val="num" w:pos="6480"/>
+        </w:tabs>
+        <w:ind w:left="6480" w:hanging="360"/>
+      </w:pPr>
+      <w:rPr>
+        <w:rFonts w:ascii="Wingdings" w:hAnsi="Wingdings" w:hint="default"/>
+        <w:sz w:val="20"/>
+      </w:rPr>
+    </w:lvl>
+  </w:abstractNum>
+  <w:abstractNum w:abstractNumId="26" w15:restartNumberingAfterBreak="0">
     <w:nsid w:val="23330F42"/>
     <w:multiLevelType w:val="multilevel"/>
     <w:tmpl w:val="2D568EEC"/>
@@ -38606,7 +39819,7 @@
       </w:rPr>
     </w:lvl>
   </w:abstractNum>
-  <w:abstractNum w:abstractNumId="26" w15:restartNumberingAfterBreak="0">
+  <w:abstractNum w:abstractNumId="27" w15:restartNumberingAfterBreak="0">
     <w:nsid w:val="26040EEC"/>
     <w:multiLevelType w:val="hybridMultilevel"/>
     <w:tmpl w:val="A04E4310"/>
@@ -38697,7 +39910,7 @@
       </w:pPr>
     </w:lvl>
   </w:abstractNum>
-  <w:abstractNum w:abstractNumId="27" w15:restartNumberingAfterBreak="0">
+  <w:abstractNum w:abstractNumId="28" w15:restartNumberingAfterBreak="0">
     <w:nsid w:val="2661041E"/>
     <w:multiLevelType w:val="multilevel"/>
     <w:tmpl w:val="5D029EB8"/>
@@ -38846,7 +40059,7 @@
       </w:rPr>
     </w:lvl>
   </w:abstractNum>
-  <w:abstractNum w:abstractNumId="28" w15:restartNumberingAfterBreak="0">
+  <w:abstractNum w:abstractNumId="29" w15:restartNumberingAfterBreak="0">
     <w:nsid w:val="26B06765"/>
     <w:multiLevelType w:val="multilevel"/>
     <w:tmpl w:val="D166EF8C"/>
@@ -38995,7 +40208,7 @@
       </w:rPr>
     </w:lvl>
   </w:abstractNum>
-  <w:abstractNum w:abstractNumId="29" w15:restartNumberingAfterBreak="0">
+  <w:abstractNum w:abstractNumId="30" w15:restartNumberingAfterBreak="0">
     <w:nsid w:val="27081F03"/>
     <w:multiLevelType w:val="multilevel"/>
     <w:tmpl w:val="FCC0FF3C"/>
@@ -39108,7 +40321,7 @@
       </w:pPr>
     </w:lvl>
   </w:abstractNum>
-  <w:abstractNum w:abstractNumId="30" w15:restartNumberingAfterBreak="0">
+  <w:abstractNum w:abstractNumId="31" w15:restartNumberingAfterBreak="0">
     <w:nsid w:val="2A0B1BB8"/>
     <w:multiLevelType w:val="multilevel"/>
     <w:tmpl w:val="30324AD0"/>
@@ -39257,7 +40470,7 @@
       </w:rPr>
     </w:lvl>
   </w:abstractNum>
-  <w:abstractNum w:abstractNumId="31" w15:restartNumberingAfterBreak="0">
+  <w:abstractNum w:abstractNumId="32" w15:restartNumberingAfterBreak="0">
     <w:nsid w:val="2F633571"/>
     <w:multiLevelType w:val="multilevel"/>
     <w:tmpl w:val="E5D6DCC6"/>
@@ -39406,7 +40619,7 @@
       </w:rPr>
     </w:lvl>
   </w:abstractNum>
-  <w:abstractNum w:abstractNumId="32" w15:restartNumberingAfterBreak="0">
+  <w:abstractNum w:abstractNumId="33" w15:restartNumberingAfterBreak="0">
     <w:nsid w:val="30417600"/>
     <w:multiLevelType w:val="multilevel"/>
     <w:tmpl w:val="68F617E0"/>
@@ -39555,7 +40768,7 @@
       </w:rPr>
     </w:lvl>
   </w:abstractNum>
-  <w:abstractNum w:abstractNumId="33" w15:restartNumberingAfterBreak="0">
+  <w:abstractNum w:abstractNumId="34" w15:restartNumberingAfterBreak="0">
     <w:nsid w:val="31E969B8"/>
     <w:multiLevelType w:val="multilevel"/>
     <w:tmpl w:val="166E0192"/>
@@ -39704,7 +40917,7 @@
       </w:rPr>
     </w:lvl>
   </w:abstractNum>
-  <w:abstractNum w:abstractNumId="34" w15:restartNumberingAfterBreak="0">
+  <w:abstractNum w:abstractNumId="35" w15:restartNumberingAfterBreak="0">
     <w:nsid w:val="327908BF"/>
     <w:multiLevelType w:val="multilevel"/>
     <w:tmpl w:val="C60C2FFA"/>
@@ -39853,7 +41066,7 @@
       </w:rPr>
     </w:lvl>
   </w:abstractNum>
-  <w:abstractNum w:abstractNumId="35" w15:restartNumberingAfterBreak="0">
+  <w:abstractNum w:abstractNumId="36" w15:restartNumberingAfterBreak="0">
     <w:nsid w:val="35524ECA"/>
     <w:multiLevelType w:val="hybridMultilevel"/>
     <w:tmpl w:val="BFF4877A"/>
@@ -39966,7 +41179,7 @@
       </w:rPr>
     </w:lvl>
   </w:abstractNum>
-  <w:abstractNum w:abstractNumId="36" w15:restartNumberingAfterBreak="0">
+  <w:abstractNum w:abstractNumId="37" w15:restartNumberingAfterBreak="0">
     <w:nsid w:val="393C6861"/>
     <w:multiLevelType w:val="multilevel"/>
     <w:tmpl w:val="47A02D72"/>
@@ -40115,7 +41328,7 @@
       </w:rPr>
     </w:lvl>
   </w:abstractNum>
-  <w:abstractNum w:abstractNumId="37" w15:restartNumberingAfterBreak="0">
+  <w:abstractNum w:abstractNumId="38" w15:restartNumberingAfterBreak="0">
     <w:nsid w:val="395F3215"/>
     <w:multiLevelType w:val="multilevel"/>
     <w:tmpl w:val="F716A9F4"/>
@@ -40232,7 +41445,7 @@
       </w:pPr>
     </w:lvl>
   </w:abstractNum>
-  <w:abstractNum w:abstractNumId="38" w15:restartNumberingAfterBreak="0">
+  <w:abstractNum w:abstractNumId="39" w15:restartNumberingAfterBreak="0">
     <w:nsid w:val="3A7E3E0C"/>
     <w:multiLevelType w:val="multilevel"/>
     <w:tmpl w:val="3DDA4034"/>
@@ -40381,7 +41594,7 @@
       </w:rPr>
     </w:lvl>
   </w:abstractNum>
-  <w:abstractNum w:abstractNumId="39" w15:restartNumberingAfterBreak="0">
+  <w:abstractNum w:abstractNumId="40" w15:restartNumberingAfterBreak="0">
     <w:nsid w:val="3A9C2647"/>
     <w:multiLevelType w:val="multilevel"/>
     <w:tmpl w:val="4208B74A"/>
@@ -40530,7 +41743,7 @@
       </w:rPr>
     </w:lvl>
   </w:abstractNum>
-  <w:abstractNum w:abstractNumId="40" w15:restartNumberingAfterBreak="0">
+  <w:abstractNum w:abstractNumId="41" w15:restartNumberingAfterBreak="0">
     <w:nsid w:val="3B6976DE"/>
     <w:multiLevelType w:val="multilevel"/>
     <w:tmpl w:val="EBD041BA"/>
@@ -40679,7 +41892,7 @@
       </w:rPr>
     </w:lvl>
   </w:abstractNum>
-  <w:abstractNum w:abstractNumId="41" w15:restartNumberingAfterBreak="0">
+  <w:abstractNum w:abstractNumId="42" w15:restartNumberingAfterBreak="0">
     <w:nsid w:val="3D0D5A10"/>
     <w:multiLevelType w:val="multilevel"/>
     <w:tmpl w:val="B3AC3AA6"/>
@@ -40828,7 +42041,7 @@
       </w:rPr>
     </w:lvl>
   </w:abstractNum>
-  <w:abstractNum w:abstractNumId="42" w15:restartNumberingAfterBreak="0">
+  <w:abstractNum w:abstractNumId="43" w15:restartNumberingAfterBreak="0">
     <w:nsid w:val="3F195869"/>
     <w:multiLevelType w:val="hybridMultilevel"/>
     <w:tmpl w:val="0AEEB606"/>
@@ -40914,7 +42127,7 @@
       </w:pPr>
     </w:lvl>
   </w:abstractNum>
-  <w:abstractNum w:abstractNumId="43" w15:restartNumberingAfterBreak="0">
+  <w:abstractNum w:abstractNumId="44" w15:restartNumberingAfterBreak="0">
     <w:nsid w:val="4083216E"/>
     <w:multiLevelType w:val="multilevel"/>
     <w:tmpl w:val="546884DA"/>
@@ -41063,7 +42276,7 @@
       </w:rPr>
     </w:lvl>
   </w:abstractNum>
-  <w:abstractNum w:abstractNumId="44" w15:restartNumberingAfterBreak="0">
+  <w:abstractNum w:abstractNumId="45" w15:restartNumberingAfterBreak="0">
     <w:nsid w:val="41215DF0"/>
     <w:multiLevelType w:val="multilevel"/>
     <w:tmpl w:val="F5C8A20E"/>
@@ -41212,7 +42425,7 @@
       </w:rPr>
     </w:lvl>
   </w:abstractNum>
-  <w:abstractNum w:abstractNumId="45" w15:restartNumberingAfterBreak="0">
+  <w:abstractNum w:abstractNumId="46" w15:restartNumberingAfterBreak="0">
     <w:nsid w:val="447D2D1B"/>
     <w:multiLevelType w:val="multilevel"/>
     <w:tmpl w:val="C60C2FFA"/>
@@ -41361,7 +42574,7 @@
       </w:rPr>
     </w:lvl>
   </w:abstractNum>
-  <w:abstractNum w:abstractNumId="46" w15:restartNumberingAfterBreak="0">
+  <w:abstractNum w:abstractNumId="47" w15:restartNumberingAfterBreak="0">
     <w:nsid w:val="45603545"/>
     <w:multiLevelType w:val="multilevel"/>
     <w:tmpl w:val="C4847E88"/>
@@ -41474,7 +42687,7 @@
       </w:pPr>
     </w:lvl>
   </w:abstractNum>
-  <w:abstractNum w:abstractNumId="47" w15:restartNumberingAfterBreak="0">
+  <w:abstractNum w:abstractNumId="48" w15:restartNumberingAfterBreak="0">
     <w:nsid w:val="46336776"/>
     <w:multiLevelType w:val="multilevel"/>
     <w:tmpl w:val="DF624274"/>
@@ -41623,7 +42836,7 @@
       </w:rPr>
     </w:lvl>
   </w:abstractNum>
-  <w:abstractNum w:abstractNumId="48" w15:restartNumberingAfterBreak="0">
+  <w:abstractNum w:abstractNumId="49" w15:restartNumberingAfterBreak="0">
     <w:nsid w:val="485E6EE6"/>
     <w:multiLevelType w:val="multilevel"/>
     <w:tmpl w:val="6860AD8A"/>
@@ -41772,7 +42985,7 @@
       </w:rPr>
     </w:lvl>
   </w:abstractNum>
-  <w:abstractNum w:abstractNumId="49" w15:restartNumberingAfterBreak="0">
+  <w:abstractNum w:abstractNumId="50" w15:restartNumberingAfterBreak="0">
     <w:nsid w:val="488A1DBB"/>
     <w:multiLevelType w:val="multilevel"/>
     <w:tmpl w:val="87DEC4A2"/>
@@ -41921,7 +43134,7 @@
       </w:rPr>
     </w:lvl>
   </w:abstractNum>
-  <w:abstractNum w:abstractNumId="50" w15:restartNumberingAfterBreak="0">
+  <w:abstractNum w:abstractNumId="51" w15:restartNumberingAfterBreak="0">
     <w:nsid w:val="4C33111E"/>
     <w:multiLevelType w:val="multilevel"/>
     <w:tmpl w:val="A1FE39D2"/>
@@ -42070,7 +43283,7 @@
       </w:rPr>
     </w:lvl>
   </w:abstractNum>
-  <w:abstractNum w:abstractNumId="51" w15:restartNumberingAfterBreak="0">
+  <w:abstractNum w:abstractNumId="52" w15:restartNumberingAfterBreak="0">
     <w:nsid w:val="522B7E37"/>
     <w:multiLevelType w:val="multilevel"/>
     <w:tmpl w:val="D52C9F50"/>
@@ -42219,7 +43432,7 @@
       </w:rPr>
     </w:lvl>
   </w:abstractNum>
-  <w:abstractNum w:abstractNumId="52" w15:restartNumberingAfterBreak="0">
+  <w:abstractNum w:abstractNumId="53" w15:restartNumberingAfterBreak="0">
     <w:nsid w:val="5491163E"/>
     <w:multiLevelType w:val="multilevel"/>
     <w:tmpl w:val="1F008D98"/>
@@ -42332,7 +43545,7 @@
       </w:pPr>
     </w:lvl>
   </w:abstractNum>
-  <w:abstractNum w:abstractNumId="53" w15:restartNumberingAfterBreak="0">
+  <w:abstractNum w:abstractNumId="54" w15:restartNumberingAfterBreak="0">
     <w:nsid w:val="55C07B86"/>
     <w:multiLevelType w:val="multilevel"/>
     <w:tmpl w:val="21B0D25A"/>
@@ -42481,7 +43694,7 @@
       </w:rPr>
     </w:lvl>
   </w:abstractNum>
-  <w:abstractNum w:abstractNumId="54" w15:restartNumberingAfterBreak="0">
+  <w:abstractNum w:abstractNumId="55" w15:restartNumberingAfterBreak="0">
     <w:nsid w:val="55F426D8"/>
     <w:multiLevelType w:val="multilevel"/>
     <w:tmpl w:val="C54A629A"/>
@@ -42630,7 +43843,7 @@
       </w:rPr>
     </w:lvl>
   </w:abstractNum>
-  <w:abstractNum w:abstractNumId="55" w15:restartNumberingAfterBreak="0">
+  <w:abstractNum w:abstractNumId="56" w15:restartNumberingAfterBreak="0">
     <w:nsid w:val="563874AD"/>
     <w:multiLevelType w:val="hybridMultilevel"/>
     <w:tmpl w:val="1A9067B4"/>
@@ -42743,7 +43956,7 @@
       </w:rPr>
     </w:lvl>
   </w:abstractNum>
-  <w:abstractNum w:abstractNumId="56" w15:restartNumberingAfterBreak="0">
+  <w:abstractNum w:abstractNumId="57" w15:restartNumberingAfterBreak="0">
     <w:nsid w:val="57AF0F76"/>
     <w:multiLevelType w:val="multilevel"/>
     <w:tmpl w:val="85580CC4"/>
@@ -42892,7 +44105,7 @@
       </w:rPr>
     </w:lvl>
   </w:abstractNum>
-  <w:abstractNum w:abstractNumId="57" w15:restartNumberingAfterBreak="0">
+  <w:abstractNum w:abstractNumId="58" w15:restartNumberingAfterBreak="0">
     <w:nsid w:val="5B1F6F2E"/>
     <w:multiLevelType w:val="multilevel"/>
     <w:tmpl w:val="0906AA84"/>
@@ -43005,7 +44218,7 @@
       </w:pPr>
     </w:lvl>
   </w:abstractNum>
-  <w:abstractNum w:abstractNumId="58" w15:restartNumberingAfterBreak="0">
+  <w:abstractNum w:abstractNumId="59" w15:restartNumberingAfterBreak="0">
     <w:nsid w:val="5CBB445D"/>
     <w:multiLevelType w:val="multilevel"/>
     <w:tmpl w:val="D5B40914"/>
@@ -43154,7 +44367,7 @@
       </w:rPr>
     </w:lvl>
   </w:abstractNum>
-  <w:abstractNum w:abstractNumId="59" w15:restartNumberingAfterBreak="0">
+  <w:abstractNum w:abstractNumId="60" w15:restartNumberingAfterBreak="0">
     <w:nsid w:val="5EB21B9C"/>
     <w:multiLevelType w:val="multilevel"/>
     <w:tmpl w:val="DA1C1E8C"/>
@@ -43267,7 +44480,7 @@
       </w:pPr>
     </w:lvl>
   </w:abstractNum>
-  <w:abstractNum w:abstractNumId="60" w15:restartNumberingAfterBreak="0">
+  <w:abstractNum w:abstractNumId="61" w15:restartNumberingAfterBreak="0">
     <w:nsid w:val="60346E60"/>
     <w:multiLevelType w:val="multilevel"/>
     <w:tmpl w:val="615EE75A"/>
@@ -43416,7 +44629,7 @@
       </w:rPr>
     </w:lvl>
   </w:abstractNum>
-  <w:abstractNum w:abstractNumId="61" w15:restartNumberingAfterBreak="0">
+  <w:abstractNum w:abstractNumId="62" w15:restartNumberingAfterBreak="0">
     <w:nsid w:val="60526FE8"/>
     <w:multiLevelType w:val="multilevel"/>
     <w:tmpl w:val="B8482F36"/>
@@ -43529,7 +44742,7 @@
       </w:pPr>
     </w:lvl>
   </w:abstractNum>
-  <w:abstractNum w:abstractNumId="62" w15:restartNumberingAfterBreak="0">
+  <w:abstractNum w:abstractNumId="63" w15:restartNumberingAfterBreak="0">
     <w:nsid w:val="611C3BA3"/>
     <w:multiLevelType w:val="multilevel"/>
     <w:tmpl w:val="3362B75C"/>
@@ -43678,7 +44891,7 @@
       </w:rPr>
     </w:lvl>
   </w:abstractNum>
-  <w:abstractNum w:abstractNumId="63" w15:restartNumberingAfterBreak="0">
+  <w:abstractNum w:abstractNumId="64" w15:restartNumberingAfterBreak="0">
     <w:nsid w:val="61221F3B"/>
     <w:multiLevelType w:val="multilevel"/>
     <w:tmpl w:val="9372F35E"/>
@@ -43791,7 +45004,7 @@
       </w:pPr>
     </w:lvl>
   </w:abstractNum>
-  <w:abstractNum w:abstractNumId="64" w15:restartNumberingAfterBreak="0">
+  <w:abstractNum w:abstractNumId="65" w15:restartNumberingAfterBreak="0">
     <w:nsid w:val="61635166"/>
     <w:multiLevelType w:val="multilevel"/>
     <w:tmpl w:val="194A916E"/>
@@ -43904,7 +45117,7 @@
       </w:pPr>
     </w:lvl>
   </w:abstractNum>
-  <w:abstractNum w:abstractNumId="65" w15:restartNumberingAfterBreak="0">
+  <w:abstractNum w:abstractNumId="66" w15:restartNumberingAfterBreak="0">
     <w:nsid w:val="616C446A"/>
     <w:multiLevelType w:val="multilevel"/>
     <w:tmpl w:val="B4F6C7B6"/>
@@ -44017,7 +45230,7 @@
       </w:pPr>
     </w:lvl>
   </w:abstractNum>
-  <w:abstractNum w:abstractNumId="66" w15:restartNumberingAfterBreak="0">
+  <w:abstractNum w:abstractNumId="67" w15:restartNumberingAfterBreak="0">
     <w:nsid w:val="61C6356F"/>
     <w:multiLevelType w:val="multilevel"/>
     <w:tmpl w:val="2690EA9C"/>
@@ -44166,7 +45379,7 @@
       </w:rPr>
     </w:lvl>
   </w:abstractNum>
-  <w:abstractNum w:abstractNumId="67" w15:restartNumberingAfterBreak="0">
+  <w:abstractNum w:abstractNumId="68" w15:restartNumberingAfterBreak="0">
     <w:nsid w:val="62D95EB3"/>
     <w:multiLevelType w:val="hybridMultilevel"/>
     <w:tmpl w:val="8FC623BE"/>
@@ -44279,7 +45492,7 @@
       </w:rPr>
     </w:lvl>
   </w:abstractNum>
-  <w:abstractNum w:abstractNumId="68" w15:restartNumberingAfterBreak="0">
+  <w:abstractNum w:abstractNumId="69" w15:restartNumberingAfterBreak="0">
     <w:nsid w:val="68E86A8C"/>
     <w:multiLevelType w:val="hybridMultilevel"/>
     <w:tmpl w:val="76287898"/>
@@ -44365,7 +45578,7 @@
       </w:pPr>
     </w:lvl>
   </w:abstractNum>
-  <w:abstractNum w:abstractNumId="69" w15:restartNumberingAfterBreak="0">
+  <w:abstractNum w:abstractNumId="70" w15:restartNumberingAfterBreak="0">
     <w:nsid w:val="692B5ABA"/>
     <w:multiLevelType w:val="multilevel"/>
     <w:tmpl w:val="B52CEBD4"/>
@@ -44514,7 +45727,7 @@
       </w:rPr>
     </w:lvl>
   </w:abstractNum>
-  <w:abstractNum w:abstractNumId="70" w15:restartNumberingAfterBreak="0">
+  <w:abstractNum w:abstractNumId="71" w15:restartNumberingAfterBreak="0">
     <w:nsid w:val="6AC020B7"/>
     <w:multiLevelType w:val="multilevel"/>
     <w:tmpl w:val="6D9441F4"/>
@@ -44663,7 +45876,7 @@
       </w:rPr>
     </w:lvl>
   </w:abstractNum>
-  <w:abstractNum w:abstractNumId="71" w15:restartNumberingAfterBreak="0">
+  <w:abstractNum w:abstractNumId="72" w15:restartNumberingAfterBreak="0">
     <w:nsid w:val="71011011"/>
     <w:multiLevelType w:val="multilevel"/>
     <w:tmpl w:val="289A1548"/>
@@ -44812,7 +46025,7 @@
       </w:rPr>
     </w:lvl>
   </w:abstractNum>
-  <w:abstractNum w:abstractNumId="72" w15:restartNumberingAfterBreak="0">
+  <w:abstractNum w:abstractNumId="73" w15:restartNumberingAfterBreak="0">
     <w:nsid w:val="721C6561"/>
     <w:multiLevelType w:val="hybridMultilevel"/>
     <w:tmpl w:val="ECD677D4"/>
@@ -44925,7 +46138,7 @@
       </w:rPr>
     </w:lvl>
   </w:abstractNum>
-  <w:abstractNum w:abstractNumId="73" w15:restartNumberingAfterBreak="0">
+  <w:abstractNum w:abstractNumId="74" w15:restartNumberingAfterBreak="0">
     <w:nsid w:val="73F9785C"/>
     <w:multiLevelType w:val="multilevel"/>
     <w:tmpl w:val="67522E8C"/>
@@ -45074,7 +46287,7 @@
       </w:rPr>
     </w:lvl>
   </w:abstractNum>
-  <w:abstractNum w:abstractNumId="74" w15:restartNumberingAfterBreak="0">
+  <w:abstractNum w:abstractNumId="75" w15:restartNumberingAfterBreak="0">
     <w:nsid w:val="746A4C4A"/>
     <w:multiLevelType w:val="multilevel"/>
     <w:tmpl w:val="10E0C05E"/>
@@ -45223,7 +46436,7 @@
       </w:rPr>
     </w:lvl>
   </w:abstractNum>
-  <w:abstractNum w:abstractNumId="75" w15:restartNumberingAfterBreak="0">
+  <w:abstractNum w:abstractNumId="76" w15:restartNumberingAfterBreak="0">
     <w:nsid w:val="74D607F9"/>
     <w:multiLevelType w:val="multilevel"/>
     <w:tmpl w:val="F4CCFE30"/>
@@ -45336,7 +46549,120 @@
       </w:pPr>
     </w:lvl>
   </w:abstractNum>
-  <w:abstractNum w:abstractNumId="76" w15:restartNumberingAfterBreak="0">
+  <w:abstractNum w:abstractNumId="77" w15:restartNumberingAfterBreak="0">
+    <w:nsid w:val="77D63042"/>
+    <w:multiLevelType w:val="multilevel"/>
+    <w:tmpl w:val="21FABEBC"/>
+    <w:lvl w:ilvl="0">
+      <w:start w:val="1"/>
+      <w:numFmt w:val="decimal"/>
+      <w:lvlText w:val="%1."/>
+      <w:lvlJc w:val="left"/>
+      <w:pPr>
+        <w:tabs>
+          <w:tab w:val="num" w:pos="720"/>
+        </w:tabs>
+        <w:ind w:left="720" w:hanging="360"/>
+      </w:pPr>
+    </w:lvl>
+    <w:lvl w:ilvl="1" w:tentative="1">
+      <w:start w:val="1"/>
+      <w:numFmt w:val="decimal"/>
+      <w:lvlText w:val="%2."/>
+      <w:lvlJc w:val="left"/>
+      <w:pPr>
+        <w:tabs>
+          <w:tab w:val="num" w:pos="1440"/>
+        </w:tabs>
+        <w:ind w:left="1440" w:hanging="360"/>
+      </w:pPr>
+    </w:lvl>
+    <w:lvl w:ilvl="2" w:tentative="1">
+      <w:start w:val="1"/>
+      <w:numFmt w:val="decimal"/>
+      <w:lvlText w:val="%3."/>
+      <w:lvlJc w:val="left"/>
+      <w:pPr>
+        <w:tabs>
+          <w:tab w:val="num" w:pos="2160"/>
+        </w:tabs>
+        <w:ind w:left="2160" w:hanging="360"/>
+      </w:pPr>
+    </w:lvl>
+    <w:lvl w:ilvl="3" w:tentative="1">
+      <w:start w:val="1"/>
+      <w:numFmt w:val="decimal"/>
+      <w:lvlText w:val="%4."/>
+      <w:lvlJc w:val="left"/>
+      <w:pPr>
+        <w:tabs>
+          <w:tab w:val="num" w:pos="2880"/>
+        </w:tabs>
+        <w:ind w:left="2880" w:hanging="360"/>
+      </w:pPr>
+    </w:lvl>
+    <w:lvl w:ilvl="4" w:tentative="1">
+      <w:start w:val="1"/>
+      <w:numFmt w:val="decimal"/>
+      <w:lvlText w:val="%5."/>
+      <w:lvlJc w:val="left"/>
+      <w:pPr>
+        <w:tabs>
+          <w:tab w:val="num" w:pos="3600"/>
+        </w:tabs>
+        <w:ind w:left="3600" w:hanging="360"/>
+      </w:pPr>
+    </w:lvl>
+    <w:lvl w:ilvl="5" w:tentative="1">
+      <w:start w:val="1"/>
+      <w:numFmt w:val="decimal"/>
+      <w:lvlText w:val="%6."/>
+      <w:lvlJc w:val="left"/>
+      <w:pPr>
+        <w:tabs>
+          <w:tab w:val="num" w:pos="4320"/>
+        </w:tabs>
+        <w:ind w:left="4320" w:hanging="360"/>
+      </w:pPr>
+    </w:lvl>
+    <w:lvl w:ilvl="6" w:tentative="1">
+      <w:start w:val="1"/>
+      <w:numFmt w:val="decimal"/>
+      <w:lvlText w:val="%7."/>
+      <w:lvlJc w:val="left"/>
+      <w:pPr>
+        <w:tabs>
+          <w:tab w:val="num" w:pos="5040"/>
+        </w:tabs>
+        <w:ind w:left="5040" w:hanging="360"/>
+      </w:pPr>
+    </w:lvl>
+    <w:lvl w:ilvl="7" w:tentative="1">
+      <w:start w:val="1"/>
+      <w:numFmt w:val="decimal"/>
+      <w:lvlText w:val="%8."/>
+      <w:lvlJc w:val="left"/>
+      <w:pPr>
+        <w:tabs>
+          <w:tab w:val="num" w:pos="5760"/>
+        </w:tabs>
+        <w:ind w:left="5760" w:hanging="360"/>
+      </w:pPr>
+    </w:lvl>
+    <w:lvl w:ilvl="8" w:tentative="1">
+      <w:start w:val="1"/>
+      <w:numFmt w:val="decimal"/>
+      <w:lvlText w:val="%9."/>
+      <w:lvlJc w:val="left"/>
+      <w:pPr>
+        <w:tabs>
+          <w:tab w:val="num" w:pos="6480"/>
+        </w:tabs>
+        <w:ind w:left="6480" w:hanging="360"/>
+      </w:pPr>
+    </w:lvl>
+  </w:abstractNum>
+  <w:abstractNum w:abstractNumId="78" w15:restartNumberingAfterBreak="0">
     <w:nsid w:val="79306BAB"/>
     <w:multiLevelType w:val="multilevel"/>
     <w:tmpl w:val="778EECBA"/>
@@ -45449,7 +46775,7 @@
       </w:pPr>
     </w:lvl>
   </w:abstractNum>
-  <w:abstractNum w:abstractNumId="77" w15:restartNumberingAfterBreak="0">
+  <w:abstractNum w:abstractNumId="79" w15:restartNumberingAfterBreak="0">
     <w:nsid w:val="7A52735D"/>
     <w:multiLevelType w:val="multilevel"/>
     <w:tmpl w:val="FD2069AA"/>
@@ -45598,7 +46924,7 @@
       </w:rPr>
     </w:lvl>
   </w:abstractNum>
-  <w:abstractNum w:abstractNumId="78" w15:restartNumberingAfterBreak="0">
+  <w:abstractNum w:abstractNumId="80" w15:restartNumberingAfterBreak="0">
     <w:nsid w:val="7B2F1B4B"/>
     <w:multiLevelType w:val="multilevel"/>
     <w:tmpl w:val="6FCA332C"/>
@@ -45711,7 +47037,7 @@
       </w:pPr>
     </w:lvl>
   </w:abstractNum>
-  <w:abstractNum w:abstractNumId="79" w15:restartNumberingAfterBreak="0">
+  <w:abstractNum w:abstractNumId="81" w15:restartNumberingAfterBreak="0">
     <w:nsid w:val="7F1B7409"/>
     <w:multiLevelType w:val="multilevel"/>
     <w:tmpl w:val="812289E2"/>
@@ -45860,7 +47186,7 @@
       </w:rPr>
     </w:lvl>
   </w:abstractNum>
-  <w:abstractNum w:abstractNumId="80" w15:restartNumberingAfterBreak="0">
+  <w:abstractNum w:abstractNumId="82" w15:restartNumberingAfterBreak="0">
     <w:nsid w:val="7F604749"/>
     <w:multiLevelType w:val="multilevel"/>
     <w:tmpl w:val="F6C69AC2"/>
@@ -46010,25 +47336,25 @@
     </w:lvl>
   </w:abstractNum>
   <w:num w:numId="1" w16cid:durableId="405300518">
-    <w:abstractNumId w:val="42"/>
+    <w:abstractNumId w:val="43"/>
   </w:num>
   <w:num w:numId="2" w16cid:durableId="2138645182">
     <w:abstractNumId w:val="20"/>
   </w:num>
   <w:num w:numId="3" w16cid:durableId="462119961">
-    <w:abstractNumId w:val="55"/>
+    <w:abstractNumId w:val="56"/>
   </w:num>
   <w:num w:numId="4" w16cid:durableId="1954094783">
-    <w:abstractNumId w:val="35"/>
+    <w:abstractNumId w:val="36"/>
   </w:num>
   <w:num w:numId="5" w16cid:durableId="882136229">
-    <w:abstractNumId w:val="74"/>
+    <w:abstractNumId w:val="75"/>
   </w:num>
   <w:num w:numId="6" w16cid:durableId="1025794466">
     <w:abstractNumId w:val="1"/>
   </w:num>
   <w:num w:numId="7" w16cid:durableId="651449495">
-    <w:abstractNumId w:val="68"/>
+    <w:abstractNumId w:val="69"/>
   </w:num>
   <w:num w:numId="8" w16cid:durableId="1139345737">
     <w:abstractNumId w:val="10"/>
@@ -46037,58 +47363,58 @@
     <w:abstractNumId w:val="6"/>
   </w:num>
   <w:num w:numId="10" w16cid:durableId="717977333">
-    <w:abstractNumId w:val="29"/>
+    <w:abstractNumId w:val="30"/>
   </w:num>
   <w:num w:numId="11" w16cid:durableId="10494282">
-    <w:abstractNumId w:val="66"/>
+    <w:abstractNumId w:val="67"/>
   </w:num>
   <w:num w:numId="12" w16cid:durableId="1177386414">
-    <w:abstractNumId w:val="80"/>
+    <w:abstractNumId w:val="82"/>
   </w:num>
   <w:num w:numId="13" w16cid:durableId="1633973990">
-    <w:abstractNumId w:val="64"/>
+    <w:abstractNumId w:val="65"/>
   </w:num>
   <w:num w:numId="14" w16cid:durableId="223836851">
     <w:abstractNumId w:val="3"/>
   </w:num>
   <w:num w:numId="15" w16cid:durableId="1183125882">
+    <w:abstractNumId w:val="45"/>
+  </w:num>
+  <w:num w:numId="16" w16cid:durableId="104740181">
+    <w:abstractNumId w:val="76"/>
+  </w:num>
+  <w:num w:numId="17" w16cid:durableId="1620184776">
+    <w:abstractNumId w:val="34"/>
+  </w:num>
+  <w:num w:numId="18" w16cid:durableId="392700641">
     <w:abstractNumId w:val="44"/>
   </w:num>
-  <w:num w:numId="16" w16cid:durableId="104740181">
-    <w:abstractNumId w:val="75"/>
-  </w:num>
-  <w:num w:numId="17" w16cid:durableId="1620184776">
-    <w:abstractNumId w:val="33"/>
-  </w:num>
-  <w:num w:numId="18" w16cid:durableId="392700641">
-    <w:abstractNumId w:val="43"/>
-  </w:num>
   <w:num w:numId="19" w16cid:durableId="1158233497">
-    <w:abstractNumId w:val="46"/>
+    <w:abstractNumId w:val="47"/>
   </w:num>
   <w:num w:numId="20" w16cid:durableId="495921676">
-    <w:abstractNumId w:val="41"/>
+    <w:abstractNumId w:val="42"/>
   </w:num>
   <w:num w:numId="21" w16cid:durableId="910694393">
-    <w:abstractNumId w:val="27"/>
+    <w:abstractNumId w:val="28"/>
   </w:num>
   <w:num w:numId="22" w16cid:durableId="15346978">
     <w:abstractNumId w:val="17"/>
   </w:num>
   <w:num w:numId="23" w16cid:durableId="505562370">
+    <w:abstractNumId w:val="33"/>
+  </w:num>
+  <w:num w:numId="24" w16cid:durableId="1103771391">
+    <w:abstractNumId w:val="62"/>
+  </w:num>
+  <w:num w:numId="25" w16cid:durableId="31465451">
+    <w:abstractNumId w:val="79"/>
+  </w:num>
+  <w:num w:numId="26" w16cid:durableId="494348183">
     <w:abstractNumId w:val="32"/>
   </w:num>
-  <w:num w:numId="24" w16cid:durableId="1103771391">
-    <w:abstractNumId w:val="61"/>
-  </w:num>
-  <w:num w:numId="25" w16cid:durableId="31465451">
-    <w:abstractNumId w:val="77"/>
-  </w:num>
-  <w:num w:numId="26" w16cid:durableId="494348183">
-    <w:abstractNumId w:val="31"/>
-  </w:num>
   <w:num w:numId="27" w16cid:durableId="356124465">
-    <w:abstractNumId w:val="79"/>
+    <w:abstractNumId w:val="81"/>
   </w:num>
   <w:num w:numId="28" w16cid:durableId="438139090">
     <w:abstractNumId w:val="18"/>
@@ -46100,55 +47426,55 @@
     <w:abstractNumId w:val="5"/>
   </w:num>
   <w:num w:numId="31" w16cid:durableId="1579947908">
-    <w:abstractNumId w:val="36"/>
+    <w:abstractNumId w:val="37"/>
   </w:num>
   <w:num w:numId="32" w16cid:durableId="1801610890">
-    <w:abstractNumId w:val="47"/>
+    <w:abstractNumId w:val="48"/>
   </w:num>
   <w:num w:numId="33" w16cid:durableId="708385342">
-    <w:abstractNumId w:val="76"/>
+    <w:abstractNumId w:val="78"/>
   </w:num>
   <w:num w:numId="34" w16cid:durableId="470095744">
-    <w:abstractNumId w:val="57"/>
+    <w:abstractNumId w:val="58"/>
   </w:num>
   <w:num w:numId="35" w16cid:durableId="2053915843">
-    <w:abstractNumId w:val="63"/>
+    <w:abstractNumId w:val="64"/>
   </w:num>
   <w:num w:numId="36" w16cid:durableId="2125225438">
-    <w:abstractNumId w:val="48"/>
+    <w:abstractNumId w:val="49"/>
   </w:num>
   <w:num w:numId="37" w16cid:durableId="498736031">
     <w:abstractNumId w:val="22"/>
   </w:num>
   <w:num w:numId="38" w16cid:durableId="796335180">
-    <w:abstractNumId w:val="28"/>
+    <w:abstractNumId w:val="29"/>
   </w:num>
   <w:num w:numId="39" w16cid:durableId="1640377546">
     <w:abstractNumId w:val="15"/>
   </w:num>
   <w:num w:numId="40" w16cid:durableId="84304739">
-    <w:abstractNumId w:val="49"/>
+    <w:abstractNumId w:val="50"/>
   </w:num>
   <w:num w:numId="41" w16cid:durableId="516886580">
     <w:abstractNumId w:val="23"/>
   </w:num>
   <w:num w:numId="42" w16cid:durableId="1743141462">
-    <w:abstractNumId w:val="62"/>
+    <w:abstractNumId w:val="63"/>
   </w:num>
   <w:num w:numId="43" w16cid:durableId="1445491838">
-    <w:abstractNumId w:val="70"/>
+    <w:abstractNumId w:val="71"/>
   </w:num>
   <w:num w:numId="44" w16cid:durableId="1236431717">
-    <w:abstractNumId w:val="30"/>
+    <w:abstractNumId w:val="31"/>
   </w:num>
   <w:num w:numId="45" w16cid:durableId="912274187">
-    <w:abstractNumId w:val="52"/>
+    <w:abstractNumId w:val="53"/>
   </w:num>
   <w:num w:numId="46" w16cid:durableId="1278945118">
-    <w:abstractNumId w:val="37"/>
+    <w:abstractNumId w:val="38"/>
   </w:num>
   <w:num w:numId="47" w16cid:durableId="2007316713">
-    <w:abstractNumId w:val="71"/>
+    <w:abstractNumId w:val="72"/>
   </w:num>
   <w:num w:numId="48" w16cid:durableId="1414624504">
     <w:abstractNumId w:val="24"/>
@@ -46157,7 +47483,7 @@
     <w:abstractNumId w:val="19"/>
   </w:num>
   <w:num w:numId="50" w16cid:durableId="427190722">
-    <w:abstractNumId w:val="59"/>
+    <w:abstractNumId w:val="60"/>
   </w:num>
   <w:num w:numId="51" w16cid:durableId="581568260">
     <w:abstractNumId w:val="16"/>
@@ -46169,13 +47495,13 @@
     <w:abstractNumId w:val="21"/>
   </w:num>
   <w:num w:numId="54" w16cid:durableId="259334031">
-    <w:abstractNumId w:val="73"/>
+    <w:abstractNumId w:val="74"/>
   </w:num>
   <w:num w:numId="55" w16cid:durableId="951471421">
-    <w:abstractNumId w:val="53"/>
+    <w:abstractNumId w:val="54"/>
   </w:num>
   <w:num w:numId="56" w16cid:durableId="569003322">
-    <w:abstractNumId w:val="51"/>
+    <w:abstractNumId w:val="52"/>
   </w:num>
   <w:num w:numId="57" w16cid:durableId="1206675072">
     <w:abstractNumId w:val="12"/>
@@ -46187,13 +47513,13 @@
     <w:abstractNumId w:val="7"/>
   </w:num>
   <w:num w:numId="60" w16cid:durableId="215556297">
-    <w:abstractNumId w:val="60"/>
+    <w:abstractNumId w:val="61"/>
   </w:num>
   <w:num w:numId="61" w16cid:durableId="985084932">
-    <w:abstractNumId w:val="38"/>
+    <w:abstractNumId w:val="39"/>
   </w:num>
   <w:num w:numId="62" w16cid:durableId="367998525">
-    <w:abstractNumId w:val="39"/>
+    <w:abstractNumId w:val="40"/>
   </w:num>
   <w:num w:numId="63" w16cid:durableId="1007638230">
     <w:abstractNumId w:val="11"/>
@@ -46205,52 +47531,58 @@
     <w:abstractNumId w:val="9"/>
   </w:num>
   <w:num w:numId="66" w16cid:durableId="1595941427">
-    <w:abstractNumId w:val="58"/>
+    <w:abstractNumId w:val="59"/>
   </w:num>
   <w:num w:numId="67" w16cid:durableId="1644001138">
     <w:abstractNumId w:val="14"/>
   </w:num>
   <w:num w:numId="68" w16cid:durableId="545222999">
-    <w:abstractNumId w:val="72"/>
+    <w:abstractNumId w:val="73"/>
   </w:num>
   <w:num w:numId="69" w16cid:durableId="25834519">
     <w:abstractNumId w:val="4"/>
   </w:num>
   <w:num w:numId="70" w16cid:durableId="1519273905">
-    <w:abstractNumId w:val="45"/>
+    <w:abstractNumId w:val="46"/>
   </w:num>
   <w:num w:numId="71" w16cid:durableId="747507213">
-    <w:abstractNumId w:val="34"/>
+    <w:abstractNumId w:val="35"/>
   </w:num>
   <w:num w:numId="72" w16cid:durableId="613681810">
-    <w:abstractNumId w:val="54"/>
+    <w:abstractNumId w:val="55"/>
   </w:num>
   <w:num w:numId="73" w16cid:durableId="260844048">
+    <w:abstractNumId w:val="27"/>
+  </w:num>
+  <w:num w:numId="74" w16cid:durableId="1905338026">
     <w:abstractNumId w:val="26"/>
   </w:num>
-  <w:num w:numId="74" w16cid:durableId="1905338026">
-    <w:abstractNumId w:val="25"/>
-  </w:num>
   <w:num w:numId="75" w16cid:durableId="26149008">
-    <w:abstractNumId w:val="65"/>
+    <w:abstractNumId w:val="66"/>
   </w:num>
   <w:num w:numId="76" w16cid:durableId="519777124">
-    <w:abstractNumId w:val="67"/>
+    <w:abstractNumId w:val="68"/>
   </w:num>
   <w:num w:numId="77" w16cid:durableId="548537405">
-    <w:abstractNumId w:val="56"/>
+    <w:abstractNumId w:val="57"/>
   </w:num>
   <w:num w:numId="78" w16cid:durableId="1276716416">
-    <w:abstractNumId w:val="50"/>
+    <w:abstractNumId w:val="51"/>
   </w:num>
   <w:num w:numId="79" w16cid:durableId="1875456340">
-    <w:abstractNumId w:val="69"/>
+    <w:abstractNumId w:val="70"/>
   </w:num>
   <w:num w:numId="80" w16cid:durableId="1813134467">
-    <w:abstractNumId w:val="40"/>
+    <w:abstractNumId w:val="41"/>
   </w:num>
   <w:num w:numId="81" w16cid:durableId="1095856623">
-    <w:abstractNumId w:val="78"/>
+    <w:abstractNumId w:val="80"/>
+  </w:num>
+  <w:num w:numId="82" w16cid:durableId="1738934217">
+    <w:abstractNumId w:val="77"/>
+  </w:num>
+  <w:num w:numId="83" w16cid:durableId="1828864883">
+    <w:abstractNumId w:val="25"/>
   </w:num>
   <w:numIdMacAtCleanup w:val="74"/>
 </w:numbering>

</xml_diff>

<commit_message>
16.09.26            List changes: sets aqa
</commit_message>
<xml_diff>
--- a/AQA/Теория/📝 aqa подготовка.docx
+++ b/AQA/Теория/📝 aqa подготовка.docx
@@ -33610,7 +33610,7 @@
       <w:pPr>
         <w:numPr>
           <w:ilvl w:val="0"/>
-          <w:numId w:val="81"/>
+          <w:numId w:val="75"/>
         </w:numPr>
         <w:rPr>
           <w:rFonts w:ascii="Times New Roman" w:hAnsi="Times New Roman" w:cs="Times New Roman"/>
@@ -33636,6 +33636,7 @@
           <w:color w:val="595959" w:themeColor="text1" w:themeTint="A6"/>
           <w:sz w:val="18"/>
           <w:szCs w:val="18"/>
+          <w:lang w:val="en-US"/>
         </w:rPr>
       </w:pPr>
       <w:r>
@@ -33647,12 +33648,23 @@
         </w:rPr>
         <w:t>Для того чтобы убрать пробелы в начале и в конце строки, таким образом мы гарантируем валидацию данных если на вход программа получит одни пробелы</w:t>
       </w:r>
+    </w:p>
+    <w:p>
+      <w:pPr>
+        <w:rPr>
+          <w:rFonts w:ascii="Times New Roman" w:hAnsi="Times New Roman" w:cs="Times New Roman"/>
+          <w:color w:val="595959" w:themeColor="text1" w:themeTint="A6"/>
+          <w:sz w:val="18"/>
+          <w:szCs w:val="18"/>
+          <w:lang w:val="en-US"/>
+        </w:rPr>
+      </w:pPr>
     </w:p>
     <w:p>
       <w:pPr>
         <w:numPr>
           <w:ilvl w:val="0"/>
-          <w:numId w:val="81"/>
+          <w:numId w:val="75"/>
         </w:numPr>
         <w:rPr>
           <w:rFonts w:ascii="Times New Roman" w:hAnsi="Times New Roman" w:cs="Times New Roman"/>
@@ -33678,6 +33690,7 @@
           <w:color w:val="595959" w:themeColor="text1" w:themeTint="A6"/>
           <w:sz w:val="18"/>
           <w:szCs w:val="18"/>
+          <w:lang w:val="en-US"/>
         </w:rPr>
       </w:pPr>
       <w:r>
@@ -33889,12 +33902,23 @@
         </w:rPr>
         <w:t>.</w:t>
       </w:r>
+    </w:p>
+    <w:p>
+      <w:pPr>
+        <w:rPr>
+          <w:rFonts w:ascii="Times New Roman" w:hAnsi="Times New Roman" w:cs="Times New Roman"/>
+          <w:color w:val="595959" w:themeColor="text1" w:themeTint="A6"/>
+          <w:sz w:val="18"/>
+          <w:szCs w:val="18"/>
+          <w:lang w:val="en-US"/>
+        </w:rPr>
+      </w:pPr>
     </w:p>
     <w:p>
       <w:pPr>
         <w:numPr>
           <w:ilvl w:val="0"/>
-          <w:numId w:val="81"/>
+          <w:numId w:val="75"/>
         </w:numPr>
         <w:rPr>
           <w:rFonts w:ascii="Times New Roman" w:hAnsi="Times New Roman" w:cs="Times New Roman"/>
@@ -33920,6 +33944,7 @@
           <w:color w:val="595959" w:themeColor="text1" w:themeTint="A6"/>
           <w:sz w:val="18"/>
           <w:szCs w:val="18"/>
+          <w:lang w:val="en-US"/>
         </w:rPr>
       </w:pPr>
       <w:r>
@@ -34006,9 +34031,19 @@
     </w:p>
     <w:p>
       <w:pPr>
+        <w:rPr>
+          <w:rFonts w:ascii="Times New Roman" w:hAnsi="Times New Roman" w:cs="Times New Roman"/>
+          <w:color w:val="595959" w:themeColor="text1" w:themeTint="A6"/>
+          <w:sz w:val="18"/>
+          <w:szCs w:val="18"/>
+        </w:rPr>
+      </w:pPr>
+    </w:p>
+    <w:p>
+      <w:pPr>
         <w:numPr>
           <w:ilvl w:val="0"/>
-          <w:numId w:val="81"/>
+          <w:numId w:val="75"/>
         </w:numPr>
         <w:rPr>
           <w:rFonts w:ascii="Times New Roman" w:hAnsi="Times New Roman" w:cs="Times New Roman"/>
@@ -34034,6 +34069,7 @@
           <w:color w:val="595959" w:themeColor="text1" w:themeTint="A6"/>
           <w:sz w:val="18"/>
           <w:szCs w:val="18"/>
+          <w:lang w:val="en-US"/>
         </w:rPr>
       </w:pPr>
       <w:r>
@@ -34081,16 +34117,6 @@
         </w:rPr>
         <w:t xml:space="preserve"> что и сейчас в текущей реализации</w:t>
       </w:r>
-    </w:p>
-    <w:p>
-      <w:pPr>
-        <w:rPr>
-          <w:rFonts w:ascii="Times New Roman" w:hAnsi="Times New Roman" w:cs="Times New Roman"/>
-          <w:color w:val="595959" w:themeColor="text1" w:themeTint="A6"/>
-          <w:sz w:val="18"/>
-          <w:szCs w:val="18"/>
-        </w:rPr>
-      </w:pPr>
     </w:p>
     <w:p>
       <w:pPr>
@@ -34407,17 +34433,116 @@
           <w:color w:val="595959" w:themeColor="text1" w:themeTint="A6"/>
           <w:sz w:val="18"/>
           <w:szCs w:val="18"/>
-        </w:rPr>
-      </w:pPr>
-      <w:r>
-        <w:rPr>
-          <w:rFonts w:ascii="Times New Roman" w:hAnsi="Times New Roman" w:cs="Times New Roman"/>
-          <w:b/>
-          <w:bCs/>
-          <w:color w:val="595959" w:themeColor="text1" w:themeTint="A6"/>
-          <w:sz w:val="18"/>
-          <w:szCs w:val="18"/>
-        </w:rPr>
+          <w:lang w:val="en-US"/>
+        </w:rPr>
+      </w:pPr>
+    </w:p>
+    <w:p>
+      <w:pPr>
+        <w:spacing w:after="0"/>
+        <w:rPr>
+          <w:rFonts w:ascii="Times New Roman" w:hAnsi="Times New Roman" w:cs="Times New Roman"/>
+          <w:b/>
+          <w:bCs/>
+          <w:color w:val="595959" w:themeColor="text1" w:themeTint="A6"/>
+          <w:sz w:val="18"/>
+          <w:szCs w:val="18"/>
+          <w:lang w:val="en-US"/>
+        </w:rPr>
+      </w:pPr>
+    </w:p>
+    <w:p>
+      <w:pPr>
+        <w:spacing w:after="0"/>
+        <w:rPr>
+          <w:rFonts w:ascii="Times New Roman" w:hAnsi="Times New Roman" w:cs="Times New Roman"/>
+          <w:b/>
+          <w:bCs/>
+          <w:color w:val="595959" w:themeColor="text1" w:themeTint="A6"/>
+          <w:sz w:val="18"/>
+          <w:szCs w:val="18"/>
+          <w:lang w:val="en-US"/>
+        </w:rPr>
+      </w:pPr>
+    </w:p>
+    <w:p>
+      <w:pPr>
+        <w:spacing w:after="0"/>
+        <w:rPr>
+          <w:rFonts w:ascii="Times New Roman" w:hAnsi="Times New Roman" w:cs="Times New Roman"/>
+          <w:b/>
+          <w:bCs/>
+          <w:color w:val="595959" w:themeColor="text1" w:themeTint="A6"/>
+          <w:sz w:val="18"/>
+          <w:szCs w:val="18"/>
+          <w:lang w:val="en-US"/>
+        </w:rPr>
+      </w:pPr>
+    </w:p>
+    <w:p>
+      <w:pPr>
+        <w:spacing w:after="0"/>
+        <w:rPr>
+          <w:rFonts w:ascii="Times New Roman" w:hAnsi="Times New Roman" w:cs="Times New Roman"/>
+          <w:b/>
+          <w:bCs/>
+          <w:color w:val="595959" w:themeColor="text1" w:themeTint="A6"/>
+          <w:sz w:val="18"/>
+          <w:szCs w:val="18"/>
+          <w:lang w:val="en-US"/>
+        </w:rPr>
+      </w:pPr>
+    </w:p>
+    <w:p>
+      <w:pPr>
+        <w:spacing w:after="0"/>
+        <w:rPr>
+          <w:rFonts w:ascii="Times New Roman" w:hAnsi="Times New Roman" w:cs="Times New Roman"/>
+          <w:b/>
+          <w:bCs/>
+          <w:color w:val="595959" w:themeColor="text1" w:themeTint="A6"/>
+          <w:sz w:val="18"/>
+          <w:szCs w:val="18"/>
+          <w:lang w:val="en-US"/>
+        </w:rPr>
+      </w:pPr>
+    </w:p>
+    <w:p>
+      <w:pPr>
+        <w:spacing w:after="0"/>
+        <w:rPr>
+          <w:rFonts w:ascii="Times New Roman" w:hAnsi="Times New Roman" w:cs="Times New Roman"/>
+          <w:b/>
+          <w:bCs/>
+          <w:color w:val="595959" w:themeColor="text1" w:themeTint="A6"/>
+          <w:sz w:val="18"/>
+          <w:szCs w:val="18"/>
+          <w:lang w:val="en-US"/>
+        </w:rPr>
+      </w:pPr>
+    </w:p>
+    <w:p>
+      <w:pPr>
+        <w:spacing w:after="0"/>
+        <w:rPr>
+          <w:rFonts w:ascii="Times New Roman" w:hAnsi="Times New Roman" w:cs="Times New Roman"/>
+          <w:b/>
+          <w:bCs/>
+          <w:color w:val="595959" w:themeColor="text1" w:themeTint="A6"/>
+          <w:sz w:val="18"/>
+          <w:szCs w:val="18"/>
+        </w:rPr>
+      </w:pPr>
+      <w:r>
+        <w:rPr>
+          <w:rFonts w:ascii="Times New Roman" w:hAnsi="Times New Roman" w:cs="Times New Roman"/>
+          <w:b/>
+          <w:bCs/>
+          <w:color w:val="595959" w:themeColor="text1" w:themeTint="A6"/>
+          <w:sz w:val="18"/>
+          <w:szCs w:val="18"/>
+        </w:rPr>
+        <w:lastRenderedPageBreak/>
         <w:t>Вопросы на закрепление</w:t>
       </w:r>
     </w:p>
@@ -34425,7 +34550,7 @@
       <w:pPr>
         <w:numPr>
           <w:ilvl w:val="0"/>
-          <w:numId w:val="82"/>
+          <w:numId w:val="76"/>
         </w:numPr>
         <w:spacing w:after="0"/>
         <w:rPr>
@@ -34619,7 +34744,7 @@
       <w:pPr>
         <w:numPr>
           <w:ilvl w:val="0"/>
-          <w:numId w:val="82"/>
+          <w:numId w:val="76"/>
         </w:numPr>
         <w:spacing w:after="0"/>
         <w:rPr>
@@ -34781,7 +34906,6 @@
           <w:sz w:val="18"/>
           <w:szCs w:val="18"/>
         </w:rPr>
-        <w:lastRenderedPageBreak/>
         <w:t> </w:t>
       </w:r>
       <w:r>
@@ -35237,23 +35361,15 @@
           <w:color w:val="595959" w:themeColor="text1" w:themeTint="A6"/>
           <w:sz w:val="18"/>
           <w:szCs w:val="18"/>
-        </w:rPr>
-      </w:pPr>
-      <w:r>
-        <w:rPr>
-          <w:rFonts w:ascii="Times New Roman" w:hAnsi="Times New Roman" w:cs="Times New Roman"/>
-          <w:color w:val="595959" w:themeColor="text1" w:themeTint="A6"/>
-          <w:sz w:val="18"/>
-          <w:szCs w:val="18"/>
-        </w:rPr>
-        <w:br/>
-      </w:r>
+          <w:lang w:val="en-US"/>
+        </w:rPr>
+      </w:pPr>
     </w:p>
     <w:p>
       <w:pPr>
         <w:numPr>
           <w:ilvl w:val="0"/>
-          <w:numId w:val="83"/>
+          <w:numId w:val="77"/>
         </w:numPr>
         <w:spacing w:after="0"/>
         <w:rPr>
@@ -35321,7 +35437,7 @@
       <w:pPr>
         <w:numPr>
           <w:ilvl w:val="0"/>
-          <w:numId w:val="83"/>
+          <w:numId w:val="77"/>
         </w:numPr>
         <w:spacing w:after="0"/>
         <w:rPr>
@@ -35400,7 +35516,7 @@
       <w:pPr>
         <w:numPr>
           <w:ilvl w:val="0"/>
-          <w:numId w:val="82"/>
+          <w:numId w:val="76"/>
         </w:numPr>
         <w:spacing w:after="0"/>
         <w:rPr>
@@ -35473,9 +35589,12 @@
     <w:p>
       <w:pPr>
         <w:spacing w:after="0"/>
-        <w:rPr>
-          <w:rFonts w:ascii="Times New Roman" w:hAnsi="Times New Roman" w:cs="Times New Roman"/>
-          <w:color w:val="595959" w:themeColor="text1" w:themeTint="A6"/>
+        <w:jc w:val="center"/>
+        <w:rPr>
+          <w:rFonts w:ascii="Century Schoolbook" w:hAnsi="Century Schoolbook" w:cs="Times New Roman"/>
+          <w:b/>
+          <w:bCs/>
+          <w:color w:val="7F7F7F" w:themeColor="text1" w:themeTint="80"/>
           <w:sz w:val="18"/>
           <w:szCs w:val="18"/>
         </w:rPr>
@@ -35489,6 +35608,69 @@
         </w:rPr>
         <w:br/>
       </w:r>
+      <w:r>
+        <w:rPr>
+          <w:rFonts w:ascii="Century Schoolbook" w:hAnsi="Century Schoolbook" w:cs="Times New Roman"/>
+          <w:b/>
+          <w:bCs/>
+          <w:color w:val="7F7F7F" w:themeColor="text1" w:themeTint="80"/>
+          <w:sz w:val="18"/>
+          <w:szCs w:val="18"/>
+        </w:rPr>
+        <w:t>Теория:</w:t>
+      </w:r>
+    </w:p>
+    <w:p>
+      <w:pPr>
+        <w:spacing w:after="0"/>
+        <w:jc w:val="center"/>
+        <w:rPr>
+          <w:rFonts w:ascii="Century Schoolbook" w:hAnsi="Century Schoolbook" w:cs="Times New Roman"/>
+          <w:b/>
+          <w:bCs/>
+          <w:color w:val="595959" w:themeColor="text1" w:themeTint="A6"/>
+          <w:sz w:val="18"/>
+          <w:szCs w:val="18"/>
+        </w:rPr>
+      </w:pPr>
+      <w:r>
+        <w:rPr>
+          <w:rFonts w:ascii="Century Schoolbook" w:hAnsi="Century Schoolbook" w:cs="Times New Roman"/>
+          <w:b/>
+          <w:bCs/>
+          <w:color w:val="7F7F7F" w:themeColor="text1" w:themeTint="80"/>
+          <w:sz w:val="18"/>
+          <w:szCs w:val="18"/>
+        </w:rPr>
+        <w:t xml:space="preserve"> Множества: </w:t>
+      </w:r>
+      <w:hyperlink r:id="rId78" w:history="1">
+        <w:r>
+          <w:rPr>
+            <w:rStyle w:val="a3"/>
+            <w:rFonts w:ascii="Century Schoolbook" w:hAnsi="Century Schoolbook" w:cs="Times New Roman"/>
+            <w:b/>
+            <w:bCs/>
+            <w:sz w:val="18"/>
+            <w:szCs w:val="18"/>
+          </w:rPr>
+          <w:t>ссылка</w:t>
+        </w:r>
+      </w:hyperlink>
+    </w:p>
+    <w:p>
+      <w:pPr>
+        <w:spacing w:after="0"/>
+        <w:jc w:val="center"/>
+        <w:rPr>
+          <w:rFonts w:ascii="Century Schoolbook" w:hAnsi="Century Schoolbook" w:cs="Times New Roman"/>
+          <w:b/>
+          <w:bCs/>
+          <w:color w:val="595959" w:themeColor="text1" w:themeTint="A6"/>
+          <w:sz w:val="18"/>
+          <w:szCs w:val="18"/>
+        </w:rPr>
+      </w:pPr>
     </w:p>
     <w:p>
       <w:pPr>
@@ -35597,6 +35779,991 @@
           <w:szCs w:val="18"/>
         </w:rPr>
         <w:t>:</w:t>
+      </w:r>
+    </w:p>
+    <w:p>
+      <w:pPr>
+        <w:rPr>
+          <w:rFonts w:ascii="Times New Roman" w:hAnsi="Times New Roman" w:cs="Times New Roman"/>
+          <w:b/>
+          <w:bCs/>
+          <w:color w:val="595959" w:themeColor="text1" w:themeTint="A6"/>
+          <w:sz w:val="18"/>
+          <w:szCs w:val="18"/>
+        </w:rPr>
+      </w:pPr>
+      <w:r>
+        <w:rPr>
+          <w:rFonts w:ascii="Times New Roman" w:hAnsi="Times New Roman" w:cs="Times New Roman"/>
+          <w:b/>
+          <w:bCs/>
+          <w:color w:val="595959" w:themeColor="text1" w:themeTint="A6"/>
+          <w:sz w:val="18"/>
+          <w:szCs w:val="18"/>
+        </w:rPr>
+        <w:t>Вопросы на закрепление</w:t>
+      </w:r>
+    </w:p>
+    <w:p>
+      <w:pPr>
+        <w:numPr>
+          <w:ilvl w:val="0"/>
+          <w:numId w:val="78"/>
+        </w:numPr>
+        <w:rPr>
+          <w:rFonts w:ascii="Times New Roman" w:hAnsi="Times New Roman" w:cs="Times New Roman"/>
+          <w:color w:val="595959" w:themeColor="text1" w:themeTint="A6"/>
+          <w:sz w:val="18"/>
+          <w:szCs w:val="18"/>
+        </w:rPr>
+      </w:pPr>
+      <w:r>
+        <w:rPr>
+          <w:rFonts w:ascii="Times New Roman" w:hAnsi="Times New Roman" w:cs="Times New Roman"/>
+          <w:color w:val="595959" w:themeColor="text1" w:themeTint="A6"/>
+          <w:sz w:val="18"/>
+          <w:szCs w:val="18"/>
+        </w:rPr>
+        <w:t>Почему в этой задаче мы сначала преобразовали списки в set(), а не работали с ними напрямую как со списками?</w:t>
+      </w:r>
+    </w:p>
+    <w:p>
+      <w:pPr>
+        <w:rPr>
+          <w:rFonts w:ascii="Times New Roman" w:hAnsi="Times New Roman" w:cs="Times New Roman"/>
+          <w:color w:val="595959" w:themeColor="text1" w:themeTint="A6"/>
+          <w:sz w:val="18"/>
+          <w:szCs w:val="18"/>
+        </w:rPr>
+      </w:pPr>
+      <w:r>
+        <w:rPr>
+          <w:rFonts w:ascii="Times New Roman" w:hAnsi="Times New Roman" w:cs="Times New Roman"/>
+          <w:color w:val="595959" w:themeColor="text1" w:themeTint="A6"/>
+          <w:sz w:val="18"/>
+          <w:szCs w:val="18"/>
+        </w:rPr>
+        <w:t>Потому что между списками недоступны операции, требуемые в задаче. Мы не можем найти пересечение, объединение и разность списков</w:t>
+      </w:r>
+      <w:r>
+        <w:rPr>
+          <w:rFonts w:ascii="Times New Roman" w:hAnsi="Times New Roman" w:cs="Times New Roman"/>
+          <w:color w:val="595959" w:themeColor="text1" w:themeTint="A6"/>
+          <w:sz w:val="18"/>
+          <w:szCs w:val="18"/>
+        </w:rPr>
+        <w:t xml:space="preserve">. </w:t>
+      </w:r>
+      <w:r>
+        <w:rPr>
+          <w:rFonts w:ascii="Times New Roman" w:hAnsi="Times New Roman" w:cs="Times New Roman"/>
+          <w:color w:val="595959" w:themeColor="text1" w:themeTint="A6"/>
+          <w:sz w:val="18"/>
+          <w:szCs w:val="18"/>
+        </w:rPr>
+        <w:t>Кстати, вопрос от меня:</w:t>
+      </w:r>
+    </w:p>
+    <w:p>
+      <w:pPr>
+        <w:rPr>
+          <w:rFonts w:ascii="Times New Roman" w:hAnsi="Times New Roman" w:cs="Times New Roman"/>
+          <w:color w:val="595959" w:themeColor="text1" w:themeTint="A6"/>
+          <w:sz w:val="18"/>
+          <w:szCs w:val="18"/>
+        </w:rPr>
+      </w:pPr>
+      <w:r>
+        <w:rPr>
+          <w:rFonts w:ascii="Times New Roman" w:hAnsi="Times New Roman" w:cs="Times New Roman"/>
+          <w:color w:val="595959" w:themeColor="text1" w:themeTint="A6"/>
+          <w:sz w:val="18"/>
+          <w:szCs w:val="18"/>
+        </w:rPr>
+        <w:t>Если изначально списки такие:</w:t>
+      </w:r>
+    </w:p>
+    <w:p>
+      <w:pPr>
+        <w:rPr>
+          <w:rFonts w:ascii="Times New Roman" w:hAnsi="Times New Roman" w:cs="Times New Roman"/>
+          <w:color w:val="595959" w:themeColor="text1" w:themeTint="A6"/>
+          <w:sz w:val="18"/>
+          <w:szCs w:val="18"/>
+        </w:rPr>
+      </w:pPr>
+      <w:r>
+        <w:rPr>
+          <w:rFonts w:ascii="Times New Roman" w:hAnsi="Times New Roman" w:cs="Times New Roman"/>
+          <w:color w:val="595959" w:themeColor="text1" w:themeTint="A6"/>
+          <w:sz w:val="18"/>
+          <w:szCs w:val="18"/>
+        </w:rPr>
+        <w:br/>
+        <w:t>one_list = [1, 2, 3, 4]</w:t>
+      </w:r>
+      <w:r>
+        <w:rPr>
+          <w:rFonts w:ascii="Times New Roman" w:hAnsi="Times New Roman" w:cs="Times New Roman"/>
+          <w:color w:val="595959" w:themeColor="text1" w:themeTint="A6"/>
+          <w:sz w:val="18"/>
+          <w:szCs w:val="18"/>
+        </w:rPr>
+        <w:br/>
+        <w:t>two_list = [5, 6, 'QA', False]</w:t>
+      </w:r>
+    </w:p>
+    <w:p>
+      <w:pPr>
+        <w:rPr>
+          <w:rFonts w:ascii="Times New Roman" w:hAnsi="Times New Roman" w:cs="Times New Roman"/>
+          <w:color w:val="595959" w:themeColor="text1" w:themeTint="A6"/>
+          <w:sz w:val="18"/>
+          <w:szCs w:val="18"/>
+        </w:rPr>
+      </w:pPr>
+      <w:r>
+        <w:rPr>
+          <w:rFonts w:ascii="Times New Roman" w:hAnsi="Times New Roman" w:cs="Times New Roman"/>
+          <w:color w:val="595959" w:themeColor="text1" w:themeTint="A6"/>
+          <w:sz w:val="18"/>
+          <w:szCs w:val="18"/>
+        </w:rPr>
+        <w:t>то:</w:t>
+      </w:r>
+    </w:p>
+    <w:p>
+      <w:pPr>
+        <w:rPr>
+          <w:rFonts w:ascii="Times New Roman" w:hAnsi="Times New Roman" w:cs="Times New Roman"/>
+          <w:color w:val="595959" w:themeColor="text1" w:themeTint="A6"/>
+          <w:sz w:val="18"/>
+          <w:szCs w:val="18"/>
+          <w:lang w:val="en-US"/>
+        </w:rPr>
+      </w:pPr>
+      <w:r>
+        <w:rPr>
+          <w:rFonts w:ascii="Times New Roman" w:hAnsi="Times New Roman" w:cs="Times New Roman"/>
+          <w:color w:val="595959" w:themeColor="text1" w:themeTint="A6"/>
+          <w:sz w:val="18"/>
+          <w:szCs w:val="18"/>
+          <w:lang w:val="en-US"/>
+        </w:rPr>
+        <w:t>Original lists:</w:t>
+      </w:r>
+    </w:p>
+    <w:p>
+      <w:pPr>
+        <w:rPr>
+          <w:rFonts w:ascii="Times New Roman" w:hAnsi="Times New Roman" w:cs="Times New Roman"/>
+          <w:color w:val="595959" w:themeColor="text1" w:themeTint="A6"/>
+          <w:sz w:val="18"/>
+          <w:szCs w:val="18"/>
+          <w:lang w:val="en-US"/>
+        </w:rPr>
+      </w:pPr>
+    </w:p>
+    <w:p>
+      <w:pPr>
+        <w:rPr>
+          <w:rFonts w:ascii="Times New Roman" w:hAnsi="Times New Roman" w:cs="Times New Roman"/>
+          <w:color w:val="595959" w:themeColor="text1" w:themeTint="A6"/>
+          <w:sz w:val="18"/>
+          <w:szCs w:val="18"/>
+          <w:lang w:val="en-US"/>
+        </w:rPr>
+      </w:pPr>
+      <w:r>
+        <w:rPr>
+          <w:rFonts w:ascii="Times New Roman" w:hAnsi="Times New Roman" w:cs="Times New Roman"/>
+          <w:color w:val="595959" w:themeColor="text1" w:themeTint="A6"/>
+          <w:sz w:val="18"/>
+          <w:szCs w:val="18"/>
+          <w:lang w:val="en-US"/>
+        </w:rPr>
+        <w:t>[1, 2, 3, 4] and [5, 6, 'QA', False]</w:t>
+      </w:r>
+    </w:p>
+    <w:p>
+      <w:pPr>
+        <w:rPr>
+          <w:rFonts w:ascii="Times New Roman" w:hAnsi="Times New Roman" w:cs="Times New Roman"/>
+          <w:color w:val="595959" w:themeColor="text1" w:themeTint="A6"/>
+          <w:sz w:val="18"/>
+          <w:szCs w:val="18"/>
+          <w:lang w:val="en-US"/>
+        </w:rPr>
+      </w:pPr>
+    </w:p>
+    <w:p>
+      <w:pPr>
+        <w:rPr>
+          <w:rFonts w:ascii="Times New Roman" w:hAnsi="Times New Roman" w:cs="Times New Roman"/>
+          <w:color w:val="595959" w:themeColor="text1" w:themeTint="A6"/>
+          <w:sz w:val="18"/>
+          <w:szCs w:val="18"/>
+        </w:rPr>
+      </w:pPr>
+      <w:r>
+        <w:rPr>
+          <w:rFonts w:ascii="Times New Roman" w:hAnsi="Times New Roman" w:cs="Times New Roman"/>
+          <w:color w:val="595959" w:themeColor="text1" w:themeTint="A6"/>
+          <w:sz w:val="18"/>
+          <w:szCs w:val="18"/>
+        </w:rPr>
+        <w:t>____________________________________________________________</w:t>
+      </w:r>
+    </w:p>
+    <w:p>
+      <w:pPr>
+        <w:rPr>
+          <w:rFonts w:ascii="Times New Roman" w:hAnsi="Times New Roman" w:cs="Times New Roman"/>
+          <w:color w:val="595959" w:themeColor="text1" w:themeTint="A6"/>
+          <w:sz w:val="18"/>
+          <w:szCs w:val="18"/>
+        </w:rPr>
+      </w:pPr>
+      <w:r>
+        <w:rPr>
+          <w:rFonts w:ascii="Times New Roman" w:hAnsi="Times New Roman" w:cs="Times New Roman"/>
+          <w:color w:val="595959" w:themeColor="text1" w:themeTint="A6"/>
+          <w:sz w:val="18"/>
+          <w:szCs w:val="18"/>
+        </w:rPr>
+        <w:t>Intersection sets: set()</w:t>
+      </w:r>
+    </w:p>
+    <w:p>
+      <w:pPr>
+        <w:rPr>
+          <w:rFonts w:ascii="Times New Roman" w:hAnsi="Times New Roman" w:cs="Times New Roman"/>
+          <w:color w:val="595959" w:themeColor="text1" w:themeTint="A6"/>
+          <w:sz w:val="18"/>
+          <w:szCs w:val="18"/>
+        </w:rPr>
+      </w:pPr>
+      <w:r>
+        <w:rPr>
+          <w:rFonts w:ascii="Times New Roman" w:hAnsi="Times New Roman" w:cs="Times New Roman"/>
+          <w:color w:val="595959" w:themeColor="text1" w:themeTint="A6"/>
+          <w:sz w:val="18"/>
+          <w:szCs w:val="18"/>
+        </w:rPr>
+        <w:lastRenderedPageBreak/>
+        <w:t>А если такие:</w:t>
+      </w:r>
+    </w:p>
+    <w:p>
+      <w:pPr>
+        <w:rPr>
+          <w:rFonts w:ascii="Times New Roman" w:hAnsi="Times New Roman" w:cs="Times New Roman"/>
+          <w:color w:val="595959" w:themeColor="text1" w:themeTint="A6"/>
+          <w:sz w:val="18"/>
+          <w:szCs w:val="18"/>
+          <w:lang w:val="en-US"/>
+        </w:rPr>
+      </w:pPr>
+      <w:r>
+        <w:rPr>
+          <w:rFonts w:ascii="Times New Roman" w:hAnsi="Times New Roman" w:cs="Times New Roman"/>
+          <w:color w:val="595959" w:themeColor="text1" w:themeTint="A6"/>
+          <w:sz w:val="18"/>
+          <w:szCs w:val="18"/>
+          <w:lang w:val="en-US"/>
+        </w:rPr>
+        <w:t>one_list = [1, 2, 3, 4]</w:t>
+      </w:r>
+      <w:r>
+        <w:rPr>
+          <w:rFonts w:ascii="Times New Roman" w:hAnsi="Times New Roman" w:cs="Times New Roman"/>
+          <w:color w:val="595959" w:themeColor="text1" w:themeTint="A6"/>
+          <w:sz w:val="18"/>
+          <w:szCs w:val="18"/>
+          <w:lang w:val="en-US"/>
+        </w:rPr>
+        <w:br/>
+        <w:t>two_list = [5, 6, 'QA', True]</w:t>
+      </w:r>
+    </w:p>
+    <w:p>
+      <w:pPr>
+        <w:rPr>
+          <w:rFonts w:ascii="Times New Roman" w:hAnsi="Times New Roman" w:cs="Times New Roman"/>
+          <w:color w:val="595959" w:themeColor="text1" w:themeTint="A6"/>
+          <w:sz w:val="18"/>
+          <w:szCs w:val="18"/>
+        </w:rPr>
+      </w:pPr>
+      <w:r>
+        <w:rPr>
+          <w:rFonts w:ascii="Times New Roman" w:hAnsi="Times New Roman" w:cs="Times New Roman"/>
+          <w:color w:val="595959" w:themeColor="text1" w:themeTint="A6"/>
+          <w:sz w:val="18"/>
+          <w:szCs w:val="18"/>
+        </w:rPr>
+        <w:t>то:</w:t>
+      </w:r>
+    </w:p>
+    <w:p>
+      <w:pPr>
+        <w:rPr>
+          <w:rFonts w:ascii="Times New Roman" w:hAnsi="Times New Roman" w:cs="Times New Roman"/>
+          <w:color w:val="595959" w:themeColor="text1" w:themeTint="A6"/>
+          <w:sz w:val="18"/>
+          <w:szCs w:val="18"/>
+          <w:lang w:val="en-US"/>
+        </w:rPr>
+      </w:pPr>
+      <w:r>
+        <w:rPr>
+          <w:rFonts w:ascii="Times New Roman" w:hAnsi="Times New Roman" w:cs="Times New Roman"/>
+          <w:color w:val="595959" w:themeColor="text1" w:themeTint="A6"/>
+          <w:sz w:val="18"/>
+          <w:szCs w:val="18"/>
+          <w:lang w:val="en-US"/>
+        </w:rPr>
+        <w:t>Original lists:</w:t>
+      </w:r>
+    </w:p>
+    <w:p>
+      <w:pPr>
+        <w:rPr>
+          <w:rFonts w:ascii="Times New Roman" w:hAnsi="Times New Roman" w:cs="Times New Roman"/>
+          <w:color w:val="595959" w:themeColor="text1" w:themeTint="A6"/>
+          <w:sz w:val="18"/>
+          <w:szCs w:val="18"/>
+          <w:lang w:val="en-US"/>
+        </w:rPr>
+      </w:pPr>
+    </w:p>
+    <w:p>
+      <w:pPr>
+        <w:rPr>
+          <w:rFonts w:ascii="Times New Roman" w:hAnsi="Times New Roman" w:cs="Times New Roman"/>
+          <w:color w:val="595959" w:themeColor="text1" w:themeTint="A6"/>
+          <w:sz w:val="18"/>
+          <w:szCs w:val="18"/>
+          <w:lang w:val="en-US"/>
+        </w:rPr>
+      </w:pPr>
+      <w:r>
+        <w:rPr>
+          <w:rFonts w:ascii="Times New Roman" w:hAnsi="Times New Roman" w:cs="Times New Roman"/>
+          <w:color w:val="595959" w:themeColor="text1" w:themeTint="A6"/>
+          <w:sz w:val="18"/>
+          <w:szCs w:val="18"/>
+          <w:lang w:val="en-US"/>
+        </w:rPr>
+        <w:t>[1, 2, 3, 4] and [5, 6, 'QA', True]</w:t>
+      </w:r>
+    </w:p>
+    <w:p>
+      <w:pPr>
+        <w:rPr>
+          <w:rFonts w:ascii="Times New Roman" w:hAnsi="Times New Roman" w:cs="Times New Roman"/>
+          <w:color w:val="595959" w:themeColor="text1" w:themeTint="A6"/>
+          <w:sz w:val="18"/>
+          <w:szCs w:val="18"/>
+          <w:lang w:val="en-US"/>
+        </w:rPr>
+      </w:pPr>
+    </w:p>
+    <w:p>
+      <w:pPr>
+        <w:rPr>
+          <w:rFonts w:ascii="Times New Roman" w:hAnsi="Times New Roman" w:cs="Times New Roman"/>
+          <w:color w:val="595959" w:themeColor="text1" w:themeTint="A6"/>
+          <w:sz w:val="18"/>
+          <w:szCs w:val="18"/>
+        </w:rPr>
+      </w:pPr>
+      <w:r>
+        <w:rPr>
+          <w:rFonts w:ascii="Times New Roman" w:hAnsi="Times New Roman" w:cs="Times New Roman"/>
+          <w:color w:val="595959" w:themeColor="text1" w:themeTint="A6"/>
+          <w:sz w:val="18"/>
+          <w:szCs w:val="18"/>
+        </w:rPr>
+        <w:t>____________________________________________________________</w:t>
+      </w:r>
+    </w:p>
+    <w:p>
+      <w:pPr>
+        <w:rPr>
+          <w:rFonts w:ascii="Times New Roman" w:hAnsi="Times New Roman" w:cs="Times New Roman"/>
+          <w:color w:val="595959" w:themeColor="text1" w:themeTint="A6"/>
+          <w:sz w:val="18"/>
+          <w:szCs w:val="18"/>
+        </w:rPr>
+      </w:pPr>
+      <w:r>
+        <w:rPr>
+          <w:rFonts w:ascii="Times New Roman" w:hAnsi="Times New Roman" w:cs="Times New Roman"/>
+          <w:color w:val="595959" w:themeColor="text1" w:themeTint="A6"/>
+          <w:sz w:val="18"/>
+          <w:szCs w:val="18"/>
+        </w:rPr>
+        <w:t>Intersection sets: {True}</w:t>
+      </w:r>
+    </w:p>
+    <w:p>
+      <w:pPr>
+        <w:rPr>
+          <w:rFonts w:ascii="Times New Roman" w:hAnsi="Times New Roman" w:cs="Times New Roman"/>
+          <w:color w:val="595959" w:themeColor="text1" w:themeTint="A6"/>
+          <w:sz w:val="18"/>
+          <w:szCs w:val="18"/>
+        </w:rPr>
+      </w:pPr>
+      <w:r>
+        <w:rPr>
+          <w:rFonts w:ascii="Times New Roman" w:hAnsi="Times New Roman" w:cs="Times New Roman"/>
+          <w:color w:val="595959" w:themeColor="text1" w:themeTint="A6"/>
+          <w:sz w:val="18"/>
+          <w:szCs w:val="18"/>
+        </w:rPr>
+        <w:t>Почему так?</w:t>
+      </w:r>
+    </w:p>
+    <w:p>
+      <w:pPr>
+        <w:spacing w:after="0"/>
+        <w:rPr>
+          <w:rFonts w:ascii="Times New Roman" w:hAnsi="Times New Roman" w:cs="Times New Roman"/>
+          <w:i/>
+          <w:iCs/>
+          <w:color w:val="538135" w:themeColor="accent6" w:themeShade="BF"/>
+          <w:sz w:val="18"/>
+          <w:szCs w:val="18"/>
+        </w:rPr>
+      </w:pPr>
+      <w:r>
+        <w:rPr>
+          <w:rFonts w:ascii="Times New Roman" w:hAnsi="Times New Roman" w:cs="Times New Roman"/>
+          <w:i/>
+          <w:iCs/>
+          <w:color w:val="538135" w:themeColor="accent6" w:themeShade="BF"/>
+          <w:sz w:val="18"/>
+          <w:szCs w:val="18"/>
+        </w:rPr>
+        <w:t xml:space="preserve">False равен 0. А 0 </w:t>
+      </w:r>
+      <w:r>
+        <w:rPr>
+          <w:rFonts w:ascii="Times New Roman" w:hAnsi="Times New Roman" w:cs="Times New Roman"/>
+          <w:b/>
+          <w:bCs/>
+          <w:i/>
+          <w:iCs/>
+          <w:color w:val="538135" w:themeColor="accent6" w:themeShade="BF"/>
+          <w:sz w:val="18"/>
+          <w:szCs w:val="18"/>
+        </w:rPr>
+        <w:t>нет</w:t>
+      </w:r>
+      <w:r>
+        <w:rPr>
+          <w:rFonts w:ascii="Times New Roman" w:hAnsi="Times New Roman" w:cs="Times New Roman"/>
+          <w:i/>
+          <w:iCs/>
+          <w:color w:val="538135" w:themeColor="accent6" w:themeShade="BF"/>
+          <w:sz w:val="18"/>
+          <w:szCs w:val="18"/>
+        </w:rPr>
+        <w:t xml:space="preserve"> в one_list. Поэтому пересечение — пустое множество set(). </w:t>
+      </w:r>
+      <w:r>
+        <w:rPr>
+          <w:rFonts w:ascii="Segoe UI Emoji" w:hAnsi="Segoe UI Emoji" w:cs="Segoe UI Emoji"/>
+          <w:i/>
+          <w:iCs/>
+          <w:color w:val="538135" w:themeColor="accent6" w:themeShade="BF"/>
+          <w:sz w:val="18"/>
+          <w:szCs w:val="18"/>
+        </w:rPr>
+        <w:t>✅</w:t>
+      </w:r>
+      <w:r>
+        <w:rPr>
+          <w:rFonts w:ascii="Times New Roman" w:hAnsi="Times New Roman" w:cs="Times New Roman"/>
+          <w:i/>
+          <w:iCs/>
+          <w:color w:val="538135" w:themeColor="accent6" w:themeShade="BF"/>
+          <w:sz w:val="18"/>
+          <w:szCs w:val="18"/>
+        </w:rPr>
+        <w:t xml:space="preserve"> Всё логично.</w:t>
+      </w:r>
+    </w:p>
+    <w:p>
+      <w:pPr>
+        <w:rPr>
+          <w:rFonts w:ascii="Times New Roman" w:hAnsi="Times New Roman" w:cs="Times New Roman"/>
+          <w:i/>
+          <w:iCs/>
+          <w:color w:val="538135" w:themeColor="accent6" w:themeShade="BF"/>
+          <w:sz w:val="18"/>
+          <w:szCs w:val="18"/>
+        </w:rPr>
+      </w:pPr>
+      <w:r>
+        <w:rPr>
+          <w:rFonts w:ascii="Times New Roman" w:hAnsi="Times New Roman" w:cs="Times New Roman"/>
+          <w:i/>
+          <w:iCs/>
+          <w:color w:val="538135" w:themeColor="accent6" w:themeShade="BF"/>
+          <w:sz w:val="18"/>
+          <w:szCs w:val="18"/>
+        </w:rPr>
+        <w:t xml:space="preserve">True равен 1. А 1 </w:t>
+      </w:r>
+      <w:r>
+        <w:rPr>
+          <w:rFonts w:ascii="Times New Roman" w:hAnsi="Times New Roman" w:cs="Times New Roman"/>
+          <w:b/>
+          <w:bCs/>
+          <w:i/>
+          <w:iCs/>
+          <w:color w:val="538135" w:themeColor="accent6" w:themeShade="BF"/>
+          <w:sz w:val="18"/>
+          <w:szCs w:val="18"/>
+        </w:rPr>
+        <w:t>есть</w:t>
+      </w:r>
+      <w:r>
+        <w:rPr>
+          <w:rFonts w:ascii="Times New Roman" w:hAnsi="Times New Roman" w:cs="Times New Roman"/>
+          <w:i/>
+          <w:iCs/>
+          <w:color w:val="538135" w:themeColor="accent6" w:themeShade="BF"/>
+          <w:sz w:val="18"/>
+          <w:szCs w:val="18"/>
+        </w:rPr>
+        <w:t xml:space="preserve"> в one_list! Поэтому Python находит совпадение — пересечение содержит этот элемент.</w:t>
+      </w:r>
+    </w:p>
+    <w:p>
+      <w:pPr>
+        <w:rPr>
+          <w:rFonts w:ascii="Times New Roman" w:hAnsi="Times New Roman" w:cs="Times New Roman"/>
+          <w:color w:val="595959" w:themeColor="text1" w:themeTint="A6"/>
+          <w:sz w:val="18"/>
+          <w:szCs w:val="18"/>
+        </w:rPr>
+      </w:pPr>
+    </w:p>
+    <w:p>
+      <w:pPr>
+        <w:rPr>
+          <w:rFonts w:ascii="Times New Roman" w:hAnsi="Times New Roman" w:cs="Times New Roman"/>
+          <w:color w:val="595959" w:themeColor="text1" w:themeTint="A6"/>
+          <w:sz w:val="18"/>
+          <w:szCs w:val="18"/>
+        </w:rPr>
+      </w:pPr>
+    </w:p>
+    <w:p>
+      <w:pPr>
+        <w:numPr>
+          <w:ilvl w:val="0"/>
+          <w:numId w:val="78"/>
+        </w:numPr>
+        <w:rPr>
+          <w:rFonts w:ascii="Times New Roman" w:hAnsi="Times New Roman" w:cs="Times New Roman"/>
+          <w:color w:val="595959" w:themeColor="text1" w:themeTint="A6"/>
+          <w:sz w:val="18"/>
+          <w:szCs w:val="18"/>
+        </w:rPr>
+      </w:pPr>
+      <w:r>
+        <w:rPr>
+          <w:rFonts w:ascii="Times New Roman" w:hAnsi="Times New Roman" w:cs="Times New Roman"/>
+          <w:color w:val="595959" w:themeColor="text1" w:themeTint="A6"/>
+          <w:sz w:val="18"/>
+          <w:szCs w:val="18"/>
+        </w:rPr>
+        <w:t>Если бы в one_list были дубликаты, например [1, 1, 2, 3, 4], повлияло бы это как-то на результат intersection_result? Почему?</w:t>
+      </w:r>
+    </w:p>
+    <w:p>
+      <w:pPr>
+        <w:rPr>
+          <w:rFonts w:ascii="Times New Roman" w:hAnsi="Times New Roman" w:cs="Times New Roman"/>
+          <w:color w:val="595959" w:themeColor="text1" w:themeTint="A6"/>
+          <w:sz w:val="18"/>
+          <w:szCs w:val="18"/>
+        </w:rPr>
+      </w:pPr>
+      <w:r>
+        <w:rPr>
+          <w:rFonts w:ascii="Times New Roman" w:hAnsi="Times New Roman" w:cs="Times New Roman"/>
+          <w:color w:val="595959" w:themeColor="text1" w:themeTint="A6"/>
+          <w:sz w:val="18"/>
+          <w:szCs w:val="18"/>
+        </w:rPr>
+        <w:t>Нет, не повлияло бы, потому что множество автоматически удаляет дубликаты, так что похуй в принципе</w:t>
+      </w:r>
+    </w:p>
+    <w:p>
+      <w:pPr>
+        <w:numPr>
+          <w:ilvl w:val="0"/>
+          <w:numId w:val="78"/>
+        </w:numPr>
+        <w:rPr>
+          <w:rFonts w:ascii="Times New Roman" w:hAnsi="Times New Roman" w:cs="Times New Roman"/>
+          <w:color w:val="595959" w:themeColor="text1" w:themeTint="A6"/>
+          <w:sz w:val="18"/>
+          <w:szCs w:val="18"/>
+        </w:rPr>
+      </w:pPr>
+      <w:r>
+        <w:rPr>
+          <w:rFonts w:ascii="Times New Roman" w:hAnsi="Times New Roman" w:cs="Times New Roman"/>
+          <w:color w:val="595959" w:themeColor="text1" w:themeTint="A6"/>
+          <w:sz w:val="18"/>
+          <w:szCs w:val="18"/>
+        </w:rPr>
+        <w:t>Разница между set1.difference(set2) и set2.difference(set1) — почему они дают разные результаты? Приведи пример из нашей задачи.</w:t>
+      </w:r>
+    </w:p>
+    <w:p>
+      <w:pPr>
+        <w:rPr>
+          <w:rFonts w:ascii="Times New Roman" w:hAnsi="Times New Roman" w:cs="Times New Roman"/>
+          <w:color w:val="595959" w:themeColor="text1" w:themeTint="A6"/>
+          <w:sz w:val="18"/>
+          <w:szCs w:val="18"/>
+          <w:lang w:val="en-US"/>
+        </w:rPr>
+      </w:pPr>
+      <w:r>
+        <w:rPr>
+          <w:rFonts w:ascii="Times New Roman" w:hAnsi="Times New Roman" w:cs="Times New Roman"/>
+          <w:color w:val="595959" w:themeColor="text1" w:themeTint="A6"/>
+          <w:sz w:val="18"/>
+          <w:szCs w:val="18"/>
+        </w:rPr>
+        <w:t>Потому что значения множеств разные и в данном случае есть разница вычет чего и откуда происходит. В</w:t>
+      </w:r>
+      <w:r>
+        <w:rPr>
+          <w:rFonts w:ascii="Times New Roman" w:hAnsi="Times New Roman" w:cs="Times New Roman"/>
+          <w:color w:val="595959" w:themeColor="text1" w:themeTint="A6"/>
+          <w:sz w:val="18"/>
+          <w:szCs w:val="18"/>
+          <w:lang w:val="en-US"/>
+        </w:rPr>
+        <w:t xml:space="preserve"> </w:t>
+      </w:r>
+      <w:r>
+        <w:rPr>
+          <w:rFonts w:ascii="Times New Roman" w:hAnsi="Times New Roman" w:cs="Times New Roman"/>
+          <w:color w:val="595959" w:themeColor="text1" w:themeTint="A6"/>
+          <w:sz w:val="18"/>
+          <w:szCs w:val="18"/>
+        </w:rPr>
+        <w:t>нашем</w:t>
+      </w:r>
+      <w:r>
+        <w:rPr>
+          <w:rFonts w:ascii="Times New Roman" w:hAnsi="Times New Roman" w:cs="Times New Roman"/>
+          <w:color w:val="595959" w:themeColor="text1" w:themeTint="A6"/>
+          <w:sz w:val="18"/>
+          <w:szCs w:val="18"/>
+          <w:lang w:val="en-US"/>
+        </w:rPr>
+        <w:t xml:space="preserve"> </w:t>
+      </w:r>
+      <w:r>
+        <w:rPr>
+          <w:rFonts w:ascii="Times New Roman" w:hAnsi="Times New Roman" w:cs="Times New Roman"/>
+          <w:color w:val="595959" w:themeColor="text1" w:themeTint="A6"/>
+          <w:sz w:val="18"/>
+          <w:szCs w:val="18"/>
+        </w:rPr>
+        <w:t>примере</w:t>
+      </w:r>
+      <w:r>
+        <w:rPr>
+          <w:rFonts w:ascii="Times New Roman" w:hAnsi="Times New Roman" w:cs="Times New Roman"/>
+          <w:color w:val="595959" w:themeColor="text1" w:themeTint="A6"/>
+          <w:sz w:val="18"/>
+          <w:szCs w:val="18"/>
+          <w:lang w:val="en-US"/>
+        </w:rPr>
+        <w:t xml:space="preserve"> </w:t>
+      </w:r>
+      <w:r>
+        <w:rPr>
+          <w:rFonts w:ascii="Times New Roman" w:hAnsi="Times New Roman" w:cs="Times New Roman"/>
+          <w:color w:val="595959" w:themeColor="text1" w:themeTint="A6"/>
+          <w:sz w:val="18"/>
+          <w:szCs w:val="18"/>
+        </w:rPr>
+        <w:t>это</w:t>
+      </w:r>
+      <w:r>
+        <w:rPr>
+          <w:rFonts w:ascii="Times New Roman" w:hAnsi="Times New Roman" w:cs="Times New Roman"/>
+          <w:color w:val="595959" w:themeColor="text1" w:themeTint="A6"/>
+          <w:sz w:val="18"/>
+          <w:szCs w:val="18"/>
+          <w:lang w:val="en-US"/>
+        </w:rPr>
+        <w:t xml:space="preserve"> </w:t>
+      </w:r>
+      <w:r>
+        <w:rPr>
+          <w:rFonts w:ascii="Times New Roman" w:hAnsi="Times New Roman" w:cs="Times New Roman"/>
+          <w:color w:val="595959" w:themeColor="text1" w:themeTint="A6"/>
+          <w:sz w:val="18"/>
+          <w:szCs w:val="18"/>
+        </w:rPr>
+        <w:t>либо</w:t>
+      </w:r>
+      <w:r>
+        <w:rPr>
+          <w:rFonts w:ascii="Times New Roman" w:hAnsi="Times New Roman" w:cs="Times New Roman"/>
+          <w:color w:val="595959" w:themeColor="text1" w:themeTint="A6"/>
+          <w:sz w:val="18"/>
+          <w:szCs w:val="18"/>
+          <w:lang w:val="en-US"/>
+        </w:rPr>
+        <w:t xml:space="preserve"> </w:t>
+      </w:r>
+      <w:r>
+        <w:rPr>
+          <w:rFonts w:ascii="Times New Roman" w:hAnsi="Times New Roman" w:cs="Times New Roman"/>
+          <w:color w:val="595959" w:themeColor="text1" w:themeTint="A6"/>
+          <w:sz w:val="18"/>
+          <w:szCs w:val="18"/>
+          <w:lang w:val="en-US"/>
+        </w:rPr>
+        <w:t>Difference sets: {</w:t>
+      </w:r>
+      <w:r>
+        <w:rPr>
+          <w:rFonts w:ascii="Times New Roman" w:hAnsi="Times New Roman" w:cs="Times New Roman"/>
+          <w:color w:val="595959" w:themeColor="text1" w:themeTint="A6"/>
+          <w:sz w:val="18"/>
+          <w:szCs w:val="18"/>
+          <w:lang w:val="en-US"/>
+        </w:rPr>
+        <w:t>1</w:t>
+      </w:r>
+      <w:r>
+        <w:rPr>
+          <w:rFonts w:ascii="Times New Roman" w:hAnsi="Times New Roman" w:cs="Times New Roman"/>
+          <w:color w:val="595959" w:themeColor="text1" w:themeTint="A6"/>
+          <w:sz w:val="18"/>
+          <w:szCs w:val="18"/>
+          <w:lang w:val="en-US"/>
+        </w:rPr>
+        <w:t xml:space="preserve">, </w:t>
+      </w:r>
+      <w:r>
+        <w:rPr>
+          <w:rFonts w:ascii="Times New Roman" w:hAnsi="Times New Roman" w:cs="Times New Roman"/>
+          <w:color w:val="595959" w:themeColor="text1" w:themeTint="A6"/>
+          <w:sz w:val="18"/>
+          <w:szCs w:val="18"/>
+          <w:lang w:val="en-US"/>
+        </w:rPr>
+        <w:t>2</w:t>
+      </w:r>
+      <w:r>
+        <w:rPr>
+          <w:rFonts w:ascii="Times New Roman" w:hAnsi="Times New Roman" w:cs="Times New Roman"/>
+          <w:color w:val="595959" w:themeColor="text1" w:themeTint="A6"/>
+          <w:sz w:val="18"/>
+          <w:szCs w:val="18"/>
+          <w:lang w:val="en-US"/>
+        </w:rPr>
+        <w:t>}</w:t>
+      </w:r>
+      <w:r>
+        <w:rPr>
+          <w:rFonts w:ascii="Times New Roman" w:hAnsi="Times New Roman" w:cs="Times New Roman"/>
+          <w:color w:val="595959" w:themeColor="text1" w:themeTint="A6"/>
+          <w:sz w:val="18"/>
+          <w:szCs w:val="18"/>
+          <w:lang w:val="en-US"/>
+        </w:rPr>
+        <w:t xml:space="preserve"> </w:t>
+      </w:r>
+      <w:r>
+        <w:rPr>
+          <w:rFonts w:ascii="Times New Roman" w:hAnsi="Times New Roman" w:cs="Times New Roman"/>
+          <w:color w:val="595959" w:themeColor="text1" w:themeTint="A6"/>
+          <w:sz w:val="18"/>
+          <w:szCs w:val="18"/>
+          <w:lang w:val="en-US"/>
+        </w:rPr>
+        <w:t>set1.difference(set2)</w:t>
+      </w:r>
+      <w:r>
+        <w:rPr>
+          <w:rFonts w:ascii="Times New Roman" w:hAnsi="Times New Roman" w:cs="Times New Roman"/>
+          <w:color w:val="595959" w:themeColor="text1" w:themeTint="A6"/>
+          <w:sz w:val="18"/>
+          <w:szCs w:val="18"/>
+          <w:lang w:val="en-US"/>
+        </w:rPr>
+        <w:t xml:space="preserve">  </w:t>
+      </w:r>
+      <w:r>
+        <w:rPr>
+          <w:rFonts w:ascii="Times New Roman" w:hAnsi="Times New Roman" w:cs="Times New Roman"/>
+          <w:color w:val="595959" w:themeColor="text1" w:themeTint="A6"/>
+          <w:sz w:val="18"/>
+          <w:szCs w:val="18"/>
+        </w:rPr>
+        <w:t>или</w:t>
+      </w:r>
+      <w:r>
+        <w:rPr>
+          <w:rFonts w:ascii="Times New Roman" w:hAnsi="Times New Roman" w:cs="Times New Roman"/>
+          <w:color w:val="595959" w:themeColor="text1" w:themeTint="A6"/>
+          <w:sz w:val="18"/>
+          <w:szCs w:val="18"/>
+          <w:lang w:val="en-US"/>
+        </w:rPr>
+        <w:t xml:space="preserve"> </w:t>
+      </w:r>
+      <w:r>
+        <w:rPr>
+          <w:rFonts w:ascii="Times New Roman" w:hAnsi="Times New Roman" w:cs="Times New Roman"/>
+          <w:color w:val="595959" w:themeColor="text1" w:themeTint="A6"/>
+          <w:sz w:val="18"/>
+          <w:szCs w:val="18"/>
+          <w:lang w:val="en-US"/>
+        </w:rPr>
+        <w:t>Difference sets: {5, 6}</w:t>
+      </w:r>
+      <w:r>
+        <w:rPr>
+          <w:rFonts w:ascii="Times New Roman" w:hAnsi="Times New Roman" w:cs="Times New Roman"/>
+          <w:color w:val="595959" w:themeColor="text1" w:themeTint="A6"/>
+          <w:sz w:val="18"/>
+          <w:szCs w:val="18"/>
+          <w:lang w:val="en-US"/>
+        </w:rPr>
+        <w:t xml:space="preserve"> </w:t>
+      </w:r>
+      <w:r>
+        <w:rPr>
+          <w:rFonts w:ascii="Times New Roman" w:hAnsi="Times New Roman" w:cs="Times New Roman"/>
+          <w:color w:val="595959" w:themeColor="text1" w:themeTint="A6"/>
+          <w:sz w:val="18"/>
+          <w:szCs w:val="18"/>
+          <w:lang w:val="en-US"/>
+        </w:rPr>
+        <w:t>set</w:t>
+      </w:r>
+      <w:r>
+        <w:rPr>
+          <w:rFonts w:ascii="Times New Roman" w:hAnsi="Times New Roman" w:cs="Times New Roman"/>
+          <w:color w:val="595959" w:themeColor="text1" w:themeTint="A6"/>
+          <w:sz w:val="18"/>
+          <w:szCs w:val="18"/>
+          <w:lang w:val="en-US"/>
+        </w:rPr>
+        <w:t>2</w:t>
+      </w:r>
+      <w:r>
+        <w:rPr>
+          <w:rFonts w:ascii="Times New Roman" w:hAnsi="Times New Roman" w:cs="Times New Roman"/>
+          <w:color w:val="595959" w:themeColor="text1" w:themeTint="A6"/>
+          <w:sz w:val="18"/>
+          <w:szCs w:val="18"/>
+          <w:lang w:val="en-US"/>
+        </w:rPr>
+        <w:t>.difference(set</w:t>
+      </w:r>
+      <w:r>
+        <w:rPr>
+          <w:rFonts w:ascii="Times New Roman" w:hAnsi="Times New Roman" w:cs="Times New Roman"/>
+          <w:color w:val="595959" w:themeColor="text1" w:themeTint="A6"/>
+          <w:sz w:val="18"/>
+          <w:szCs w:val="18"/>
+          <w:lang w:val="en-US"/>
+        </w:rPr>
+        <w:t>1</w:t>
+      </w:r>
+      <w:r>
+        <w:rPr>
+          <w:rFonts w:ascii="Times New Roman" w:hAnsi="Times New Roman" w:cs="Times New Roman"/>
+          <w:color w:val="595959" w:themeColor="text1" w:themeTint="A6"/>
+          <w:sz w:val="18"/>
+          <w:szCs w:val="18"/>
+          <w:lang w:val="en-US"/>
+        </w:rPr>
+        <w:t>)</w:t>
+      </w:r>
+      <w:r>
+        <w:rPr>
+          <w:rFonts w:ascii="Times New Roman" w:hAnsi="Times New Roman" w:cs="Times New Roman"/>
+          <w:color w:val="595959" w:themeColor="text1" w:themeTint="A6"/>
+          <w:sz w:val="18"/>
+          <w:szCs w:val="18"/>
+          <w:lang w:val="en-US"/>
+        </w:rPr>
+        <w:t xml:space="preserve"> </w:t>
+      </w:r>
+      <w:r>
+        <w:rPr>
+          <w:rFonts w:ascii="Times New Roman" w:hAnsi="Times New Roman" w:cs="Times New Roman"/>
+          <w:color w:val="595959" w:themeColor="text1" w:themeTint="A6"/>
+          <w:sz w:val="18"/>
+          <w:szCs w:val="18"/>
+          <w:lang w:val="en-US"/>
+        </w:rPr>
+        <w:tab/>
+        <w:t xml:space="preserve"> </w:t>
+      </w:r>
+    </w:p>
+    <w:p>
+      <w:pPr>
+        <w:numPr>
+          <w:ilvl w:val="0"/>
+          <w:numId w:val="78"/>
+        </w:numPr>
+        <w:rPr>
+          <w:rFonts w:ascii="Times New Roman" w:hAnsi="Times New Roman" w:cs="Times New Roman"/>
+          <w:color w:val="595959" w:themeColor="text1" w:themeTint="A6"/>
+          <w:sz w:val="18"/>
+          <w:szCs w:val="18"/>
+        </w:rPr>
+      </w:pPr>
+      <w:r>
+        <w:rPr>
+          <w:rFonts w:ascii="Times New Roman" w:hAnsi="Times New Roman" w:cs="Times New Roman"/>
+          <w:color w:val="595959" w:themeColor="text1" w:themeTint="A6"/>
+          <w:sz w:val="18"/>
+          <w:szCs w:val="18"/>
+        </w:rPr>
+        <w:t>Как ты думаешь, можно ли было использовать операторы &amp;, |, - вместо методов .intersection(), .union(), .difference()? Дал бы это тот же результат?</w:t>
+      </w:r>
+    </w:p>
+    <w:p>
+      <w:pPr>
+        <w:rPr>
+          <w:rFonts w:ascii="Times New Roman" w:hAnsi="Times New Roman" w:cs="Times New Roman"/>
+          <w:color w:val="595959" w:themeColor="text1" w:themeTint="A6"/>
+          <w:sz w:val="18"/>
+          <w:szCs w:val="18"/>
+        </w:rPr>
+      </w:pPr>
+      <w:r>
+        <w:rPr>
+          <w:rFonts w:ascii="Times New Roman" w:hAnsi="Times New Roman" w:cs="Times New Roman"/>
+          <w:color w:val="595959" w:themeColor="text1" w:themeTint="A6"/>
+          <w:sz w:val="18"/>
+          <w:szCs w:val="18"/>
+        </w:rPr>
+        <w:t>Да, разницы никакой кроме синтаксического оформления.</w:t>
       </w:r>
     </w:p>
     <w:p>
@@ -35972,8 +37139,8 @@
       </w:pPr>
     </w:p>
     <w:sectPr>
-      <w:headerReference w:type="default" r:id="rId78"/>
-      <w:footerReference w:type="default" r:id="rId79"/>
+      <w:headerReference w:type="default" r:id="rId79"/>
+      <w:footerReference w:type="default" r:id="rId80"/>
       <w:pgSz w:w="12240" w:h="20160" w:code="5"/>
       <w:pgMar w:top="1134" w:right="850" w:bottom="1134" w:left="1701" w:header="283" w:footer="397" w:gutter="0"/>
       <w:pgNumType w:start="1"/>
@@ -41744,13 +42911,13 @@
     </w:lvl>
   </w:abstractNum>
   <w:abstractNum w:abstractNumId="41" w15:restartNumberingAfterBreak="0">
-    <w:nsid w:val="3B6976DE"/>
+    <w:nsid w:val="3C8F0803"/>
     <w:multiLevelType w:val="multilevel"/>
-    <w:tmpl w:val="EBD041BA"/>
+    <w:tmpl w:val="FD4A8904"/>
     <w:lvl w:ilvl="0">
       <w:start w:val="1"/>
-      <w:numFmt w:val="bullet"/>
-      <w:lvlText w:val=""/>
+      <w:numFmt w:val="decimal"/>
+      <w:lvlText w:val="%1."/>
       <w:lvlJc w:val="left"/>
       <w:pPr>
         <w:tabs>
@@ -41758,15 +42925,11 @@
         </w:tabs>
         <w:ind w:left="720" w:hanging="360"/>
       </w:pPr>
-      <w:rPr>
-        <w:rFonts w:ascii="Symbol" w:hAnsi="Symbol" w:hint="default"/>
-        <w:sz w:val="20"/>
-      </w:rPr>
     </w:lvl>
     <w:lvl w:ilvl="1" w:tentative="1">
       <w:start w:val="1"/>
-      <w:numFmt w:val="bullet"/>
-      <w:lvlText w:val="o"/>
+      <w:numFmt w:val="decimal"/>
+      <w:lvlText w:val="%2."/>
       <w:lvlJc w:val="left"/>
       <w:pPr>
         <w:tabs>
@@ -41774,15 +42937,11 @@
         </w:tabs>
         <w:ind w:left="1440" w:hanging="360"/>
       </w:pPr>
-      <w:rPr>
-        <w:rFonts w:ascii="Courier New" w:hAnsi="Courier New" w:hint="default"/>
-        <w:sz w:val="20"/>
-      </w:rPr>
     </w:lvl>
     <w:lvl w:ilvl="2" w:tentative="1">
       <w:start w:val="1"/>
-      <w:numFmt w:val="bullet"/>
-      <w:lvlText w:val=""/>
+      <w:numFmt w:val="decimal"/>
+      <w:lvlText w:val="%3."/>
       <w:lvlJc w:val="left"/>
       <w:pPr>
         <w:tabs>
@@ -41790,15 +42949,11 @@
         </w:tabs>
         <w:ind w:left="2160" w:hanging="360"/>
       </w:pPr>
-      <w:rPr>
-        <w:rFonts w:ascii="Wingdings" w:hAnsi="Wingdings" w:hint="default"/>
-        <w:sz w:val="20"/>
-      </w:rPr>
     </w:lvl>
     <w:lvl w:ilvl="3" w:tentative="1">
       <w:start w:val="1"/>
-      <w:numFmt w:val="bullet"/>
-      <w:lvlText w:val=""/>
+      <w:numFmt w:val="decimal"/>
+      <w:lvlText w:val="%4."/>
       <w:lvlJc w:val="left"/>
       <w:pPr>
         <w:tabs>
@@ -41806,15 +42961,11 @@
         </w:tabs>
         <w:ind w:left="2880" w:hanging="360"/>
       </w:pPr>
-      <w:rPr>
-        <w:rFonts w:ascii="Wingdings" w:hAnsi="Wingdings" w:hint="default"/>
-        <w:sz w:val="20"/>
-      </w:rPr>
     </w:lvl>
     <w:lvl w:ilvl="4" w:tentative="1">
       <w:start w:val="1"/>
-      <w:numFmt w:val="bullet"/>
-      <w:lvlText w:val=""/>
+      <w:numFmt w:val="decimal"/>
+      <w:lvlText w:val="%5."/>
       <w:lvlJc w:val="left"/>
       <w:pPr>
         <w:tabs>
@@ -41822,15 +42973,11 @@
         </w:tabs>
         <w:ind w:left="3600" w:hanging="360"/>
       </w:pPr>
-      <w:rPr>
-        <w:rFonts w:ascii="Wingdings" w:hAnsi="Wingdings" w:hint="default"/>
-        <w:sz w:val="20"/>
-      </w:rPr>
     </w:lvl>
     <w:lvl w:ilvl="5" w:tentative="1">
       <w:start w:val="1"/>
-      <w:numFmt w:val="bullet"/>
-      <w:lvlText w:val=""/>
+      <w:numFmt w:val="decimal"/>
+      <w:lvlText w:val="%6."/>
       <w:lvlJc w:val="left"/>
       <w:pPr>
         <w:tabs>
@@ -41838,15 +42985,11 @@
         </w:tabs>
         <w:ind w:left="4320" w:hanging="360"/>
       </w:pPr>
-      <w:rPr>
-        <w:rFonts w:ascii="Wingdings" w:hAnsi="Wingdings" w:hint="default"/>
-        <w:sz w:val="20"/>
-      </w:rPr>
     </w:lvl>
     <w:lvl w:ilvl="6" w:tentative="1">
       <w:start w:val="1"/>
-      <w:numFmt w:val="bullet"/>
-      <w:lvlText w:val=""/>
+      <w:numFmt w:val="decimal"/>
+      <w:lvlText w:val="%7."/>
       <w:lvlJc w:val="left"/>
       <w:pPr>
         <w:tabs>
@@ -41854,15 +42997,11 @@
         </w:tabs>
         <w:ind w:left="5040" w:hanging="360"/>
       </w:pPr>
-      <w:rPr>
-        <w:rFonts w:ascii="Wingdings" w:hAnsi="Wingdings" w:hint="default"/>
-        <w:sz w:val="20"/>
-      </w:rPr>
     </w:lvl>
     <w:lvl w:ilvl="7" w:tentative="1">
       <w:start w:val="1"/>
-      <w:numFmt w:val="bullet"/>
-      <w:lvlText w:val=""/>
+      <w:numFmt w:val="decimal"/>
+      <w:lvlText w:val="%8."/>
       <w:lvlJc w:val="left"/>
       <w:pPr>
         <w:tabs>
@@ -41870,15 +43009,11 @@
         </w:tabs>
         <w:ind w:left="5760" w:hanging="360"/>
       </w:pPr>
-      <w:rPr>
-        <w:rFonts w:ascii="Wingdings" w:hAnsi="Wingdings" w:hint="default"/>
-        <w:sz w:val="20"/>
-      </w:rPr>
     </w:lvl>
     <w:lvl w:ilvl="8" w:tentative="1">
       <w:start w:val="1"/>
-      <w:numFmt w:val="bullet"/>
-      <w:lvlText w:val=""/>
+      <w:numFmt w:val="decimal"/>
+      <w:lvlText w:val="%9."/>
       <w:lvlJc w:val="left"/>
       <w:pPr>
         <w:tabs>
@@ -41886,10 +43021,6 @@
         </w:tabs>
         <w:ind w:left="6480" w:hanging="360"/>
       </w:pPr>
-      <w:rPr>
-        <w:rFonts w:ascii="Wingdings" w:hAnsi="Wingdings" w:hint="default"/>
-        <w:sz w:val="20"/>
-      </w:rPr>
     </w:lvl>
   </w:abstractNum>
   <w:abstractNum w:abstractNumId="42" w15:restartNumberingAfterBreak="0">
@@ -43135,155 +44266,6 @@
     </w:lvl>
   </w:abstractNum>
   <w:abstractNum w:abstractNumId="51" w15:restartNumberingAfterBreak="0">
-    <w:nsid w:val="4C33111E"/>
-    <w:multiLevelType w:val="multilevel"/>
-    <w:tmpl w:val="A1FE39D2"/>
-    <w:lvl w:ilvl="0">
-      <w:start w:val="1"/>
-      <w:numFmt w:val="bullet"/>
-      <w:lvlText w:val=""/>
-      <w:lvlJc w:val="left"/>
-      <w:pPr>
-        <w:tabs>
-          <w:tab w:val="num" w:pos="720"/>
-        </w:tabs>
-        <w:ind w:left="720" w:hanging="360"/>
-      </w:pPr>
-      <w:rPr>
-        <w:rFonts w:ascii="Symbol" w:hAnsi="Symbol" w:hint="default"/>
-        <w:sz w:val="20"/>
-      </w:rPr>
-    </w:lvl>
-    <w:lvl w:ilvl="1" w:tentative="1">
-      <w:start w:val="1"/>
-      <w:numFmt w:val="bullet"/>
-      <w:lvlText w:val="o"/>
-      <w:lvlJc w:val="left"/>
-      <w:pPr>
-        <w:tabs>
-          <w:tab w:val="num" w:pos="1440"/>
-        </w:tabs>
-        <w:ind w:left="1440" w:hanging="360"/>
-      </w:pPr>
-      <w:rPr>
-        <w:rFonts w:ascii="Courier New" w:hAnsi="Courier New" w:hint="default"/>
-        <w:sz w:val="20"/>
-      </w:rPr>
-    </w:lvl>
-    <w:lvl w:ilvl="2" w:tentative="1">
-      <w:start w:val="1"/>
-      <w:numFmt w:val="bullet"/>
-      <w:lvlText w:val=""/>
-      <w:lvlJc w:val="left"/>
-      <w:pPr>
-        <w:tabs>
-          <w:tab w:val="num" w:pos="2160"/>
-        </w:tabs>
-        <w:ind w:left="2160" w:hanging="360"/>
-      </w:pPr>
-      <w:rPr>
-        <w:rFonts w:ascii="Wingdings" w:hAnsi="Wingdings" w:hint="default"/>
-        <w:sz w:val="20"/>
-      </w:rPr>
-    </w:lvl>
-    <w:lvl w:ilvl="3" w:tentative="1">
-      <w:start w:val="1"/>
-      <w:numFmt w:val="bullet"/>
-      <w:lvlText w:val=""/>
-      <w:lvlJc w:val="left"/>
-      <w:pPr>
-        <w:tabs>
-          <w:tab w:val="num" w:pos="2880"/>
-        </w:tabs>
-        <w:ind w:left="2880" w:hanging="360"/>
-      </w:pPr>
-      <w:rPr>
-        <w:rFonts w:ascii="Wingdings" w:hAnsi="Wingdings" w:hint="default"/>
-        <w:sz w:val="20"/>
-      </w:rPr>
-    </w:lvl>
-    <w:lvl w:ilvl="4" w:tentative="1">
-      <w:start w:val="1"/>
-      <w:numFmt w:val="bullet"/>
-      <w:lvlText w:val=""/>
-      <w:lvlJc w:val="left"/>
-      <w:pPr>
-        <w:tabs>
-          <w:tab w:val="num" w:pos="3600"/>
-        </w:tabs>
-        <w:ind w:left="3600" w:hanging="360"/>
-      </w:pPr>
-      <w:rPr>
-        <w:rFonts w:ascii="Wingdings" w:hAnsi="Wingdings" w:hint="default"/>
-        <w:sz w:val="20"/>
-      </w:rPr>
-    </w:lvl>
-    <w:lvl w:ilvl="5" w:tentative="1">
-      <w:start w:val="1"/>
-      <w:numFmt w:val="bullet"/>
-      <w:lvlText w:val=""/>
-      <w:lvlJc w:val="left"/>
-      <w:pPr>
-        <w:tabs>
-          <w:tab w:val="num" w:pos="4320"/>
-        </w:tabs>
-        <w:ind w:left="4320" w:hanging="360"/>
-      </w:pPr>
-      <w:rPr>
-        <w:rFonts w:ascii="Wingdings" w:hAnsi="Wingdings" w:hint="default"/>
-        <w:sz w:val="20"/>
-      </w:rPr>
-    </w:lvl>
-    <w:lvl w:ilvl="6" w:tentative="1">
-      <w:start w:val="1"/>
-      <w:numFmt w:val="bullet"/>
-      <w:lvlText w:val=""/>
-      <w:lvlJc w:val="left"/>
-      <w:pPr>
-        <w:tabs>
-          <w:tab w:val="num" w:pos="5040"/>
-        </w:tabs>
-        <w:ind w:left="5040" w:hanging="360"/>
-      </w:pPr>
-      <w:rPr>
-        <w:rFonts w:ascii="Wingdings" w:hAnsi="Wingdings" w:hint="default"/>
-        <w:sz w:val="20"/>
-      </w:rPr>
-    </w:lvl>
-    <w:lvl w:ilvl="7" w:tentative="1">
-      <w:start w:val="1"/>
-      <w:numFmt w:val="bullet"/>
-      <w:lvlText w:val=""/>
-      <w:lvlJc w:val="left"/>
-      <w:pPr>
-        <w:tabs>
-          <w:tab w:val="num" w:pos="5760"/>
-        </w:tabs>
-        <w:ind w:left="5760" w:hanging="360"/>
-      </w:pPr>
-      <w:rPr>
-        <w:rFonts w:ascii="Wingdings" w:hAnsi="Wingdings" w:hint="default"/>
-        <w:sz w:val="20"/>
-      </w:rPr>
-    </w:lvl>
-    <w:lvl w:ilvl="8" w:tentative="1">
-      <w:start w:val="1"/>
-      <w:numFmt w:val="bullet"/>
-      <w:lvlText w:val=""/>
-      <w:lvlJc w:val="left"/>
-      <w:pPr>
-        <w:tabs>
-          <w:tab w:val="num" w:pos="6480"/>
-        </w:tabs>
-        <w:ind w:left="6480" w:hanging="360"/>
-      </w:pPr>
-      <w:rPr>
-        <w:rFonts w:ascii="Wingdings" w:hAnsi="Wingdings" w:hint="default"/>
-        <w:sz w:val="20"/>
-      </w:rPr>
-    </w:lvl>
-  </w:abstractNum>
-  <w:abstractNum w:abstractNumId="52" w15:restartNumberingAfterBreak="0">
     <w:nsid w:val="522B7E37"/>
     <w:multiLevelType w:val="multilevel"/>
     <w:tmpl w:val="D52C9F50"/>
@@ -43432,7 +44414,7 @@
       </w:rPr>
     </w:lvl>
   </w:abstractNum>
-  <w:abstractNum w:abstractNumId="53" w15:restartNumberingAfterBreak="0">
+  <w:abstractNum w:abstractNumId="52" w15:restartNumberingAfterBreak="0">
     <w:nsid w:val="5491163E"/>
     <w:multiLevelType w:val="multilevel"/>
     <w:tmpl w:val="1F008D98"/>
@@ -43545,7 +44527,7 @@
       </w:pPr>
     </w:lvl>
   </w:abstractNum>
-  <w:abstractNum w:abstractNumId="54" w15:restartNumberingAfterBreak="0">
+  <w:abstractNum w:abstractNumId="53" w15:restartNumberingAfterBreak="0">
     <w:nsid w:val="55C07B86"/>
     <w:multiLevelType w:val="multilevel"/>
     <w:tmpl w:val="21B0D25A"/>
@@ -43694,7 +44676,7 @@
       </w:rPr>
     </w:lvl>
   </w:abstractNum>
-  <w:abstractNum w:abstractNumId="55" w15:restartNumberingAfterBreak="0">
+  <w:abstractNum w:abstractNumId="54" w15:restartNumberingAfterBreak="0">
     <w:nsid w:val="55F426D8"/>
     <w:multiLevelType w:val="multilevel"/>
     <w:tmpl w:val="C54A629A"/>
@@ -43843,7 +44825,7 @@
       </w:rPr>
     </w:lvl>
   </w:abstractNum>
-  <w:abstractNum w:abstractNumId="56" w15:restartNumberingAfterBreak="0">
+  <w:abstractNum w:abstractNumId="55" w15:restartNumberingAfterBreak="0">
     <w:nsid w:val="563874AD"/>
     <w:multiLevelType w:val="hybridMultilevel"/>
     <w:tmpl w:val="1A9067B4"/>
@@ -43956,156 +44938,7 @@
       </w:rPr>
     </w:lvl>
   </w:abstractNum>
-  <w:abstractNum w:abstractNumId="57" w15:restartNumberingAfterBreak="0">
-    <w:nsid w:val="57AF0F76"/>
-    <w:multiLevelType w:val="multilevel"/>
-    <w:tmpl w:val="85580CC4"/>
-    <w:lvl w:ilvl="0">
-      <w:start w:val="1"/>
-      <w:numFmt w:val="bullet"/>
-      <w:lvlText w:val=""/>
-      <w:lvlJc w:val="left"/>
-      <w:pPr>
-        <w:tabs>
-          <w:tab w:val="num" w:pos="720"/>
-        </w:tabs>
-        <w:ind w:left="720" w:hanging="360"/>
-      </w:pPr>
-      <w:rPr>
-        <w:rFonts w:ascii="Symbol" w:hAnsi="Symbol" w:hint="default"/>
-        <w:sz w:val="20"/>
-      </w:rPr>
-    </w:lvl>
-    <w:lvl w:ilvl="1" w:tentative="1">
-      <w:start w:val="1"/>
-      <w:numFmt w:val="bullet"/>
-      <w:lvlText w:val="o"/>
-      <w:lvlJc w:val="left"/>
-      <w:pPr>
-        <w:tabs>
-          <w:tab w:val="num" w:pos="1440"/>
-        </w:tabs>
-        <w:ind w:left="1440" w:hanging="360"/>
-      </w:pPr>
-      <w:rPr>
-        <w:rFonts w:ascii="Courier New" w:hAnsi="Courier New" w:hint="default"/>
-        <w:sz w:val="20"/>
-      </w:rPr>
-    </w:lvl>
-    <w:lvl w:ilvl="2" w:tentative="1">
-      <w:start w:val="1"/>
-      <w:numFmt w:val="bullet"/>
-      <w:lvlText w:val=""/>
-      <w:lvlJc w:val="left"/>
-      <w:pPr>
-        <w:tabs>
-          <w:tab w:val="num" w:pos="2160"/>
-        </w:tabs>
-        <w:ind w:left="2160" w:hanging="360"/>
-      </w:pPr>
-      <w:rPr>
-        <w:rFonts w:ascii="Wingdings" w:hAnsi="Wingdings" w:hint="default"/>
-        <w:sz w:val="20"/>
-      </w:rPr>
-    </w:lvl>
-    <w:lvl w:ilvl="3" w:tentative="1">
-      <w:start w:val="1"/>
-      <w:numFmt w:val="bullet"/>
-      <w:lvlText w:val=""/>
-      <w:lvlJc w:val="left"/>
-      <w:pPr>
-        <w:tabs>
-          <w:tab w:val="num" w:pos="2880"/>
-        </w:tabs>
-        <w:ind w:left="2880" w:hanging="360"/>
-      </w:pPr>
-      <w:rPr>
-        <w:rFonts w:ascii="Wingdings" w:hAnsi="Wingdings" w:hint="default"/>
-        <w:sz w:val="20"/>
-      </w:rPr>
-    </w:lvl>
-    <w:lvl w:ilvl="4" w:tentative="1">
-      <w:start w:val="1"/>
-      <w:numFmt w:val="bullet"/>
-      <w:lvlText w:val=""/>
-      <w:lvlJc w:val="left"/>
-      <w:pPr>
-        <w:tabs>
-          <w:tab w:val="num" w:pos="3600"/>
-        </w:tabs>
-        <w:ind w:left="3600" w:hanging="360"/>
-      </w:pPr>
-      <w:rPr>
-        <w:rFonts w:ascii="Wingdings" w:hAnsi="Wingdings" w:hint="default"/>
-        <w:sz w:val="20"/>
-      </w:rPr>
-    </w:lvl>
-    <w:lvl w:ilvl="5" w:tentative="1">
-      <w:start w:val="1"/>
-      <w:numFmt w:val="bullet"/>
-      <w:lvlText w:val=""/>
-      <w:lvlJc w:val="left"/>
-      <w:pPr>
-        <w:tabs>
-          <w:tab w:val="num" w:pos="4320"/>
-        </w:tabs>
-        <w:ind w:left="4320" w:hanging="360"/>
-      </w:pPr>
-      <w:rPr>
-        <w:rFonts w:ascii="Wingdings" w:hAnsi="Wingdings" w:hint="default"/>
-        <w:sz w:val="20"/>
-      </w:rPr>
-    </w:lvl>
-    <w:lvl w:ilvl="6" w:tentative="1">
-      <w:start w:val="1"/>
-      <w:numFmt w:val="bullet"/>
-      <w:lvlText w:val=""/>
-      <w:lvlJc w:val="left"/>
-      <w:pPr>
-        <w:tabs>
-          <w:tab w:val="num" w:pos="5040"/>
-        </w:tabs>
-        <w:ind w:left="5040" w:hanging="360"/>
-      </w:pPr>
-      <w:rPr>
-        <w:rFonts w:ascii="Wingdings" w:hAnsi="Wingdings" w:hint="default"/>
-        <w:sz w:val="20"/>
-      </w:rPr>
-    </w:lvl>
-    <w:lvl w:ilvl="7" w:tentative="1">
-      <w:start w:val="1"/>
-      <w:numFmt w:val="bullet"/>
-      <w:lvlText w:val=""/>
-      <w:lvlJc w:val="left"/>
-      <w:pPr>
-        <w:tabs>
-          <w:tab w:val="num" w:pos="5760"/>
-        </w:tabs>
-        <w:ind w:left="5760" w:hanging="360"/>
-      </w:pPr>
-      <w:rPr>
-        <w:rFonts w:ascii="Wingdings" w:hAnsi="Wingdings" w:hint="default"/>
-        <w:sz w:val="20"/>
-      </w:rPr>
-    </w:lvl>
-    <w:lvl w:ilvl="8" w:tentative="1">
-      <w:start w:val="1"/>
-      <w:numFmt w:val="bullet"/>
-      <w:lvlText w:val=""/>
-      <w:lvlJc w:val="left"/>
-      <w:pPr>
-        <w:tabs>
-          <w:tab w:val="num" w:pos="6480"/>
-        </w:tabs>
-        <w:ind w:left="6480" w:hanging="360"/>
-      </w:pPr>
-      <w:rPr>
-        <w:rFonts w:ascii="Wingdings" w:hAnsi="Wingdings" w:hint="default"/>
-        <w:sz w:val="20"/>
-      </w:rPr>
-    </w:lvl>
-  </w:abstractNum>
-  <w:abstractNum w:abstractNumId="58" w15:restartNumberingAfterBreak="0">
+  <w:abstractNum w:abstractNumId="56" w15:restartNumberingAfterBreak="0">
     <w:nsid w:val="5B1F6F2E"/>
     <w:multiLevelType w:val="multilevel"/>
     <w:tmpl w:val="0906AA84"/>
@@ -44218,7 +45051,7 @@
       </w:pPr>
     </w:lvl>
   </w:abstractNum>
-  <w:abstractNum w:abstractNumId="59" w15:restartNumberingAfterBreak="0">
+  <w:abstractNum w:abstractNumId="57" w15:restartNumberingAfterBreak="0">
     <w:nsid w:val="5CBB445D"/>
     <w:multiLevelType w:val="multilevel"/>
     <w:tmpl w:val="D5B40914"/>
@@ -44367,7 +45200,7 @@
       </w:rPr>
     </w:lvl>
   </w:abstractNum>
-  <w:abstractNum w:abstractNumId="60" w15:restartNumberingAfterBreak="0">
+  <w:abstractNum w:abstractNumId="58" w15:restartNumberingAfterBreak="0">
     <w:nsid w:val="5EB21B9C"/>
     <w:multiLevelType w:val="multilevel"/>
     <w:tmpl w:val="DA1C1E8C"/>
@@ -44480,7 +45313,7 @@
       </w:pPr>
     </w:lvl>
   </w:abstractNum>
-  <w:abstractNum w:abstractNumId="61" w15:restartNumberingAfterBreak="0">
+  <w:abstractNum w:abstractNumId="59" w15:restartNumberingAfterBreak="0">
     <w:nsid w:val="60346E60"/>
     <w:multiLevelType w:val="multilevel"/>
     <w:tmpl w:val="615EE75A"/>
@@ -44629,7 +45462,7 @@
       </w:rPr>
     </w:lvl>
   </w:abstractNum>
-  <w:abstractNum w:abstractNumId="62" w15:restartNumberingAfterBreak="0">
+  <w:abstractNum w:abstractNumId="60" w15:restartNumberingAfterBreak="0">
     <w:nsid w:val="60526FE8"/>
     <w:multiLevelType w:val="multilevel"/>
     <w:tmpl w:val="B8482F36"/>
@@ -44742,7 +45575,7 @@
       </w:pPr>
     </w:lvl>
   </w:abstractNum>
-  <w:abstractNum w:abstractNumId="63" w15:restartNumberingAfterBreak="0">
+  <w:abstractNum w:abstractNumId="61" w15:restartNumberingAfterBreak="0">
     <w:nsid w:val="611C3BA3"/>
     <w:multiLevelType w:val="multilevel"/>
     <w:tmpl w:val="3362B75C"/>
@@ -44891,7 +45724,7 @@
       </w:rPr>
     </w:lvl>
   </w:abstractNum>
-  <w:abstractNum w:abstractNumId="64" w15:restartNumberingAfterBreak="0">
+  <w:abstractNum w:abstractNumId="62" w15:restartNumberingAfterBreak="0">
     <w:nsid w:val="61221F3B"/>
     <w:multiLevelType w:val="multilevel"/>
     <w:tmpl w:val="9372F35E"/>
@@ -45004,7 +45837,7 @@
       </w:pPr>
     </w:lvl>
   </w:abstractNum>
-  <w:abstractNum w:abstractNumId="65" w15:restartNumberingAfterBreak="0">
+  <w:abstractNum w:abstractNumId="63" w15:restartNumberingAfterBreak="0">
     <w:nsid w:val="61635166"/>
     <w:multiLevelType w:val="multilevel"/>
     <w:tmpl w:val="194A916E"/>
@@ -45117,120 +45950,7 @@
       </w:pPr>
     </w:lvl>
   </w:abstractNum>
-  <w:abstractNum w:abstractNumId="66" w15:restartNumberingAfterBreak="0">
-    <w:nsid w:val="616C446A"/>
-    <w:multiLevelType w:val="multilevel"/>
-    <w:tmpl w:val="B4F6C7B6"/>
-    <w:lvl w:ilvl="0">
-      <w:start w:val="1"/>
-      <w:numFmt w:val="decimal"/>
-      <w:lvlText w:val="%1."/>
-      <w:lvlJc w:val="left"/>
-      <w:pPr>
-        <w:tabs>
-          <w:tab w:val="num" w:pos="720"/>
-        </w:tabs>
-        <w:ind w:left="720" w:hanging="360"/>
-      </w:pPr>
-    </w:lvl>
-    <w:lvl w:ilvl="1" w:tentative="1">
-      <w:start w:val="1"/>
-      <w:numFmt w:val="decimal"/>
-      <w:lvlText w:val="%2."/>
-      <w:lvlJc w:val="left"/>
-      <w:pPr>
-        <w:tabs>
-          <w:tab w:val="num" w:pos="1440"/>
-        </w:tabs>
-        <w:ind w:left="1440" w:hanging="360"/>
-      </w:pPr>
-    </w:lvl>
-    <w:lvl w:ilvl="2" w:tentative="1">
-      <w:start w:val="1"/>
-      <w:numFmt w:val="decimal"/>
-      <w:lvlText w:val="%3."/>
-      <w:lvlJc w:val="left"/>
-      <w:pPr>
-        <w:tabs>
-          <w:tab w:val="num" w:pos="2160"/>
-        </w:tabs>
-        <w:ind w:left="2160" w:hanging="360"/>
-      </w:pPr>
-    </w:lvl>
-    <w:lvl w:ilvl="3" w:tentative="1">
-      <w:start w:val="1"/>
-      <w:numFmt w:val="decimal"/>
-      <w:lvlText w:val="%4."/>
-      <w:lvlJc w:val="left"/>
-      <w:pPr>
-        <w:tabs>
-          <w:tab w:val="num" w:pos="2880"/>
-        </w:tabs>
-        <w:ind w:left="2880" w:hanging="360"/>
-      </w:pPr>
-    </w:lvl>
-    <w:lvl w:ilvl="4" w:tentative="1">
-      <w:start w:val="1"/>
-      <w:numFmt w:val="decimal"/>
-      <w:lvlText w:val="%5."/>
-      <w:lvlJc w:val="left"/>
-      <w:pPr>
-        <w:tabs>
-          <w:tab w:val="num" w:pos="3600"/>
-        </w:tabs>
-        <w:ind w:left="3600" w:hanging="360"/>
-      </w:pPr>
-    </w:lvl>
-    <w:lvl w:ilvl="5" w:tentative="1">
-      <w:start w:val="1"/>
-      <w:numFmt w:val="decimal"/>
-      <w:lvlText w:val="%6."/>
-      <w:lvlJc w:val="left"/>
-      <w:pPr>
-        <w:tabs>
-          <w:tab w:val="num" w:pos="4320"/>
-        </w:tabs>
-        <w:ind w:left="4320" w:hanging="360"/>
-      </w:pPr>
-    </w:lvl>
-    <w:lvl w:ilvl="6" w:tentative="1">
-      <w:start w:val="1"/>
-      <w:numFmt w:val="decimal"/>
-      <w:lvlText w:val="%7."/>
-      <w:lvlJc w:val="left"/>
-      <w:pPr>
-        <w:tabs>
-          <w:tab w:val="num" w:pos="5040"/>
-        </w:tabs>
-        <w:ind w:left="5040" w:hanging="360"/>
-      </w:pPr>
-    </w:lvl>
-    <w:lvl w:ilvl="7" w:tentative="1">
-      <w:start w:val="1"/>
-      <w:numFmt w:val="decimal"/>
-      <w:lvlText w:val="%8."/>
-      <w:lvlJc w:val="left"/>
-      <w:pPr>
-        <w:tabs>
-          <w:tab w:val="num" w:pos="5760"/>
-        </w:tabs>
-        <w:ind w:left="5760" w:hanging="360"/>
-      </w:pPr>
-    </w:lvl>
-    <w:lvl w:ilvl="8" w:tentative="1">
-      <w:start w:val="1"/>
-      <w:numFmt w:val="decimal"/>
-      <w:lvlText w:val="%9."/>
-      <w:lvlJc w:val="left"/>
-      <w:pPr>
-        <w:tabs>
-          <w:tab w:val="num" w:pos="6480"/>
-        </w:tabs>
-        <w:ind w:left="6480" w:hanging="360"/>
-      </w:pPr>
-    </w:lvl>
-  </w:abstractNum>
-  <w:abstractNum w:abstractNumId="67" w15:restartNumberingAfterBreak="0">
+  <w:abstractNum w:abstractNumId="64" w15:restartNumberingAfterBreak="0">
     <w:nsid w:val="61C6356F"/>
     <w:multiLevelType w:val="multilevel"/>
     <w:tmpl w:val="2690EA9C"/>
@@ -45379,120 +46099,7 @@
       </w:rPr>
     </w:lvl>
   </w:abstractNum>
-  <w:abstractNum w:abstractNumId="68" w15:restartNumberingAfterBreak="0">
-    <w:nsid w:val="62D95EB3"/>
-    <w:multiLevelType w:val="hybridMultilevel"/>
-    <w:tmpl w:val="8FC623BE"/>
-    <w:lvl w:ilvl="0" w:tplc="04190001">
-      <w:start w:val="1"/>
-      <w:numFmt w:val="bullet"/>
-      <w:lvlText w:val=""/>
-      <w:lvlJc w:val="left"/>
-      <w:pPr>
-        <w:ind w:left="1428" w:hanging="360"/>
-      </w:pPr>
-      <w:rPr>
-        <w:rFonts w:ascii="Symbol" w:hAnsi="Symbol" w:hint="default"/>
-      </w:rPr>
-    </w:lvl>
-    <w:lvl w:ilvl="1" w:tplc="04190003" w:tentative="1">
-      <w:start w:val="1"/>
-      <w:numFmt w:val="bullet"/>
-      <w:lvlText w:val="o"/>
-      <w:lvlJc w:val="left"/>
-      <w:pPr>
-        <w:ind w:left="2148" w:hanging="360"/>
-      </w:pPr>
-      <w:rPr>
-        <w:rFonts w:ascii="Courier New" w:hAnsi="Courier New" w:cs="Courier New" w:hint="default"/>
-      </w:rPr>
-    </w:lvl>
-    <w:lvl w:ilvl="2" w:tplc="04190005" w:tentative="1">
-      <w:start w:val="1"/>
-      <w:numFmt w:val="bullet"/>
-      <w:lvlText w:val=""/>
-      <w:lvlJc w:val="left"/>
-      <w:pPr>
-        <w:ind w:left="2868" w:hanging="360"/>
-      </w:pPr>
-      <w:rPr>
-        <w:rFonts w:ascii="Wingdings" w:hAnsi="Wingdings" w:hint="default"/>
-      </w:rPr>
-    </w:lvl>
-    <w:lvl w:ilvl="3" w:tplc="04190001" w:tentative="1">
-      <w:start w:val="1"/>
-      <w:numFmt w:val="bullet"/>
-      <w:lvlText w:val=""/>
-      <w:lvlJc w:val="left"/>
-      <w:pPr>
-        <w:ind w:left="3588" w:hanging="360"/>
-      </w:pPr>
-      <w:rPr>
-        <w:rFonts w:ascii="Symbol" w:hAnsi="Symbol" w:hint="default"/>
-      </w:rPr>
-    </w:lvl>
-    <w:lvl w:ilvl="4" w:tplc="04190003" w:tentative="1">
-      <w:start w:val="1"/>
-      <w:numFmt w:val="bullet"/>
-      <w:lvlText w:val="o"/>
-      <w:lvlJc w:val="left"/>
-      <w:pPr>
-        <w:ind w:left="4308" w:hanging="360"/>
-      </w:pPr>
-      <w:rPr>
-        <w:rFonts w:ascii="Courier New" w:hAnsi="Courier New" w:cs="Courier New" w:hint="default"/>
-      </w:rPr>
-    </w:lvl>
-    <w:lvl w:ilvl="5" w:tplc="04190005" w:tentative="1">
-      <w:start w:val="1"/>
-      <w:numFmt w:val="bullet"/>
-      <w:lvlText w:val=""/>
-      <w:lvlJc w:val="left"/>
-      <w:pPr>
-        <w:ind w:left="5028" w:hanging="360"/>
-      </w:pPr>
-      <w:rPr>
-        <w:rFonts w:ascii="Wingdings" w:hAnsi="Wingdings" w:hint="default"/>
-      </w:rPr>
-    </w:lvl>
-    <w:lvl w:ilvl="6" w:tplc="04190001" w:tentative="1">
-      <w:start w:val="1"/>
-      <w:numFmt w:val="bullet"/>
-      <w:lvlText w:val=""/>
-      <w:lvlJc w:val="left"/>
-      <w:pPr>
-        <w:ind w:left="5748" w:hanging="360"/>
-      </w:pPr>
-      <w:rPr>
-        <w:rFonts w:ascii="Symbol" w:hAnsi="Symbol" w:hint="default"/>
-      </w:rPr>
-    </w:lvl>
-    <w:lvl w:ilvl="7" w:tplc="04190003" w:tentative="1">
-      <w:start w:val="1"/>
-      <w:numFmt w:val="bullet"/>
-      <w:lvlText w:val="o"/>
-      <w:lvlJc w:val="left"/>
-      <w:pPr>
-        <w:ind w:left="6468" w:hanging="360"/>
-      </w:pPr>
-      <w:rPr>
-        <w:rFonts w:ascii="Courier New" w:hAnsi="Courier New" w:cs="Courier New" w:hint="default"/>
-      </w:rPr>
-    </w:lvl>
-    <w:lvl w:ilvl="8" w:tplc="04190005" w:tentative="1">
-      <w:start w:val="1"/>
-      <w:numFmt w:val="bullet"/>
-      <w:lvlText w:val=""/>
-      <w:lvlJc w:val="left"/>
-      <w:pPr>
-        <w:ind w:left="7188" w:hanging="360"/>
-      </w:pPr>
-      <w:rPr>
-        <w:rFonts w:ascii="Wingdings" w:hAnsi="Wingdings" w:hint="default"/>
-      </w:rPr>
-    </w:lvl>
-  </w:abstractNum>
-  <w:abstractNum w:abstractNumId="69" w15:restartNumberingAfterBreak="0">
+  <w:abstractNum w:abstractNumId="65" w15:restartNumberingAfterBreak="0">
     <w:nsid w:val="68E86A8C"/>
     <w:multiLevelType w:val="hybridMultilevel"/>
     <w:tmpl w:val="76287898"/>
@@ -45578,156 +46185,7 @@
       </w:pPr>
     </w:lvl>
   </w:abstractNum>
-  <w:abstractNum w:abstractNumId="70" w15:restartNumberingAfterBreak="0">
-    <w:nsid w:val="692B5ABA"/>
-    <w:multiLevelType w:val="multilevel"/>
-    <w:tmpl w:val="B52CEBD4"/>
-    <w:lvl w:ilvl="0">
-      <w:start w:val="1"/>
-      <w:numFmt w:val="bullet"/>
-      <w:lvlText w:val=""/>
-      <w:lvlJc w:val="left"/>
-      <w:pPr>
-        <w:tabs>
-          <w:tab w:val="num" w:pos="720"/>
-        </w:tabs>
-        <w:ind w:left="720" w:hanging="360"/>
-      </w:pPr>
-      <w:rPr>
-        <w:rFonts w:ascii="Symbol" w:hAnsi="Symbol" w:hint="default"/>
-        <w:sz w:val="20"/>
-      </w:rPr>
-    </w:lvl>
-    <w:lvl w:ilvl="1" w:tentative="1">
-      <w:start w:val="1"/>
-      <w:numFmt w:val="bullet"/>
-      <w:lvlText w:val="o"/>
-      <w:lvlJc w:val="left"/>
-      <w:pPr>
-        <w:tabs>
-          <w:tab w:val="num" w:pos="1440"/>
-        </w:tabs>
-        <w:ind w:left="1440" w:hanging="360"/>
-      </w:pPr>
-      <w:rPr>
-        <w:rFonts w:ascii="Courier New" w:hAnsi="Courier New" w:hint="default"/>
-        <w:sz w:val="20"/>
-      </w:rPr>
-    </w:lvl>
-    <w:lvl w:ilvl="2" w:tentative="1">
-      <w:start w:val="1"/>
-      <w:numFmt w:val="bullet"/>
-      <w:lvlText w:val=""/>
-      <w:lvlJc w:val="left"/>
-      <w:pPr>
-        <w:tabs>
-          <w:tab w:val="num" w:pos="2160"/>
-        </w:tabs>
-        <w:ind w:left="2160" w:hanging="360"/>
-      </w:pPr>
-      <w:rPr>
-        <w:rFonts w:ascii="Wingdings" w:hAnsi="Wingdings" w:hint="default"/>
-        <w:sz w:val="20"/>
-      </w:rPr>
-    </w:lvl>
-    <w:lvl w:ilvl="3" w:tentative="1">
-      <w:start w:val="1"/>
-      <w:numFmt w:val="bullet"/>
-      <w:lvlText w:val=""/>
-      <w:lvlJc w:val="left"/>
-      <w:pPr>
-        <w:tabs>
-          <w:tab w:val="num" w:pos="2880"/>
-        </w:tabs>
-        <w:ind w:left="2880" w:hanging="360"/>
-      </w:pPr>
-      <w:rPr>
-        <w:rFonts w:ascii="Wingdings" w:hAnsi="Wingdings" w:hint="default"/>
-        <w:sz w:val="20"/>
-      </w:rPr>
-    </w:lvl>
-    <w:lvl w:ilvl="4" w:tentative="1">
-      <w:start w:val="1"/>
-      <w:numFmt w:val="bullet"/>
-      <w:lvlText w:val=""/>
-      <w:lvlJc w:val="left"/>
-      <w:pPr>
-        <w:tabs>
-          <w:tab w:val="num" w:pos="3600"/>
-        </w:tabs>
-        <w:ind w:left="3600" w:hanging="360"/>
-      </w:pPr>
-      <w:rPr>
-        <w:rFonts w:ascii="Wingdings" w:hAnsi="Wingdings" w:hint="default"/>
-        <w:sz w:val="20"/>
-      </w:rPr>
-    </w:lvl>
-    <w:lvl w:ilvl="5" w:tentative="1">
-      <w:start w:val="1"/>
-      <w:numFmt w:val="bullet"/>
-      <w:lvlText w:val=""/>
-      <w:lvlJc w:val="left"/>
-      <w:pPr>
-        <w:tabs>
-          <w:tab w:val="num" w:pos="4320"/>
-        </w:tabs>
-        <w:ind w:left="4320" w:hanging="360"/>
-      </w:pPr>
-      <w:rPr>
-        <w:rFonts w:ascii="Wingdings" w:hAnsi="Wingdings" w:hint="default"/>
-        <w:sz w:val="20"/>
-      </w:rPr>
-    </w:lvl>
-    <w:lvl w:ilvl="6" w:tentative="1">
-      <w:start w:val="1"/>
-      <w:numFmt w:val="bullet"/>
-      <w:lvlText w:val=""/>
-      <w:lvlJc w:val="left"/>
-      <w:pPr>
-        <w:tabs>
-          <w:tab w:val="num" w:pos="5040"/>
-        </w:tabs>
-        <w:ind w:left="5040" w:hanging="360"/>
-      </w:pPr>
-      <w:rPr>
-        <w:rFonts w:ascii="Wingdings" w:hAnsi="Wingdings" w:hint="default"/>
-        <w:sz w:val="20"/>
-      </w:rPr>
-    </w:lvl>
-    <w:lvl w:ilvl="7" w:tentative="1">
-      <w:start w:val="1"/>
-      <w:numFmt w:val="bullet"/>
-      <w:lvlText w:val=""/>
-      <w:lvlJc w:val="left"/>
-      <w:pPr>
-        <w:tabs>
-          <w:tab w:val="num" w:pos="5760"/>
-        </w:tabs>
-        <w:ind w:left="5760" w:hanging="360"/>
-      </w:pPr>
-      <w:rPr>
-        <w:rFonts w:ascii="Wingdings" w:hAnsi="Wingdings" w:hint="default"/>
-        <w:sz w:val="20"/>
-      </w:rPr>
-    </w:lvl>
-    <w:lvl w:ilvl="8" w:tentative="1">
-      <w:start w:val="1"/>
-      <w:numFmt w:val="bullet"/>
-      <w:lvlText w:val=""/>
-      <w:lvlJc w:val="left"/>
-      <w:pPr>
-        <w:tabs>
-          <w:tab w:val="num" w:pos="6480"/>
-        </w:tabs>
-        <w:ind w:left="6480" w:hanging="360"/>
-      </w:pPr>
-      <w:rPr>
-        <w:rFonts w:ascii="Wingdings" w:hAnsi="Wingdings" w:hint="default"/>
-        <w:sz w:val="20"/>
-      </w:rPr>
-    </w:lvl>
-  </w:abstractNum>
-  <w:abstractNum w:abstractNumId="71" w15:restartNumberingAfterBreak="0">
+  <w:abstractNum w:abstractNumId="66" w15:restartNumberingAfterBreak="0">
     <w:nsid w:val="6AC020B7"/>
     <w:multiLevelType w:val="multilevel"/>
     <w:tmpl w:val="6D9441F4"/>
@@ -45876,7 +46334,7 @@
       </w:rPr>
     </w:lvl>
   </w:abstractNum>
-  <w:abstractNum w:abstractNumId="72" w15:restartNumberingAfterBreak="0">
+  <w:abstractNum w:abstractNumId="67" w15:restartNumberingAfterBreak="0">
     <w:nsid w:val="71011011"/>
     <w:multiLevelType w:val="multilevel"/>
     <w:tmpl w:val="289A1548"/>
@@ -46025,7 +46483,7 @@
       </w:rPr>
     </w:lvl>
   </w:abstractNum>
-  <w:abstractNum w:abstractNumId="73" w15:restartNumberingAfterBreak="0">
+  <w:abstractNum w:abstractNumId="68" w15:restartNumberingAfterBreak="0">
     <w:nsid w:val="721C6561"/>
     <w:multiLevelType w:val="hybridMultilevel"/>
     <w:tmpl w:val="ECD677D4"/>
@@ -46138,7 +46596,7 @@
       </w:rPr>
     </w:lvl>
   </w:abstractNum>
-  <w:abstractNum w:abstractNumId="74" w15:restartNumberingAfterBreak="0">
+  <w:abstractNum w:abstractNumId="69" w15:restartNumberingAfterBreak="0">
     <w:nsid w:val="73F9785C"/>
     <w:multiLevelType w:val="multilevel"/>
     <w:tmpl w:val="67522E8C"/>
@@ -46287,7 +46745,7 @@
       </w:rPr>
     </w:lvl>
   </w:abstractNum>
-  <w:abstractNum w:abstractNumId="75" w15:restartNumberingAfterBreak="0">
+  <w:abstractNum w:abstractNumId="70" w15:restartNumberingAfterBreak="0">
     <w:nsid w:val="746A4C4A"/>
     <w:multiLevelType w:val="multilevel"/>
     <w:tmpl w:val="10E0C05E"/>
@@ -46436,7 +46894,7 @@
       </w:rPr>
     </w:lvl>
   </w:abstractNum>
-  <w:abstractNum w:abstractNumId="76" w15:restartNumberingAfterBreak="0">
+  <w:abstractNum w:abstractNumId="71" w15:restartNumberingAfterBreak="0">
     <w:nsid w:val="74D607F9"/>
     <w:multiLevelType w:val="multilevel"/>
     <w:tmpl w:val="F4CCFE30"/>
@@ -46549,7 +47007,7 @@
       </w:pPr>
     </w:lvl>
   </w:abstractNum>
-  <w:abstractNum w:abstractNumId="77" w15:restartNumberingAfterBreak="0">
+  <w:abstractNum w:abstractNumId="72" w15:restartNumberingAfterBreak="0">
     <w:nsid w:val="77D63042"/>
     <w:multiLevelType w:val="multilevel"/>
     <w:tmpl w:val="21FABEBC"/>
@@ -46662,7 +47120,7 @@
       </w:pPr>
     </w:lvl>
   </w:abstractNum>
-  <w:abstractNum w:abstractNumId="78" w15:restartNumberingAfterBreak="0">
+  <w:abstractNum w:abstractNumId="73" w15:restartNumberingAfterBreak="0">
     <w:nsid w:val="79306BAB"/>
     <w:multiLevelType w:val="multilevel"/>
     <w:tmpl w:val="778EECBA"/>
@@ -46775,7 +47233,7 @@
       </w:pPr>
     </w:lvl>
   </w:abstractNum>
-  <w:abstractNum w:abstractNumId="79" w15:restartNumberingAfterBreak="0">
+  <w:abstractNum w:abstractNumId="74" w15:restartNumberingAfterBreak="0">
     <w:nsid w:val="7A52735D"/>
     <w:multiLevelType w:val="multilevel"/>
     <w:tmpl w:val="FD2069AA"/>
@@ -46924,7 +47382,7 @@
       </w:rPr>
     </w:lvl>
   </w:abstractNum>
-  <w:abstractNum w:abstractNumId="80" w15:restartNumberingAfterBreak="0">
+  <w:abstractNum w:abstractNumId="75" w15:restartNumberingAfterBreak="0">
     <w:nsid w:val="7B2F1B4B"/>
     <w:multiLevelType w:val="multilevel"/>
     <w:tmpl w:val="6FCA332C"/>
@@ -47037,7 +47495,7 @@
       </w:pPr>
     </w:lvl>
   </w:abstractNum>
-  <w:abstractNum w:abstractNumId="81" w15:restartNumberingAfterBreak="0">
+  <w:abstractNum w:abstractNumId="76" w15:restartNumberingAfterBreak="0">
     <w:nsid w:val="7F1B7409"/>
     <w:multiLevelType w:val="multilevel"/>
     <w:tmpl w:val="812289E2"/>
@@ -47186,7 +47644,7 @@
       </w:rPr>
     </w:lvl>
   </w:abstractNum>
-  <w:abstractNum w:abstractNumId="82" w15:restartNumberingAfterBreak="0">
+  <w:abstractNum w:abstractNumId="77" w15:restartNumberingAfterBreak="0">
     <w:nsid w:val="7F604749"/>
     <w:multiLevelType w:val="multilevel"/>
     <w:tmpl w:val="F6C69AC2"/>
@@ -47342,19 +47800,19 @@
     <w:abstractNumId w:val="20"/>
   </w:num>
   <w:num w:numId="3" w16cid:durableId="462119961">
-    <w:abstractNumId w:val="56"/>
+    <w:abstractNumId w:val="55"/>
   </w:num>
   <w:num w:numId="4" w16cid:durableId="1954094783">
     <w:abstractNumId w:val="36"/>
   </w:num>
   <w:num w:numId="5" w16cid:durableId="882136229">
-    <w:abstractNumId w:val="75"/>
+    <w:abstractNumId w:val="70"/>
   </w:num>
   <w:num w:numId="6" w16cid:durableId="1025794466">
     <w:abstractNumId w:val="1"/>
   </w:num>
   <w:num w:numId="7" w16cid:durableId="651449495">
-    <w:abstractNumId w:val="69"/>
+    <w:abstractNumId w:val="65"/>
   </w:num>
   <w:num w:numId="8" w16cid:durableId="1139345737">
     <w:abstractNumId w:val="10"/>
@@ -47366,13 +47824,13 @@
     <w:abstractNumId w:val="30"/>
   </w:num>
   <w:num w:numId="11" w16cid:durableId="10494282">
-    <w:abstractNumId w:val="67"/>
+    <w:abstractNumId w:val="64"/>
   </w:num>
   <w:num w:numId="12" w16cid:durableId="1177386414">
-    <w:abstractNumId w:val="82"/>
+    <w:abstractNumId w:val="77"/>
   </w:num>
   <w:num w:numId="13" w16cid:durableId="1633973990">
-    <w:abstractNumId w:val="65"/>
+    <w:abstractNumId w:val="63"/>
   </w:num>
   <w:num w:numId="14" w16cid:durableId="223836851">
     <w:abstractNumId w:val="3"/>
@@ -47381,7 +47839,7 @@
     <w:abstractNumId w:val="45"/>
   </w:num>
   <w:num w:numId="16" w16cid:durableId="104740181">
-    <w:abstractNumId w:val="76"/>
+    <w:abstractNumId w:val="71"/>
   </w:num>
   <w:num w:numId="17" w16cid:durableId="1620184776">
     <w:abstractNumId w:val="34"/>
@@ -47405,16 +47863,16 @@
     <w:abstractNumId w:val="33"/>
   </w:num>
   <w:num w:numId="24" w16cid:durableId="1103771391">
-    <w:abstractNumId w:val="62"/>
+    <w:abstractNumId w:val="60"/>
   </w:num>
   <w:num w:numId="25" w16cid:durableId="31465451">
-    <w:abstractNumId w:val="79"/>
+    <w:abstractNumId w:val="74"/>
   </w:num>
   <w:num w:numId="26" w16cid:durableId="494348183">
     <w:abstractNumId w:val="32"/>
   </w:num>
   <w:num w:numId="27" w16cid:durableId="356124465">
-    <w:abstractNumId w:val="81"/>
+    <w:abstractNumId w:val="76"/>
   </w:num>
   <w:num w:numId="28" w16cid:durableId="438139090">
     <w:abstractNumId w:val="18"/>
@@ -47432,13 +47890,13 @@
     <w:abstractNumId w:val="48"/>
   </w:num>
   <w:num w:numId="33" w16cid:durableId="708385342">
-    <w:abstractNumId w:val="78"/>
+    <w:abstractNumId w:val="73"/>
   </w:num>
   <w:num w:numId="34" w16cid:durableId="470095744">
-    <w:abstractNumId w:val="58"/>
+    <w:abstractNumId w:val="56"/>
   </w:num>
   <w:num w:numId="35" w16cid:durableId="2053915843">
-    <w:abstractNumId w:val="64"/>
+    <w:abstractNumId w:val="62"/>
   </w:num>
   <w:num w:numId="36" w16cid:durableId="2125225438">
     <w:abstractNumId w:val="49"/>
@@ -47459,22 +47917,22 @@
     <w:abstractNumId w:val="23"/>
   </w:num>
   <w:num w:numId="42" w16cid:durableId="1743141462">
-    <w:abstractNumId w:val="63"/>
+    <w:abstractNumId w:val="61"/>
   </w:num>
   <w:num w:numId="43" w16cid:durableId="1445491838">
-    <w:abstractNumId w:val="71"/>
+    <w:abstractNumId w:val="66"/>
   </w:num>
   <w:num w:numId="44" w16cid:durableId="1236431717">
     <w:abstractNumId w:val="31"/>
   </w:num>
   <w:num w:numId="45" w16cid:durableId="912274187">
-    <w:abstractNumId w:val="53"/>
+    <w:abstractNumId w:val="52"/>
   </w:num>
   <w:num w:numId="46" w16cid:durableId="1278945118">
     <w:abstractNumId w:val="38"/>
   </w:num>
   <w:num w:numId="47" w16cid:durableId="2007316713">
-    <w:abstractNumId w:val="72"/>
+    <w:abstractNumId w:val="67"/>
   </w:num>
   <w:num w:numId="48" w16cid:durableId="1414624504">
     <w:abstractNumId w:val="24"/>
@@ -47483,7 +47941,7 @@
     <w:abstractNumId w:val="19"/>
   </w:num>
   <w:num w:numId="50" w16cid:durableId="427190722">
-    <w:abstractNumId w:val="60"/>
+    <w:abstractNumId w:val="58"/>
   </w:num>
   <w:num w:numId="51" w16cid:durableId="581568260">
     <w:abstractNumId w:val="16"/>
@@ -47495,13 +47953,13 @@
     <w:abstractNumId w:val="21"/>
   </w:num>
   <w:num w:numId="54" w16cid:durableId="259334031">
-    <w:abstractNumId w:val="74"/>
+    <w:abstractNumId w:val="69"/>
   </w:num>
   <w:num w:numId="55" w16cid:durableId="951471421">
-    <w:abstractNumId w:val="54"/>
+    <w:abstractNumId w:val="53"/>
   </w:num>
   <w:num w:numId="56" w16cid:durableId="569003322">
-    <w:abstractNumId w:val="52"/>
+    <w:abstractNumId w:val="51"/>
   </w:num>
   <w:num w:numId="57" w16cid:durableId="1206675072">
     <w:abstractNumId w:val="12"/>
@@ -47513,7 +47971,7 @@
     <w:abstractNumId w:val="7"/>
   </w:num>
   <w:num w:numId="60" w16cid:durableId="215556297">
-    <w:abstractNumId w:val="61"/>
+    <w:abstractNumId w:val="59"/>
   </w:num>
   <w:num w:numId="61" w16cid:durableId="985084932">
     <w:abstractNumId w:val="39"/>
@@ -47531,13 +47989,13 @@
     <w:abstractNumId w:val="9"/>
   </w:num>
   <w:num w:numId="66" w16cid:durableId="1595941427">
-    <w:abstractNumId w:val="59"/>
+    <w:abstractNumId w:val="57"/>
   </w:num>
   <w:num w:numId="67" w16cid:durableId="1644001138">
     <w:abstractNumId w:val="14"/>
   </w:num>
   <w:num w:numId="68" w16cid:durableId="545222999">
-    <w:abstractNumId w:val="73"/>
+    <w:abstractNumId w:val="68"/>
   </w:num>
   <w:num w:numId="69" w16cid:durableId="25834519">
     <w:abstractNumId w:val="4"/>
@@ -47549,7 +48007,7 @@
     <w:abstractNumId w:val="35"/>
   </w:num>
   <w:num w:numId="72" w16cid:durableId="613681810">
-    <w:abstractNumId w:val="55"/>
+    <w:abstractNumId w:val="54"/>
   </w:num>
   <w:num w:numId="73" w16cid:durableId="260844048">
     <w:abstractNumId w:val="27"/>
@@ -47557,34 +48015,19 @@
   <w:num w:numId="74" w16cid:durableId="1905338026">
     <w:abstractNumId w:val="26"/>
   </w:num>
-  <w:num w:numId="75" w16cid:durableId="26149008">
-    <w:abstractNumId w:val="66"/>
+  <w:num w:numId="75" w16cid:durableId="1095856623">
+    <w:abstractNumId w:val="75"/>
   </w:num>
-  <w:num w:numId="76" w16cid:durableId="519777124">
-    <w:abstractNumId w:val="68"/>
+  <w:num w:numId="76" w16cid:durableId="1738934217">
+    <w:abstractNumId w:val="72"/>
   </w:num>
-  <w:num w:numId="77" w16cid:durableId="548537405">
-    <w:abstractNumId w:val="57"/>
+  <w:num w:numId="77" w16cid:durableId="1828864883">
+    <w:abstractNumId w:val="25"/>
   </w:num>
-  <w:num w:numId="78" w16cid:durableId="1276716416">
-    <w:abstractNumId w:val="51"/>
-  </w:num>
-  <w:num w:numId="79" w16cid:durableId="1875456340">
-    <w:abstractNumId w:val="70"/>
-  </w:num>
-  <w:num w:numId="80" w16cid:durableId="1813134467">
+  <w:num w:numId="78" w16cid:durableId="1891724297">
     <w:abstractNumId w:val="41"/>
   </w:num>
-  <w:num w:numId="81" w16cid:durableId="1095856623">
-    <w:abstractNumId w:val="80"/>
-  </w:num>
-  <w:num w:numId="82" w16cid:durableId="1738934217">
-    <w:abstractNumId w:val="77"/>
-  </w:num>
-  <w:num w:numId="83" w16cid:durableId="1828864883">
-    <w:abstractNumId w:val="25"/>
-  </w:num>
-  <w:numIdMacAtCleanup w:val="74"/>
+  <w:numIdMacAtCleanup w:val="78"/>
 </w:numbering>
 </file>
 

</xml_diff>